<commit_message>
missing ' and missing _ in want_help_to_agree.docx
</commit_message>
<xml_diff>
--- a/docassemble/AKA2JBranding/data/templates/want_help_to_agree_content.docx
+++ b/docassemble/AKA2JBranding/data/templates/want_help_to_agree_content.docx
@@ -1,6 +1,6 @@
 
 <file path=word/document.xml><?xml version="1.0" encoding="utf-8"?>
-<w:document xmlns:wpc="http://schemas.microsoft.com/office/word/2010/wordprocessingCanvas" xmlns:mc="http://schemas.openxmlformats.org/markup-compatibility/2006" xmlns:o="urn:schemas-microsoft-com:office:office" xmlns:r="http://schemas.openxmlformats.org/officeDocument/2006/relationships" xmlns:m="http://schemas.openxmlformats.org/officeDocument/2006/math" xmlns:v="urn:schemas-microsoft-com:vml" xmlns:wp14="http://schemas.microsoft.com/office/word/2010/wordprocessingDrawing" xmlns:wp="http://schemas.openxmlformats.org/drawingml/2006/wordprocessingDrawing" xmlns:w10="urn:schemas-microsoft-com:office:word" xmlns:w="http://schemas.openxmlformats.org/wordprocessingml/2006/main" xmlns:w14="http://schemas.microsoft.com/office/word/2010/wordml" xmlns:wpg="http://schemas.microsoft.com/office/word/2010/wordprocessingGroup" xmlns:wpi="http://schemas.microsoft.com/office/word/2010/wordprocessingInk" xmlns:wne="http://schemas.microsoft.com/office/word/2006/wordml" xmlns:wps="http://schemas.microsoft.com/office/word/2010/wordprocessingShape" mc:Ignorable="w14 wp14">
+<w:document xmlns:wpc="http://schemas.microsoft.com/office/word/2010/wordprocessingCanvas" xmlns:cx="http://schemas.microsoft.com/office/drawing/2014/chartex" xmlns:cx1="http://schemas.microsoft.com/office/drawing/2015/9/8/chartex" xmlns:cx2="http://schemas.microsoft.com/office/drawing/2015/10/21/chartex" xmlns:cx3="http://schemas.microsoft.com/office/drawing/2016/5/9/chartex" xmlns:cx4="http://schemas.microsoft.com/office/drawing/2016/5/10/chartex" xmlns:cx5="http://schemas.microsoft.com/office/drawing/2016/5/11/chartex" xmlns:cx6="http://schemas.microsoft.com/office/drawing/2016/5/12/chartex" xmlns:cx7="http://schemas.microsoft.com/office/drawing/2016/5/13/chartex" xmlns:cx8="http://schemas.microsoft.com/office/drawing/2016/5/14/chartex" xmlns:mc="http://schemas.openxmlformats.org/markup-compatibility/2006" xmlns:aink="http://schemas.microsoft.com/office/drawing/2016/ink" xmlns:am3d="http://schemas.microsoft.com/office/drawing/2017/model3d" xmlns:o="urn:schemas-microsoft-com:office:office" xmlns:r="http://schemas.openxmlformats.org/officeDocument/2006/relationships" xmlns:m="http://schemas.openxmlformats.org/officeDocument/2006/math" xmlns:v="urn:schemas-microsoft-com:vml" xmlns:wp14="http://schemas.microsoft.com/office/word/2010/wordprocessingDrawing" xmlns:wp="http://schemas.openxmlformats.org/drawingml/2006/wordprocessingDrawing" xmlns:w10="urn:schemas-microsoft-com:office:word" xmlns:w="http://schemas.openxmlformats.org/wordprocessingml/2006/main" xmlns:w14="http://schemas.microsoft.com/office/word/2010/wordml" xmlns:w15="http://schemas.microsoft.com/office/word/2012/wordml" xmlns:w16cex="http://schemas.microsoft.com/office/word/2018/wordml/cex" xmlns:w16cid="http://schemas.microsoft.com/office/word/2016/wordml/cid" xmlns:w16="http://schemas.microsoft.com/office/word/2018/wordml" xmlns:w16sdtdh="http://schemas.microsoft.com/office/word/2020/wordml/sdtdatahash" xmlns:w16se="http://schemas.microsoft.com/office/word/2015/wordml/symex" xmlns:wpg="http://schemas.microsoft.com/office/word/2010/wordprocessingGroup" xmlns:wpi="http://schemas.microsoft.com/office/word/2010/wordprocessingInk" xmlns:wne="http://schemas.microsoft.com/office/word/2006/wordml" xmlns:wps="http://schemas.microsoft.com/office/word/2010/wordprocessingShape" mc:Ignorable="w14 w15 w16se w16cid w16 w16cex w16sdtdh wp14">
   <w:body>
     <w:p>
       <w:pPr>
@@ -11,35 +11,7 @@
         <w:rPr>
           <w:color w:val="FF0000"/>
         </w:rPr>
-        <w:t xml:space="preserve">{%p if </w:t>
-      </w:r>
-      <w:proofErr w:type="spellStart"/>
-      <w:r>
-        <w:rPr>
-          <w:color w:val="FF0000"/>
-        </w:rPr>
-        <w:t>user_need</w:t>
-      </w:r>
-      <w:proofErr w:type="spellEnd"/>
-      <w:r>
-        <w:rPr>
-          <w:color w:val="FF0000"/>
-        </w:rPr>
-        <w:t xml:space="preserve"> == 'answer custody' and type_of_response.all_</w:t>
-      </w:r>
-      <w:proofErr w:type="gramStart"/>
-      <w:r>
-        <w:rPr>
-          <w:color w:val="FF0000"/>
-        </w:rPr>
-        <w:t>false(</w:t>
-      </w:r>
-      <w:proofErr w:type="gramEnd"/>
-      <w:r>
-        <w:rPr>
-          <w:color w:val="FF0000"/>
-        </w:rPr>
-        <w:t>) %}</w:t>
+        <w:t>{%p if user_need == 'answer custody' and type_of_response.all_false() %}</w:t>
       </w:r>
     </w:p>
     <w:p>
@@ -81,41 +53,13 @@
         <w:rPr>
           <w:color w:val="FF0000"/>
         </w:rPr>
-        <w:t xml:space="preserve">{%p if </w:t>
-      </w:r>
-      <w:proofErr w:type="spellStart"/>
-      <w:r>
-        <w:rPr>
-          <w:color w:val="FF0000"/>
-        </w:rPr>
-        <w:t>user_need</w:t>
-      </w:r>
-      <w:proofErr w:type="spellEnd"/>
-      <w:r>
-        <w:rPr>
-          <w:color w:val="FF0000"/>
-        </w:rPr>
-        <w:t xml:space="preserve"> == 'answer divorce' and (</w:t>
+        <w:t>{%p if user_need == 'answer divorce' and (</w:t>
       </w:r>
       <w:r>
         <w:rPr>
           <w:color w:val="FFC000"/>
         </w:rPr>
-        <w:t>type_of_response.all_</w:t>
-      </w:r>
-      <w:proofErr w:type="gramStart"/>
-      <w:r>
-        <w:rPr>
-          <w:color w:val="FFC000"/>
-        </w:rPr>
-        <w:t>false(</w:t>
-      </w:r>
-      <w:proofErr w:type="gramEnd"/>
-      <w:r>
-        <w:rPr>
-          <w:color w:val="FFC000"/>
-        </w:rPr>
-        <w:t>) or type_of_response['stay married']</w:t>
+        <w:t>type_of_response.all_false() or type_of_response['stay married']</w:t>
       </w:r>
       <w:r>
         <w:rPr>
@@ -146,78 +90,108 @@
         <w:rPr>
           <w:color w:val="92D050"/>
         </w:rPr>
+        <w:t>{% if type_of_response.all_false() %}</w:t>
+      </w:r>
+      <w:r>
+        <w:t>divorce or legal separation.</w:t>
+      </w:r>
+      <w:r>
+        <w:rPr>
+          <w:color w:val="92D050"/>
+        </w:rPr>
+        <w:t>{% else %}</w:t>
+      </w:r>
+      <w:r>
+        <w:t>{{ case_type }.</w:t>
+      </w:r>
+      <w:r>
+        <w:rPr>
+          <w:color w:val="92D050"/>
+        </w:rPr>
+        <w:t>{% endif %}</w:t>
+      </w:r>
+      <w:r>
+        <w:t>.</w:t>
+      </w:r>
+    </w:p>
+    <w:p>
+      <w:pPr>
+        <w:pStyle w:val="Body"/>
+      </w:pPr>
+      <w:r>
+        <w:rPr>
+          <w:color w:val="92D050"/>
+        </w:rPr>
         <w:t xml:space="preserve">{% if </w:t>
       </w:r>
-      <w:proofErr w:type="spellStart"/>
       <w:r>
         <w:rPr>
           <w:color w:val="92D050"/>
         </w:rPr>
-        <w:t>type_of_response.all_</w:t>
-      </w:r>
-      <w:proofErr w:type="gramStart"/>
+        <w:t xml:space="preserve">type_of_response['stay married'] </w:t>
+      </w:r>
       <w:r>
         <w:rPr>
           <w:color w:val="92D050"/>
         </w:rPr>
-        <w:t>false</w:t>
-      </w:r>
-      <w:proofErr w:type="spellEnd"/>
+        <w:t>%}</w:t>
+      </w:r>
+      <w:r>
+        <w:t xml:space="preserve">If you and your spouse have children together and they are </w:t>
+      </w:r>
+      <w:r>
+        <w:t>under 18, the</w:t>
+      </w:r>
+      <w:r>
+        <w:t xml:space="preserve"> </w:t>
+      </w:r>
+      <w:r>
+        <w:t>court will also issue a Parenting Plan, custody, and child support order.</w:t>
+      </w:r>
+      <w:r>
+        <w:rPr>
+          <w:color w:val="FFC000"/>
+        </w:rPr>
+        <w:t xml:space="preserve"> </w:t>
+      </w:r>
       <w:r>
         <w:rPr>
           <w:color w:val="92D050"/>
         </w:rPr>
-        <w:t>(</w:t>
-      </w:r>
-      <w:proofErr w:type="gramEnd"/>
+        <w:t xml:space="preserve">{% </w:t>
+      </w:r>
       <w:r>
         <w:rPr>
           <w:color w:val="92D050"/>
         </w:rPr>
-        <w:t>) %}</w:t>
-      </w:r>
-      <w:r>
-        <w:t>divorce or legal separation.</w:t>
+        <w:t>el</w:t>
       </w:r>
       <w:r>
         <w:rPr>
           <w:color w:val="92D050"/>
         </w:rPr>
-        <w:t>{% else %}</w:t>
-      </w:r>
-      <w:r>
-        <w:t xml:space="preserve">{{ </w:t>
-      </w:r>
-      <w:proofErr w:type="spellStart"/>
-      <w:r>
-        <w:t>case_type</w:t>
-      </w:r>
-      <w:proofErr w:type="spellEnd"/>
-      <w:r>
-        <w:t xml:space="preserve"> }.</w:t>
+        <w:t>if type_of_response.all_false() and minor_children %}</w:t>
+      </w:r>
+      <w:r>
+        <w:t>The</w:t>
       </w:r>
       <w:r>
         <w:rPr>
           <w:color w:val="92D050"/>
         </w:rPr>
-        <w:t xml:space="preserve">{% </w:t>
-      </w:r>
-      <w:proofErr w:type="spellStart"/>
+        <w:t xml:space="preserve"> %}</w:t>
+      </w:r>
+      <w:r>
+        <w:t xml:space="preserve"> </w:t>
+      </w:r>
+      <w:r>
+        <w:t>court will also issue a Parenting Plan, custody, and child support order.</w:t>
+      </w:r>
       <w:r>
         <w:rPr>
           <w:color w:val="92D050"/>
         </w:rPr>
-        <w:t>endif</w:t>
-      </w:r>
-      <w:proofErr w:type="spellEnd"/>
-      <w:r>
-        <w:rPr>
-          <w:color w:val="92D050"/>
-        </w:rPr>
-        <w:t xml:space="preserve"> %}</w:t>
-      </w:r>
-      <w:r>
-        <w:t>.</w:t>
+        <w:t>{% endif</w:t>
       </w:r>
     </w:p>
     <w:p>
@@ -225,162 +199,30 @@
         <w:pStyle w:val="Body"/>
       </w:pPr>
       <w:r>
-        <w:rPr>
-          <w:color w:val="92D050"/>
-        </w:rPr>
-        <w:t xml:space="preserve">{% if </w:t>
-      </w:r>
-      <w:r>
-        <w:rPr>
-          <w:color w:val="92D050"/>
-        </w:rPr>
-        <w:t>type_of_</w:t>
-      </w:r>
-      <w:proofErr w:type="gramStart"/>
-      <w:r>
-        <w:rPr>
-          <w:color w:val="92D050"/>
-        </w:rPr>
-        <w:t>response[</w:t>
-      </w:r>
-      <w:proofErr w:type="gramEnd"/>
-      <w:r>
-        <w:rPr>
-          <w:color w:val="92D050"/>
-        </w:rPr>
-        <w:t xml:space="preserve">'stay married'] </w:t>
-      </w:r>
-      <w:r>
-        <w:rPr>
-          <w:color w:val="92D050"/>
-        </w:rPr>
-        <w:t>%}</w:t>
-      </w:r>
-      <w:r>
-        <w:t xml:space="preserve">If you and your spouse have children together and they are </w:t>
-      </w:r>
-      <w:r>
-        <w:t>under 18, the</w:t>
-      </w:r>
-      <w:r>
-        <w:t xml:space="preserve"> </w:t>
-      </w:r>
-      <w:r>
-        <w:t>court will also issue a Parenting Plan, custody, and child support order.</w:t>
-      </w:r>
-      <w:r>
-        <w:rPr>
-          <w:color w:val="FFC000"/>
-        </w:rPr>
-        <w:t xml:space="preserve"> </w:t>
-      </w:r>
-      <w:r>
-        <w:rPr>
-          <w:color w:val="92D050"/>
-        </w:rPr>
-        <w:t xml:space="preserve">{% </w:t>
-      </w:r>
-      <w:r>
-        <w:rPr>
-          <w:color w:val="92D050"/>
-        </w:rPr>
-        <w:t>el</w:t>
-      </w:r>
-      <w:r>
-        <w:rPr>
-          <w:color w:val="92D050"/>
-        </w:rPr>
-        <w:t xml:space="preserve">if </w:t>
-      </w:r>
-      <w:proofErr w:type="spellStart"/>
-      <w:r>
-        <w:rPr>
-          <w:color w:val="92D050"/>
-        </w:rPr>
-        <w:t>type_of_response.all_</w:t>
-      </w:r>
-      <w:proofErr w:type="gramStart"/>
-      <w:r>
-        <w:rPr>
-          <w:color w:val="92D050"/>
-        </w:rPr>
-        <w:t>false</w:t>
-      </w:r>
-      <w:proofErr w:type="spellEnd"/>
-      <w:r>
-        <w:rPr>
-          <w:color w:val="92D050"/>
-        </w:rPr>
-        <w:t>(</w:t>
-      </w:r>
-      <w:proofErr w:type="gramEnd"/>
-      <w:r>
-        <w:rPr>
-          <w:color w:val="92D050"/>
-        </w:rPr>
-        <w:t xml:space="preserve">) and </w:t>
-      </w:r>
-      <w:proofErr w:type="spellStart"/>
-      <w:r>
-        <w:rPr>
-          <w:color w:val="92D050"/>
-        </w:rPr>
-        <w:t>minor_children</w:t>
-      </w:r>
-      <w:proofErr w:type="spellEnd"/>
-      <w:r>
-        <w:rPr>
-          <w:color w:val="92D050"/>
-        </w:rPr>
-        <w:t xml:space="preserve"> %}</w:t>
-      </w:r>
-      <w:r>
-        <w:t>The</w:t>
-      </w:r>
-      <w:r>
-        <w:rPr>
-          <w:color w:val="92D050"/>
-        </w:rPr>
-        <w:t xml:space="preserve"> %}</w:t>
-      </w:r>
-      <w:r>
-        <w:t xml:space="preserve"> </w:t>
-      </w:r>
-      <w:r>
-        <w:t>court will also issue a Parenting Plan, custody, and child support order</w:t>
-      </w:r>
-      <w:proofErr w:type="gramStart"/>
-      <w:r>
-        <w:t>.</w:t>
-      </w:r>
-      <w:r>
-        <w:rPr>
-          <w:color w:val="92D050"/>
-        </w:rPr>
-        <w:t>{</w:t>
-      </w:r>
-      <w:proofErr w:type="gramEnd"/>
-      <w:r>
-        <w:rPr>
-          <w:color w:val="92D050"/>
-        </w:rPr>
-        <w:t xml:space="preserve">% </w:t>
-      </w:r>
-      <w:proofErr w:type="spellStart"/>
-      <w:r>
-        <w:rPr>
-          <w:color w:val="92D050"/>
-        </w:rPr>
-        <w:t>endif</w:t>
-      </w:r>
-      <w:proofErr w:type="spellEnd"/>
+        <w:t>If the marriage is going to end, there are benefits to reaching an agreement</w:t>
+      </w:r>
     </w:p>
     <w:p>
       <w:pPr>
         <w:pStyle w:val="Body"/>
       </w:pPr>
       <w:r>
-        <w:t>If the marriage is going to end, there are benefits to reaching an agreement</w:t>
+        <w:rPr>
+          <w:color w:val="FF0000"/>
+        </w:rPr>
+        <w:t>{%</w:t>
+      </w:r>
+      <w:r>
+        <w:rPr>
+          <w:color w:val="FF0000"/>
+        </w:rPr>
+        <w:t>p</w:t>
+      </w:r>
+      <w:r>
+        <w:rPr>
+          <w:color w:val="FF0000"/>
+        </w:rPr>
+        <w:t xml:space="preserve"> endif %}</w:t>
       </w:r>
     </w:p>
     <w:p>
@@ -391,87 +233,14 @@
         <w:rPr>
           <w:color w:val="FF0000"/>
         </w:rPr>
-        <w:t>{%</w:t>
+        <w:t>{%p if user_need in('answer custody', 'answer divorce') and type_of_response.</w:t>
       </w:r>
       <w:r>
         <w:rPr>
           <w:color w:val="FF0000"/>
         </w:rPr>
-        <w:t>p</w:t>
-      </w:r>
-      <w:r>
-        <w:rPr>
-          <w:color w:val="FF0000"/>
-        </w:rPr>
-        <w:t xml:space="preserve"> </w:t>
-      </w:r>
-      <w:proofErr w:type="spellStart"/>
-      <w:r>
-        <w:rPr>
-          <w:color w:val="FF0000"/>
-        </w:rPr>
-        <w:t>endif</w:t>
-      </w:r>
-      <w:proofErr w:type="spellEnd"/>
-      <w:r>
-        <w:rPr>
-          <w:color w:val="FF0000"/>
-        </w:rPr>
-        <w:t xml:space="preserve"> %}</w:t>
-      </w:r>
-    </w:p>
-    <w:p>
-      <w:pPr>
-        <w:pStyle w:val="Body"/>
-      </w:pPr>
-      <w:r>
-        <w:rPr>
-          <w:color w:val="FF0000"/>
-        </w:rPr>
-        <w:t xml:space="preserve">{%p if </w:t>
-      </w:r>
-      <w:proofErr w:type="spellStart"/>
-      <w:r>
-        <w:rPr>
-          <w:color w:val="FF0000"/>
-        </w:rPr>
-        <w:t>user_need</w:t>
-      </w:r>
-      <w:proofErr w:type="spellEnd"/>
-      <w:r>
-        <w:rPr>
-          <w:color w:val="FF0000"/>
-        </w:rPr>
-        <w:t xml:space="preserve"> </w:t>
-      </w:r>
-      <w:proofErr w:type="gramStart"/>
-      <w:r>
-        <w:rPr>
-          <w:color w:val="FF0000"/>
-        </w:rPr>
-        <w:t>in(</w:t>
-      </w:r>
-      <w:proofErr w:type="gramEnd"/>
-      <w:r>
-        <w:rPr>
-          <w:color w:val="FF0000"/>
-        </w:rPr>
-        <w:t xml:space="preserve">'answer custody', 'answer divorce') and </w:t>
-      </w:r>
-      <w:proofErr w:type="spellStart"/>
-      <w:r>
-        <w:rPr>
-          <w:color w:val="FF0000"/>
-        </w:rPr>
-        <w:t>type_of_response.</w:t>
-      </w:r>
-      <w:r>
-        <w:rPr>
-          <w:color w:val="FF0000"/>
-        </w:rPr>
         <w:t>any_true</w:t>
       </w:r>
-      <w:proofErr w:type="spellEnd"/>
       <w:r>
         <w:rPr>
           <w:color w:val="FF0000"/>
@@ -539,53 +308,25 @@
         <w:rPr>
           <w:color w:val="FF0000"/>
         </w:rPr>
-        <w:t>{% if (</w:t>
-      </w:r>
-      <w:proofErr w:type="spellStart"/>
+        <w:t>{% if (user_need == 'answer custody' and type_of_response['ak custody case']) or (user_need == 'answer divorce' and type_of_response['ak divorce case']) or (user_need in('answer custody',</w:t>
+      </w:r>
       <w:r>
         <w:rPr>
           <w:color w:val="FF0000"/>
         </w:rPr>
-        <w:t>user_need</w:t>
-      </w:r>
-      <w:proofErr w:type="spellEnd"/>
+        <w:t xml:space="preserve"> </w:t>
+      </w:r>
       <w:r>
         <w:rPr>
           <w:color w:val="FF0000"/>
         </w:rPr>
-        <w:t xml:space="preserve"> == 'answer custody' and type_of_response['ak custody case']) or (user_need == 'answer divorce' and type_of_response['ak divorce case']) or (user_need in('answer custody',</w:t>
-      </w:r>
-      <w:r>
-        <w:rPr>
-          <w:color w:val="FF0000"/>
-        </w:rPr>
-        <w:t xml:space="preserve"> </w:t>
-      </w:r>
-      <w:r>
-        <w:rPr>
-          <w:color w:val="FF0000"/>
-        </w:rPr>
         <w:t>'answer divorce') and type_of_response['case in 2 states'] and stage_of_other_case == 'ended with no order') %}</w:t>
       </w:r>
       <w:r>
         <w:rPr>
           <w:color w:val="FFC000"/>
         </w:rPr>
-        <w:t xml:space="preserve">{% if case_type </w:t>
-      </w:r>
-      <w:proofErr w:type="gramStart"/>
-      <w:r>
-        <w:rPr>
-          <w:color w:val="FFC000"/>
-        </w:rPr>
-        <w:t>in(</w:t>
-      </w:r>
-      <w:proofErr w:type="gramEnd"/>
-      <w:r>
-        <w:rPr>
-          <w:color w:val="FFC000"/>
-        </w:rPr>
-        <w:t>'custody', 'divorce') or (case_type == 'legal separation' and want_legal_separation == 'yes') %}</w:t>
+        <w:t>{% if case_type in('custody', 'divorce') or (case_type == 'legal separation' and want_legal_separation == 'yes') %}</w:t>
       </w:r>
       <w:r>
         <w:rPr>
@@ -850,85 +591,8 @@
         </w:rPr>
         <w:t>(</w:t>
       </w:r>
-      <w:proofErr w:type="spellStart"/>
-      <w:r>
-        <w:t>type_of_response.all_true</w:t>
-      </w:r>
-      <w:proofErr w:type="spellEnd"/>
-      <w:r>
-        <w:t>('</w:t>
-      </w:r>
-      <w:proofErr w:type="spellStart"/>
-      <w:r>
-        <w:t>ak</w:t>
-      </w:r>
-      <w:proofErr w:type="spellEnd"/>
-      <w:r>
-        <w:t xml:space="preserve"> custody case', exclusive = True) or </w:t>
-      </w:r>
-      <w:proofErr w:type="spellStart"/>
-      <w:r>
-        <w:t>type_of_response.all_true</w:t>
-      </w:r>
-      <w:proofErr w:type="spellEnd"/>
-      <w:r>
-        <w:t>('</w:t>
-      </w:r>
-      <w:proofErr w:type="spellStart"/>
-      <w:r>
-        <w:t>ak</w:t>
-      </w:r>
-      <w:proofErr w:type="spellEnd"/>
-      <w:r>
-        <w:t xml:space="preserve"> custody case', 'improper service', exclusive = True) or </w:t>
-      </w:r>
-      <w:proofErr w:type="spellStart"/>
-      <w:r>
-        <w:t>type_of_response.all_true</w:t>
-      </w:r>
-      <w:proofErr w:type="spellEnd"/>
-      <w:r>
-        <w:t>('</w:t>
-      </w:r>
-      <w:proofErr w:type="spellStart"/>
-      <w:r>
-        <w:t>ak</w:t>
-      </w:r>
-      <w:proofErr w:type="spellEnd"/>
-      <w:r>
-        <w:t xml:space="preserve"> divorce case', exclusive = True) or </w:t>
-      </w:r>
-      <w:proofErr w:type="spellStart"/>
-      <w:r>
-        <w:t>type_of_response.all_true</w:t>
-      </w:r>
-      <w:proofErr w:type="spellEnd"/>
-      <w:r>
-        <w:t>('</w:t>
-      </w:r>
-      <w:proofErr w:type="spellStart"/>
-      <w:r>
-        <w:t>ak</w:t>
-      </w:r>
-      <w:proofErr w:type="spellEnd"/>
-      <w:r>
-        <w:t xml:space="preserve"> divorce case', 'improper service', exclusive = True) or </w:t>
-      </w:r>
-      <w:proofErr w:type="spellStart"/>
-      <w:r>
-        <w:t>type_of_response.all_true</w:t>
-      </w:r>
-      <w:proofErr w:type="spellEnd"/>
-      <w:r>
-        <w:t>('</w:t>
-      </w:r>
-      <w:proofErr w:type="spellStart"/>
-      <w:r>
-        <w:t>ak</w:t>
-      </w:r>
-      <w:proofErr w:type="spellEnd"/>
-      <w:r>
-        <w:t xml:space="preserve"> divorce case', 'stay married', exclusive = True) or (type_of_response['case in 2 states'] and stage_of_other_case == 'ended with no order')</w:t>
+      <w:r>
+        <w:t>type_of_response.all_true('ak custody case', exclusive = True) or type_of_response.all_true('ak custody case', 'improper service', exclusive = True) or type_of_response.all_true('ak divorce case', exclusive = True) or type_of_response.all_true('ak divorce case', 'improper service', exclusive = True) or type_of_response.all_true('ak divorce case', 'stay married', exclusive = True) or (type_of_response['case in 2 states'] and stage_of_other_case == 'ended with no order')</w:t>
       </w:r>
       <w:r>
         <w:rPr>
@@ -1026,15 +690,7 @@
         <w:pStyle w:val="Body"/>
       </w:pPr>
       <w:r>
-        <w:t>If you and {</w:t>
-      </w:r>
-      <w:proofErr w:type="gramStart"/>
-      <w:r>
-        <w:t>{ other</w:t>
-      </w:r>
-      <w:proofErr w:type="gramEnd"/>
-      <w:r>
-        <w:t>_party_in_case }} reach an agreement about the issues in the case, you can avoid a trial.</w:t>
+        <w:t>If you and {{ other_party_in_case }} reach an agreement about the issues in the case, you can avoid a trial.</w:t>
       </w:r>
     </w:p>
     <w:p>
@@ -1057,72 +713,30 @@
         <w:rPr>
           <w:color w:val="FF0000"/>
         </w:rPr>
-        <w:t xml:space="preserve"> </w:t>
-      </w:r>
-      <w:proofErr w:type="spellStart"/>
+        <w:t xml:space="preserve"> endif %}</w:t>
+      </w:r>
+    </w:p>
+    <w:p>
+      <w:pPr>
+        <w:pStyle w:val="Body"/>
+      </w:pPr>
       <w:r>
         <w:rPr>
           <w:color w:val="FF0000"/>
         </w:rPr>
-        <w:t>endif</w:t>
-      </w:r>
-      <w:proofErr w:type="spellEnd"/>
+        <w:t>{%</w:t>
+      </w:r>
       <w:r>
         <w:rPr>
           <w:color w:val="FF0000"/>
         </w:rPr>
-        <w:t xml:space="preserve"> %}</w:t>
-      </w:r>
-    </w:p>
-    <w:p>
-      <w:pPr>
-        <w:pStyle w:val="Body"/>
-      </w:pPr>
+        <w:t>p</w:t>
+      </w:r>
       <w:r>
         <w:rPr>
           <w:color w:val="FF0000"/>
         </w:rPr>
-        <w:t>{%</w:t>
-      </w:r>
-      <w:r>
-        <w:rPr>
-          <w:color w:val="FF0000"/>
-        </w:rPr>
-        <w:t>p</w:t>
-      </w:r>
-      <w:r>
-        <w:rPr>
-          <w:color w:val="FF0000"/>
-        </w:rPr>
-        <w:t xml:space="preserve"> if not (</w:t>
-      </w:r>
-      <w:proofErr w:type="spellStart"/>
-      <w:r>
-        <w:rPr>
-          <w:color w:val="FF0000"/>
-        </w:rPr>
-        <w:t>user_need</w:t>
-      </w:r>
-      <w:proofErr w:type="spellEnd"/>
-      <w:r>
-        <w:rPr>
-          <w:color w:val="FF0000"/>
-        </w:rPr>
-        <w:t xml:space="preserve"> == 'answer divorce' and type_of_response.all_</w:t>
-      </w:r>
-      <w:proofErr w:type="gramStart"/>
-      <w:r>
-        <w:rPr>
-          <w:color w:val="FF0000"/>
-        </w:rPr>
-        <w:t>true(</w:t>
-      </w:r>
-      <w:proofErr w:type="gramEnd"/>
-      <w:r>
-        <w:rPr>
-          <w:color w:val="FF0000"/>
-        </w:rPr>
-        <w:t>'stay married', exclusive = True)) %}</w:t>
+        <w:t xml:space="preserve"> if not (user_need == 'answer divorce' and type_of_response.all_true('stay married', exclusive = True)) %}</w:t>
       </w:r>
     </w:p>
     <w:p>
@@ -1158,119 +772,7 @@
         <w:rPr>
           <w:color w:val="FFC000"/>
         </w:rPr>
-        <w:t>{%p if (</w:t>
-      </w:r>
-      <w:proofErr w:type="spellStart"/>
-      <w:r>
-        <w:rPr>
-          <w:color w:val="FFC000"/>
-        </w:rPr>
-        <w:t>user_need</w:t>
-      </w:r>
-      <w:proofErr w:type="spellEnd"/>
-      <w:r>
-        <w:rPr>
-          <w:color w:val="FFC000"/>
-        </w:rPr>
-        <w:t xml:space="preserve"> == 'answer custody' and type_of_response['</w:t>
-      </w:r>
-      <w:proofErr w:type="spellStart"/>
-      <w:r>
-        <w:rPr>
-          <w:color w:val="FFC000"/>
-        </w:rPr>
-        <w:t>ak</w:t>
-      </w:r>
-      <w:proofErr w:type="spellEnd"/>
-      <w:r>
-        <w:rPr>
-          <w:color w:val="FFC000"/>
-        </w:rPr>
-        <w:t xml:space="preserve"> custody case']) or (</w:t>
-      </w:r>
-      <w:proofErr w:type="spellStart"/>
-      <w:r>
-        <w:rPr>
-          <w:color w:val="FFC000"/>
-        </w:rPr>
-        <w:t>user_need</w:t>
-      </w:r>
-      <w:proofErr w:type="spellEnd"/>
-      <w:r>
-        <w:rPr>
-          <w:color w:val="FFC000"/>
-        </w:rPr>
-        <w:t xml:space="preserve"> == 'answer divorce' and type_of_response['</w:t>
-      </w:r>
-      <w:proofErr w:type="spellStart"/>
-      <w:r>
-        <w:rPr>
-          <w:color w:val="FFC000"/>
-        </w:rPr>
-        <w:t>ak</w:t>
-      </w:r>
-      <w:proofErr w:type="spellEnd"/>
-      <w:r>
-        <w:rPr>
-          <w:color w:val="FFC000"/>
-        </w:rPr>
-        <w:t xml:space="preserve"> divorce case'] and </w:t>
-      </w:r>
-      <w:proofErr w:type="spellStart"/>
-      <w:r>
-        <w:rPr>
-          <w:color w:val="FFC000"/>
-        </w:rPr>
-        <w:t>minor_children</w:t>
-      </w:r>
-      <w:proofErr w:type="spellEnd"/>
-      <w:r>
-        <w:rPr>
-          <w:color w:val="FFC000"/>
-        </w:rPr>
-        <w:t>) or (</w:t>
-      </w:r>
-      <w:proofErr w:type="spellStart"/>
-      <w:r>
-        <w:rPr>
-          <w:color w:val="FFC000"/>
-        </w:rPr>
-        <w:t>type_of_response.all_false</w:t>
-      </w:r>
-      <w:proofErr w:type="spellEnd"/>
-      <w:r>
-        <w:rPr>
-          <w:color w:val="FFC000"/>
-        </w:rPr>
-        <w:t xml:space="preserve">() and </w:t>
-      </w:r>
-      <w:proofErr w:type="spellStart"/>
-      <w:r>
-        <w:rPr>
-          <w:color w:val="FFC000"/>
-        </w:rPr>
-        <w:t>want_help_to_agree</w:t>
-      </w:r>
-      <w:proofErr w:type="spellEnd"/>
-      <w:r>
-        <w:rPr>
-          <w:color w:val="FFC000"/>
-        </w:rPr>
-        <w:t xml:space="preserve">) or (type_of_response['case in 2 states'] and </w:t>
-      </w:r>
-      <w:proofErr w:type="spellStart"/>
-      <w:r>
-        <w:rPr>
-          <w:color w:val="FFC000"/>
-        </w:rPr>
-        <w:t>stage_of_other_case</w:t>
-      </w:r>
-      <w:proofErr w:type="spellEnd"/>
-      <w:r>
-        <w:rPr>
-          <w:color w:val="FFC000"/>
-        </w:rPr>
-        <w:t xml:space="preserve"> == 'ended with no order') %}</w:t>
+        <w:t>{%p if (user_need == 'answer custody' and type_of_response['ak custody case']) or (user_need == 'answer divorce' and type_of_response['ak divorce case'] and minor_children) or (type_of_response.all_false() and want_help_to_agree) or (type_of_response['case in 2 states'] and stage_of_other_case == 'ended with no order') %}</w:t>
       </w:r>
     </w:p>
     <w:p>
@@ -1309,21 +811,7 @@
           <w:color w:val="FFC000"/>
         </w:rPr>
         <w:lastRenderedPageBreak/>
-        <w:t xml:space="preserve">{%p </w:t>
-      </w:r>
-      <w:proofErr w:type="spellStart"/>
-      <w:r>
-        <w:rPr>
-          <w:color w:val="FFC000"/>
-        </w:rPr>
-        <w:t>endif</w:t>
-      </w:r>
-      <w:proofErr w:type="spellEnd"/>
-      <w:r>
-        <w:rPr>
-          <w:color w:val="FFC000"/>
-        </w:rPr>
-        <w:t xml:space="preserve"> %}</w:t>
+        <w:t>{%p endif %}</w:t>
       </w:r>
     </w:p>
     <w:p>
@@ -1363,23 +851,7 @@
         </w:rPr>
       </w:pPr>
       <w:r>
-        <w:t>Reaching an agreement may be more cooperative than dealing with the issues in a trial, where each {</w:t>
-      </w:r>
-      <w:proofErr w:type="gramStart"/>
-      <w:r>
-        <w:t>{ 'parent'</w:t>
-      </w:r>
-      <w:proofErr w:type="gramEnd"/>
-      <w:r>
-        <w:t xml:space="preserve"> if </w:t>
-      </w:r>
-      <w:proofErr w:type="spellStart"/>
-      <w:r>
-        <w:t>user_need</w:t>
-      </w:r>
-      <w:proofErr w:type="spellEnd"/>
-      <w:r>
-        <w:t xml:space="preserve"> == 'answer custody' else 'spouse' }} presents evidence and makes arguments about what they want the judge to decide.</w:t>
+        <w:t>Reaching an agreement may be more cooperative than dealing with the issues in a trial, where each {{ 'parent' if user_need == 'answer custody' else 'spouse' }} presents evidence and makes arguments about what they want the judge to decide.</w:t>
       </w:r>
     </w:p>
     <w:p>
@@ -1414,7 +886,7 @@
       <w:r>
         <w:t xml:space="preserve">Watch a </w:t>
       </w:r>
-      <w:hyperlink r:id="rId6">
+      <w:hyperlink r:id="rId5">
         <w:r>
           <w:rPr>
             <w:rStyle w:val="Hyperlink"/>
@@ -1423,15 +895,7 @@
         </w:r>
       </w:hyperlink>
       <w:r>
-        <w:t xml:space="preserve"> by reaching agreement with {</w:t>
-      </w:r>
-      <w:proofErr w:type="gramStart"/>
-      <w:r>
-        <w:t>{ other</w:t>
-      </w:r>
-      <w:proofErr w:type="gramEnd"/>
-      <w:r>
-        <w:t>_party_in_case }}.</w:t>
+        <w:t xml:space="preserve"> by reaching agreement with {{ other_party_in_case }}.</w:t>
       </w:r>
     </w:p>
     <w:p>
@@ -1442,161 +906,7 @@
         <w:rPr>
           <w:color w:val="FFC000"/>
         </w:rPr>
-        <w:t>{%p if (</w:t>
-      </w:r>
-      <w:proofErr w:type="spellStart"/>
-      <w:r>
-        <w:rPr>
-          <w:color w:val="FFC000"/>
-        </w:rPr>
-        <w:t>user_need</w:t>
-      </w:r>
-      <w:proofErr w:type="spellEnd"/>
-      <w:r>
-        <w:rPr>
-          <w:color w:val="FFC000"/>
-        </w:rPr>
-        <w:t xml:space="preserve"> == 'answer custody' and type_of_</w:t>
-      </w:r>
-      <w:proofErr w:type="gramStart"/>
-      <w:r>
-        <w:rPr>
-          <w:color w:val="FFC000"/>
-        </w:rPr>
-        <w:t>response[</w:t>
-      </w:r>
-      <w:proofErr w:type="gramEnd"/>
-      <w:r>
-        <w:rPr>
-          <w:color w:val="FFC000"/>
-        </w:rPr>
-        <w:t>'</w:t>
-      </w:r>
-      <w:proofErr w:type="spellStart"/>
-      <w:r>
-        <w:rPr>
-          <w:color w:val="FFC000"/>
-        </w:rPr>
-        <w:t>ak</w:t>
-      </w:r>
-      <w:proofErr w:type="spellEnd"/>
-      <w:r>
-        <w:rPr>
-          <w:color w:val="FFC000"/>
-        </w:rPr>
-        <w:t xml:space="preserve"> custody case'] and </w:t>
-      </w:r>
-      <w:proofErr w:type="spellStart"/>
-      <w:r>
-        <w:rPr>
-          <w:color w:val="FFC000"/>
-        </w:rPr>
-        <w:t>case_type</w:t>
-      </w:r>
-      <w:proofErr w:type="spellEnd"/>
-      <w:r>
-        <w:rPr>
-          <w:color w:val="FFC000"/>
-        </w:rPr>
-        <w:t xml:space="preserve"> == 'custody') or (</w:t>
-      </w:r>
-      <w:proofErr w:type="spellStart"/>
-      <w:r>
-        <w:rPr>
-          <w:color w:val="FFC000"/>
-        </w:rPr>
-        <w:t>user_need</w:t>
-      </w:r>
-      <w:proofErr w:type="spellEnd"/>
-      <w:r>
-        <w:rPr>
-          <w:color w:val="FFC000"/>
-        </w:rPr>
-        <w:t xml:space="preserve"> == 'answer divorce' and type_of_response['</w:t>
-      </w:r>
-      <w:proofErr w:type="spellStart"/>
-      <w:r>
-        <w:rPr>
-          <w:color w:val="FFC000"/>
-        </w:rPr>
-        <w:t>ak</w:t>
-      </w:r>
-      <w:proofErr w:type="spellEnd"/>
-      <w:r>
-        <w:rPr>
-          <w:color w:val="FFC000"/>
-        </w:rPr>
-        <w:t xml:space="preserve"> divorce case'] and (</w:t>
-      </w:r>
-      <w:proofErr w:type="spellStart"/>
-      <w:r>
-        <w:rPr>
-          <w:color w:val="FFC000"/>
-        </w:rPr>
-        <w:t>case_type</w:t>
-      </w:r>
-      <w:proofErr w:type="spellEnd"/>
-      <w:r>
-        <w:rPr>
-          <w:color w:val="FFC000"/>
-        </w:rPr>
-        <w:t xml:space="preserve"> == 'divorce' or (</w:t>
-      </w:r>
-      <w:proofErr w:type="spellStart"/>
-      <w:r>
-        <w:rPr>
-          <w:color w:val="FFC000"/>
-        </w:rPr>
-        <w:t>case_type</w:t>
-      </w:r>
-      <w:proofErr w:type="spellEnd"/>
-      <w:r>
-        <w:rPr>
-          <w:color w:val="FFC000"/>
-        </w:rPr>
-        <w:t xml:space="preserve"> == 'legal separation' and </w:t>
-      </w:r>
-      <w:proofErr w:type="spellStart"/>
-      <w:r>
-        <w:rPr>
-          <w:color w:val="FFC000"/>
-        </w:rPr>
-        <w:t>want_legal_separation</w:t>
-      </w:r>
-      <w:proofErr w:type="spellEnd"/>
-      <w:r>
-        <w:rPr>
-          <w:color w:val="FFC000"/>
-        </w:rPr>
-        <w:t xml:space="preserve"> == 'yes'))) or (type_of_response['case in 2 states'] and </w:t>
-      </w:r>
-      <w:proofErr w:type="spellStart"/>
-      <w:r>
-        <w:rPr>
-          <w:color w:val="FFC000"/>
-        </w:rPr>
-        <w:t>stage_of_other_case</w:t>
-      </w:r>
-      <w:proofErr w:type="spellEnd"/>
-      <w:r>
-        <w:rPr>
-          <w:color w:val="FFC000"/>
-        </w:rPr>
-        <w:t xml:space="preserve"> == 'ended with no order') or </w:t>
-      </w:r>
-      <w:proofErr w:type="spellStart"/>
-      <w:r>
-        <w:rPr>
-          <w:color w:val="FFC000"/>
-        </w:rPr>
-        <w:t>type_of_response.all_false</w:t>
-      </w:r>
-      <w:proofErr w:type="spellEnd"/>
-      <w:r>
-        <w:rPr>
-          <w:color w:val="FFC000"/>
-        </w:rPr>
-        <w:t>() %}</w:t>
+        <w:t>{%p if (user_need == 'answer custody' and type_of_response['ak custody case'] and case_type == 'custody') or (user_need == 'answer divorce' and type_of_response['ak divorce case'] and (case_type == 'divorce' or (case_type == 'legal separation' and want_legal_separation == 'yes'))) or (type_of_response['case in 2 states'] and stage_of_other_case == 'ended with no order') or type_of_response.all_false() %}</w:t>
       </w:r>
     </w:p>
     <w:p>
@@ -1607,94 +917,22 @@
         <w:rPr>
           <w:color w:val="92D050"/>
         </w:rPr>
-        <w:t xml:space="preserve">{% if </w:t>
-      </w:r>
-      <w:proofErr w:type="spellStart"/>
+        <w:t>{% if type_of_response.all_false() or (type_of_response.any_true() and response_to_complaint == 'agree') %}</w:t>
+      </w:r>
+      <w:r>
+        <w:t>Options for working with {{ other_party_in_case }} to write out your agreement{% else %} Options for working with {{ other_party_in_case }} to reach an agreement</w:t>
+      </w:r>
       <w:r>
         <w:rPr>
           <w:color w:val="92D050"/>
         </w:rPr>
-        <w:t>type_of_response.all_</w:t>
-      </w:r>
-      <w:proofErr w:type="gramStart"/>
+        <w:t xml:space="preserve">{% </w:t>
+      </w:r>
       <w:r>
         <w:rPr>
           <w:color w:val="92D050"/>
         </w:rPr>
-        <w:t>false</w:t>
-      </w:r>
-      <w:proofErr w:type="spellEnd"/>
-      <w:r>
-        <w:rPr>
-          <w:color w:val="92D050"/>
-        </w:rPr>
-        <w:t>(</w:t>
-      </w:r>
-      <w:proofErr w:type="gramEnd"/>
-      <w:r>
-        <w:rPr>
-          <w:color w:val="92D050"/>
-        </w:rPr>
-        <w:t>) or (</w:t>
-      </w:r>
-      <w:proofErr w:type="spellStart"/>
-      <w:r>
-        <w:rPr>
-          <w:color w:val="92D050"/>
-        </w:rPr>
-        <w:t>type_of_response.any_true</w:t>
-      </w:r>
-      <w:proofErr w:type="spellEnd"/>
-      <w:r>
-        <w:rPr>
-          <w:color w:val="92D050"/>
-        </w:rPr>
-        <w:t xml:space="preserve">() and </w:t>
-      </w:r>
-      <w:proofErr w:type="spellStart"/>
-      <w:r>
-        <w:rPr>
-          <w:color w:val="92D050"/>
-        </w:rPr>
-        <w:t>response_to_complaint</w:t>
-      </w:r>
-      <w:proofErr w:type="spellEnd"/>
-      <w:r>
-        <w:rPr>
-          <w:color w:val="92D050"/>
-        </w:rPr>
-        <w:t xml:space="preserve"> == 'agree') %}</w:t>
-      </w:r>
-      <w:r>
-        <w:t>Options for working with {</w:t>
-      </w:r>
-      <w:proofErr w:type="gramStart"/>
-      <w:r>
-        <w:t>{ other</w:t>
-      </w:r>
-      <w:proofErr w:type="gramEnd"/>
-      <w:r>
-        <w:t>_party_in_case }} to write out your agreement{% else %} Options for working with {{ other_party_in_case }} to reach an agreement</w:t>
-      </w:r>
-      <w:r>
-        <w:rPr>
-          <w:color w:val="92D050"/>
-        </w:rPr>
-        <w:t xml:space="preserve">{% </w:t>
-      </w:r>
-      <w:proofErr w:type="spellStart"/>
-      <w:r>
-        <w:rPr>
-          <w:color w:val="92D050"/>
-        </w:rPr>
-        <w:t>endif</w:t>
-      </w:r>
-      <w:proofErr w:type="spellEnd"/>
-      <w:r>
-        <w:rPr>
-          <w:color w:val="92D050"/>
-        </w:rPr>
-        <w:t xml:space="preserve"> %}</w:t>
+        <w:t>endif %}</w:t>
       </w:r>
     </w:p>
     <w:p>
@@ -1743,21 +981,7 @@
         <w:rPr>
           <w:color w:val="92D050"/>
         </w:rPr>
-        <w:t xml:space="preserve">{% if </w:t>
-      </w:r>
-      <w:proofErr w:type="spellStart"/>
-      <w:r>
-        <w:rPr>
-          <w:color w:val="92D050"/>
-        </w:rPr>
-        <w:t>type_of_response.any_true</w:t>
-      </w:r>
-      <w:proofErr w:type="spellEnd"/>
-      <w:r>
-        <w:rPr>
-          <w:color w:val="92D050"/>
-        </w:rPr>
-        <w:t>() %}</w:t>
+        <w:t>{% if type_of_response.any_true() %}</w:t>
       </w:r>
     </w:p>
     <w:p>
@@ -1786,21 +1010,7 @@
         <w:rPr>
           <w:color w:val="92D050"/>
         </w:rPr>
-        <w:t xml:space="preserve">{% </w:t>
-      </w:r>
-      <w:proofErr w:type="spellStart"/>
-      <w:r>
-        <w:rPr>
-          <w:color w:val="92D050"/>
-        </w:rPr>
-        <w:t>endif</w:t>
-      </w:r>
-      <w:proofErr w:type="spellEnd"/>
-      <w:r>
-        <w:rPr>
-          <w:color w:val="92D050"/>
-        </w:rPr>
-        <w:t xml:space="preserve"> %}</w:t>
+        <w:t>{% endif %}</w:t>
       </w:r>
     </w:p>
     <w:p>
@@ -1846,21 +1056,7 @@
         <w:rPr>
           <w:color w:val="FFC000"/>
         </w:rPr>
-        <w:t xml:space="preserve">{%p </w:t>
-      </w:r>
-      <w:proofErr w:type="spellStart"/>
-      <w:r>
-        <w:rPr>
-          <w:color w:val="FFC000"/>
-        </w:rPr>
-        <w:t>endif</w:t>
-      </w:r>
-      <w:proofErr w:type="spellEnd"/>
-      <w:r>
-        <w:rPr>
-          <w:color w:val="FFC000"/>
-        </w:rPr>
-        <w:t xml:space="preserve"> %}</w:t>
+        <w:t>{%p endif %}</w:t>
       </w:r>
     </w:p>
     <w:p>
@@ -1876,15 +1072,7 @@
         <w:pStyle w:val="Body"/>
       </w:pPr>
       <w:r>
-        <w:t xml:space="preserve">Some {{ "parents" if </w:t>
-      </w:r>
-      <w:proofErr w:type="spellStart"/>
-      <w:r>
-        <w:t>user_need</w:t>
-      </w:r>
-      <w:proofErr w:type="spellEnd"/>
-      <w:r>
-        <w:t xml:space="preserve"> == 'answer custody' else "spouses" }} want to work out the issues by agreement without the judge deciding and are able to talk to each other in person, on-line, or with the help of a friend or family member.</w:t>
+        <w:t>Some {{ "parents" if user_need == 'answer custody' else "spouses" }} want to work out the issues by agreement without the judge deciding and are able to talk to each other in person, on-line, or with the help of a friend or family member.</w:t>
       </w:r>
     </w:p>
     <w:p>
@@ -2006,90 +1194,84 @@
         <w:rPr>
           <w:color w:val="FFC000"/>
         </w:rPr>
-        <w:t xml:space="preserve">{%p if </w:t>
-      </w:r>
-      <w:proofErr w:type="spellStart"/>
+        <w:t xml:space="preserve">{%p if type_of_response.any_true() </w:t>
+      </w:r>
       <w:r>
         <w:rPr>
           <w:color w:val="FFC000"/>
         </w:rPr>
-        <w:t>type_of_response.any_true</w:t>
-      </w:r>
-      <w:proofErr w:type="spellEnd"/>
+        <w:t xml:space="preserve">and </w:t>
+      </w:r>
       <w:r>
         <w:rPr>
           <w:color w:val="FFC000"/>
         </w:rPr>
-        <w:t xml:space="preserve">() </w:t>
+        <w:t>(</w:t>
+      </w:r>
+      <w:r>
+        <w:rPr>
+          <w:color w:val="92D050"/>
+        </w:rPr>
+        <w:t>user_need == 'answer custody or</w:t>
+      </w:r>
+      <w:r>
+        <w:rPr>
+          <w:color w:val="92D050"/>
+        </w:rPr>
+        <w:t xml:space="preserve"> (</w:t>
+      </w:r>
+      <w:r>
+        <w:rPr>
+          <w:color w:val="00B050"/>
+        </w:rPr>
+        <w:t xml:space="preserve">user_need == 'answer </w:t>
+      </w:r>
+      <w:r>
+        <w:rPr>
+          <w:color w:val="00B050"/>
+        </w:rPr>
+        <w:t>divorce</w:t>
+      </w:r>
+      <w:r>
+        <w:rPr>
+          <w:color w:val="00B050"/>
+        </w:rPr>
+        <w:t>’</w:t>
+      </w:r>
+      <w:r>
+        <w:rPr>
+          <w:color w:val="00B050"/>
+        </w:rPr>
+        <w:t xml:space="preserve"> and minor</w:t>
+      </w:r>
+      <w:r>
+        <w:rPr>
+          <w:color w:val="00B050"/>
+        </w:rPr>
+        <w:t>_</w:t>
+      </w:r>
+      <w:r>
+        <w:rPr>
+          <w:color w:val="00B050"/>
+        </w:rPr>
+        <w:t xml:space="preserve">children </w:t>
+      </w:r>
+      <w:r>
+        <w:rPr>
+          <w:color w:val="92D050"/>
+        </w:rPr>
+        <w:t>)</w:t>
       </w:r>
       <w:r>
         <w:rPr>
           <w:color w:val="FFC000"/>
         </w:rPr>
-        <w:t xml:space="preserve">and </w:t>
+        <w:t>)</w:t>
       </w:r>
       <w:r>
         <w:rPr>
           <w:color w:val="FFC000"/>
         </w:rPr>
-        <w:t>(</w:t>
-      </w:r>
-      <w:proofErr w:type="spellStart"/>
-      <w:r>
-        <w:rPr>
-          <w:color w:val="92D050"/>
-        </w:rPr>
-        <w:t>user_need</w:t>
-      </w:r>
-      <w:proofErr w:type="spellEnd"/>
-      <w:r>
-        <w:rPr>
-          <w:color w:val="92D050"/>
-        </w:rPr>
-        <w:t xml:space="preserve"> == 'answer custody or</w:t>
-      </w:r>
-      <w:r>
-        <w:rPr>
-          <w:color w:val="92D050"/>
-        </w:rPr>
-        <w:t xml:space="preserve"> (</w:t>
-      </w:r>
-      <w:proofErr w:type="spellStart"/>
-      <w:r>
-        <w:rPr>
-          <w:color w:val="00B050"/>
-        </w:rPr>
-        <w:t>user_need</w:t>
-      </w:r>
-      <w:proofErr w:type="spellEnd"/>
-      <w:r>
-        <w:rPr>
-          <w:color w:val="00B050"/>
-        </w:rPr>
-        <w:t xml:space="preserve"> == 'answer </w:t>
-      </w:r>
-      <w:r>
-        <w:rPr>
-          <w:color w:val="00B050"/>
-        </w:rPr>
-        <w:t xml:space="preserve">divorce and minor children </w:t>
-      </w:r>
-      <w:r>
-        <w:rPr>
-          <w:color w:val="92D050"/>
-        </w:rPr>
-        <w:t>)</w:t>
-      </w:r>
-      <w:r>
-        <w:rPr>
-          <w:color w:val="FFC000"/>
-        </w:rPr>
-        <w:t>)</w:t>
-      </w:r>
-      <w:r>
-        <w:rPr>
-          <w:color w:val="FFC000"/>
-        </w:rPr>
         <w:t>%}</w:t>
       </w:r>
     </w:p>
@@ -2129,7 +1311,7 @@
         </w:rPr>
         <w:t xml:space="preserve"> [</w:t>
       </w:r>
-      <w:hyperlink r:id="rId7" w:history="1">
+      <w:hyperlink r:id="rId6" w:history="1">
         <w:r>
           <w:rPr>
             <w:rStyle w:val="Hyperlink"/>
@@ -2158,21 +1340,7 @@
         <w:rPr>
           <w:color w:val="FFC000"/>
         </w:rPr>
-        <w:t xml:space="preserve">{%p </w:t>
-      </w:r>
-      <w:proofErr w:type="spellStart"/>
-      <w:r>
-        <w:rPr>
-          <w:color w:val="FFC000"/>
-        </w:rPr>
-        <w:t>endif</w:t>
-      </w:r>
-      <w:proofErr w:type="spellEnd"/>
-      <w:r>
-        <w:rPr>
-          <w:color w:val="FFC000"/>
-        </w:rPr>
-        <w:t xml:space="preserve"> %}</w:t>
+        <w:t>{%p endif %}</w:t>
       </w:r>
     </w:p>
     <w:p>
@@ -2191,7 +1359,7 @@
           <w:rFonts w:eastAsia="Calibri"/>
         </w:rPr>
       </w:pPr>
-      <w:hyperlink r:id="rId8">
+      <w:hyperlink r:id="rId7">
         <w:r>
           <w:rPr>
             <w:rStyle w:val="Hyperlink"/>
@@ -2215,7 +1383,7 @@
           <w:rFonts w:eastAsia="Calibri"/>
         </w:rPr>
       </w:pPr>
-      <w:hyperlink r:id="rId9" w:history="1">
+      <w:hyperlink r:id="rId8" w:history="1">
         <w:r>
           <w:rPr>
             <w:rStyle w:val="Hyperlink"/>
@@ -2242,49 +1410,7 @@
         <w:rPr>
           <w:color w:val="FFC000"/>
         </w:rPr>
-        <w:t xml:space="preserve">{%p if </w:t>
-      </w:r>
-      <w:proofErr w:type="spellStart"/>
-      <w:r>
-        <w:rPr>
-          <w:color w:val="FFC000"/>
-        </w:rPr>
-        <w:t>user_need</w:t>
-      </w:r>
-      <w:proofErr w:type="spellEnd"/>
-      <w:r>
-        <w:rPr>
-          <w:color w:val="FFC000"/>
-        </w:rPr>
-        <w:t xml:space="preserve"> in ('answer custody', 'answer divorce') and </w:t>
-      </w:r>
-      <w:proofErr w:type="spellStart"/>
-      <w:r>
-        <w:rPr>
-          <w:color w:val="FFC000"/>
-        </w:rPr>
-        <w:t>type_of_response.any_</w:t>
-      </w:r>
-      <w:proofErr w:type="gramStart"/>
-      <w:r>
-        <w:rPr>
-          <w:color w:val="FFC000"/>
-        </w:rPr>
-        <w:t>true</w:t>
-      </w:r>
-      <w:proofErr w:type="spellEnd"/>
-      <w:r>
-        <w:rPr>
-          <w:color w:val="FFC000"/>
-        </w:rPr>
-        <w:t>(</w:t>
-      </w:r>
-      <w:proofErr w:type="gramEnd"/>
-      <w:r>
-        <w:rPr>
-          <w:color w:val="FFC000"/>
-        </w:rPr>
-        <w:t>) %}</w:t>
+        <w:t>{%p if user_need in ('answer custody', 'answer divorce') and type_of_response.any_true() %}</w:t>
       </w:r>
     </w:p>
     <w:p>
@@ -2454,7 +1580,7 @@
       <w:r>
         <w:t xml:space="preserve"> </w:t>
       </w:r>
-      <w:hyperlink r:id="rId10">
+      <w:hyperlink r:id="rId9">
         <w:r>
           <w:rPr>
             <w:rStyle w:val="Hyperlink"/>
@@ -2465,7 +1591,7 @@
       <w:r>
         <w:t xml:space="preserve"> | </w:t>
       </w:r>
-      <w:hyperlink r:id="rId11">
+      <w:hyperlink r:id="rId10">
         <w:r>
           <w:rPr>
             <w:rStyle w:val="Hyperlink"/>
@@ -2496,19 +1622,11 @@
         </w:rPr>
         <w:t xml:space="preserve">{%p </w:t>
       </w:r>
-      <w:proofErr w:type="spellStart"/>
       <w:r>
         <w:rPr>
           <w:color w:val="FFC000"/>
         </w:rPr>
-        <w:t>endif</w:t>
-      </w:r>
-      <w:proofErr w:type="spellEnd"/>
-      <w:r>
-        <w:rPr>
-          <w:color w:val="FFC000"/>
-        </w:rPr>
-        <w:t xml:space="preserve"> %}</w:t>
+        <w:t>endif %}</w:t>
       </w:r>
     </w:p>
     <w:p>
@@ -2526,7 +1644,7 @@
       <w:r>
         <w:t xml:space="preserve">The </w:t>
       </w:r>
-      <w:hyperlink r:id="rId12">
+      <w:hyperlink r:id="rId11">
         <w:r>
           <w:rPr>
             <w:rStyle w:val="Hyperlink"/>
@@ -2565,55 +1683,27 @@
         <w:rPr>
           <w:color w:val="92D050"/>
         </w:rPr>
-        <w:t xml:space="preserve">{% </w:t>
-      </w:r>
-      <w:proofErr w:type="spellStart"/>
-      <w:r>
-        <w:rPr>
-          <w:color w:val="92D050"/>
-        </w:rPr>
-        <w:t>endif</w:t>
-      </w:r>
-      <w:proofErr w:type="spellEnd"/>
-      <w:r>
-        <w:rPr>
-          <w:color w:val="92D050"/>
-        </w:rPr>
-        <w:t xml:space="preserve"> %}</w:t>
+        <w:t>{% endif %}</w:t>
       </w:r>
       <w:r>
         <w:rPr>
           <w:color w:val="FFC000"/>
         </w:rPr>
-        <w:t xml:space="preserve">{% elif </w:t>
-      </w:r>
-      <w:proofErr w:type="spellStart"/>
+        <w:t>{% elif user_need in('custody', 'answer custody', 'change AK order') %}</w:t>
+      </w:r>
+      <w:r>
+        <w:t>parenting</w:t>
+      </w:r>
       <w:r>
         <w:rPr>
           <w:color w:val="FFC000"/>
         </w:rPr>
-        <w:t>user_need</w:t>
-      </w:r>
-      <w:proofErr w:type="spellEnd"/>
-      <w:r>
-        <w:rPr>
-          <w:color w:val="FFC000"/>
-        </w:rPr>
-        <w:t xml:space="preserve"> in('custody', 'answer custody', 'change AK order') %}</w:t>
-      </w:r>
-      <w:r>
-        <w:t>parenting</w:t>
-      </w:r>
-      <w:r>
-        <w:rPr>
-          <w:color w:val="FFC000"/>
-        </w:rPr>
         <w:t>{% endif %}</w:t>
       </w:r>
       <w:r>
         <w:t xml:space="preserve"> issues themselves. The judge does not get involved in making the decisions. Learn more about the Association on </w:t>
       </w:r>
-      <w:hyperlink r:id="rId13" w:history="1">
+      <w:hyperlink r:id="rId12" w:history="1">
         <w:r>
           <w:rPr>
             <w:rStyle w:val="Hyperlink"/>
@@ -2633,91 +1723,7 @@
         <w:rPr>
           <w:color w:val="FFC000"/>
         </w:rPr>
-        <w:t>{%p if (</w:t>
-      </w:r>
-      <w:proofErr w:type="spellStart"/>
-      <w:r>
-        <w:rPr>
-          <w:color w:val="FFC000"/>
-        </w:rPr>
-        <w:t>user_need</w:t>
-      </w:r>
-      <w:proofErr w:type="spellEnd"/>
-      <w:r>
-        <w:rPr>
-          <w:color w:val="FFC000"/>
-        </w:rPr>
-        <w:t xml:space="preserve"> == '</w:t>
-      </w:r>
-      <w:proofErr w:type="spellStart"/>
-      <w:r>
-        <w:rPr>
-          <w:color w:val="FFC000"/>
-        </w:rPr>
-        <w:t>answer_custody</w:t>
-      </w:r>
-      <w:proofErr w:type="spellEnd"/>
-      <w:r>
-        <w:rPr>
-          <w:color w:val="FFC000"/>
-        </w:rPr>
-        <w:t xml:space="preserve">' and </w:t>
-      </w:r>
-      <w:proofErr w:type="spellStart"/>
-      <w:r>
-        <w:rPr>
-          <w:color w:val="FFC000"/>
-        </w:rPr>
-        <w:t>type_of_response.all_false</w:t>
-      </w:r>
-      <w:proofErr w:type="spellEnd"/>
-      <w:r>
-        <w:rPr>
-          <w:color w:val="FFC000"/>
-        </w:rPr>
-        <w:t xml:space="preserve">() and not </w:t>
-      </w:r>
-      <w:proofErr w:type="spellStart"/>
-      <w:r>
-        <w:rPr>
-          <w:color w:val="FFC000"/>
-        </w:rPr>
-        <w:t>agreement_documents</w:t>
-      </w:r>
-      <w:proofErr w:type="spellEnd"/>
-      <w:r>
-        <w:rPr>
-          <w:color w:val="FFC000"/>
-        </w:rPr>
-        <w:t>) or (</w:t>
-      </w:r>
-      <w:proofErr w:type="spellStart"/>
-      <w:r>
-        <w:rPr>
-          <w:color w:val="FFC000"/>
-        </w:rPr>
-        <w:t>user_need</w:t>
-      </w:r>
-      <w:proofErr w:type="spellEnd"/>
-      <w:r>
-        <w:rPr>
-          <w:color w:val="FFC000"/>
-        </w:rPr>
-        <w:t xml:space="preserve"> == 'answer divorce' and </w:t>
-      </w:r>
-      <w:proofErr w:type="spellStart"/>
-      <w:r>
-        <w:rPr>
-          <w:color w:val="FFC000"/>
-        </w:rPr>
-        <w:t>type_of_response.all_false</w:t>
-      </w:r>
-      <w:proofErr w:type="spellEnd"/>
-      <w:r>
-        <w:rPr>
-          <w:color w:val="FFC000"/>
-        </w:rPr>
-        <w:t>)%}</w:t>
+        <w:t>{%p if (user_need == 'answer_custody' and type_of_response.all_false() and not agreement_documents) or (user_need == 'answer divorce' and type_of_response.all_false)%}</w:t>
       </w:r>
     </w:p>
     <w:p>
@@ -2743,37 +1749,16 @@
         <w:rPr>
           <w:color w:val="92D050"/>
         </w:rPr>
-        <w:t>{% if user_need == 'answer custody' %</w:t>
-      </w:r>
-      <w:proofErr w:type="gramStart"/>
-      <w:r>
-        <w:rPr>
-          <w:color w:val="92D050"/>
-        </w:rPr>
-        <w:t>}</w:t>
-      </w:r>
-      <w:proofErr w:type="gramEnd"/>
-      <w:r>
-        <w:fldChar w:fldCharType="begin"/>
-      </w:r>
-      <w:r>
-        <w:instrText xml:space="preserve"> HYPERLINK "https://courtguide.akcourts.gov/start/AskingForChildCustody" \h </w:instrText>
-      </w:r>
-      <w:r>
-        <w:fldChar w:fldCharType="separate"/>
-      </w:r>
-      <w:r>
-        <w:rPr>
-          <w:rStyle w:val="Hyperlink"/>
-        </w:rPr>
-        <w:t>Starting a Custody Case</w:t>
-      </w:r>
-      <w:r>
-        <w:rPr>
-          <w:rStyle w:val="Hyperlink"/>
-        </w:rPr>
-        <w:fldChar w:fldCharType="end"/>
-      </w:r>
+        <w:t>{% if user_need == 'answer custody' %}</w:t>
+      </w:r>
+      <w:hyperlink r:id="rId13">
+        <w:r>
+          <w:rPr>
+            <w:rStyle w:val="Hyperlink"/>
+          </w:rPr>
+          <w:t>Starting a Custody Case</w:t>
+        </w:r>
+      </w:hyperlink>
       <w:r>
         <w:rPr>
           <w:rStyle w:val="Hyperlink"/>
@@ -2781,19 +1766,11 @@
         </w:rPr>
         <w:t xml:space="preserve">.{% elif </w:t>
       </w:r>
-      <w:proofErr w:type="spellStart"/>
       <w:r>
         <w:rPr>
           <w:color w:val="92D050"/>
         </w:rPr>
-        <w:t>user_need</w:t>
-      </w:r>
-      <w:proofErr w:type="spellEnd"/>
-      <w:r>
-        <w:rPr>
-          <w:color w:val="92D050"/>
-        </w:rPr>
-        <w:t xml:space="preserve"> == 'answer divorce' </w:t>
+        <w:t xml:space="preserve">user_need == 'answer divorce' </w:t>
       </w:r>
       <w:r>
         <w:rPr>
@@ -2838,21 +1815,7 @@
         <w:rPr>
           <w:color w:val="FFC000"/>
         </w:rPr>
-        <w:t xml:space="preserve">{%p </w:t>
-      </w:r>
-      <w:proofErr w:type="spellStart"/>
-      <w:r>
-        <w:rPr>
-          <w:color w:val="FFC000"/>
-        </w:rPr>
-        <w:t>endif</w:t>
-      </w:r>
-      <w:proofErr w:type="spellEnd"/>
-      <w:r>
-        <w:rPr>
-          <w:color w:val="FFC000"/>
-        </w:rPr>
-        <w:t xml:space="preserve"> %}</w:t>
+        <w:t>{%p endif %}</w:t>
       </w:r>
     </w:p>
     <w:p>
@@ -2921,32 +1884,7 @@
             <w:rStyle w:val="Hyperlink"/>
             <w:spacing w:val="0"/>
           </w:rPr>
-          <w:t>youtube.com/</w:t>
-        </w:r>
-        <w:proofErr w:type="spellStart"/>
-        <w:r>
-          <w:rPr>
-            <w:rStyle w:val="Hyperlink"/>
-            <w:spacing w:val="0"/>
-          </w:rPr>
-          <w:t>watch</w:t>
-        </w:r>
-        <w:proofErr w:type="gramStart"/>
-        <w:r>
-          <w:rPr>
-            <w:rStyle w:val="Hyperlink"/>
-            <w:spacing w:val="0"/>
-          </w:rPr>
-          <w:t>?v</w:t>
-        </w:r>
-        <w:proofErr w:type="spellEnd"/>
-        <w:proofErr w:type="gramEnd"/>
-        <w:r>
-          <w:rPr>
-            <w:rStyle w:val="Hyperlink"/>
-            <w:spacing w:val="0"/>
-          </w:rPr>
-          <w:t>=4EuW9HET3nM</w:t>
+          <w:t>youtube.com/watch?v=4EuW9HET3nM</w:t>
         </w:r>
       </w:hyperlink>
     </w:p>
@@ -2969,67 +1907,23 @@
         </w:rPr>
         <w:t>(</w:t>
       </w:r>
-      <w:proofErr w:type="spellStart"/>
       <w:r>
         <w:rPr>
           <w:color w:val="92D050"/>
         </w:rPr>
-        <w:t>user_need</w:t>
-      </w:r>
-      <w:proofErr w:type="spellEnd"/>
-      <w:r>
-        <w:rPr>
-          <w:color w:val="92D050"/>
-        </w:rPr>
-        <w:t xml:space="preserve"> == 'answer divorce' and </w:t>
-      </w:r>
-      <w:proofErr w:type="spellStart"/>
-      <w:r>
-        <w:rPr>
-          <w:color w:val="92D050"/>
-        </w:rPr>
-        <w:t>minor_children</w:t>
-      </w:r>
-      <w:proofErr w:type="spellEnd"/>
+        <w:t>user_need == 'answer divorce' and minor_children</w:t>
+      </w:r>
       <w:r>
         <w:rPr>
           <w:color w:val="FFC000"/>
         </w:rPr>
-        <w:t xml:space="preserve">) or </w:t>
-      </w:r>
-      <w:proofErr w:type="spellStart"/>
-      <w:r>
-        <w:rPr>
-          <w:color w:val="FFC000"/>
-        </w:rPr>
-        <w:t>user_need</w:t>
-      </w:r>
-      <w:proofErr w:type="spellEnd"/>
-      <w:r>
-        <w:rPr>
-          <w:color w:val="FFC000"/>
-        </w:rPr>
-        <w:t xml:space="preserve"> == 'answer custody'</w:t>
+        <w:t>) or user_need == 'answer custody'</w:t>
       </w:r>
       <w:r>
         <w:rPr>
           <w:color w:val="FF0000"/>
         </w:rPr>
-        <w:t xml:space="preserve">) and </w:t>
-      </w:r>
-      <w:proofErr w:type="spellStart"/>
-      <w:r>
-        <w:rPr>
-          <w:color w:val="FF0000"/>
-        </w:rPr>
-        <w:t>type_of_response.any_true</w:t>
-      </w:r>
-      <w:proofErr w:type="spellEnd"/>
-      <w:r>
-        <w:rPr>
-          <w:color w:val="FF0000"/>
-        </w:rPr>
-        <w:t>() %}</w:t>
+        <w:t>) and type_of_response.any_true() %}</w:t>
       </w:r>
     </w:p>
     <w:p>
@@ -3095,21 +1989,7 @@
         <w:rPr>
           <w:color w:val="FF0000"/>
         </w:rPr>
-        <w:t xml:space="preserve">{%p </w:t>
-      </w:r>
-      <w:proofErr w:type="spellStart"/>
-      <w:r>
-        <w:rPr>
-          <w:color w:val="FF0000"/>
-        </w:rPr>
-        <w:t>endif</w:t>
-      </w:r>
-      <w:proofErr w:type="spellEnd"/>
-      <w:r>
-        <w:rPr>
-          <w:color w:val="FF0000"/>
-        </w:rPr>
-        <w:t xml:space="preserve"> %}</w:t>
+        <w:t>{%p endif %}</w:t>
       </w:r>
     </w:p>
     <w:p>
@@ -3136,53 +2016,24 @@
         </w:rPr>
         <w:br/>
       </w:r>
+      <w:hyperlink r:id="rId22" w:history="1">
+        <w:r>
+          <w:rPr>
+            <w:rStyle w:val="Hyperlink"/>
+            <w:rFonts w:ascii="Arial" w:eastAsia="Calibri" w:hAnsi="Arial" w:cs="Arial"/>
+            <w:spacing w:val="0"/>
+            <w:sz w:val="22"/>
+            <w:szCs w:val="22"/>
+          </w:rPr>
+          <w:t>ak-courts.info/med</w:t>
+        </w:r>
+      </w:hyperlink>
       <w:r>
         <w:rPr>
           <w:rFonts w:eastAsia="Calibri"/>
         </w:rPr>
-        <w:fldChar w:fldCharType="begin"/>
-      </w:r>
-      <w:r>
-        <w:rPr>
-          <w:rFonts w:eastAsia="Calibri"/>
-        </w:rPr>
-        <w:instrText xml:space="preserve"> HYPERLINK "https://ak-courts.info/med" </w:instrText>
-      </w:r>
-      <w:r>
-        <w:rPr>
-          <w:rFonts w:eastAsia="Calibri"/>
-        </w:rPr>
-      </w:r>
-      <w:r>
-        <w:rPr>
-          <w:rFonts w:eastAsia="Calibri"/>
-        </w:rPr>
-        <w:fldChar w:fldCharType="separate"/>
-      </w:r>
-      <w:r>
-        <w:rPr>
-          <w:rStyle w:val="Hyperlink"/>
-          <w:rFonts w:ascii="Arial" w:eastAsia="Calibri" w:hAnsi="Arial" w:cs="Arial"/>
-          <w:spacing w:val="0"/>
-          <w:sz w:val="22"/>
-          <w:szCs w:val="22"/>
-        </w:rPr>
-        <w:t>ak-courts.info/med</w:t>
-      </w:r>
-      <w:r>
-        <w:rPr>
-          <w:rFonts w:eastAsia="Calibri"/>
-        </w:rPr>
-        <w:fldChar w:fldCharType="end"/>
-      </w:r>
-      <w:r>
-        <w:rPr>
-          <w:rFonts w:eastAsia="Calibri"/>
-        </w:rPr>
         <w:t>.</w:t>
       </w:r>
-      <w:bookmarkStart w:id="0" w:name="_GoBack"/>
-      <w:bookmarkEnd w:id="0"/>
     </w:p>
     <w:p>
       <w:pPr>
@@ -3193,7 +2044,7 @@
           <w:b/>
         </w:rPr>
       </w:pPr>
-      <w:hyperlink r:id="rId22">
+      <w:hyperlink r:id="rId23">
         <w:r>
           <w:rPr>
             <w:rStyle w:val="Hyperlink"/>
@@ -3208,7 +2059,7 @@
         </w:rPr>
         <w:br/>
       </w:r>
-      <w:hyperlink r:id="rId23" w:history="1">
+      <w:hyperlink r:id="rId24" w:history="1">
         <w:r>
           <w:rPr>
             <w:rStyle w:val="Hyperlink"/>
@@ -3233,23 +2084,7 @@
           <w:rFonts w:eastAsia="Calibri"/>
           <w:color w:val="FF0000"/>
         </w:rPr>
-        <w:t xml:space="preserve">{%p if not </w:t>
-      </w:r>
-      <w:proofErr w:type="spellStart"/>
-      <w:r>
-        <w:rPr>
-          <w:rFonts w:eastAsia="Calibri"/>
-          <w:color w:val="FF0000"/>
-        </w:rPr>
-        <w:t>type_of_response.all_false</w:t>
-      </w:r>
-      <w:proofErr w:type="spellEnd"/>
-      <w:r>
-        <w:rPr>
-          <w:rFonts w:eastAsia="Calibri"/>
-          <w:color w:val="FF0000"/>
-        </w:rPr>
-        <w:t>() %}</w:t>
+        <w:t>{%p if not type_of_response.all_false() %}</w:t>
       </w:r>
     </w:p>
     <w:p>
@@ -3286,7 +2121,7 @@
         </w:rPr>
         <w:t xml:space="preserve"> </w:t>
       </w:r>
-      <w:hyperlink r:id="rId24">
+      <w:hyperlink r:id="rId25">
         <w:r>
           <w:rPr>
             <w:rStyle w:val="Hyperlink"/>
@@ -3296,21 +2131,13 @@
       </w:hyperlink>
       <w:r>
         <w:br/>
-        <w:t>courts.alaska.gov/</w:t>
-      </w:r>
-      <w:proofErr w:type="spellStart"/>
-      <w:r>
-        <w:t>shc</w:t>
-      </w:r>
-      <w:proofErr w:type="spellEnd"/>
-      <w:r>
-        <w:t>/family/docs/shc-1062.doc</w:t>
+        <w:t>courts.alaska.gov/shc/family/docs/shc-1062.doc</w:t>
       </w:r>
       <w:r>
         <w:br/>
         <w:t xml:space="preserve">as a </w:t>
       </w:r>
-      <w:hyperlink r:id="rId25">
+      <w:hyperlink r:id="rId26">
         <w:r>
           <w:rPr>
             <w:rStyle w:val="Hyperlink"/>
@@ -3320,15 +2147,7 @@
       </w:hyperlink>
       <w:r>
         <w:br/>
-        <w:t>courts.alaska.gov/</w:t>
-      </w:r>
-      <w:proofErr w:type="spellStart"/>
-      <w:r>
-        <w:t>shc</w:t>
-      </w:r>
-      <w:proofErr w:type="spellEnd"/>
-      <w:r>
-        <w:t>/family/docs/shc-1062n.pdf</w:t>
+        <w:t>courts.alaska.gov/shc/family/docs/shc-1062n.pdf</w:t>
       </w:r>
     </w:p>
     <w:p>
@@ -3344,116 +2163,57 @@
           <w:rFonts w:eastAsia="Calibri"/>
           <w:color w:val="FF0000"/>
         </w:rPr>
-        <w:t xml:space="preserve">{%p </w:t>
-      </w:r>
-      <w:proofErr w:type="spellStart"/>
+        <w:t>{%p endif %}</w:t>
+      </w:r>
+      <w:r>
+        <w:rPr>
+          <w:rFonts w:eastAsia="Calibri"/>
+          <w:b/>
+        </w:rPr>
+        <w:t xml:space="preserve"> </w:t>
+      </w:r>
+    </w:p>
+    <w:p>
+      <w:pPr>
+        <w:pStyle w:val="Body"/>
+        <w:rPr>
+          <w:rFonts w:eastAsia="Calibri"/>
+        </w:rPr>
+      </w:pPr>
       <w:r>
         <w:rPr>
           <w:rFonts w:eastAsia="Calibri"/>
           <w:color w:val="FF0000"/>
         </w:rPr>
-        <w:t>endif</w:t>
-      </w:r>
-      <w:proofErr w:type="spellEnd"/>
-      <w:r>
-        <w:rPr>
-          <w:rFonts w:eastAsia="Calibri"/>
-          <w:color w:val="FF0000"/>
-        </w:rPr>
-        <w:t xml:space="preserve"> %}</w:t>
-      </w:r>
-      <w:r>
-        <w:rPr>
-          <w:rFonts w:eastAsia="Calibri"/>
-          <w:b/>
-        </w:rPr>
-        <w:t xml:space="preserve"> </w:t>
-      </w:r>
-    </w:p>
-    <w:p>
-      <w:pPr>
-        <w:pStyle w:val="Body"/>
-        <w:rPr>
-          <w:rFonts w:eastAsia="Calibri"/>
-        </w:rPr>
-      </w:pPr>
-      <w:r>
-        <w:rPr>
-          <w:rFonts w:eastAsia="Calibri"/>
-          <w:color w:val="FF0000"/>
-        </w:rPr>
         <w:t xml:space="preserve">{%p if </w:t>
       </w:r>
-      <w:proofErr w:type="spellStart"/>
       <w:r>
         <w:rPr>
           <w:rFonts w:eastAsia="Calibri"/>
           <w:color w:val="FF0000"/>
           <w:u w:val="single"/>
         </w:rPr>
-        <w:t>user_need</w:t>
-      </w:r>
-      <w:proofErr w:type="spellEnd"/>
+        <w:t>user_need == 'answer custody' and t</w:t>
+      </w:r>
       <w:r>
         <w:rPr>
           <w:rFonts w:eastAsia="Calibri"/>
           <w:color w:val="FF0000"/>
-          <w:u w:val="single"/>
-        </w:rPr>
-        <w:t xml:space="preserve"> == 'answer custody' and </w:t>
-      </w:r>
-      <w:proofErr w:type="spellStart"/>
+        </w:rPr>
+        <w:t xml:space="preserve">ype_of_response.all_false() </w:t>
+      </w:r>
       <w:r>
         <w:rPr>
           <w:rFonts w:eastAsia="Calibri"/>
           <w:color w:val="FF0000"/>
-          <w:u w:val="single"/>
-        </w:rPr>
-        <w:t>t</w:t>
+        </w:rPr>
+        <w:t xml:space="preserve">and not agreement_documents </w:t>
       </w:r>
       <w:r>
         <w:rPr>
           <w:rFonts w:eastAsia="Calibri"/>
           <w:color w:val="FF0000"/>
         </w:rPr>
-        <w:t>ype_of_response.all_false</w:t>
-      </w:r>
-      <w:proofErr w:type="spellEnd"/>
-      <w:r>
-        <w:rPr>
-          <w:rFonts w:eastAsia="Calibri"/>
-          <w:color w:val="FF0000"/>
-        </w:rPr>
-        <w:t xml:space="preserve">() </w:t>
-      </w:r>
-      <w:r>
-        <w:rPr>
-          <w:rFonts w:eastAsia="Calibri"/>
-          <w:color w:val="FF0000"/>
-        </w:rPr>
-        <w:t xml:space="preserve">and not </w:t>
-      </w:r>
-      <w:proofErr w:type="spellStart"/>
-      <w:r>
-        <w:rPr>
-          <w:rFonts w:eastAsia="Calibri"/>
-          <w:color w:val="FF0000"/>
-        </w:rPr>
-        <w:t>agreement_documents</w:t>
-      </w:r>
-      <w:proofErr w:type="spellEnd"/>
-      <w:r>
-        <w:rPr>
-          <w:rFonts w:eastAsia="Calibri"/>
-          <w:color w:val="FF0000"/>
-        </w:rPr>
-        <w:t xml:space="preserve"> </w:t>
-      </w:r>
-      <w:r>
-        <w:rPr>
-          <w:rFonts w:eastAsia="Calibri"/>
-          <w:color w:val="FF0000"/>
-        </w:rPr>
         <w:t>%}</w:t>
       </w:r>
     </w:p>
@@ -3461,7 +2221,7 @@
       <w:pPr>
         <w:pStyle w:val="Body"/>
       </w:pPr>
-      <w:hyperlink r:id="rId26" w:history="1">
+      <w:hyperlink r:id="rId27" w:history="1">
         <w:r>
           <w:rPr>
             <w:rStyle w:val="Hyperlink"/>
@@ -3473,7 +2233,7 @@
       <w:r>
         <w:br/>
       </w:r>
-      <w:hyperlink r:id="rId27" w:history="1">
+      <w:hyperlink r:id="rId28" w:history="1">
         <w:r>
           <w:rPr>
             <w:rStyle w:val="Hyperlink"/>
@@ -3492,17 +2252,8 @@
             <w:rStyle w:val="Hyperlink"/>
             <w:spacing w:val="0"/>
           </w:rPr>
-          <w:t>.akcourts.gov/start/</w:t>
+          <w:t>.akcourts.gov/start/AskingForChildCustody</w:t>
         </w:r>
-        <w:proofErr w:type="spellStart"/>
-        <w:r>
-          <w:rPr>
-            <w:rStyle w:val="Hyperlink"/>
-            <w:spacing w:val="0"/>
-          </w:rPr>
-          <w:t>AskingForChildCustody</w:t>
-        </w:r>
-        <w:proofErr w:type="spellEnd"/>
       </w:hyperlink>
     </w:p>
     <w:p>
@@ -3519,54 +2270,27 @@
         </w:rPr>
         <w:t xml:space="preserve">{%p elif </w:t>
       </w:r>
-      <w:proofErr w:type="spellStart"/>
       <w:r>
         <w:rPr>
           <w:rFonts w:eastAsia="Calibri"/>
           <w:color w:val="FF0000"/>
           <w:u w:val="single"/>
         </w:rPr>
-        <w:t>user_need</w:t>
-      </w:r>
-      <w:proofErr w:type="spellEnd"/>
+        <w:t>user_need == 'answer divorce' and t</w:t>
+      </w:r>
       <w:r>
         <w:rPr>
           <w:rFonts w:eastAsia="Calibri"/>
           <w:color w:val="FF0000"/>
-          <w:u w:val="single"/>
-        </w:rPr>
-        <w:t xml:space="preserve"> == 'answer divorce' and </w:t>
-      </w:r>
-      <w:proofErr w:type="spellStart"/>
-      <w:r>
-        <w:rPr>
-          <w:rFonts w:eastAsia="Calibri"/>
-          <w:color w:val="FF0000"/>
-          <w:u w:val="single"/>
-        </w:rPr>
-        <w:t>t</w:t>
-      </w:r>
-      <w:r>
-        <w:rPr>
-          <w:rFonts w:eastAsia="Calibri"/>
-          <w:color w:val="FF0000"/>
-        </w:rPr>
-        <w:t>ype_of_response.all_false</w:t>
-      </w:r>
-      <w:proofErr w:type="spellEnd"/>
-      <w:r>
-        <w:rPr>
-          <w:rFonts w:eastAsia="Calibri"/>
-          <w:color w:val="FF0000"/>
-        </w:rPr>
-        <w:t>() %}</w:t>
+        </w:rPr>
+        <w:t>ype_of_response.all_false() %}</w:t>
       </w:r>
     </w:p>
     <w:p>
       <w:pPr>
         <w:pStyle w:val="Body"/>
       </w:pPr>
-      <w:hyperlink r:id="rId28" w:history="1">
+      <w:hyperlink r:id="rId29" w:history="1">
         <w:r>
           <w:rPr>
             <w:rStyle w:val="Hyperlink"/>
@@ -3578,23 +2302,14 @@
       <w:r>
         <w:br/>
       </w:r>
-      <w:hyperlink r:id="rId29" w:history="1">
+      <w:hyperlink r:id="rId30" w:history="1">
         <w:r>
           <w:rPr>
             <w:rStyle w:val="Hyperlink"/>
             <w:spacing w:val="0"/>
           </w:rPr>
-          <w:t>CourtGuide.akcourts.gov/start/</w:t>
+          <w:t>CourtGuide.akcourts.gov/start/DivorceAndSeparation</w:t>
         </w:r>
-        <w:proofErr w:type="spellStart"/>
-        <w:r>
-          <w:rPr>
-            <w:rStyle w:val="Hyperlink"/>
-            <w:spacing w:val="0"/>
-          </w:rPr>
-          <w:t>DivorceAndSeparation</w:t>
-        </w:r>
-        <w:proofErr w:type="spellEnd"/>
       </w:hyperlink>
     </w:p>
     <w:p>
@@ -3606,23 +2321,7 @@
           <w:rFonts w:eastAsia="Calibri"/>
           <w:color w:val="FF0000"/>
         </w:rPr>
-        <w:t xml:space="preserve">{%p </w:t>
-      </w:r>
-      <w:proofErr w:type="spellStart"/>
-      <w:r>
-        <w:rPr>
-          <w:rFonts w:eastAsia="Calibri"/>
-          <w:color w:val="FF0000"/>
-        </w:rPr>
-        <w:t>endif</w:t>
-      </w:r>
-      <w:proofErr w:type="spellEnd"/>
-      <w:r>
-        <w:rPr>
-          <w:rFonts w:eastAsia="Calibri"/>
-          <w:color w:val="FF0000"/>
-        </w:rPr>
-        <w:t xml:space="preserve"> %}</w:t>
+        <w:t>{%p endif %}</w:t>
       </w:r>
     </w:p>
     <w:p>
@@ -3630,7 +2329,7 @@
         <w:pStyle w:val="BodyText"/>
         <w:spacing w:before="280" w:after="280"/>
       </w:pPr>
-      <w:hyperlink r:id="rId30">
+      <w:hyperlink r:id="rId31">
         <w:r>
           <w:rPr>
             <w:rStyle w:val="Hyperlink"/>
@@ -3641,7 +2340,7 @@
       <w:r>
         <w:br/>
       </w:r>
-      <w:hyperlink r:id="rId31" w:history="1">
+      <w:hyperlink r:id="rId32" w:history="1">
         <w:r>
           <w:rPr>
             <w:rStyle w:val="Hyperlink"/>
@@ -3661,30 +2360,9 @@
 </w:document>
 </file>
 
-<file path=word/commentsExtended.xml><?xml version="1.0" encoding="utf-8"?>
-<w15:commentsEx xmlns:wpc="http://schemas.microsoft.com/office/word/2010/wordprocessingCanvas" xmlns:cx="http://schemas.microsoft.com/office/drawing/2014/chartex" xmlns:cx1="http://schemas.microsoft.com/office/drawing/2015/9/8/chartex" xmlns:cx2="http://schemas.microsoft.com/office/drawing/2015/10/21/chartex" xmlns:cx3="http://schemas.microsoft.com/office/drawing/2016/5/9/chartex" xmlns:cx4="http://schemas.microsoft.com/office/drawing/2016/5/10/chartex" xmlns:cx5="http://schemas.microsoft.com/office/drawing/2016/5/11/chartex" xmlns:cx6="http://schemas.microsoft.com/office/drawing/2016/5/12/chartex" xmlns:cx7="http://schemas.microsoft.com/office/drawing/2016/5/13/chartex" xmlns:cx8="http://schemas.microsoft.com/office/drawing/2016/5/14/chartex" xmlns:mc="http://schemas.openxmlformats.org/markup-compatibility/2006" xmlns:aink="http://schemas.microsoft.com/office/drawing/2016/ink" xmlns:am3d="http://schemas.microsoft.com/office/drawing/2017/model3d" xmlns:o="urn:schemas-microsoft-com:office:office" xmlns:r="http://schemas.openxmlformats.org/officeDocument/2006/relationships" xmlns:m="http://schemas.openxmlformats.org/officeDocument/2006/math" xmlns:v="urn:schemas-microsoft-com:vml" xmlns:wp14="http://schemas.microsoft.com/office/word/2010/wordprocessingDrawing" xmlns:wp="http://schemas.openxmlformats.org/drawingml/2006/wordprocessingDrawing" xmlns:w10="urn:schemas-microsoft-com:office:word" xmlns:w="http://schemas.openxmlformats.org/wordprocessingml/2006/main" xmlns:w14="http://schemas.microsoft.com/office/word/2010/wordml" xmlns:w15="http://schemas.microsoft.com/office/word/2012/wordml" xmlns:w16cex="http://schemas.microsoft.com/office/word/2018/wordml/cex" xmlns:w16cid="http://schemas.microsoft.com/office/word/2016/wordml/cid" xmlns:w16="http://schemas.microsoft.com/office/word/2018/wordml" xmlns:w16sdtdh="http://schemas.microsoft.com/office/word/2020/wordml/sdtdatahash" xmlns:w16se="http://schemas.microsoft.com/office/word/2015/wordml/symex" xmlns:wpg="http://schemas.microsoft.com/office/word/2010/wordprocessingGroup" xmlns:wpi="http://schemas.microsoft.com/office/word/2010/wordprocessingInk" xmlns:wne="http://schemas.microsoft.com/office/word/2006/wordml" xmlns:wps="http://schemas.microsoft.com/office/word/2010/wordprocessingShape" mc:Ignorable="w14 w15 w16se w16cid w16 w16cex w16sdtdh wp14">
-  <w15:commentEx w15:paraId="34B215C8" w15:done="0"/>
-  <w15:commentEx w15:paraId="7A27CDF3" w15:done="0"/>
-</w15:commentsEx>
-</file>
-
-<file path=word/commentsExtensible.xml><?xml version="1.0" encoding="utf-8"?>
-<w16cex:commentsExtensible xmlns:wpc="http://schemas.microsoft.com/office/word/2010/wordprocessingCanvas" xmlns:cx="http://schemas.microsoft.com/office/drawing/2014/chartex" xmlns:cx1="http://schemas.microsoft.com/office/drawing/2015/9/8/chartex" xmlns:cx2="http://schemas.microsoft.com/office/drawing/2015/10/21/chartex" xmlns:cx3="http://schemas.microsoft.com/office/drawing/2016/5/9/chartex" xmlns:cx4="http://schemas.microsoft.com/office/drawing/2016/5/10/chartex" xmlns:cx5="http://schemas.microsoft.com/office/drawing/2016/5/11/chartex" xmlns:cx6="http://schemas.microsoft.com/office/drawing/2016/5/12/chartex" xmlns:cx7="http://schemas.microsoft.com/office/drawing/2016/5/13/chartex" xmlns:cx8="http://schemas.microsoft.com/office/drawing/2016/5/14/chartex" xmlns:mc="http://schemas.openxmlformats.org/markup-compatibility/2006" xmlns:aink="http://schemas.microsoft.com/office/drawing/2016/ink" xmlns:am3d="http://schemas.microsoft.com/office/drawing/2017/model3d" xmlns:o="urn:schemas-microsoft-com:office:office" xmlns:r="http://schemas.openxmlformats.org/officeDocument/2006/relationships" xmlns:m="http://schemas.openxmlformats.org/officeDocument/2006/math" xmlns:v="urn:schemas-microsoft-com:vml" xmlns:wp14="http://schemas.microsoft.com/office/word/2010/wordprocessingDrawing" xmlns:wp="http://schemas.openxmlformats.org/drawingml/2006/wordprocessingDrawing" xmlns:w10="urn:schemas-microsoft-com:office:word" xmlns:w="http://schemas.openxmlformats.org/wordprocessingml/2006/main" xmlns:w14="http://schemas.microsoft.com/office/word/2010/wordml" xmlns:w15="http://schemas.microsoft.com/office/word/2012/wordml" xmlns:w16cex="http://schemas.microsoft.com/office/word/2018/wordml/cex" xmlns:w16cid="http://schemas.microsoft.com/office/word/2016/wordml/cid" xmlns:w16="http://schemas.microsoft.com/office/word/2018/wordml" xmlns:w16sdtdh="http://schemas.microsoft.com/office/word/2020/wordml/sdtdatahash" xmlns:w16se="http://schemas.microsoft.com/office/word/2015/wordml/symex" xmlns:wpg="http://schemas.microsoft.com/office/word/2010/wordprocessingGroup" xmlns:wpi="http://schemas.microsoft.com/office/word/2010/wordprocessingInk" xmlns:wne="http://schemas.microsoft.com/office/word/2006/wordml" xmlns:wps="http://schemas.microsoft.com/office/word/2010/wordprocessingShape" mc:Ignorable="w14 w15 w16se w16cid w16 w16cex w16sdtdh wp14">
-  <w16cex:commentExtensible w16cex:durableId="2D80574F" w16cex:dateUtc="2026-04-08T12:25:00Z"/>
-  <w16cex:commentExtensible w16cex:durableId="2D806D58" w16cex:dateUtc="2026-04-08T13:59:00Z"/>
-</w16cex:commentsExtensible>
-</file>
-
-<file path=word/commentsIds.xml><?xml version="1.0" encoding="utf-8"?>
-<w16cid:commentsIds xmlns:wpc="http://schemas.microsoft.com/office/word/2010/wordprocessingCanvas" xmlns:cx="http://schemas.microsoft.com/office/drawing/2014/chartex" xmlns:cx1="http://schemas.microsoft.com/office/drawing/2015/9/8/chartex" xmlns:cx2="http://schemas.microsoft.com/office/drawing/2015/10/21/chartex" xmlns:cx3="http://schemas.microsoft.com/office/drawing/2016/5/9/chartex" xmlns:cx4="http://schemas.microsoft.com/office/drawing/2016/5/10/chartex" xmlns:cx5="http://schemas.microsoft.com/office/drawing/2016/5/11/chartex" xmlns:cx6="http://schemas.microsoft.com/office/drawing/2016/5/12/chartex" xmlns:cx7="http://schemas.microsoft.com/office/drawing/2016/5/13/chartex" xmlns:cx8="http://schemas.microsoft.com/office/drawing/2016/5/14/chartex" xmlns:mc="http://schemas.openxmlformats.org/markup-compatibility/2006" xmlns:aink="http://schemas.microsoft.com/office/drawing/2016/ink" xmlns:am3d="http://schemas.microsoft.com/office/drawing/2017/model3d" xmlns:o="urn:schemas-microsoft-com:office:office" xmlns:r="http://schemas.openxmlformats.org/officeDocument/2006/relationships" xmlns:m="http://schemas.openxmlformats.org/officeDocument/2006/math" xmlns:v="urn:schemas-microsoft-com:vml" xmlns:wp14="http://schemas.microsoft.com/office/word/2010/wordprocessingDrawing" xmlns:wp="http://schemas.openxmlformats.org/drawingml/2006/wordprocessingDrawing" xmlns:w10="urn:schemas-microsoft-com:office:word" xmlns:w="http://schemas.openxmlformats.org/wordprocessingml/2006/main" xmlns:w14="http://schemas.microsoft.com/office/word/2010/wordml" xmlns:w15="http://schemas.microsoft.com/office/word/2012/wordml" xmlns:w16cex="http://schemas.microsoft.com/office/word/2018/wordml/cex" xmlns:w16cid="http://schemas.microsoft.com/office/word/2016/wordml/cid" xmlns:w16="http://schemas.microsoft.com/office/word/2018/wordml" xmlns:w16sdtdh="http://schemas.microsoft.com/office/word/2020/wordml/sdtdatahash" xmlns:w16se="http://schemas.microsoft.com/office/word/2015/wordml/symex" xmlns:wpg="http://schemas.microsoft.com/office/word/2010/wordprocessingGroup" xmlns:wpi="http://schemas.microsoft.com/office/word/2010/wordprocessingInk" xmlns:wne="http://schemas.microsoft.com/office/word/2006/wordml" xmlns:wps="http://schemas.microsoft.com/office/word/2010/wordprocessingShape" mc:Ignorable="w14 w15 w16se w16cid w16 w16cex w16sdtdh wp14">
-  <w16cid:commentId w16cid:paraId="34B215C8" w16cid:durableId="2D80574F"/>
-  <w16cid:commentId w16cid:paraId="7A27CDF3" w16cid:durableId="2D806D58"/>
-</w16cid:commentsIds>
-</file>
-
 <file path=word/numbering.xml><?xml version="1.0" encoding="utf-8"?>
-<w:numbering xmlns:wpc="http://schemas.microsoft.com/office/word/2010/wordprocessingCanvas" xmlns:mc="http://schemas.openxmlformats.org/markup-compatibility/2006" xmlns:o="urn:schemas-microsoft-com:office:office" xmlns:r="http://schemas.openxmlformats.org/officeDocument/2006/relationships" xmlns:m="http://schemas.openxmlformats.org/officeDocument/2006/math" xmlns:v="urn:schemas-microsoft-com:vml" xmlns:wp14="http://schemas.microsoft.com/office/word/2010/wordprocessingDrawing" xmlns:wp="http://schemas.openxmlformats.org/drawingml/2006/wordprocessingDrawing" xmlns:w10="urn:schemas-microsoft-com:office:word" xmlns:w="http://schemas.openxmlformats.org/wordprocessingml/2006/main" xmlns:w14="http://schemas.microsoft.com/office/word/2010/wordml" xmlns:wpg="http://schemas.microsoft.com/office/word/2010/wordprocessingGroup" xmlns:wpi="http://schemas.microsoft.com/office/word/2010/wordprocessingInk" xmlns:wne="http://schemas.microsoft.com/office/word/2006/wordml" xmlns:wps="http://schemas.microsoft.com/office/word/2010/wordprocessingShape" mc:Ignorable="w14 wp14">
-  <w:abstractNum w:abstractNumId="0">
+<w:numbering xmlns:wpc="http://schemas.microsoft.com/office/word/2010/wordprocessingCanvas" xmlns:cx="http://schemas.microsoft.com/office/drawing/2014/chartex" xmlns:cx1="http://schemas.microsoft.com/office/drawing/2015/9/8/chartex" xmlns:cx2="http://schemas.microsoft.com/office/drawing/2015/10/21/chartex" xmlns:cx3="http://schemas.microsoft.com/office/drawing/2016/5/9/chartex" xmlns:cx4="http://schemas.microsoft.com/office/drawing/2016/5/10/chartex" xmlns:cx5="http://schemas.microsoft.com/office/drawing/2016/5/11/chartex" xmlns:cx6="http://schemas.microsoft.com/office/drawing/2016/5/12/chartex" xmlns:cx7="http://schemas.microsoft.com/office/drawing/2016/5/13/chartex" xmlns:cx8="http://schemas.microsoft.com/office/drawing/2016/5/14/chartex" xmlns:mc="http://schemas.openxmlformats.org/markup-compatibility/2006" xmlns:aink="http://schemas.microsoft.com/office/drawing/2016/ink" xmlns:am3d="http://schemas.microsoft.com/office/drawing/2017/model3d" xmlns:o="urn:schemas-microsoft-com:office:office" xmlns:r="http://schemas.openxmlformats.org/officeDocument/2006/relationships" xmlns:m="http://schemas.openxmlformats.org/officeDocument/2006/math" xmlns:v="urn:schemas-microsoft-com:vml" xmlns:wp14="http://schemas.microsoft.com/office/word/2010/wordprocessingDrawing" xmlns:wp="http://schemas.openxmlformats.org/drawingml/2006/wordprocessingDrawing" xmlns:w10="urn:schemas-microsoft-com:office:word" xmlns:w="http://schemas.openxmlformats.org/wordprocessingml/2006/main" xmlns:w14="http://schemas.microsoft.com/office/word/2010/wordml" xmlns:w15="http://schemas.microsoft.com/office/word/2012/wordml" xmlns:w16cex="http://schemas.microsoft.com/office/word/2018/wordml/cex" xmlns:w16cid="http://schemas.microsoft.com/office/word/2016/wordml/cid" xmlns:w16="http://schemas.microsoft.com/office/word/2018/wordml" xmlns:w16sdtdh="http://schemas.microsoft.com/office/word/2020/wordml/sdtdatahash" xmlns:w16se="http://schemas.microsoft.com/office/word/2015/wordml/symex" xmlns:wpg="http://schemas.microsoft.com/office/word/2010/wordprocessingGroup" xmlns:wpi="http://schemas.microsoft.com/office/word/2010/wordprocessingInk" xmlns:wne="http://schemas.microsoft.com/office/word/2006/wordml" xmlns:wps="http://schemas.microsoft.com/office/word/2010/wordprocessingShape" mc:Ignorable="w14 w15 w16se w16cid w16 w16cex w16sdtdh wp14">
+  <w:abstractNum w:abstractNumId="0" w15:restartNumberingAfterBreak="0">
     <w:nsid w:val="073E10F3"/>
     <w:multiLevelType w:val="hybridMultilevel"/>
     <w:tmpl w:val="8504561E"/>
@@ -3796,7 +2474,7 @@
       </w:rPr>
     </w:lvl>
   </w:abstractNum>
-  <w:abstractNum w:abstractNumId="1">
+  <w:abstractNum w:abstractNumId="1" w15:restartNumberingAfterBreak="0">
     <w:nsid w:val="08C6366F"/>
     <w:multiLevelType w:val="hybridMultilevel"/>
     <w:tmpl w:val="D3561CAA"/>
@@ -3883,7 +2561,7 @@
       </w:pPr>
     </w:lvl>
   </w:abstractNum>
-  <w:abstractNum w:abstractNumId="2">
+  <w:abstractNum w:abstractNumId="2" w15:restartNumberingAfterBreak="0">
     <w:nsid w:val="09F353E3"/>
     <w:multiLevelType w:val="hybridMultilevel"/>
     <w:tmpl w:val="EE5CFEAC"/>
@@ -3996,7 +2674,7 @@
       </w:rPr>
     </w:lvl>
   </w:abstractNum>
-  <w:abstractNum w:abstractNumId="3">
+  <w:abstractNum w:abstractNumId="3" w15:restartNumberingAfterBreak="0">
     <w:nsid w:val="0C357DD6"/>
     <w:multiLevelType w:val="hybridMultilevel"/>
     <w:tmpl w:val="D83AD7E4"/>
@@ -4087,7 +2765,7 @@
       </w:pPr>
     </w:lvl>
   </w:abstractNum>
-  <w:abstractNum w:abstractNumId="4">
+  <w:abstractNum w:abstractNumId="4" w15:restartNumberingAfterBreak="0">
     <w:nsid w:val="0DEA069D"/>
     <w:multiLevelType w:val="multilevel"/>
     <w:tmpl w:val="450C4EF6"/>
@@ -4228,7 +2906,7 @@
       </w:rPr>
     </w:lvl>
   </w:abstractNum>
-  <w:abstractNum w:abstractNumId="5">
+  <w:abstractNum w:abstractNumId="5" w15:restartNumberingAfterBreak="0">
     <w:nsid w:val="1323523E"/>
     <w:multiLevelType w:val="multilevel"/>
     <w:tmpl w:val="873C83DA"/>
@@ -4385,7 +3063,7 @@
       </w:rPr>
     </w:lvl>
   </w:abstractNum>
-  <w:abstractNum w:abstractNumId="6">
+  <w:abstractNum w:abstractNumId="6" w15:restartNumberingAfterBreak="0">
     <w:nsid w:val="15510218"/>
     <w:multiLevelType w:val="hybridMultilevel"/>
     <w:tmpl w:val="8EF49D20"/>
@@ -4475,7 +3153,7 @@
       </w:pPr>
     </w:lvl>
   </w:abstractNum>
-  <w:abstractNum w:abstractNumId="7">
+  <w:abstractNum w:abstractNumId="7" w15:restartNumberingAfterBreak="0">
     <w:nsid w:val="253D4794"/>
     <w:multiLevelType w:val="multilevel"/>
     <w:tmpl w:val="8C80AB36"/>
@@ -4588,7 +3266,7 @@
       </w:rPr>
     </w:lvl>
   </w:abstractNum>
-  <w:abstractNum w:abstractNumId="8">
+  <w:abstractNum w:abstractNumId="8" w15:restartNumberingAfterBreak="0">
     <w:nsid w:val="27FF20A5"/>
     <w:multiLevelType w:val="hybridMultilevel"/>
     <w:tmpl w:val="9036D3D8"/>
@@ -4703,7 +3381,7 @@
       </w:rPr>
     </w:lvl>
   </w:abstractNum>
-  <w:abstractNum w:abstractNumId="9">
+  <w:abstractNum w:abstractNumId="9" w15:restartNumberingAfterBreak="0">
     <w:nsid w:val="296F3872"/>
     <w:multiLevelType w:val="hybridMultilevel"/>
     <w:tmpl w:val="5E9E6A2E"/>
@@ -4817,7 +3495,7 @@
       </w:rPr>
     </w:lvl>
   </w:abstractNum>
-  <w:abstractNum w:abstractNumId="10">
+  <w:abstractNum w:abstractNumId="10" w15:restartNumberingAfterBreak="0">
     <w:nsid w:val="3BB67316"/>
     <w:multiLevelType w:val="hybridMultilevel"/>
     <w:tmpl w:val="D2A20BEA"/>
@@ -4930,7 +3608,7 @@
       </w:rPr>
     </w:lvl>
   </w:abstractNum>
-  <w:abstractNum w:abstractNumId="11">
+  <w:abstractNum w:abstractNumId="11" w15:restartNumberingAfterBreak="0">
     <w:nsid w:val="416740F3"/>
     <w:multiLevelType w:val="hybridMultilevel"/>
     <w:tmpl w:val="F012AB78"/>
@@ -5043,7 +3721,7 @@
       </w:rPr>
     </w:lvl>
   </w:abstractNum>
-  <w:abstractNum w:abstractNumId="12">
+  <w:abstractNum w:abstractNumId="12" w15:restartNumberingAfterBreak="0">
     <w:nsid w:val="4803540D"/>
     <w:multiLevelType w:val="hybridMultilevel"/>
     <w:tmpl w:val="CC58063A"/>
@@ -5157,7 +3835,7 @@
       </w:rPr>
     </w:lvl>
   </w:abstractNum>
-  <w:abstractNum w:abstractNumId="13">
+  <w:abstractNum w:abstractNumId="13" w15:restartNumberingAfterBreak="0">
     <w:nsid w:val="492F4D8F"/>
     <w:multiLevelType w:val="hybridMultilevel"/>
     <w:tmpl w:val="F62C94DE"/>
@@ -5271,7 +3949,7 @@
       </w:rPr>
     </w:lvl>
   </w:abstractNum>
-  <w:abstractNum w:abstractNumId="14">
+  <w:abstractNum w:abstractNumId="14" w15:restartNumberingAfterBreak="0">
     <w:nsid w:val="527D4778"/>
     <w:multiLevelType w:val="hybridMultilevel"/>
     <w:tmpl w:val="EE8038B2"/>
@@ -5384,7 +4062,7 @@
       </w:rPr>
     </w:lvl>
   </w:abstractNum>
-  <w:abstractNum w:abstractNumId="15">
+  <w:abstractNum w:abstractNumId="15" w15:restartNumberingAfterBreak="0">
     <w:nsid w:val="5A0B13C4"/>
     <w:multiLevelType w:val="hybridMultilevel"/>
     <w:tmpl w:val="E84E7C10"/>
@@ -5497,7 +4175,7 @@
       </w:rPr>
     </w:lvl>
   </w:abstractNum>
-  <w:abstractNum w:abstractNumId="16">
+  <w:abstractNum w:abstractNumId="16" w15:restartNumberingAfterBreak="0">
     <w:nsid w:val="636B498A"/>
     <w:multiLevelType w:val="hybridMultilevel"/>
     <w:tmpl w:val="1032CF60"/>
@@ -5610,7 +4288,7 @@
       </w:rPr>
     </w:lvl>
   </w:abstractNum>
-  <w:abstractNum w:abstractNumId="17">
+  <w:abstractNum w:abstractNumId="17" w15:restartNumberingAfterBreak="0">
     <w:nsid w:val="6774194D"/>
     <w:multiLevelType w:val="hybridMultilevel"/>
     <w:tmpl w:val="9CD2C286"/>
@@ -5723,7 +4401,7 @@
       </w:rPr>
     </w:lvl>
   </w:abstractNum>
-  <w:abstractNum w:abstractNumId="18">
+  <w:abstractNum w:abstractNumId="18" w15:restartNumberingAfterBreak="0">
     <w:nsid w:val="6B961852"/>
     <w:multiLevelType w:val="hybridMultilevel"/>
     <w:tmpl w:val="DAAECE10"/>
@@ -5816,7 +4494,7 @@
       </w:pPr>
     </w:lvl>
   </w:abstractNum>
-  <w:abstractNum w:abstractNumId="19">
+  <w:abstractNum w:abstractNumId="19" w15:restartNumberingAfterBreak="0">
     <w:nsid w:val="6DA640A9"/>
     <w:multiLevelType w:val="multilevel"/>
     <w:tmpl w:val="9760A870"/>
@@ -5956,7 +4634,7 @@
       </w:rPr>
     </w:lvl>
   </w:abstractNum>
-  <w:abstractNum w:abstractNumId="20">
+  <w:abstractNum w:abstractNumId="20" w15:restartNumberingAfterBreak="0">
     <w:nsid w:val="7BAF36E9"/>
     <w:multiLevelType w:val="multilevel"/>
     <w:tmpl w:val="24180D92"/>
@@ -6241,19 +4919,8 @@
 </w:numbering>
 </file>
 
-<file path=word/people.xml><?xml version="1.0" encoding="utf-8"?>
-<w15:people xmlns:wpc="http://schemas.microsoft.com/office/word/2010/wordprocessingCanvas" xmlns:cx="http://schemas.microsoft.com/office/drawing/2014/chartex" xmlns:cx1="http://schemas.microsoft.com/office/drawing/2015/9/8/chartex" xmlns:cx2="http://schemas.microsoft.com/office/drawing/2015/10/21/chartex" xmlns:cx3="http://schemas.microsoft.com/office/drawing/2016/5/9/chartex" xmlns:cx4="http://schemas.microsoft.com/office/drawing/2016/5/10/chartex" xmlns:cx5="http://schemas.microsoft.com/office/drawing/2016/5/11/chartex" xmlns:cx6="http://schemas.microsoft.com/office/drawing/2016/5/12/chartex" xmlns:cx7="http://schemas.microsoft.com/office/drawing/2016/5/13/chartex" xmlns:cx8="http://schemas.microsoft.com/office/drawing/2016/5/14/chartex" xmlns:mc="http://schemas.openxmlformats.org/markup-compatibility/2006" xmlns:aink="http://schemas.microsoft.com/office/drawing/2016/ink" xmlns:am3d="http://schemas.microsoft.com/office/drawing/2017/model3d" xmlns:o="urn:schemas-microsoft-com:office:office" xmlns:r="http://schemas.openxmlformats.org/officeDocument/2006/relationships" xmlns:m="http://schemas.openxmlformats.org/officeDocument/2006/math" xmlns:v="urn:schemas-microsoft-com:vml" xmlns:wp14="http://schemas.microsoft.com/office/word/2010/wordprocessingDrawing" xmlns:wp="http://schemas.openxmlformats.org/drawingml/2006/wordprocessingDrawing" xmlns:w10="urn:schemas-microsoft-com:office:word" xmlns:w="http://schemas.openxmlformats.org/wordprocessingml/2006/main" xmlns:w14="http://schemas.microsoft.com/office/word/2010/wordml" xmlns:w15="http://schemas.microsoft.com/office/word/2012/wordml" xmlns:w16cex="http://schemas.microsoft.com/office/word/2018/wordml/cex" xmlns:w16cid="http://schemas.microsoft.com/office/word/2016/wordml/cid" xmlns:w16="http://schemas.microsoft.com/office/word/2018/wordml" xmlns:w16sdtdh="http://schemas.microsoft.com/office/word/2020/wordml/sdtdatahash" xmlns:w16se="http://schemas.microsoft.com/office/word/2015/wordml/symex" xmlns:wpg="http://schemas.microsoft.com/office/word/2010/wordprocessingGroup" xmlns:wpi="http://schemas.microsoft.com/office/word/2010/wordprocessingInk" xmlns:wne="http://schemas.microsoft.com/office/word/2006/wordml" xmlns:wps="http://schemas.microsoft.com/office/word/2010/wordprocessingShape" mc:Ignorable="w14 w15 w16se w16cid w16 w16cex w16sdtdh wp14">
-  <w15:person w15:author="Caroline Robinson">
-    <w15:presenceInfo w15:providerId="AD" w15:userId="S::CRobinson@AKCourts.gov::90d5f6fb-be36-42a5-b1db-9f4aa0bce5fa"/>
-  </w15:person>
-  <w15:person w15:author="Caroline Robinson [2]">
-    <w15:presenceInfo w15:providerId="AD" w15:userId="S::CRobinson@AKCourts.gov::90d5f6fb-be36-42a5-b1db-9f4aa0bce5fa"/>
-  </w15:person>
-</w15:people>
-</file>
-
 <file path=word/styles.xml><?xml version="1.0" encoding="utf-8"?>
-<w:styles xmlns:mc="http://schemas.openxmlformats.org/markup-compatibility/2006" xmlns:r="http://schemas.openxmlformats.org/officeDocument/2006/relationships" xmlns:w="http://schemas.openxmlformats.org/wordprocessingml/2006/main" xmlns:w14="http://schemas.microsoft.com/office/word/2010/wordml" mc:Ignorable="w14">
+<w:styles xmlns:mc="http://schemas.openxmlformats.org/markup-compatibility/2006" xmlns:r="http://schemas.openxmlformats.org/officeDocument/2006/relationships" xmlns:w="http://schemas.openxmlformats.org/wordprocessingml/2006/main" xmlns:w14="http://schemas.microsoft.com/office/word/2010/wordml" xmlns:w15="http://schemas.microsoft.com/office/word/2012/wordml" xmlns:w16cex="http://schemas.microsoft.com/office/word/2018/wordml/cex" xmlns:w16cid="http://schemas.microsoft.com/office/word/2016/wordml/cid" xmlns:w16="http://schemas.microsoft.com/office/word/2018/wordml" xmlns:w16sdtdh="http://schemas.microsoft.com/office/word/2020/wordml/sdtdatahash" xmlns:w16se="http://schemas.microsoft.com/office/word/2015/wordml/symex" mc:Ignorable="w14 w15 w16se w16cid w16 w16cex w16sdtdh">
   <w:docDefaults>
     <w:rPrDefault>
       <w:rPr>
@@ -6269,147 +4936,383 @@
       </w:pPr>
     </w:pPrDefault>
   </w:docDefaults>
-  <w:latentStyles w:defLockedState="0" w:defUIPriority="99" w:defSemiHidden="1" w:defUnhideWhenUsed="1" w:defQFormat="0" w:count="267">
-    <w:lsdException w:name="Normal" w:semiHidden="0" w:uiPriority="0" w:unhideWhenUsed="0" w:qFormat="1"/>
-    <w:lsdException w:name="heading 1" w:semiHidden="0" w:uiPriority="9" w:unhideWhenUsed="0" w:qFormat="1"/>
-    <w:lsdException w:name="heading 2" w:uiPriority="9" w:qFormat="1"/>
-    <w:lsdException w:name="heading 3" w:uiPriority="9" w:qFormat="1"/>
-    <w:lsdException w:name="heading 4" w:uiPriority="9" w:qFormat="1"/>
-    <w:lsdException w:name="heading 5" w:uiPriority="9" w:qFormat="1"/>
-    <w:lsdException w:name="heading 6" w:uiPriority="9" w:qFormat="1"/>
-    <w:lsdException w:name="heading 7" w:uiPriority="9" w:qFormat="1"/>
-    <w:lsdException w:name="heading 8" w:uiPriority="9" w:qFormat="1"/>
-    <w:lsdException w:name="heading 9" w:uiPriority="9" w:qFormat="1"/>
-    <w:lsdException w:name="toc 1" w:uiPriority="39"/>
-    <w:lsdException w:name="toc 2" w:uiPriority="39"/>
-    <w:lsdException w:name="toc 3" w:uiPriority="39"/>
-    <w:lsdException w:name="toc 4" w:uiPriority="39"/>
-    <w:lsdException w:name="toc 5" w:uiPriority="39"/>
-    <w:lsdException w:name="toc 6" w:uiPriority="39"/>
-    <w:lsdException w:name="toc 7" w:uiPriority="39"/>
-    <w:lsdException w:name="toc 8" w:uiPriority="39"/>
-    <w:lsdException w:name="toc 9" w:uiPriority="39"/>
-    <w:lsdException w:name="annotation text" w:qFormat="1"/>
-    <w:lsdException w:name="caption" w:uiPriority="35" w:qFormat="1"/>
-    <w:lsdException w:name="annotation reference" w:qFormat="1"/>
-    <w:lsdException w:name="Title" w:semiHidden="0" w:uiPriority="10" w:unhideWhenUsed="0" w:qFormat="1"/>
-    <w:lsdException w:name="Default Paragraph Font" w:uiPriority="1"/>
-    <w:lsdException w:name="Body Text" w:uiPriority="1" w:qFormat="1"/>
-    <w:lsdException w:name="Subtitle" w:semiHidden="0" w:uiPriority="11" w:unhideWhenUsed="0" w:qFormat="1"/>
-    <w:lsdException w:name="Strong" w:semiHidden="0" w:uiPriority="22" w:unhideWhenUsed="0" w:qFormat="1"/>
-    <w:lsdException w:name="Emphasis" w:semiHidden="0" w:uiPriority="20" w:unhideWhenUsed="0" w:qFormat="1"/>
-    <w:lsdException w:name="Table Grid" w:semiHidden="0" w:uiPriority="39" w:unhideWhenUsed="0"/>
-    <w:lsdException w:name="Placeholder Text" w:unhideWhenUsed="0"/>
-    <w:lsdException w:name="No Spacing" w:semiHidden="0" w:uiPriority="1" w:unhideWhenUsed="0" w:qFormat="1"/>
-    <w:lsdException w:name="Light Shading" w:semiHidden="0" w:uiPriority="60" w:unhideWhenUsed="0"/>
-    <w:lsdException w:name="Light List" w:semiHidden="0" w:uiPriority="61" w:unhideWhenUsed="0"/>
-    <w:lsdException w:name="Light Grid" w:semiHidden="0" w:uiPriority="62" w:unhideWhenUsed="0"/>
-    <w:lsdException w:name="Medium Shading 1" w:semiHidden="0" w:uiPriority="63" w:unhideWhenUsed="0"/>
-    <w:lsdException w:name="Medium Shading 2" w:semiHidden="0" w:uiPriority="64" w:unhideWhenUsed="0"/>
-    <w:lsdException w:name="Medium List 1" w:semiHidden="0" w:uiPriority="65" w:unhideWhenUsed="0"/>
-    <w:lsdException w:name="Medium List 2" w:semiHidden="0" w:uiPriority="66" w:unhideWhenUsed="0"/>
-    <w:lsdException w:name="Medium Grid 1" w:semiHidden="0" w:uiPriority="67" w:unhideWhenUsed="0"/>
-    <w:lsdException w:name="Medium Grid 2" w:semiHidden="0" w:uiPriority="68" w:unhideWhenUsed="0"/>
-    <w:lsdException w:name="Medium Grid 3" w:semiHidden="0" w:uiPriority="69" w:unhideWhenUsed="0"/>
-    <w:lsdException w:name="Dark List" w:semiHidden="0" w:uiPriority="70" w:unhideWhenUsed="0"/>
-    <w:lsdException w:name="Colorful Shading" w:semiHidden="0" w:uiPriority="71" w:unhideWhenUsed="0"/>
-    <w:lsdException w:name="Colorful List" w:semiHidden="0" w:uiPriority="72" w:unhideWhenUsed="0"/>
-    <w:lsdException w:name="Colorful Grid" w:semiHidden="0" w:uiPriority="73" w:unhideWhenUsed="0"/>
-    <w:lsdException w:name="Light Shading Accent 1" w:semiHidden="0" w:uiPriority="60" w:unhideWhenUsed="0"/>
-    <w:lsdException w:name="Light List Accent 1" w:semiHidden="0" w:uiPriority="61" w:unhideWhenUsed="0"/>
-    <w:lsdException w:name="Light Grid Accent 1" w:semiHidden="0" w:uiPriority="62" w:unhideWhenUsed="0"/>
-    <w:lsdException w:name="Medium Shading 1 Accent 1" w:semiHidden="0" w:uiPriority="63" w:unhideWhenUsed="0"/>
-    <w:lsdException w:name="Medium Shading 2 Accent 1" w:semiHidden="0" w:uiPriority="64" w:unhideWhenUsed="0"/>
-    <w:lsdException w:name="Medium List 1 Accent 1" w:semiHidden="0" w:uiPriority="65" w:unhideWhenUsed="0"/>
-    <w:lsdException w:name="Revision" w:unhideWhenUsed="0"/>
-    <w:lsdException w:name="List Paragraph" w:semiHidden="0" w:uiPriority="34" w:unhideWhenUsed="0" w:qFormat="1"/>
-    <w:lsdException w:name="Quote" w:semiHidden="0" w:uiPriority="29" w:unhideWhenUsed="0" w:qFormat="1"/>
-    <w:lsdException w:name="Intense Quote" w:semiHidden="0" w:uiPriority="30" w:unhideWhenUsed="0" w:qFormat="1"/>
-    <w:lsdException w:name="Medium List 2 Accent 1" w:semiHidden="0" w:uiPriority="66" w:unhideWhenUsed="0"/>
-    <w:lsdException w:name="Medium Grid 1 Accent 1" w:semiHidden="0" w:uiPriority="67" w:unhideWhenUsed="0"/>
-    <w:lsdException w:name="Medium Grid 2 Accent 1" w:semiHidden="0" w:uiPriority="68" w:unhideWhenUsed="0"/>
-    <w:lsdException w:name="Medium Grid 3 Accent 1" w:semiHidden="0" w:uiPriority="69" w:unhideWhenUsed="0"/>
-    <w:lsdException w:name="Dark List Accent 1" w:semiHidden="0" w:uiPriority="70" w:unhideWhenUsed="0"/>
-    <w:lsdException w:name="Colorful Shading Accent 1" w:semiHidden="0" w:uiPriority="71" w:unhideWhenUsed="0"/>
-    <w:lsdException w:name="Colorful List Accent 1" w:semiHidden="0" w:uiPriority="72" w:unhideWhenUsed="0"/>
-    <w:lsdException w:name="Colorful Grid Accent 1" w:semiHidden="0" w:uiPriority="73" w:unhideWhenUsed="0"/>
-    <w:lsdException w:name="Light Shading Accent 2" w:semiHidden="0" w:uiPriority="60" w:unhideWhenUsed="0"/>
-    <w:lsdException w:name="Light List Accent 2" w:semiHidden="0" w:uiPriority="61" w:unhideWhenUsed="0"/>
-    <w:lsdException w:name="Light Grid Accent 2" w:semiHidden="0" w:uiPriority="62" w:unhideWhenUsed="0"/>
-    <w:lsdException w:name="Medium Shading 1 Accent 2" w:semiHidden="0" w:uiPriority="63" w:unhideWhenUsed="0"/>
-    <w:lsdException w:name="Medium Shading 2 Accent 2" w:semiHidden="0" w:uiPriority="64" w:unhideWhenUsed="0"/>
-    <w:lsdException w:name="Medium List 1 Accent 2" w:semiHidden="0" w:uiPriority="65" w:unhideWhenUsed="0"/>
-    <w:lsdException w:name="Medium List 2 Accent 2" w:semiHidden="0" w:uiPriority="66" w:unhideWhenUsed="0"/>
-    <w:lsdException w:name="Medium Grid 1 Accent 2" w:semiHidden="0" w:uiPriority="67" w:unhideWhenUsed="0"/>
-    <w:lsdException w:name="Medium Grid 2 Accent 2" w:semiHidden="0" w:uiPriority="68" w:unhideWhenUsed="0"/>
-    <w:lsdException w:name="Medium Grid 3 Accent 2" w:semiHidden="0" w:uiPriority="69" w:unhideWhenUsed="0"/>
-    <w:lsdException w:name="Dark List Accent 2" w:semiHidden="0" w:uiPriority="70" w:unhideWhenUsed="0"/>
-    <w:lsdException w:name="Colorful Shading Accent 2" w:semiHidden="0" w:uiPriority="71" w:unhideWhenUsed="0"/>
-    <w:lsdException w:name="Colorful List Accent 2" w:semiHidden="0" w:uiPriority="72" w:unhideWhenUsed="0"/>
-    <w:lsdException w:name="Colorful Grid Accent 2" w:semiHidden="0" w:uiPriority="73" w:unhideWhenUsed="0"/>
-    <w:lsdException w:name="Light Shading Accent 3" w:semiHidden="0" w:uiPriority="60" w:unhideWhenUsed="0"/>
-    <w:lsdException w:name="Light List Accent 3" w:semiHidden="0" w:uiPriority="61" w:unhideWhenUsed="0"/>
-    <w:lsdException w:name="Light Grid Accent 3" w:semiHidden="0" w:uiPriority="62" w:unhideWhenUsed="0"/>
-    <w:lsdException w:name="Medium Shading 1 Accent 3" w:semiHidden="0" w:uiPriority="63" w:unhideWhenUsed="0"/>
-    <w:lsdException w:name="Medium Shading 2 Accent 3" w:semiHidden="0" w:uiPriority="64" w:unhideWhenUsed="0"/>
-    <w:lsdException w:name="Medium List 1 Accent 3" w:semiHidden="0" w:uiPriority="65" w:unhideWhenUsed="0"/>
-    <w:lsdException w:name="Medium List 2 Accent 3" w:semiHidden="0" w:uiPriority="66" w:unhideWhenUsed="0"/>
-    <w:lsdException w:name="Medium Grid 1 Accent 3" w:semiHidden="0" w:uiPriority="67" w:unhideWhenUsed="0"/>
-    <w:lsdException w:name="Medium Grid 2 Accent 3" w:semiHidden="0" w:uiPriority="68" w:unhideWhenUsed="0"/>
-    <w:lsdException w:name="Medium Grid 3 Accent 3" w:semiHidden="0" w:uiPriority="69" w:unhideWhenUsed="0"/>
-    <w:lsdException w:name="Dark List Accent 3" w:semiHidden="0" w:uiPriority="70" w:unhideWhenUsed="0"/>
-    <w:lsdException w:name="Colorful Shading Accent 3" w:semiHidden="0" w:uiPriority="71" w:unhideWhenUsed="0"/>
-    <w:lsdException w:name="Colorful List Accent 3" w:semiHidden="0" w:uiPriority="72" w:unhideWhenUsed="0"/>
-    <w:lsdException w:name="Colorful Grid Accent 3" w:semiHidden="0" w:uiPriority="73" w:unhideWhenUsed="0"/>
-    <w:lsdException w:name="Light Shading Accent 4" w:semiHidden="0" w:uiPriority="60" w:unhideWhenUsed="0"/>
-    <w:lsdException w:name="Light List Accent 4" w:semiHidden="0" w:uiPriority="61" w:unhideWhenUsed="0"/>
-    <w:lsdException w:name="Light Grid Accent 4" w:semiHidden="0" w:uiPriority="62" w:unhideWhenUsed="0"/>
-    <w:lsdException w:name="Medium Shading 1 Accent 4" w:semiHidden="0" w:uiPriority="63" w:unhideWhenUsed="0"/>
-    <w:lsdException w:name="Medium Shading 2 Accent 4" w:semiHidden="0" w:uiPriority="64" w:unhideWhenUsed="0"/>
-    <w:lsdException w:name="Medium List 1 Accent 4" w:semiHidden="0" w:uiPriority="65" w:unhideWhenUsed="0"/>
-    <w:lsdException w:name="Medium List 2 Accent 4" w:semiHidden="0" w:uiPriority="66" w:unhideWhenUsed="0"/>
-    <w:lsdException w:name="Medium Grid 1 Accent 4" w:semiHidden="0" w:uiPriority="67" w:unhideWhenUsed="0"/>
-    <w:lsdException w:name="Medium Grid 2 Accent 4" w:semiHidden="0" w:uiPriority="68" w:unhideWhenUsed="0"/>
-    <w:lsdException w:name="Medium Grid 3 Accent 4" w:semiHidden="0" w:uiPriority="69" w:unhideWhenUsed="0"/>
-    <w:lsdException w:name="Dark List Accent 4" w:semiHidden="0" w:uiPriority="70" w:unhideWhenUsed="0"/>
-    <w:lsdException w:name="Colorful Shading Accent 4" w:semiHidden="0" w:uiPriority="71" w:unhideWhenUsed="0"/>
-    <w:lsdException w:name="Colorful List Accent 4" w:semiHidden="0" w:uiPriority="72" w:unhideWhenUsed="0"/>
-    <w:lsdException w:name="Colorful Grid Accent 4" w:semiHidden="0" w:uiPriority="73" w:unhideWhenUsed="0"/>
-    <w:lsdException w:name="Light Shading Accent 5" w:semiHidden="0" w:uiPriority="60" w:unhideWhenUsed="0"/>
-    <w:lsdException w:name="Light List Accent 5" w:semiHidden="0" w:uiPriority="61" w:unhideWhenUsed="0"/>
-    <w:lsdException w:name="Light Grid Accent 5" w:semiHidden="0" w:uiPriority="62" w:unhideWhenUsed="0"/>
-    <w:lsdException w:name="Medium Shading 1 Accent 5" w:semiHidden="0" w:uiPriority="63" w:unhideWhenUsed="0"/>
-    <w:lsdException w:name="Medium Shading 2 Accent 5" w:semiHidden="0" w:uiPriority="64" w:unhideWhenUsed="0"/>
-    <w:lsdException w:name="Medium List 1 Accent 5" w:semiHidden="0" w:uiPriority="65" w:unhideWhenUsed="0"/>
-    <w:lsdException w:name="Medium List 2 Accent 5" w:semiHidden="0" w:uiPriority="66" w:unhideWhenUsed="0"/>
-    <w:lsdException w:name="Medium Grid 1 Accent 5" w:semiHidden="0" w:uiPriority="67" w:unhideWhenUsed="0"/>
-    <w:lsdException w:name="Medium Grid 2 Accent 5" w:semiHidden="0" w:uiPriority="68" w:unhideWhenUsed="0"/>
-    <w:lsdException w:name="Medium Grid 3 Accent 5" w:semiHidden="0" w:uiPriority="69" w:unhideWhenUsed="0"/>
-    <w:lsdException w:name="Dark List Accent 5" w:semiHidden="0" w:uiPriority="70" w:unhideWhenUsed="0"/>
-    <w:lsdException w:name="Colorful Shading Accent 5" w:semiHidden="0" w:uiPriority="71" w:unhideWhenUsed="0"/>
-    <w:lsdException w:name="Colorful List Accent 5" w:semiHidden="0" w:uiPriority="72" w:unhideWhenUsed="0"/>
-    <w:lsdException w:name="Colorful Grid Accent 5" w:semiHidden="0" w:uiPriority="73" w:unhideWhenUsed="0"/>
-    <w:lsdException w:name="Light Shading Accent 6" w:semiHidden="0" w:uiPriority="60" w:unhideWhenUsed="0"/>
-    <w:lsdException w:name="Light List Accent 6" w:semiHidden="0" w:uiPriority="61" w:unhideWhenUsed="0"/>
-    <w:lsdException w:name="Light Grid Accent 6" w:semiHidden="0" w:uiPriority="62" w:unhideWhenUsed="0"/>
-    <w:lsdException w:name="Medium Shading 1 Accent 6" w:semiHidden="0" w:uiPriority="63" w:unhideWhenUsed="0"/>
-    <w:lsdException w:name="Medium Shading 2 Accent 6" w:semiHidden="0" w:uiPriority="64" w:unhideWhenUsed="0"/>
-    <w:lsdException w:name="Medium List 1 Accent 6" w:semiHidden="0" w:uiPriority="65" w:unhideWhenUsed="0"/>
-    <w:lsdException w:name="Medium List 2 Accent 6" w:semiHidden="0" w:uiPriority="66" w:unhideWhenUsed="0"/>
-    <w:lsdException w:name="Medium Grid 1 Accent 6" w:semiHidden="0" w:uiPriority="67" w:unhideWhenUsed="0"/>
-    <w:lsdException w:name="Medium Grid 2 Accent 6" w:semiHidden="0" w:uiPriority="68" w:unhideWhenUsed="0"/>
-    <w:lsdException w:name="Medium Grid 3 Accent 6" w:semiHidden="0" w:uiPriority="69" w:unhideWhenUsed="0"/>
-    <w:lsdException w:name="Dark List Accent 6" w:semiHidden="0" w:uiPriority="70" w:unhideWhenUsed="0"/>
-    <w:lsdException w:name="Colorful Shading Accent 6" w:semiHidden="0" w:uiPriority="71" w:unhideWhenUsed="0"/>
-    <w:lsdException w:name="Colorful List Accent 6" w:semiHidden="0" w:uiPriority="72" w:unhideWhenUsed="0"/>
-    <w:lsdException w:name="Colorful Grid Accent 6" w:semiHidden="0" w:uiPriority="73" w:unhideWhenUsed="0"/>
-    <w:lsdException w:name="Subtle Emphasis" w:semiHidden="0" w:uiPriority="19" w:unhideWhenUsed="0" w:qFormat="1"/>
-    <w:lsdException w:name="Intense Emphasis" w:semiHidden="0" w:uiPriority="21" w:unhideWhenUsed="0" w:qFormat="1"/>
-    <w:lsdException w:name="Subtle Reference" w:semiHidden="0" w:uiPriority="31" w:unhideWhenUsed="0" w:qFormat="1"/>
-    <w:lsdException w:name="Intense Reference" w:semiHidden="0" w:uiPriority="32" w:unhideWhenUsed="0" w:qFormat="1"/>
-    <w:lsdException w:name="Book Title" w:semiHidden="0" w:uiPriority="33" w:unhideWhenUsed="0" w:qFormat="1"/>
-    <w:lsdException w:name="Bibliography" w:uiPriority="37"/>
-    <w:lsdException w:name="TOC Heading" w:uiPriority="39" w:qFormat="1"/>
+  <w:latentStyles w:defLockedState="0" w:defUIPriority="99" w:defSemiHidden="0" w:defUnhideWhenUsed="0" w:defQFormat="0" w:count="376">
+    <w:lsdException w:name="Normal" w:uiPriority="0" w:qFormat="1"/>
+    <w:lsdException w:name="heading 1" w:uiPriority="9" w:qFormat="1"/>
+    <w:lsdException w:name="heading 2" w:semiHidden="1" w:uiPriority="9" w:unhideWhenUsed="1" w:qFormat="1"/>
+    <w:lsdException w:name="heading 3" w:semiHidden="1" w:uiPriority="9" w:unhideWhenUsed="1" w:qFormat="1"/>
+    <w:lsdException w:name="heading 4" w:semiHidden="1" w:uiPriority="9" w:unhideWhenUsed="1" w:qFormat="1"/>
+    <w:lsdException w:name="heading 5" w:semiHidden="1" w:uiPriority="9" w:unhideWhenUsed="1" w:qFormat="1"/>
+    <w:lsdException w:name="heading 6" w:semiHidden="1" w:uiPriority="9" w:unhideWhenUsed="1" w:qFormat="1"/>
+    <w:lsdException w:name="heading 7" w:semiHidden="1" w:uiPriority="9" w:unhideWhenUsed="1" w:qFormat="1"/>
+    <w:lsdException w:name="heading 8" w:semiHidden="1" w:uiPriority="9" w:unhideWhenUsed="1" w:qFormat="1"/>
+    <w:lsdException w:name="heading 9" w:semiHidden="1" w:uiPriority="9" w:unhideWhenUsed="1" w:qFormat="1"/>
+    <w:lsdException w:name="index 1" w:semiHidden="1" w:unhideWhenUsed="1"/>
+    <w:lsdException w:name="index 2" w:semiHidden="1" w:unhideWhenUsed="1"/>
+    <w:lsdException w:name="index 3" w:semiHidden="1" w:unhideWhenUsed="1"/>
+    <w:lsdException w:name="index 4" w:semiHidden="1" w:unhideWhenUsed="1"/>
+    <w:lsdException w:name="index 5" w:semiHidden="1" w:unhideWhenUsed="1"/>
+    <w:lsdException w:name="index 6" w:semiHidden="1" w:unhideWhenUsed="1"/>
+    <w:lsdException w:name="index 7" w:semiHidden="1" w:unhideWhenUsed="1"/>
+    <w:lsdException w:name="index 8" w:semiHidden="1" w:unhideWhenUsed="1"/>
+    <w:lsdException w:name="index 9" w:semiHidden="1" w:unhideWhenUsed="1"/>
+    <w:lsdException w:name="toc 1" w:semiHidden="1" w:uiPriority="39" w:unhideWhenUsed="1"/>
+    <w:lsdException w:name="toc 2" w:semiHidden="1" w:uiPriority="39" w:unhideWhenUsed="1"/>
+    <w:lsdException w:name="toc 3" w:semiHidden="1" w:uiPriority="39" w:unhideWhenUsed="1"/>
+    <w:lsdException w:name="toc 4" w:semiHidden="1" w:uiPriority="39" w:unhideWhenUsed="1"/>
+    <w:lsdException w:name="toc 5" w:semiHidden="1" w:uiPriority="39" w:unhideWhenUsed="1"/>
+    <w:lsdException w:name="toc 6" w:semiHidden="1" w:uiPriority="39" w:unhideWhenUsed="1"/>
+    <w:lsdException w:name="toc 7" w:semiHidden="1" w:uiPriority="39" w:unhideWhenUsed="1"/>
+    <w:lsdException w:name="toc 8" w:semiHidden="1" w:uiPriority="39" w:unhideWhenUsed="1"/>
+    <w:lsdException w:name="toc 9" w:semiHidden="1" w:uiPriority="39" w:unhideWhenUsed="1"/>
+    <w:lsdException w:name="Normal Indent" w:semiHidden="1" w:unhideWhenUsed="1"/>
+    <w:lsdException w:name="footnote text" w:semiHidden="1" w:unhideWhenUsed="1"/>
+    <w:lsdException w:name="annotation text" w:semiHidden="1" w:unhideWhenUsed="1" w:qFormat="1"/>
+    <w:lsdException w:name="header" w:semiHidden="1" w:unhideWhenUsed="1"/>
+    <w:lsdException w:name="footer" w:semiHidden="1" w:unhideWhenUsed="1"/>
+    <w:lsdException w:name="index heading" w:semiHidden="1" w:unhideWhenUsed="1"/>
+    <w:lsdException w:name="caption" w:semiHidden="1" w:uiPriority="35" w:unhideWhenUsed="1" w:qFormat="1"/>
+    <w:lsdException w:name="table of figures" w:semiHidden="1" w:unhideWhenUsed="1"/>
+    <w:lsdException w:name="envelope address" w:semiHidden="1" w:unhideWhenUsed="1"/>
+    <w:lsdException w:name="envelope return" w:semiHidden="1" w:unhideWhenUsed="1"/>
+    <w:lsdException w:name="footnote reference" w:semiHidden="1" w:unhideWhenUsed="1"/>
+    <w:lsdException w:name="annotation reference" w:semiHidden="1" w:unhideWhenUsed="1" w:qFormat="1"/>
+    <w:lsdException w:name="line number" w:semiHidden="1" w:unhideWhenUsed="1"/>
+    <w:lsdException w:name="page number" w:semiHidden="1" w:unhideWhenUsed="1"/>
+    <w:lsdException w:name="endnote reference" w:semiHidden="1" w:unhideWhenUsed="1"/>
+    <w:lsdException w:name="endnote text" w:semiHidden="1" w:unhideWhenUsed="1"/>
+    <w:lsdException w:name="table of authorities" w:semiHidden="1" w:unhideWhenUsed="1"/>
+    <w:lsdException w:name="macro" w:semiHidden="1" w:unhideWhenUsed="1"/>
+    <w:lsdException w:name="toa heading" w:semiHidden="1" w:unhideWhenUsed="1"/>
+    <w:lsdException w:name="List" w:semiHidden="1" w:unhideWhenUsed="1"/>
+    <w:lsdException w:name="List Bullet" w:semiHidden="1" w:unhideWhenUsed="1"/>
+    <w:lsdException w:name="List Number" w:semiHidden="1" w:unhideWhenUsed="1"/>
+    <w:lsdException w:name="List 2" w:semiHidden="1" w:unhideWhenUsed="1"/>
+    <w:lsdException w:name="List 3" w:semiHidden="1" w:unhideWhenUsed="1"/>
+    <w:lsdException w:name="List 4" w:semiHidden="1" w:unhideWhenUsed="1"/>
+    <w:lsdException w:name="List 5" w:semiHidden="1" w:unhideWhenUsed="1"/>
+    <w:lsdException w:name="List Bullet 2" w:semiHidden="1" w:unhideWhenUsed="1"/>
+    <w:lsdException w:name="List Bullet 3" w:semiHidden="1" w:unhideWhenUsed="1"/>
+    <w:lsdException w:name="List Bullet 4" w:semiHidden="1" w:unhideWhenUsed="1"/>
+    <w:lsdException w:name="List Bullet 5" w:semiHidden="1" w:unhideWhenUsed="1"/>
+    <w:lsdException w:name="List Number 2" w:semiHidden="1" w:unhideWhenUsed="1"/>
+    <w:lsdException w:name="List Number 3" w:semiHidden="1" w:unhideWhenUsed="1"/>
+    <w:lsdException w:name="List Number 4" w:semiHidden="1" w:unhideWhenUsed="1"/>
+    <w:lsdException w:name="List Number 5" w:semiHidden="1" w:unhideWhenUsed="1"/>
+    <w:lsdException w:name="Title" w:uiPriority="10" w:qFormat="1"/>
+    <w:lsdException w:name="Closing" w:semiHidden="1" w:unhideWhenUsed="1"/>
+    <w:lsdException w:name="Signature" w:semiHidden="1" w:unhideWhenUsed="1"/>
+    <w:lsdException w:name="Default Paragraph Font" w:semiHidden="1" w:uiPriority="1" w:unhideWhenUsed="1"/>
+    <w:lsdException w:name="Body Text" w:semiHidden="1" w:uiPriority="1" w:unhideWhenUsed="1" w:qFormat="1"/>
+    <w:lsdException w:name="Body Text Indent" w:semiHidden="1" w:unhideWhenUsed="1"/>
+    <w:lsdException w:name="List Continue" w:semiHidden="1" w:unhideWhenUsed="1"/>
+    <w:lsdException w:name="List Continue 2" w:semiHidden="1" w:unhideWhenUsed="1"/>
+    <w:lsdException w:name="List Continue 3" w:semiHidden="1" w:unhideWhenUsed="1"/>
+    <w:lsdException w:name="List Continue 4" w:semiHidden="1" w:unhideWhenUsed="1"/>
+    <w:lsdException w:name="List Continue 5" w:semiHidden="1" w:unhideWhenUsed="1"/>
+    <w:lsdException w:name="Message Header" w:semiHidden="1" w:unhideWhenUsed="1"/>
+    <w:lsdException w:name="Subtitle" w:uiPriority="11" w:qFormat="1"/>
+    <w:lsdException w:name="Salutation" w:semiHidden="1" w:unhideWhenUsed="1"/>
+    <w:lsdException w:name="Date" w:semiHidden="1" w:unhideWhenUsed="1"/>
+    <w:lsdException w:name="Body Text First Indent" w:semiHidden="1" w:unhideWhenUsed="1"/>
+    <w:lsdException w:name="Body Text First Indent 2" w:semiHidden="1" w:unhideWhenUsed="1"/>
+    <w:lsdException w:name="Note Heading" w:semiHidden="1" w:unhideWhenUsed="1"/>
+    <w:lsdException w:name="Body Text 2" w:semiHidden="1" w:unhideWhenUsed="1"/>
+    <w:lsdException w:name="Body Text 3" w:semiHidden="1" w:unhideWhenUsed="1"/>
+    <w:lsdException w:name="Body Text Indent 2" w:semiHidden="1" w:unhideWhenUsed="1"/>
+    <w:lsdException w:name="Body Text Indent 3" w:semiHidden="1" w:unhideWhenUsed="1"/>
+    <w:lsdException w:name="Block Text" w:semiHidden="1" w:unhideWhenUsed="1"/>
+    <w:lsdException w:name="Hyperlink" w:semiHidden="1" w:unhideWhenUsed="1"/>
+    <w:lsdException w:name="FollowedHyperlink" w:semiHidden="1" w:unhideWhenUsed="1"/>
+    <w:lsdException w:name="Strong" w:uiPriority="22" w:qFormat="1"/>
+    <w:lsdException w:name="Emphasis" w:uiPriority="20" w:qFormat="1"/>
+    <w:lsdException w:name="Document Map" w:semiHidden="1" w:unhideWhenUsed="1"/>
+    <w:lsdException w:name="Plain Text" w:semiHidden="1" w:unhideWhenUsed="1"/>
+    <w:lsdException w:name="E-mail Signature" w:semiHidden="1" w:unhideWhenUsed="1"/>
+    <w:lsdException w:name="HTML Top of Form" w:semiHidden="1" w:unhideWhenUsed="1"/>
+    <w:lsdException w:name="HTML Bottom of Form" w:semiHidden="1" w:unhideWhenUsed="1"/>
+    <w:lsdException w:name="Normal (Web)" w:semiHidden="1" w:unhideWhenUsed="1"/>
+    <w:lsdException w:name="HTML Acronym" w:semiHidden="1" w:unhideWhenUsed="1"/>
+    <w:lsdException w:name="HTML Address" w:semiHidden="1" w:unhideWhenUsed="1"/>
+    <w:lsdException w:name="HTML Cite" w:semiHidden="1" w:unhideWhenUsed="1"/>
+    <w:lsdException w:name="HTML Code" w:semiHidden="1" w:unhideWhenUsed="1"/>
+    <w:lsdException w:name="HTML Definition" w:semiHidden="1" w:unhideWhenUsed="1"/>
+    <w:lsdException w:name="HTML Keyboard" w:semiHidden="1" w:unhideWhenUsed="1"/>
+    <w:lsdException w:name="HTML Preformatted" w:semiHidden="1" w:unhideWhenUsed="1"/>
+    <w:lsdException w:name="HTML Sample" w:semiHidden="1" w:unhideWhenUsed="1"/>
+    <w:lsdException w:name="HTML Typewriter" w:semiHidden="1" w:unhideWhenUsed="1"/>
+    <w:lsdException w:name="HTML Variable" w:semiHidden="1" w:unhideWhenUsed="1"/>
+    <w:lsdException w:name="Normal Table" w:semiHidden="1" w:unhideWhenUsed="1"/>
+    <w:lsdException w:name="annotation subject" w:semiHidden="1" w:unhideWhenUsed="1"/>
+    <w:lsdException w:name="No List" w:semiHidden="1" w:unhideWhenUsed="1"/>
+    <w:lsdException w:name="Outline List 1" w:semiHidden="1" w:unhideWhenUsed="1"/>
+    <w:lsdException w:name="Outline List 2" w:semiHidden="1" w:unhideWhenUsed="1"/>
+    <w:lsdException w:name="Outline List 3" w:semiHidden="1" w:unhideWhenUsed="1"/>
+    <w:lsdException w:name="Table Simple 1" w:semiHidden="1" w:unhideWhenUsed="1"/>
+    <w:lsdException w:name="Table Simple 2" w:semiHidden="1" w:unhideWhenUsed="1"/>
+    <w:lsdException w:name="Table Simple 3" w:semiHidden="1" w:unhideWhenUsed="1"/>
+    <w:lsdException w:name="Table Classic 1" w:semiHidden="1" w:unhideWhenUsed="1"/>
+    <w:lsdException w:name="Table Classic 2" w:semiHidden="1" w:unhideWhenUsed="1"/>
+    <w:lsdException w:name="Table Classic 3" w:semiHidden="1" w:unhideWhenUsed="1"/>
+    <w:lsdException w:name="Table Classic 4" w:semiHidden="1" w:unhideWhenUsed="1"/>
+    <w:lsdException w:name="Table Colorful 1" w:semiHidden="1" w:unhideWhenUsed="1"/>
+    <w:lsdException w:name="Table Colorful 2" w:semiHidden="1" w:unhideWhenUsed="1"/>
+    <w:lsdException w:name="Table Colorful 3" w:semiHidden="1" w:unhideWhenUsed="1"/>
+    <w:lsdException w:name="Table Columns 1" w:semiHidden="1" w:unhideWhenUsed="1"/>
+    <w:lsdException w:name="Table Columns 2" w:semiHidden="1" w:unhideWhenUsed="1"/>
+    <w:lsdException w:name="Table Columns 3" w:semiHidden="1" w:unhideWhenUsed="1"/>
+    <w:lsdException w:name="Table Columns 4" w:semiHidden="1" w:unhideWhenUsed="1"/>
+    <w:lsdException w:name="Table Columns 5" w:semiHidden="1" w:unhideWhenUsed="1"/>
+    <w:lsdException w:name="Table Grid 1" w:semiHidden="1" w:unhideWhenUsed="1"/>
+    <w:lsdException w:name="Table Grid 2" w:semiHidden="1" w:unhideWhenUsed="1"/>
+    <w:lsdException w:name="Table Grid 3" w:semiHidden="1" w:unhideWhenUsed="1"/>
+    <w:lsdException w:name="Table Grid 4" w:semiHidden="1" w:unhideWhenUsed="1"/>
+    <w:lsdException w:name="Table Grid 5" w:semiHidden="1" w:unhideWhenUsed="1"/>
+    <w:lsdException w:name="Table Grid 6" w:semiHidden="1" w:unhideWhenUsed="1"/>
+    <w:lsdException w:name="Table Grid 7" w:semiHidden="1" w:unhideWhenUsed="1"/>
+    <w:lsdException w:name="Table Grid 8" w:semiHidden="1" w:unhideWhenUsed="1"/>
+    <w:lsdException w:name="Table List 1" w:semiHidden="1" w:unhideWhenUsed="1"/>
+    <w:lsdException w:name="Table List 2" w:semiHidden="1" w:unhideWhenUsed="1"/>
+    <w:lsdException w:name="Table List 3" w:semiHidden="1" w:unhideWhenUsed="1"/>
+    <w:lsdException w:name="Table List 4" w:semiHidden="1" w:unhideWhenUsed="1"/>
+    <w:lsdException w:name="Table List 5" w:semiHidden="1" w:unhideWhenUsed="1"/>
+    <w:lsdException w:name="Table List 6" w:semiHidden="1" w:unhideWhenUsed="1"/>
+    <w:lsdException w:name="Table List 7" w:semiHidden="1" w:unhideWhenUsed="1"/>
+    <w:lsdException w:name="Table List 8" w:semiHidden="1" w:unhideWhenUsed="1"/>
+    <w:lsdException w:name="Table 3D effects 1" w:semiHidden="1" w:unhideWhenUsed="1"/>
+    <w:lsdException w:name="Table 3D effects 2" w:semiHidden="1" w:unhideWhenUsed="1"/>
+    <w:lsdException w:name="Table 3D effects 3" w:semiHidden="1" w:unhideWhenUsed="1"/>
+    <w:lsdException w:name="Table Contemporary" w:semiHidden="1" w:unhideWhenUsed="1"/>
+    <w:lsdException w:name="Table Elegant" w:semiHidden="1" w:unhideWhenUsed="1"/>
+    <w:lsdException w:name="Table Professional" w:semiHidden="1" w:unhideWhenUsed="1"/>
+    <w:lsdException w:name="Table Subtle 1" w:semiHidden="1" w:unhideWhenUsed="1"/>
+    <w:lsdException w:name="Table Subtle 2" w:semiHidden="1" w:unhideWhenUsed="1"/>
+    <w:lsdException w:name="Table Web 1" w:semiHidden="1" w:unhideWhenUsed="1"/>
+    <w:lsdException w:name="Table Web 2" w:semiHidden="1" w:unhideWhenUsed="1"/>
+    <w:lsdException w:name="Table Web 3" w:semiHidden="1" w:unhideWhenUsed="1"/>
+    <w:lsdException w:name="Balloon Text" w:semiHidden="1" w:unhideWhenUsed="1"/>
+    <w:lsdException w:name="Table Grid" w:semiHidden="1" w:uiPriority="39" w:unhideWhenUsed="1"/>
+    <w:lsdException w:name="Table Theme" w:semiHidden="1" w:unhideWhenUsed="1"/>
+    <w:lsdException w:name="Placeholder Text" w:semiHidden="1"/>
+    <w:lsdException w:name="No Spacing" w:uiPriority="1" w:qFormat="1"/>
+    <w:lsdException w:name="Light Shading" w:uiPriority="60"/>
+    <w:lsdException w:name="Light List" w:uiPriority="61"/>
+    <w:lsdException w:name="Light Grid" w:uiPriority="62"/>
+    <w:lsdException w:name="Medium Shading 1" w:uiPriority="63"/>
+    <w:lsdException w:name="Medium Shading 2" w:uiPriority="64"/>
+    <w:lsdException w:name="Medium List 1" w:uiPriority="65"/>
+    <w:lsdException w:name="Medium List 2" w:uiPriority="66"/>
+    <w:lsdException w:name="Medium Grid 1" w:uiPriority="67"/>
+    <w:lsdException w:name="Medium Grid 2" w:uiPriority="68"/>
+    <w:lsdException w:name="Medium Grid 3" w:uiPriority="69"/>
+    <w:lsdException w:name="Dark List" w:uiPriority="70"/>
+    <w:lsdException w:name="Colorful Shading" w:uiPriority="71"/>
+    <w:lsdException w:name="Colorful List" w:uiPriority="72"/>
+    <w:lsdException w:name="Colorful Grid" w:uiPriority="73"/>
+    <w:lsdException w:name="Light Shading Accent 1" w:uiPriority="60"/>
+    <w:lsdException w:name="Light List Accent 1" w:uiPriority="61"/>
+    <w:lsdException w:name="Light Grid Accent 1" w:uiPriority="62"/>
+    <w:lsdException w:name="Medium Shading 1 Accent 1" w:uiPriority="63"/>
+    <w:lsdException w:name="Medium Shading 2 Accent 1" w:uiPriority="64"/>
+    <w:lsdException w:name="Medium List 1 Accent 1" w:uiPriority="65"/>
+    <w:lsdException w:name="Revision" w:semiHidden="1"/>
+    <w:lsdException w:name="List Paragraph" w:uiPriority="34" w:qFormat="1"/>
+    <w:lsdException w:name="Quote" w:uiPriority="29" w:qFormat="1"/>
+    <w:lsdException w:name="Intense Quote" w:uiPriority="30" w:qFormat="1"/>
+    <w:lsdException w:name="Medium List 2 Accent 1" w:uiPriority="66"/>
+    <w:lsdException w:name="Medium Grid 1 Accent 1" w:uiPriority="67"/>
+    <w:lsdException w:name="Medium Grid 2 Accent 1" w:uiPriority="68"/>
+    <w:lsdException w:name="Medium Grid 3 Accent 1" w:uiPriority="69"/>
+    <w:lsdException w:name="Dark List Accent 1" w:uiPriority="70"/>
+    <w:lsdException w:name="Colorful Shading Accent 1" w:uiPriority="71"/>
+    <w:lsdException w:name="Colorful List Accent 1" w:uiPriority="72"/>
+    <w:lsdException w:name="Colorful Grid Accent 1" w:uiPriority="73"/>
+    <w:lsdException w:name="Light Shading Accent 2" w:uiPriority="60"/>
+    <w:lsdException w:name="Light List Accent 2" w:uiPriority="61"/>
+    <w:lsdException w:name="Light Grid Accent 2" w:uiPriority="62"/>
+    <w:lsdException w:name="Medium Shading 1 Accent 2" w:uiPriority="63"/>
+    <w:lsdException w:name="Medium Shading 2 Accent 2" w:uiPriority="64"/>
+    <w:lsdException w:name="Medium List 1 Accent 2" w:uiPriority="65"/>
+    <w:lsdException w:name="Medium List 2 Accent 2" w:uiPriority="66"/>
+    <w:lsdException w:name="Medium Grid 1 Accent 2" w:uiPriority="67"/>
+    <w:lsdException w:name="Medium Grid 2 Accent 2" w:uiPriority="68"/>
+    <w:lsdException w:name="Medium Grid 3 Accent 2" w:uiPriority="69"/>
+    <w:lsdException w:name="Dark List Accent 2" w:uiPriority="70"/>
+    <w:lsdException w:name="Colorful Shading Accent 2" w:uiPriority="71"/>
+    <w:lsdException w:name="Colorful List Accent 2" w:uiPriority="72"/>
+    <w:lsdException w:name="Colorful Grid Accent 2" w:uiPriority="73"/>
+    <w:lsdException w:name="Light Shading Accent 3" w:uiPriority="60"/>
+    <w:lsdException w:name="Light List Accent 3" w:uiPriority="61"/>
+    <w:lsdException w:name="Light Grid Accent 3" w:uiPriority="62"/>
+    <w:lsdException w:name="Medium Shading 1 Accent 3" w:uiPriority="63"/>
+    <w:lsdException w:name="Medium Shading 2 Accent 3" w:uiPriority="64"/>
+    <w:lsdException w:name="Medium List 1 Accent 3" w:uiPriority="65"/>
+    <w:lsdException w:name="Medium List 2 Accent 3" w:uiPriority="66"/>
+    <w:lsdException w:name="Medium Grid 1 Accent 3" w:uiPriority="67"/>
+    <w:lsdException w:name="Medium Grid 2 Accent 3" w:uiPriority="68"/>
+    <w:lsdException w:name="Medium Grid 3 Accent 3" w:uiPriority="69"/>
+    <w:lsdException w:name="Dark List Accent 3" w:uiPriority="70"/>
+    <w:lsdException w:name="Colorful Shading Accent 3" w:uiPriority="71"/>
+    <w:lsdException w:name="Colorful List Accent 3" w:uiPriority="72"/>
+    <w:lsdException w:name="Colorful Grid Accent 3" w:uiPriority="73"/>
+    <w:lsdException w:name="Light Shading Accent 4" w:uiPriority="60"/>
+    <w:lsdException w:name="Light List Accent 4" w:uiPriority="61"/>
+    <w:lsdException w:name="Light Grid Accent 4" w:uiPriority="62"/>
+    <w:lsdException w:name="Medium Shading 1 Accent 4" w:uiPriority="63"/>
+    <w:lsdException w:name="Medium Shading 2 Accent 4" w:uiPriority="64"/>
+    <w:lsdException w:name="Medium List 1 Accent 4" w:uiPriority="65"/>
+    <w:lsdException w:name="Medium List 2 Accent 4" w:uiPriority="66"/>
+    <w:lsdException w:name="Medium Grid 1 Accent 4" w:uiPriority="67"/>
+    <w:lsdException w:name="Medium Grid 2 Accent 4" w:uiPriority="68"/>
+    <w:lsdException w:name="Medium Grid 3 Accent 4" w:uiPriority="69"/>
+    <w:lsdException w:name="Dark List Accent 4" w:uiPriority="70"/>
+    <w:lsdException w:name="Colorful Shading Accent 4" w:uiPriority="71"/>
+    <w:lsdException w:name="Colorful List Accent 4" w:uiPriority="72"/>
+    <w:lsdException w:name="Colorful Grid Accent 4" w:uiPriority="73"/>
+    <w:lsdException w:name="Light Shading Accent 5" w:uiPriority="60"/>
+    <w:lsdException w:name="Light List Accent 5" w:uiPriority="61"/>
+    <w:lsdException w:name="Light Grid Accent 5" w:uiPriority="62"/>
+    <w:lsdException w:name="Medium Shading 1 Accent 5" w:uiPriority="63"/>
+    <w:lsdException w:name="Medium Shading 2 Accent 5" w:uiPriority="64"/>
+    <w:lsdException w:name="Medium List 1 Accent 5" w:uiPriority="65"/>
+    <w:lsdException w:name="Medium List 2 Accent 5" w:uiPriority="66"/>
+    <w:lsdException w:name="Medium Grid 1 Accent 5" w:uiPriority="67"/>
+    <w:lsdException w:name="Medium Grid 2 Accent 5" w:uiPriority="68"/>
+    <w:lsdException w:name="Medium Grid 3 Accent 5" w:uiPriority="69"/>
+    <w:lsdException w:name="Dark List Accent 5" w:uiPriority="70"/>
+    <w:lsdException w:name="Colorful Shading Accent 5" w:uiPriority="71"/>
+    <w:lsdException w:name="Colorful List Accent 5" w:uiPriority="72"/>
+    <w:lsdException w:name="Colorful Grid Accent 5" w:uiPriority="73"/>
+    <w:lsdException w:name="Light Shading Accent 6" w:uiPriority="60"/>
+    <w:lsdException w:name="Light List Accent 6" w:uiPriority="61"/>
+    <w:lsdException w:name="Light Grid Accent 6" w:uiPriority="62"/>
+    <w:lsdException w:name="Medium Shading 1 Accent 6" w:uiPriority="63"/>
+    <w:lsdException w:name="Medium Shading 2 Accent 6" w:uiPriority="64"/>
+    <w:lsdException w:name="Medium List 1 Accent 6" w:uiPriority="65"/>
+    <w:lsdException w:name="Medium List 2 Accent 6" w:uiPriority="66"/>
+    <w:lsdException w:name="Medium Grid 1 Accent 6" w:uiPriority="67"/>
+    <w:lsdException w:name="Medium Grid 2 Accent 6" w:uiPriority="68"/>
+    <w:lsdException w:name="Medium Grid 3 Accent 6" w:uiPriority="69"/>
+    <w:lsdException w:name="Dark List Accent 6" w:uiPriority="70"/>
+    <w:lsdException w:name="Colorful Shading Accent 6" w:uiPriority="71"/>
+    <w:lsdException w:name="Colorful List Accent 6" w:uiPriority="72"/>
+    <w:lsdException w:name="Colorful Grid Accent 6" w:uiPriority="73"/>
+    <w:lsdException w:name="Subtle Emphasis" w:uiPriority="19" w:qFormat="1"/>
+    <w:lsdException w:name="Intense Emphasis" w:uiPriority="21" w:qFormat="1"/>
+    <w:lsdException w:name="Subtle Reference" w:uiPriority="31" w:qFormat="1"/>
+    <w:lsdException w:name="Intense Reference" w:uiPriority="32" w:qFormat="1"/>
+    <w:lsdException w:name="Book Title" w:uiPriority="33" w:qFormat="1"/>
+    <w:lsdException w:name="Bibliography" w:semiHidden="1" w:uiPriority="37" w:unhideWhenUsed="1"/>
+    <w:lsdException w:name="TOC Heading" w:semiHidden="1" w:uiPriority="39" w:unhideWhenUsed="1" w:qFormat="1"/>
+    <w:lsdException w:name="Plain Table 1" w:uiPriority="41"/>
+    <w:lsdException w:name="Plain Table 2" w:uiPriority="42"/>
+    <w:lsdException w:name="Plain Table 3" w:uiPriority="43"/>
+    <w:lsdException w:name="Plain Table 4" w:uiPriority="44"/>
+    <w:lsdException w:name="Plain Table 5" w:uiPriority="45"/>
+    <w:lsdException w:name="Grid Table Light" w:uiPriority="40"/>
+    <w:lsdException w:name="Grid Table 1 Light" w:uiPriority="46"/>
+    <w:lsdException w:name="Grid Table 2" w:uiPriority="47"/>
+    <w:lsdException w:name="Grid Table 3" w:uiPriority="48"/>
+    <w:lsdException w:name="Grid Table 4" w:uiPriority="49"/>
+    <w:lsdException w:name="Grid Table 5 Dark" w:uiPriority="50"/>
+    <w:lsdException w:name="Grid Table 6 Colorful" w:uiPriority="51"/>
+    <w:lsdException w:name="Grid Table 7 Colorful" w:uiPriority="52"/>
+    <w:lsdException w:name="Grid Table 1 Light Accent 1" w:uiPriority="46"/>
+    <w:lsdException w:name="Grid Table 2 Accent 1" w:uiPriority="47"/>
+    <w:lsdException w:name="Grid Table 3 Accent 1" w:uiPriority="48"/>
+    <w:lsdException w:name="Grid Table 4 Accent 1" w:uiPriority="49"/>
+    <w:lsdException w:name="Grid Table 5 Dark Accent 1" w:uiPriority="50"/>
+    <w:lsdException w:name="Grid Table 6 Colorful Accent 1" w:uiPriority="51"/>
+    <w:lsdException w:name="Grid Table 7 Colorful Accent 1" w:uiPriority="52"/>
+    <w:lsdException w:name="Grid Table 1 Light Accent 2" w:uiPriority="46"/>
+    <w:lsdException w:name="Grid Table 2 Accent 2" w:uiPriority="47"/>
+    <w:lsdException w:name="Grid Table 3 Accent 2" w:uiPriority="48"/>
+    <w:lsdException w:name="Grid Table 4 Accent 2" w:uiPriority="49"/>
+    <w:lsdException w:name="Grid Table 5 Dark Accent 2" w:uiPriority="50"/>
+    <w:lsdException w:name="Grid Table 6 Colorful Accent 2" w:uiPriority="51"/>
+    <w:lsdException w:name="Grid Table 7 Colorful Accent 2" w:uiPriority="52"/>
+    <w:lsdException w:name="Grid Table 1 Light Accent 3" w:uiPriority="46"/>
+    <w:lsdException w:name="Grid Table 2 Accent 3" w:uiPriority="47"/>
+    <w:lsdException w:name="Grid Table 3 Accent 3" w:uiPriority="48"/>
+    <w:lsdException w:name="Grid Table 4 Accent 3" w:uiPriority="49"/>
+    <w:lsdException w:name="Grid Table 5 Dark Accent 3" w:uiPriority="50"/>
+    <w:lsdException w:name="Grid Table 6 Colorful Accent 3" w:uiPriority="51"/>
+    <w:lsdException w:name="Grid Table 7 Colorful Accent 3" w:uiPriority="52"/>
+    <w:lsdException w:name="Grid Table 1 Light Accent 4" w:uiPriority="46"/>
+    <w:lsdException w:name="Grid Table 2 Accent 4" w:uiPriority="47"/>
+    <w:lsdException w:name="Grid Table 3 Accent 4" w:uiPriority="48"/>
+    <w:lsdException w:name="Grid Table 4 Accent 4" w:uiPriority="49"/>
+    <w:lsdException w:name="Grid Table 5 Dark Accent 4" w:uiPriority="50"/>
+    <w:lsdException w:name="Grid Table 6 Colorful Accent 4" w:uiPriority="51"/>
+    <w:lsdException w:name="Grid Table 7 Colorful Accent 4" w:uiPriority="52"/>
+    <w:lsdException w:name="Grid Table 1 Light Accent 5" w:uiPriority="46"/>
+    <w:lsdException w:name="Grid Table 2 Accent 5" w:uiPriority="47"/>
+    <w:lsdException w:name="Grid Table 3 Accent 5" w:uiPriority="48"/>
+    <w:lsdException w:name="Grid Table 4 Accent 5" w:uiPriority="49"/>
+    <w:lsdException w:name="Grid Table 5 Dark Accent 5" w:uiPriority="50"/>
+    <w:lsdException w:name="Grid Table 6 Colorful Accent 5" w:uiPriority="51"/>
+    <w:lsdException w:name="Grid Table 7 Colorful Accent 5" w:uiPriority="52"/>
+    <w:lsdException w:name="Grid Table 1 Light Accent 6" w:uiPriority="46"/>
+    <w:lsdException w:name="Grid Table 2 Accent 6" w:uiPriority="47"/>
+    <w:lsdException w:name="Grid Table 3 Accent 6" w:uiPriority="48"/>
+    <w:lsdException w:name="Grid Table 4 Accent 6" w:uiPriority="49"/>
+    <w:lsdException w:name="Grid Table 5 Dark Accent 6" w:uiPriority="50"/>
+    <w:lsdException w:name="Grid Table 6 Colorful Accent 6" w:uiPriority="51"/>
+    <w:lsdException w:name="Grid Table 7 Colorful Accent 6" w:uiPriority="52"/>
+    <w:lsdException w:name="List Table 1 Light" w:uiPriority="46"/>
+    <w:lsdException w:name="List Table 2" w:uiPriority="47"/>
+    <w:lsdException w:name="List Table 3" w:uiPriority="48"/>
+    <w:lsdException w:name="List Table 4" w:uiPriority="49"/>
+    <w:lsdException w:name="List Table 5 Dark" w:uiPriority="50"/>
+    <w:lsdException w:name="List Table 6 Colorful" w:uiPriority="51"/>
+    <w:lsdException w:name="List Table 7 Colorful" w:uiPriority="52"/>
+    <w:lsdException w:name="List Table 1 Light Accent 1" w:uiPriority="46"/>
+    <w:lsdException w:name="List Table 2 Accent 1" w:uiPriority="47"/>
+    <w:lsdException w:name="List Table 3 Accent 1" w:uiPriority="48"/>
+    <w:lsdException w:name="List Table 4 Accent 1" w:uiPriority="49"/>
+    <w:lsdException w:name="List Table 5 Dark Accent 1" w:uiPriority="50"/>
+    <w:lsdException w:name="List Table 6 Colorful Accent 1" w:uiPriority="51"/>
+    <w:lsdException w:name="List Table 7 Colorful Accent 1" w:uiPriority="52"/>
+    <w:lsdException w:name="List Table 1 Light Accent 2" w:uiPriority="46"/>
+    <w:lsdException w:name="List Table 2 Accent 2" w:uiPriority="47"/>
+    <w:lsdException w:name="List Table 3 Accent 2" w:uiPriority="48"/>
+    <w:lsdException w:name="List Table 4 Accent 2" w:uiPriority="49"/>
+    <w:lsdException w:name="List Table 5 Dark Accent 2" w:uiPriority="50"/>
+    <w:lsdException w:name="List Table 6 Colorful Accent 2" w:uiPriority="51"/>
+    <w:lsdException w:name="List Table 7 Colorful Accent 2" w:uiPriority="52"/>
+    <w:lsdException w:name="List Table 1 Light Accent 3" w:uiPriority="46"/>
+    <w:lsdException w:name="List Table 2 Accent 3" w:uiPriority="47"/>
+    <w:lsdException w:name="List Table 3 Accent 3" w:uiPriority="48"/>
+    <w:lsdException w:name="List Table 4 Accent 3" w:uiPriority="49"/>
+    <w:lsdException w:name="List Table 5 Dark Accent 3" w:uiPriority="50"/>
+    <w:lsdException w:name="List Table 6 Colorful Accent 3" w:uiPriority="51"/>
+    <w:lsdException w:name="List Table 7 Colorful Accent 3" w:uiPriority="52"/>
+    <w:lsdException w:name="List Table 1 Light Accent 4" w:uiPriority="46"/>
+    <w:lsdException w:name="List Table 2 Accent 4" w:uiPriority="47"/>
+    <w:lsdException w:name="List Table 3 Accent 4" w:uiPriority="48"/>
+    <w:lsdException w:name="List Table 4 Accent 4" w:uiPriority="49"/>
+    <w:lsdException w:name="List Table 5 Dark Accent 4" w:uiPriority="50"/>
+    <w:lsdException w:name="List Table 6 Colorful Accent 4" w:uiPriority="51"/>
+    <w:lsdException w:name="List Table 7 Colorful Accent 4" w:uiPriority="52"/>
+    <w:lsdException w:name="List Table 1 Light Accent 5" w:uiPriority="46"/>
+    <w:lsdException w:name="List Table 2 Accent 5" w:uiPriority="47"/>
+    <w:lsdException w:name="List Table 3 Accent 5" w:uiPriority="48"/>
+    <w:lsdException w:name="List Table 4 Accent 5" w:uiPriority="49"/>
+    <w:lsdException w:name="List Table 5 Dark Accent 5" w:uiPriority="50"/>
+    <w:lsdException w:name="List Table 6 Colorful Accent 5" w:uiPriority="51"/>
+    <w:lsdException w:name="List Table 7 Colorful Accent 5" w:uiPriority="52"/>
+    <w:lsdException w:name="List Table 1 Light Accent 6" w:uiPriority="46"/>
+    <w:lsdException w:name="List Table 2 Accent 6" w:uiPriority="47"/>
+    <w:lsdException w:name="List Table 3 Accent 6" w:uiPriority="48"/>
+    <w:lsdException w:name="List Table 4 Accent 6" w:uiPriority="49"/>
+    <w:lsdException w:name="List Table 5 Dark Accent 6" w:uiPriority="50"/>
+    <w:lsdException w:name="List Table 6 Colorful Accent 6" w:uiPriority="51"/>
+    <w:lsdException w:name="List Table 7 Colorful Accent 6" w:uiPriority="52"/>
+    <w:lsdException w:name="Mention" w:semiHidden="1" w:unhideWhenUsed="1"/>
+    <w:lsdException w:name="Smart Hyperlink" w:semiHidden="1" w:unhideWhenUsed="1"/>
+    <w:lsdException w:name="Hashtag" w:semiHidden="1" w:unhideWhenUsed="1"/>
+    <w:lsdException w:name="Unresolved Mention" w:semiHidden="1" w:unhideWhenUsed="1"/>
+    <w:lsdException w:name="Smart Link" w:semiHidden="1" w:unhideWhenUsed="1"/>
   </w:latentStyles>
   <w:style w:type="paragraph" w:default="1" w:styleId="Normal">
     <w:name w:val="Normal"/>
@@ -7394,1746 +6297,8 @@
     <w:qFormat/>
     <w:rsid w:val="000F4FEF"/>
   </w:style>
-  <w:style w:type="character" w:customStyle="1" w:styleId="UnresolvedMention">
-    <w:name w:val="Unresolved Mention"/>
-    <w:basedOn w:val="DefaultParagraphFont"/>
-    <w:uiPriority w:val="99"/>
-    <w:semiHidden/>
-    <w:unhideWhenUsed/>
-    <w:rsid w:val="005E785C"/>
-    <w:rPr>
-      <w:color w:val="605E5C"/>
-      <w:shd w:val="clear" w:color="auto" w:fill="E1DFDD"/>
-    </w:rPr>
-  </w:style>
-  <w:style w:type="paragraph" w:customStyle="1" w:styleId="interviewsituationcondition">
-    <w:name w:val="interview situation condition"/>
-    <w:basedOn w:val="Heading1"/>
-    <w:next w:val="Heading2"/>
-    <w:qFormat/>
-    <w:rsid w:val="000F4FEF"/>
-    <w:pPr>
-      <w:keepNext/>
-      <w:keepLines/>
-      <w:pBdr>
-        <w:bottom w:val="none" w:sz="0" w:space="0" w:color="auto"/>
-      </w:pBdr>
-      <w:spacing w:after="60" w:afterAutospacing="0"/>
-    </w:pPr>
-    <w:rPr>
-      <w:rFonts w:asciiTheme="majorHAnsi" w:eastAsiaTheme="majorEastAsia" w:hAnsiTheme="majorHAnsi" w:cstheme="majorBidi"/>
-      <w:color w:val="FF0000"/>
-      <w:spacing w:val="0"/>
-      <w:sz w:val="24"/>
-      <w:szCs w:val="26"/>
-    </w:rPr>
-  </w:style>
-  <w:style w:type="paragraph" w:customStyle="1" w:styleId="heading">
-    <w:name w:val="heading"/>
-    <w:basedOn w:val="Normal"/>
-    <w:rsid w:val="00DD3DDA"/>
-    <w:pPr>
-      <w:spacing w:before="100" w:after="100"/>
-    </w:pPr>
-    <w:rPr>
-      <w:rFonts w:ascii="Times New Roman" w:eastAsia="Times New Roman" w:hAnsi="Times New Roman" w:cs="Times New Roman"/>
-      <w:sz w:val="24"/>
-      <w:szCs w:val="24"/>
-    </w:rPr>
-  </w:style>
-  <w:style w:type="character" w:customStyle="1" w:styleId="Interviewpinknote">
-    <w:name w:val="Interview pink note"/>
-    <w:basedOn w:val="BodyChar"/>
-    <w:uiPriority w:val="1"/>
-    <w:qFormat/>
-    <w:rsid w:val="00DD3DDA"/>
-    <w:rPr>
-      <w:rFonts w:ascii="Helvetica" w:eastAsiaTheme="minorHAnsi" w:hAnsi="Helvetica" w:cs="Tahoma"/>
-      <w:b w:val="0"/>
-      <w:bCs/>
-      <w:color w:val="FF99FF"/>
-      <w:sz w:val="24"/>
-      <w:szCs w:val="24"/>
-    </w:rPr>
-  </w:style>
-  <w:style w:type="paragraph" w:customStyle="1" w:styleId="interviewsituationp">
-    <w:name w:val="interview situation p"/>
-    <w:basedOn w:val="Body"/>
-    <w:next w:val="interviewsituationcondition"/>
-    <w:qFormat/>
-    <w:rsid w:val="00DD3DDA"/>
-    <w:pPr>
-      <w:spacing w:before="240" w:after="0" w:line="240" w:lineRule="auto"/>
-      <w:contextualSpacing/>
-    </w:pPr>
-  </w:style>
-  <w:style w:type="character" w:customStyle="1" w:styleId="Heading5Char">
-    <w:name w:val="Heading 5 Char"/>
-    <w:basedOn w:val="DefaultParagraphFont"/>
-    <w:link w:val="Heading5"/>
-    <w:uiPriority w:val="9"/>
-    <w:rsid w:val="000F4FEF"/>
-    <w:rPr>
-      <w:rFonts w:ascii="Arial" w:hAnsi="Arial" w:cs="Arial"/>
-      <w:color w:val="666666"/>
-    </w:rPr>
-  </w:style>
-  <w:style w:type="character" w:customStyle="1" w:styleId="Heading6Char">
-    <w:name w:val="Heading 6 Char"/>
-    <w:basedOn w:val="DefaultParagraphFont"/>
-    <w:link w:val="Heading6"/>
-    <w:uiPriority w:val="9"/>
-    <w:semiHidden/>
-    <w:rsid w:val="000F4FEF"/>
-    <w:rPr>
-      <w:rFonts w:ascii="Arial" w:hAnsi="Arial" w:cs="Arial"/>
-      <w:i/>
-      <w:color w:val="666666"/>
-    </w:rPr>
-  </w:style>
-  <w:style w:type="paragraph" w:styleId="TOC1">
-    <w:name w:val="toc 1"/>
-    <w:basedOn w:val="Normal"/>
-    <w:next w:val="Normal"/>
-    <w:autoRedefine/>
-    <w:uiPriority w:val="39"/>
-    <w:unhideWhenUsed/>
-    <w:rsid w:val="000F4FEF"/>
-    <w:pPr>
-      <w:spacing w:after="100"/>
-    </w:pPr>
-  </w:style>
-  <w:style w:type="paragraph" w:styleId="TOC2">
-    <w:name w:val="toc 2"/>
-    <w:basedOn w:val="Normal"/>
-    <w:next w:val="Normal"/>
-    <w:autoRedefine/>
-    <w:uiPriority w:val="39"/>
-    <w:unhideWhenUsed/>
-    <w:rsid w:val="000F4FEF"/>
-    <w:pPr>
-      <w:spacing w:after="100"/>
-      <w:ind w:left="240"/>
-    </w:pPr>
-  </w:style>
-  <w:style w:type="paragraph" w:styleId="TOC3">
-    <w:name w:val="toc 3"/>
-    <w:basedOn w:val="Normal"/>
-    <w:next w:val="Normal"/>
-    <w:autoRedefine/>
-    <w:uiPriority w:val="39"/>
-    <w:unhideWhenUsed/>
-    <w:rsid w:val="000F4FEF"/>
-    <w:pPr>
-      <w:spacing w:after="100"/>
-      <w:ind w:left="480"/>
-    </w:pPr>
-  </w:style>
-  <w:style w:type="paragraph" w:styleId="CommentText">
-    <w:name w:val="annotation text"/>
-    <w:basedOn w:val="Normal"/>
-    <w:link w:val="CommentTextChar"/>
-    <w:uiPriority w:val="99"/>
-    <w:unhideWhenUsed/>
-    <w:qFormat/>
-    <w:rsid w:val="000F4FEF"/>
-    <w:rPr>
-      <w:sz w:val="20"/>
-      <w:szCs w:val="20"/>
-    </w:rPr>
-  </w:style>
-  <w:style w:type="character" w:customStyle="1" w:styleId="CommentTextChar">
-    <w:name w:val="Comment Text Char"/>
-    <w:basedOn w:val="DefaultParagraphFont"/>
-    <w:link w:val="CommentText"/>
-    <w:uiPriority w:val="99"/>
-    <w:qFormat/>
-    <w:rsid w:val="000F4FEF"/>
-    <w:rPr>
-      <w:rFonts w:ascii="Arial" w:hAnsi="Arial" w:cs="Arial"/>
-      <w:sz w:val="20"/>
-      <w:szCs w:val="20"/>
-    </w:rPr>
-  </w:style>
-  <w:style w:type="paragraph" w:styleId="Header">
-    <w:name w:val="header"/>
-    <w:basedOn w:val="Normal"/>
-    <w:link w:val="HeaderChar"/>
-    <w:uiPriority w:val="99"/>
-    <w:unhideWhenUsed/>
-    <w:rsid w:val="000F4FEF"/>
-    <w:pPr>
-      <w:tabs>
-        <w:tab w:val="center" w:pos="4680"/>
-        <w:tab w:val="right" w:pos="9360"/>
-      </w:tabs>
-    </w:pPr>
-  </w:style>
-  <w:style w:type="character" w:customStyle="1" w:styleId="HeaderChar">
-    <w:name w:val="Header Char"/>
-    <w:basedOn w:val="DefaultParagraphFont"/>
-    <w:link w:val="Header"/>
-    <w:uiPriority w:val="99"/>
-    <w:rsid w:val="000F4FEF"/>
-    <w:rPr>
-      <w:rFonts w:ascii="Arial" w:hAnsi="Arial" w:cs="Arial"/>
-    </w:rPr>
-  </w:style>
-  <w:style w:type="character" w:styleId="CommentReference">
-    <w:name w:val="annotation reference"/>
-    <w:basedOn w:val="DefaultParagraphFont"/>
-    <w:uiPriority w:val="99"/>
-    <w:semiHidden/>
-    <w:unhideWhenUsed/>
-    <w:qFormat/>
-    <w:rsid w:val="000F4FEF"/>
-    <w:rPr>
-      <w:sz w:val="16"/>
-      <w:szCs w:val="16"/>
-    </w:rPr>
-  </w:style>
-  <w:style w:type="paragraph" w:styleId="Title">
-    <w:name w:val="Title"/>
-    <w:basedOn w:val="Normal"/>
-    <w:next w:val="Normal"/>
-    <w:link w:val="TitleChar"/>
-    <w:uiPriority w:val="10"/>
-    <w:qFormat/>
-    <w:rsid w:val="000F4FEF"/>
-    <w:pPr>
-      <w:spacing w:before="0" w:beforeAutospacing="0" w:after="100" w:line="276" w:lineRule="auto"/>
-    </w:pPr>
-    <w:rPr>
-      <w:rFonts w:ascii="Helvetica" w:hAnsi="Helvetica" w:cs="Helvetica"/>
-      <w:color w:val="0A2A78"/>
-      <w:spacing w:val="-2"/>
-      <w:sz w:val="48"/>
-      <w:szCs w:val="24"/>
-    </w:rPr>
-  </w:style>
-  <w:style w:type="character" w:customStyle="1" w:styleId="TitleChar">
-    <w:name w:val="Title Char"/>
-    <w:basedOn w:val="DefaultParagraphFont"/>
-    <w:link w:val="Title"/>
-    <w:uiPriority w:val="10"/>
-    <w:qFormat/>
-    <w:rsid w:val="000F4FEF"/>
-    <w:rPr>
-      <w:rFonts w:ascii="Helvetica" w:hAnsi="Helvetica" w:cs="Helvetica"/>
-      <w:color w:val="0A2A78"/>
-      <w:spacing w:val="-2"/>
-      <w:sz w:val="48"/>
-      <w:szCs w:val="24"/>
-    </w:rPr>
-  </w:style>
-  <w:style w:type="paragraph" w:styleId="Subtitle">
-    <w:name w:val="Subtitle"/>
-    <w:basedOn w:val="Normal"/>
-    <w:next w:val="Normal"/>
-    <w:link w:val="SubtitleChar"/>
-    <w:uiPriority w:val="11"/>
-    <w:qFormat/>
-    <w:rsid w:val="000F4FEF"/>
-    <w:pPr>
-      <w:keepNext/>
-      <w:keepLines/>
-      <w:spacing w:after="320"/>
-    </w:pPr>
-    <w:rPr>
-      <w:color w:val="666666"/>
-      <w:sz w:val="30"/>
-      <w:szCs w:val="30"/>
-    </w:rPr>
-  </w:style>
-  <w:style w:type="character" w:customStyle="1" w:styleId="SubtitleChar">
-    <w:name w:val="Subtitle Char"/>
-    <w:basedOn w:val="DefaultParagraphFont"/>
-    <w:link w:val="Subtitle"/>
-    <w:uiPriority w:val="11"/>
-    <w:rsid w:val="000F4FEF"/>
-    <w:rPr>
-      <w:rFonts w:ascii="Arial" w:hAnsi="Arial" w:cs="Arial"/>
-      <w:color w:val="666666"/>
-      <w:sz w:val="30"/>
-      <w:szCs w:val="30"/>
-    </w:rPr>
-  </w:style>
-  <w:style w:type="character" w:styleId="FollowedHyperlink">
-    <w:name w:val="FollowedHyperlink"/>
-    <w:basedOn w:val="DefaultParagraphFont"/>
-    <w:uiPriority w:val="99"/>
-    <w:semiHidden/>
-    <w:unhideWhenUsed/>
-    <w:rsid w:val="000F4FEF"/>
-    <w:rPr>
-      <w:color w:val="954F72" w:themeColor="followedHyperlink"/>
-      <w:u w:val="single"/>
-    </w:rPr>
-  </w:style>
-  <w:style w:type="character" w:styleId="Strong">
-    <w:name w:val="Strong"/>
-    <w:basedOn w:val="DefaultParagraphFont"/>
-    <w:uiPriority w:val="22"/>
-    <w:qFormat/>
-    <w:rsid w:val="000F4FEF"/>
-    <w:rPr>
-      <w:b/>
-      <w:bCs/>
-    </w:rPr>
-  </w:style>
-  <w:style w:type="character" w:styleId="Emphasis">
-    <w:name w:val="Emphasis"/>
-    <w:basedOn w:val="DefaultParagraphFont"/>
-    <w:uiPriority w:val="20"/>
-    <w:qFormat/>
-    <w:rsid w:val="000F4FEF"/>
-    <w:rPr>
-      <w:i/>
-      <w:iCs/>
-    </w:rPr>
-  </w:style>
-  <w:style w:type="paragraph" w:styleId="PlainText">
-    <w:name w:val="Plain Text"/>
-    <w:basedOn w:val="Normal"/>
-    <w:link w:val="PlainTextChar"/>
-    <w:uiPriority w:val="99"/>
-    <w:semiHidden/>
-    <w:unhideWhenUsed/>
-    <w:rsid w:val="00DD3DDA"/>
-    <w:pPr>
-      <w:spacing w:after="0"/>
-    </w:pPr>
-    <w:rPr>
-      <w:sz w:val="24"/>
-      <w:szCs w:val="21"/>
-    </w:rPr>
-  </w:style>
-  <w:style w:type="character" w:customStyle="1" w:styleId="PlainTextChar">
-    <w:name w:val="Plain Text Char"/>
-    <w:basedOn w:val="DefaultParagraphFont"/>
-    <w:link w:val="PlainText"/>
-    <w:uiPriority w:val="99"/>
-    <w:semiHidden/>
-    <w:rsid w:val="00DD3DDA"/>
-    <w:rPr>
-      <w:rFonts w:ascii="Arial" w:hAnsi="Arial" w:cs="Arial"/>
-      <w:sz w:val="24"/>
-      <w:szCs w:val="21"/>
-    </w:rPr>
-  </w:style>
-  <w:style w:type="paragraph" w:styleId="NormalWeb">
-    <w:name w:val="Normal (Web)"/>
-    <w:basedOn w:val="Normal"/>
-    <w:uiPriority w:val="99"/>
-    <w:unhideWhenUsed/>
-    <w:rsid w:val="000F4FEF"/>
-    <w:pPr>
-      <w:spacing w:before="100" w:after="100"/>
-    </w:pPr>
-    <w:rPr>
-      <w:rFonts w:ascii="Times New Roman" w:eastAsia="Times New Roman" w:hAnsi="Times New Roman" w:cs="Times New Roman"/>
-      <w:sz w:val="24"/>
-      <w:szCs w:val="24"/>
-    </w:rPr>
-  </w:style>
-  <w:style w:type="paragraph" w:styleId="HTMLPreformatted">
-    <w:name w:val="HTML Preformatted"/>
-    <w:basedOn w:val="Normal"/>
-    <w:link w:val="HTMLPreformattedChar"/>
-    <w:uiPriority w:val="99"/>
-    <w:semiHidden/>
-    <w:unhideWhenUsed/>
-    <w:rsid w:val="000F4FEF"/>
-    <w:pPr>
-      <w:tabs>
-        <w:tab w:val="left" w:pos="916"/>
-        <w:tab w:val="left" w:pos="1832"/>
-        <w:tab w:val="left" w:pos="2748"/>
-        <w:tab w:val="left" w:pos="3664"/>
-        <w:tab w:val="left" w:pos="4580"/>
-        <w:tab w:val="left" w:pos="5496"/>
-        <w:tab w:val="left" w:pos="6412"/>
-        <w:tab w:val="left" w:pos="7328"/>
-        <w:tab w:val="left" w:pos="8244"/>
-        <w:tab w:val="left" w:pos="9160"/>
-        <w:tab w:val="left" w:pos="10076"/>
-        <w:tab w:val="left" w:pos="10992"/>
-        <w:tab w:val="left" w:pos="11908"/>
-        <w:tab w:val="left" w:pos="12824"/>
-        <w:tab w:val="left" w:pos="13740"/>
-        <w:tab w:val="left" w:pos="14656"/>
-      </w:tabs>
-      <w:spacing w:before="0" w:beforeAutospacing="0" w:after="0" w:afterAutospacing="0"/>
-    </w:pPr>
-    <w:rPr>
-      <w:rFonts w:ascii="Courier New" w:eastAsia="Times New Roman" w:hAnsi="Courier New" w:cs="Courier New"/>
-      <w:sz w:val="20"/>
-      <w:szCs w:val="20"/>
-    </w:rPr>
-  </w:style>
-  <w:style w:type="character" w:customStyle="1" w:styleId="HTMLPreformattedChar">
-    <w:name w:val="HTML Preformatted Char"/>
-    <w:basedOn w:val="DefaultParagraphFont"/>
-    <w:link w:val="HTMLPreformatted"/>
-    <w:uiPriority w:val="99"/>
-    <w:semiHidden/>
-    <w:rsid w:val="000F4FEF"/>
-    <w:rPr>
-      <w:rFonts w:ascii="Courier New" w:eastAsia="Times New Roman" w:hAnsi="Courier New" w:cs="Courier New"/>
-      <w:sz w:val="20"/>
-      <w:szCs w:val="20"/>
-    </w:rPr>
-  </w:style>
-  <w:style w:type="paragraph" w:styleId="CommentSubject">
-    <w:name w:val="annotation subject"/>
-    <w:basedOn w:val="CommentText"/>
-    <w:next w:val="CommentText"/>
-    <w:link w:val="CommentSubjectChar"/>
-    <w:uiPriority w:val="99"/>
-    <w:semiHidden/>
-    <w:unhideWhenUsed/>
-    <w:rsid w:val="000F4FEF"/>
-    <w:rPr>
-      <w:b/>
-      <w:bCs/>
-    </w:rPr>
-  </w:style>
-  <w:style w:type="character" w:customStyle="1" w:styleId="CommentSubjectChar">
-    <w:name w:val="Comment Subject Char"/>
-    <w:basedOn w:val="CommentTextChar"/>
-    <w:link w:val="CommentSubject"/>
-    <w:uiPriority w:val="99"/>
-    <w:semiHidden/>
-    <w:rsid w:val="000F4FEF"/>
-    <w:rPr>
-      <w:rFonts w:ascii="Arial" w:hAnsi="Arial" w:cs="Arial"/>
-      <w:b/>
-      <w:bCs/>
-      <w:sz w:val="20"/>
-      <w:szCs w:val="20"/>
-    </w:rPr>
-  </w:style>
-  <w:style w:type="paragraph" w:styleId="BalloonText">
-    <w:name w:val="Balloon Text"/>
-    <w:basedOn w:val="Normal"/>
-    <w:link w:val="BalloonTextChar"/>
-    <w:uiPriority w:val="99"/>
-    <w:semiHidden/>
-    <w:unhideWhenUsed/>
-    <w:rsid w:val="000F4FEF"/>
-    <w:rPr>
-      <w:rFonts w:ascii="Segoe UI" w:hAnsi="Segoe UI" w:cs="Segoe UI"/>
-      <w:sz w:val="18"/>
-      <w:szCs w:val="18"/>
-    </w:rPr>
-  </w:style>
-  <w:style w:type="character" w:customStyle="1" w:styleId="BalloonTextChar">
-    <w:name w:val="Balloon Text Char"/>
-    <w:basedOn w:val="DefaultParagraphFont"/>
-    <w:link w:val="BalloonText"/>
-    <w:uiPriority w:val="99"/>
-    <w:semiHidden/>
-    <w:rsid w:val="000F4FEF"/>
-    <w:rPr>
-      <w:rFonts w:ascii="Segoe UI" w:hAnsi="Segoe UI" w:cs="Segoe UI"/>
-      <w:sz w:val="18"/>
-      <w:szCs w:val="18"/>
-    </w:rPr>
-  </w:style>
-  <w:style w:type="table" w:styleId="TableGrid">
-    <w:name w:val="Table Grid"/>
-    <w:basedOn w:val="TableNormal"/>
-    <w:uiPriority w:val="39"/>
-    <w:rsid w:val="000F4FEF"/>
-    <w:pPr>
-      <w:widowControl w:val="0"/>
-      <w:autoSpaceDE w:val="0"/>
-      <w:autoSpaceDN w:val="0"/>
-      <w:spacing w:beforeAutospacing="0" w:after="0" w:afterAutospacing="0" w:line="240" w:lineRule="auto"/>
-    </w:pPr>
-    <w:rPr>
-      <w:rFonts w:eastAsiaTheme="minorHAnsi"/>
-    </w:rPr>
-    <w:tblPr>
-      <w:tblBorders>
-        <w:top w:val="single" w:sz="4" w:space="0" w:color="auto"/>
-        <w:left w:val="single" w:sz="4" w:space="0" w:color="auto"/>
-        <w:bottom w:val="single" w:sz="4" w:space="0" w:color="auto"/>
-        <w:right w:val="single" w:sz="4" w:space="0" w:color="auto"/>
-        <w:insideH w:val="single" w:sz="4" w:space="0" w:color="auto"/>
-        <w:insideV w:val="single" w:sz="4" w:space="0" w:color="auto"/>
-      </w:tblBorders>
-    </w:tblPr>
-  </w:style>
-  <w:style w:type="paragraph" w:styleId="NoSpacing">
-    <w:name w:val="No Spacing"/>
-    <w:uiPriority w:val="1"/>
-    <w:qFormat/>
-    <w:rsid w:val="00DD3DDA"/>
-    <w:pPr>
-      <w:spacing w:beforeAutospacing="0" w:after="0" w:afterAutospacing="0"/>
-    </w:pPr>
-    <w:rPr>
-      <w:rFonts w:ascii="Helvetica" w:eastAsiaTheme="minorHAnsi" w:hAnsi="Helvetica"/>
-      <w:sz w:val="24"/>
-    </w:rPr>
-  </w:style>
-  <w:style w:type="paragraph" w:styleId="Quote">
-    <w:name w:val="Quote"/>
-    <w:basedOn w:val="Normal"/>
-    <w:next w:val="Normal"/>
-    <w:link w:val="QuoteChar"/>
-    <w:uiPriority w:val="29"/>
-    <w:rsid w:val="000F4FEF"/>
-    <w:pPr>
-      <w:spacing w:before="200" w:after="160"/>
-      <w:ind w:left="864" w:right="864"/>
-      <w:jc w:val="center"/>
-    </w:pPr>
-    <w:rPr>
-      <w:i/>
-      <w:iCs/>
-      <w:color w:val="404040" w:themeColor="text1" w:themeTint="BF"/>
-    </w:rPr>
-  </w:style>
-  <w:style w:type="character" w:customStyle="1" w:styleId="QuoteChar">
-    <w:name w:val="Quote Char"/>
-    <w:basedOn w:val="DefaultParagraphFont"/>
-    <w:link w:val="Quote"/>
-    <w:uiPriority w:val="29"/>
-    <w:rsid w:val="000F4FEF"/>
-    <w:rPr>
-      <w:rFonts w:ascii="Arial" w:hAnsi="Arial" w:cs="Arial"/>
-      <w:i/>
-      <w:iCs/>
-      <w:color w:val="404040" w:themeColor="text1" w:themeTint="BF"/>
-    </w:rPr>
-  </w:style>
-  <w:style w:type="character" w:styleId="SubtleEmphasis">
-    <w:name w:val="Subtle Emphasis"/>
-    <w:basedOn w:val="DefaultParagraphFont"/>
-    <w:uiPriority w:val="19"/>
-    <w:rsid w:val="000F4FEF"/>
-    <w:rPr>
-      <w:i/>
-      <w:iCs/>
-      <w:color w:val="404040" w:themeColor="text1" w:themeTint="BF"/>
-    </w:rPr>
-  </w:style>
-  <w:style w:type="paragraph" w:styleId="TOCHeading">
-    <w:name w:val="TOC Heading"/>
-    <w:basedOn w:val="Heading1"/>
-    <w:next w:val="Normal"/>
-    <w:uiPriority w:val="39"/>
-    <w:unhideWhenUsed/>
-    <w:qFormat/>
-    <w:rsid w:val="000F4FEF"/>
-    <w:pPr>
-      <w:spacing w:before="240" w:after="0" w:line="259" w:lineRule="auto"/>
-      <w:outlineLvl w:val="9"/>
-    </w:pPr>
-    <w:rPr>
-      <w:rFonts w:asciiTheme="majorHAnsi" w:eastAsiaTheme="majorEastAsia" w:hAnsiTheme="majorHAnsi" w:cstheme="majorBidi"/>
-      <w:color w:val="2F5496" w:themeColor="accent1" w:themeShade="BF"/>
-      <w:sz w:val="32"/>
-      <w:szCs w:val="32"/>
-    </w:rPr>
-  </w:style>
-  <w:style w:type="character" w:customStyle="1" w:styleId="BodyChar">
-    <w:name w:val="Body Char"/>
-    <w:basedOn w:val="DefaultParagraphFont"/>
-    <w:link w:val="Body"/>
-    <w:rsid w:val="000F4FEF"/>
-    <w:rPr>
-      <w:rFonts w:ascii="Helvetica" w:eastAsiaTheme="minorHAnsi" w:hAnsi="Helvetica" w:cs="Helvetica"/>
-      <w:sz w:val="24"/>
-      <w:szCs w:val="24"/>
-    </w:rPr>
-  </w:style>
-  <w:style w:type="paragraph" w:customStyle="1" w:styleId="interviewneedsediting">
-    <w:name w:val="interview needs editing"/>
-    <w:basedOn w:val="Normal"/>
-    <w:next w:val="Normal"/>
-    <w:qFormat/>
-    <w:rsid w:val="000F4FEF"/>
-    <w:pPr>
-      <w:shd w:val="clear" w:color="auto" w:fill="FFFF00"/>
-      <w:spacing w:after="60" w:line="360" w:lineRule="auto"/>
-    </w:pPr>
-    <w:rPr>
-      <w:sz w:val="21"/>
-      <w:szCs w:val="21"/>
-    </w:rPr>
-  </w:style>
-  <w:style w:type="table" w:customStyle="1" w:styleId="TableGridLight1">
-    <w:name w:val="Table Grid Light1"/>
-    <w:basedOn w:val="TableNormal"/>
-    <w:uiPriority w:val="40"/>
-    <w:rsid w:val="000F4FEF"/>
-    <w:pPr>
-      <w:spacing w:beforeAutospacing="0" w:after="0" w:afterAutospacing="0" w:line="240" w:lineRule="auto"/>
-    </w:pPr>
-    <w:rPr>
-      <w:rFonts w:eastAsiaTheme="minorHAnsi"/>
-    </w:rPr>
-    <w:tblPr>
-      <w:tblBorders>
-        <w:top w:val="single" w:sz="4" w:space="0" w:color="BFBFBF" w:themeColor="background1" w:themeShade="BF"/>
-        <w:left w:val="single" w:sz="4" w:space="0" w:color="BFBFBF" w:themeColor="background1" w:themeShade="BF"/>
-        <w:bottom w:val="single" w:sz="4" w:space="0" w:color="BFBFBF" w:themeColor="background1" w:themeShade="BF"/>
-        <w:right w:val="single" w:sz="4" w:space="0" w:color="BFBFBF" w:themeColor="background1" w:themeShade="BF"/>
-        <w:insideH w:val="single" w:sz="4" w:space="0" w:color="BFBFBF" w:themeColor="background1" w:themeShade="BF"/>
-        <w:insideV w:val="single" w:sz="4" w:space="0" w:color="BFBFBF" w:themeColor="background1" w:themeShade="BF"/>
-      </w:tblBorders>
-    </w:tblPr>
-  </w:style>
-</w:styles>
-</file>
-
-<file path=word/stylesWithEffects.xml><?xml version="1.0" encoding="utf-8"?>
-<w:styles xmlns:wpc="http://schemas.microsoft.com/office/word/2010/wordprocessingCanvas" xmlns:mc="http://schemas.openxmlformats.org/markup-compatibility/2006" xmlns:o="urn:schemas-microsoft-com:office:office" xmlns:r="http://schemas.openxmlformats.org/officeDocument/2006/relationships" xmlns:m="http://schemas.openxmlformats.org/officeDocument/2006/math" xmlns:v="urn:schemas-microsoft-com:vml" xmlns:wp14="http://schemas.microsoft.com/office/word/2010/wordprocessingDrawing" xmlns:wp="http://schemas.openxmlformats.org/drawingml/2006/wordprocessingDrawing" xmlns:w10="urn:schemas-microsoft-com:office:word" xmlns:w="http://schemas.openxmlformats.org/wordprocessingml/2006/main" xmlns:w14="http://schemas.microsoft.com/office/word/2010/wordml" xmlns:wpg="http://schemas.microsoft.com/office/word/2010/wordprocessingGroup" xmlns:wpi="http://schemas.microsoft.com/office/word/2010/wordprocessingInk" xmlns:wne="http://schemas.microsoft.com/office/word/2006/wordml" xmlns:wps="http://schemas.microsoft.com/office/word/2010/wordprocessingShape" mc:Ignorable="w14 wp14">
-  <w:docDefaults>
-    <w:rPrDefault>
-      <w:rPr>
-        <w:rFonts w:asciiTheme="minorHAnsi" w:eastAsia="Arial" w:hAnsiTheme="minorHAnsi" w:cstheme="minorBidi"/>
-        <w:sz w:val="22"/>
-        <w:szCs w:val="22"/>
-        <w:lang w:val="en-US" w:eastAsia="en-US" w:bidi="ar-SA"/>
-      </w:rPr>
-    </w:rPrDefault>
-    <w:pPrDefault>
-      <w:pPr>
-        <w:spacing w:beforeAutospacing="1" w:after="160" w:afterAutospacing="1" w:line="259" w:lineRule="auto"/>
-      </w:pPr>
-    </w:pPrDefault>
-  </w:docDefaults>
-  <w:latentStyles w:defLockedState="0" w:defUIPriority="99" w:defSemiHidden="1" w:defUnhideWhenUsed="1" w:defQFormat="0" w:count="267">
-    <w:lsdException w:name="Normal" w:semiHidden="0" w:uiPriority="0" w:unhideWhenUsed="0" w:qFormat="1"/>
-    <w:lsdException w:name="heading 1" w:semiHidden="0" w:uiPriority="9" w:unhideWhenUsed="0" w:qFormat="1"/>
-    <w:lsdException w:name="heading 2" w:uiPriority="9" w:qFormat="1"/>
-    <w:lsdException w:name="heading 3" w:uiPriority="9" w:qFormat="1"/>
-    <w:lsdException w:name="heading 4" w:uiPriority="9" w:qFormat="1"/>
-    <w:lsdException w:name="heading 5" w:uiPriority="9" w:qFormat="1"/>
-    <w:lsdException w:name="heading 6" w:uiPriority="9" w:qFormat="1"/>
-    <w:lsdException w:name="heading 7" w:uiPriority="9" w:qFormat="1"/>
-    <w:lsdException w:name="heading 8" w:uiPriority="9" w:qFormat="1"/>
-    <w:lsdException w:name="heading 9" w:uiPriority="9" w:qFormat="1"/>
-    <w:lsdException w:name="toc 1" w:uiPriority="39"/>
-    <w:lsdException w:name="toc 2" w:uiPriority="39"/>
-    <w:lsdException w:name="toc 3" w:uiPriority="39"/>
-    <w:lsdException w:name="toc 4" w:uiPriority="39"/>
-    <w:lsdException w:name="toc 5" w:uiPriority="39"/>
-    <w:lsdException w:name="toc 6" w:uiPriority="39"/>
-    <w:lsdException w:name="toc 7" w:uiPriority="39"/>
-    <w:lsdException w:name="toc 8" w:uiPriority="39"/>
-    <w:lsdException w:name="toc 9" w:uiPriority="39"/>
-    <w:lsdException w:name="annotation text" w:qFormat="1"/>
-    <w:lsdException w:name="caption" w:uiPriority="35" w:qFormat="1"/>
-    <w:lsdException w:name="annotation reference" w:qFormat="1"/>
-    <w:lsdException w:name="Title" w:semiHidden="0" w:uiPriority="10" w:unhideWhenUsed="0" w:qFormat="1"/>
-    <w:lsdException w:name="Default Paragraph Font" w:uiPriority="1"/>
-    <w:lsdException w:name="Body Text" w:uiPriority="1" w:qFormat="1"/>
-    <w:lsdException w:name="Subtitle" w:semiHidden="0" w:uiPriority="11" w:unhideWhenUsed="0" w:qFormat="1"/>
-    <w:lsdException w:name="Strong" w:semiHidden="0" w:uiPriority="22" w:unhideWhenUsed="0" w:qFormat="1"/>
-    <w:lsdException w:name="Emphasis" w:semiHidden="0" w:uiPriority="20" w:unhideWhenUsed="0" w:qFormat="1"/>
-    <w:lsdException w:name="Table Grid" w:semiHidden="0" w:uiPriority="39" w:unhideWhenUsed="0"/>
-    <w:lsdException w:name="Placeholder Text" w:unhideWhenUsed="0"/>
-    <w:lsdException w:name="No Spacing" w:semiHidden="0" w:uiPriority="1" w:unhideWhenUsed="0" w:qFormat="1"/>
-    <w:lsdException w:name="Light Shading" w:semiHidden="0" w:uiPriority="60" w:unhideWhenUsed="0"/>
-    <w:lsdException w:name="Light List" w:semiHidden="0" w:uiPriority="61" w:unhideWhenUsed="0"/>
-    <w:lsdException w:name="Light Grid" w:semiHidden="0" w:uiPriority="62" w:unhideWhenUsed="0"/>
-    <w:lsdException w:name="Medium Shading 1" w:semiHidden="0" w:uiPriority="63" w:unhideWhenUsed="0"/>
-    <w:lsdException w:name="Medium Shading 2" w:semiHidden="0" w:uiPriority="64" w:unhideWhenUsed="0"/>
-    <w:lsdException w:name="Medium List 1" w:semiHidden="0" w:uiPriority="65" w:unhideWhenUsed="0"/>
-    <w:lsdException w:name="Medium List 2" w:semiHidden="0" w:uiPriority="66" w:unhideWhenUsed="0"/>
-    <w:lsdException w:name="Medium Grid 1" w:semiHidden="0" w:uiPriority="67" w:unhideWhenUsed="0"/>
-    <w:lsdException w:name="Medium Grid 2" w:semiHidden="0" w:uiPriority="68" w:unhideWhenUsed="0"/>
-    <w:lsdException w:name="Medium Grid 3" w:semiHidden="0" w:uiPriority="69" w:unhideWhenUsed="0"/>
-    <w:lsdException w:name="Dark List" w:semiHidden="0" w:uiPriority="70" w:unhideWhenUsed="0"/>
-    <w:lsdException w:name="Colorful Shading" w:semiHidden="0" w:uiPriority="71" w:unhideWhenUsed="0"/>
-    <w:lsdException w:name="Colorful List" w:semiHidden="0" w:uiPriority="72" w:unhideWhenUsed="0"/>
-    <w:lsdException w:name="Colorful Grid" w:semiHidden="0" w:uiPriority="73" w:unhideWhenUsed="0"/>
-    <w:lsdException w:name="Light Shading Accent 1" w:semiHidden="0" w:uiPriority="60" w:unhideWhenUsed="0"/>
-    <w:lsdException w:name="Light List Accent 1" w:semiHidden="0" w:uiPriority="61" w:unhideWhenUsed="0"/>
-    <w:lsdException w:name="Light Grid Accent 1" w:semiHidden="0" w:uiPriority="62" w:unhideWhenUsed="0"/>
-    <w:lsdException w:name="Medium Shading 1 Accent 1" w:semiHidden="0" w:uiPriority="63" w:unhideWhenUsed="0"/>
-    <w:lsdException w:name="Medium Shading 2 Accent 1" w:semiHidden="0" w:uiPriority="64" w:unhideWhenUsed="0"/>
-    <w:lsdException w:name="Medium List 1 Accent 1" w:semiHidden="0" w:uiPriority="65" w:unhideWhenUsed="0"/>
-    <w:lsdException w:name="Revision" w:unhideWhenUsed="0"/>
-    <w:lsdException w:name="List Paragraph" w:semiHidden="0" w:uiPriority="34" w:unhideWhenUsed="0" w:qFormat="1"/>
-    <w:lsdException w:name="Quote" w:semiHidden="0" w:uiPriority="29" w:unhideWhenUsed="0" w:qFormat="1"/>
-    <w:lsdException w:name="Intense Quote" w:semiHidden="0" w:uiPriority="30" w:unhideWhenUsed="0" w:qFormat="1"/>
-    <w:lsdException w:name="Medium List 2 Accent 1" w:semiHidden="0" w:uiPriority="66" w:unhideWhenUsed="0"/>
-    <w:lsdException w:name="Medium Grid 1 Accent 1" w:semiHidden="0" w:uiPriority="67" w:unhideWhenUsed="0"/>
-    <w:lsdException w:name="Medium Grid 2 Accent 1" w:semiHidden="0" w:uiPriority="68" w:unhideWhenUsed="0"/>
-    <w:lsdException w:name="Medium Grid 3 Accent 1" w:semiHidden="0" w:uiPriority="69" w:unhideWhenUsed="0"/>
-    <w:lsdException w:name="Dark List Accent 1" w:semiHidden="0" w:uiPriority="70" w:unhideWhenUsed="0"/>
-    <w:lsdException w:name="Colorful Shading Accent 1" w:semiHidden="0" w:uiPriority="71" w:unhideWhenUsed="0"/>
-    <w:lsdException w:name="Colorful List Accent 1" w:semiHidden="0" w:uiPriority="72" w:unhideWhenUsed="0"/>
-    <w:lsdException w:name="Colorful Grid Accent 1" w:semiHidden="0" w:uiPriority="73" w:unhideWhenUsed="0"/>
-    <w:lsdException w:name="Light Shading Accent 2" w:semiHidden="0" w:uiPriority="60" w:unhideWhenUsed="0"/>
-    <w:lsdException w:name="Light List Accent 2" w:semiHidden="0" w:uiPriority="61" w:unhideWhenUsed="0"/>
-    <w:lsdException w:name="Light Grid Accent 2" w:semiHidden="0" w:uiPriority="62" w:unhideWhenUsed="0"/>
-    <w:lsdException w:name="Medium Shading 1 Accent 2" w:semiHidden="0" w:uiPriority="63" w:unhideWhenUsed="0"/>
-    <w:lsdException w:name="Medium Shading 2 Accent 2" w:semiHidden="0" w:uiPriority="64" w:unhideWhenUsed="0"/>
-    <w:lsdException w:name="Medium List 1 Accent 2" w:semiHidden="0" w:uiPriority="65" w:unhideWhenUsed="0"/>
-    <w:lsdException w:name="Medium List 2 Accent 2" w:semiHidden="0" w:uiPriority="66" w:unhideWhenUsed="0"/>
-    <w:lsdException w:name="Medium Grid 1 Accent 2" w:semiHidden="0" w:uiPriority="67" w:unhideWhenUsed="0"/>
-    <w:lsdException w:name="Medium Grid 2 Accent 2" w:semiHidden="0" w:uiPriority="68" w:unhideWhenUsed="0"/>
-    <w:lsdException w:name="Medium Grid 3 Accent 2" w:semiHidden="0" w:uiPriority="69" w:unhideWhenUsed="0"/>
-    <w:lsdException w:name="Dark List Accent 2" w:semiHidden="0" w:uiPriority="70" w:unhideWhenUsed="0"/>
-    <w:lsdException w:name="Colorful Shading Accent 2" w:semiHidden="0" w:uiPriority="71" w:unhideWhenUsed="0"/>
-    <w:lsdException w:name="Colorful List Accent 2" w:semiHidden="0" w:uiPriority="72" w:unhideWhenUsed="0"/>
-    <w:lsdException w:name="Colorful Grid Accent 2" w:semiHidden="0" w:uiPriority="73" w:unhideWhenUsed="0"/>
-    <w:lsdException w:name="Light Shading Accent 3" w:semiHidden="0" w:uiPriority="60" w:unhideWhenUsed="0"/>
-    <w:lsdException w:name="Light List Accent 3" w:semiHidden="0" w:uiPriority="61" w:unhideWhenUsed="0"/>
-    <w:lsdException w:name="Light Grid Accent 3" w:semiHidden="0" w:uiPriority="62" w:unhideWhenUsed="0"/>
-    <w:lsdException w:name="Medium Shading 1 Accent 3" w:semiHidden="0" w:uiPriority="63" w:unhideWhenUsed="0"/>
-    <w:lsdException w:name="Medium Shading 2 Accent 3" w:semiHidden="0" w:uiPriority="64" w:unhideWhenUsed="0"/>
-    <w:lsdException w:name="Medium List 1 Accent 3" w:semiHidden="0" w:uiPriority="65" w:unhideWhenUsed="0"/>
-    <w:lsdException w:name="Medium List 2 Accent 3" w:semiHidden="0" w:uiPriority="66" w:unhideWhenUsed="0"/>
-    <w:lsdException w:name="Medium Grid 1 Accent 3" w:semiHidden="0" w:uiPriority="67" w:unhideWhenUsed="0"/>
-    <w:lsdException w:name="Medium Grid 2 Accent 3" w:semiHidden="0" w:uiPriority="68" w:unhideWhenUsed="0"/>
-    <w:lsdException w:name="Medium Grid 3 Accent 3" w:semiHidden="0" w:uiPriority="69" w:unhideWhenUsed="0"/>
-    <w:lsdException w:name="Dark List Accent 3" w:semiHidden="0" w:uiPriority="70" w:unhideWhenUsed="0"/>
-    <w:lsdException w:name="Colorful Shading Accent 3" w:semiHidden="0" w:uiPriority="71" w:unhideWhenUsed="0"/>
-    <w:lsdException w:name="Colorful List Accent 3" w:semiHidden="0" w:uiPriority="72" w:unhideWhenUsed="0"/>
-    <w:lsdException w:name="Colorful Grid Accent 3" w:semiHidden="0" w:uiPriority="73" w:unhideWhenUsed="0"/>
-    <w:lsdException w:name="Light Shading Accent 4" w:semiHidden="0" w:uiPriority="60" w:unhideWhenUsed="0"/>
-    <w:lsdException w:name="Light List Accent 4" w:semiHidden="0" w:uiPriority="61" w:unhideWhenUsed="0"/>
-    <w:lsdException w:name="Light Grid Accent 4" w:semiHidden="0" w:uiPriority="62" w:unhideWhenUsed="0"/>
-    <w:lsdException w:name="Medium Shading 1 Accent 4" w:semiHidden="0" w:uiPriority="63" w:unhideWhenUsed="0"/>
-    <w:lsdException w:name="Medium Shading 2 Accent 4" w:semiHidden="0" w:uiPriority="64" w:unhideWhenUsed="0"/>
-    <w:lsdException w:name="Medium List 1 Accent 4" w:semiHidden="0" w:uiPriority="65" w:unhideWhenUsed="0"/>
-    <w:lsdException w:name="Medium List 2 Accent 4" w:semiHidden="0" w:uiPriority="66" w:unhideWhenUsed="0"/>
-    <w:lsdException w:name="Medium Grid 1 Accent 4" w:semiHidden="0" w:uiPriority="67" w:unhideWhenUsed="0"/>
-    <w:lsdException w:name="Medium Grid 2 Accent 4" w:semiHidden="0" w:uiPriority="68" w:unhideWhenUsed="0"/>
-    <w:lsdException w:name="Medium Grid 3 Accent 4" w:semiHidden="0" w:uiPriority="69" w:unhideWhenUsed="0"/>
-    <w:lsdException w:name="Dark List Accent 4" w:semiHidden="0" w:uiPriority="70" w:unhideWhenUsed="0"/>
-    <w:lsdException w:name="Colorful Shading Accent 4" w:semiHidden="0" w:uiPriority="71" w:unhideWhenUsed="0"/>
-    <w:lsdException w:name="Colorful List Accent 4" w:semiHidden="0" w:uiPriority="72" w:unhideWhenUsed="0"/>
-    <w:lsdException w:name="Colorful Grid Accent 4" w:semiHidden="0" w:uiPriority="73" w:unhideWhenUsed="0"/>
-    <w:lsdException w:name="Light Shading Accent 5" w:semiHidden="0" w:uiPriority="60" w:unhideWhenUsed="0"/>
-    <w:lsdException w:name="Light List Accent 5" w:semiHidden="0" w:uiPriority="61" w:unhideWhenUsed="0"/>
-    <w:lsdException w:name="Light Grid Accent 5" w:semiHidden="0" w:uiPriority="62" w:unhideWhenUsed="0"/>
-    <w:lsdException w:name="Medium Shading 1 Accent 5" w:semiHidden="0" w:uiPriority="63" w:unhideWhenUsed="0"/>
-    <w:lsdException w:name="Medium Shading 2 Accent 5" w:semiHidden="0" w:uiPriority="64" w:unhideWhenUsed="0"/>
-    <w:lsdException w:name="Medium List 1 Accent 5" w:semiHidden="0" w:uiPriority="65" w:unhideWhenUsed="0"/>
-    <w:lsdException w:name="Medium List 2 Accent 5" w:semiHidden="0" w:uiPriority="66" w:unhideWhenUsed="0"/>
-    <w:lsdException w:name="Medium Grid 1 Accent 5" w:semiHidden="0" w:uiPriority="67" w:unhideWhenUsed="0"/>
-    <w:lsdException w:name="Medium Grid 2 Accent 5" w:semiHidden="0" w:uiPriority="68" w:unhideWhenUsed="0"/>
-    <w:lsdException w:name="Medium Grid 3 Accent 5" w:semiHidden="0" w:uiPriority="69" w:unhideWhenUsed="0"/>
-    <w:lsdException w:name="Dark List Accent 5" w:semiHidden="0" w:uiPriority="70" w:unhideWhenUsed="0"/>
-    <w:lsdException w:name="Colorful Shading Accent 5" w:semiHidden="0" w:uiPriority="71" w:unhideWhenUsed="0"/>
-    <w:lsdException w:name="Colorful List Accent 5" w:semiHidden="0" w:uiPriority="72" w:unhideWhenUsed="0"/>
-    <w:lsdException w:name="Colorful Grid Accent 5" w:semiHidden="0" w:uiPriority="73" w:unhideWhenUsed="0"/>
-    <w:lsdException w:name="Light Shading Accent 6" w:semiHidden="0" w:uiPriority="60" w:unhideWhenUsed="0"/>
-    <w:lsdException w:name="Light List Accent 6" w:semiHidden="0" w:uiPriority="61" w:unhideWhenUsed="0"/>
-    <w:lsdException w:name="Light Grid Accent 6" w:semiHidden="0" w:uiPriority="62" w:unhideWhenUsed="0"/>
-    <w:lsdException w:name="Medium Shading 1 Accent 6" w:semiHidden="0" w:uiPriority="63" w:unhideWhenUsed="0"/>
-    <w:lsdException w:name="Medium Shading 2 Accent 6" w:semiHidden="0" w:uiPriority="64" w:unhideWhenUsed="0"/>
-    <w:lsdException w:name="Medium List 1 Accent 6" w:semiHidden="0" w:uiPriority="65" w:unhideWhenUsed="0"/>
-    <w:lsdException w:name="Medium List 2 Accent 6" w:semiHidden="0" w:uiPriority="66" w:unhideWhenUsed="0"/>
-    <w:lsdException w:name="Medium Grid 1 Accent 6" w:semiHidden="0" w:uiPriority="67" w:unhideWhenUsed="0"/>
-    <w:lsdException w:name="Medium Grid 2 Accent 6" w:semiHidden="0" w:uiPriority="68" w:unhideWhenUsed="0"/>
-    <w:lsdException w:name="Medium Grid 3 Accent 6" w:semiHidden="0" w:uiPriority="69" w:unhideWhenUsed="0"/>
-    <w:lsdException w:name="Dark List Accent 6" w:semiHidden="0" w:uiPriority="70" w:unhideWhenUsed="0"/>
-    <w:lsdException w:name="Colorful Shading Accent 6" w:semiHidden="0" w:uiPriority="71" w:unhideWhenUsed="0"/>
-    <w:lsdException w:name="Colorful List Accent 6" w:semiHidden="0" w:uiPriority="72" w:unhideWhenUsed="0"/>
-    <w:lsdException w:name="Colorful Grid Accent 6" w:semiHidden="0" w:uiPriority="73" w:unhideWhenUsed="0"/>
-    <w:lsdException w:name="Subtle Emphasis" w:semiHidden="0" w:uiPriority="19" w:unhideWhenUsed="0" w:qFormat="1"/>
-    <w:lsdException w:name="Intense Emphasis" w:semiHidden="0" w:uiPriority="21" w:unhideWhenUsed="0" w:qFormat="1"/>
-    <w:lsdException w:name="Subtle Reference" w:semiHidden="0" w:uiPriority="31" w:unhideWhenUsed="0" w:qFormat="1"/>
-    <w:lsdException w:name="Intense Reference" w:semiHidden="0" w:uiPriority="32" w:unhideWhenUsed="0" w:qFormat="1"/>
-    <w:lsdException w:name="Book Title" w:semiHidden="0" w:uiPriority="33" w:unhideWhenUsed="0" w:qFormat="1"/>
-    <w:lsdException w:name="Bibliography" w:uiPriority="37"/>
-    <w:lsdException w:name="TOC Heading" w:uiPriority="39" w:qFormat="1"/>
-  </w:latentStyles>
-  <w:style w:type="paragraph" w:default="1" w:styleId="Normal">
-    <w:name w:val="Normal"/>
-    <w:qFormat/>
-    <w:rsid w:val="000F4FEF"/>
-    <w:pPr>
-      <w:spacing w:before="-1" w:after="-1" w:line="240" w:lineRule="auto"/>
-    </w:pPr>
-    <w:rPr>
-      <w:rFonts w:ascii="Arial" w:hAnsi="Arial" w:cs="Arial"/>
-    </w:rPr>
-  </w:style>
-  <w:style w:type="paragraph" w:styleId="Heading1">
-    <w:name w:val="heading 1"/>
-    <w:basedOn w:val="Normal"/>
-    <w:link w:val="Heading1Char"/>
-    <w:uiPriority w:val="9"/>
-    <w:qFormat/>
-    <w:rsid w:val="000F4FEF"/>
-    <w:pPr>
-      <w:pBdr>
-        <w:bottom w:val="single" w:sz="4" w:space="1" w:color="A6A6A6" w:themeColor="background1" w:themeShade="A6"/>
-      </w:pBdr>
-      <w:spacing w:before="0" w:beforeAutospacing="0" w:after="100" w:line="276" w:lineRule="auto"/>
-      <w:outlineLvl w:val="0"/>
-    </w:pPr>
-    <w:rPr>
-      <w:rFonts w:ascii="Helvetica" w:hAnsi="Helvetica" w:cs="Helvetica"/>
-      <w:color w:val="0A2A78"/>
-      <w:spacing w:val="-4"/>
-      <w:sz w:val="40"/>
-      <w:szCs w:val="24"/>
-    </w:rPr>
-  </w:style>
-  <w:style w:type="paragraph" w:styleId="Heading2">
-    <w:name w:val="heading 2"/>
-    <w:basedOn w:val="Normal"/>
-    <w:next w:val="Normal"/>
-    <w:link w:val="Heading2Char"/>
-    <w:uiPriority w:val="9"/>
-    <w:unhideWhenUsed/>
-    <w:qFormat/>
-    <w:rsid w:val="000F4FEF"/>
-    <w:pPr>
-      <w:widowControl w:val="0"/>
-      <w:autoSpaceDE w:val="0"/>
-      <w:autoSpaceDN w:val="0"/>
-      <w:spacing w:before="0" w:beforeAutospacing="0" w:after="0" w:afterAutospacing="0" w:line="276" w:lineRule="auto"/>
-      <w:outlineLvl w:val="1"/>
-    </w:pPr>
-    <w:rPr>
-      <w:rFonts w:ascii="Helvetica" w:eastAsiaTheme="minorHAnsi" w:hAnsi="Helvetica" w:cs="Helvetica"/>
-      <w:color w:val="0A2A78"/>
-      <w:spacing w:val="-2"/>
-      <w:sz w:val="36"/>
-      <w:szCs w:val="24"/>
-    </w:rPr>
-  </w:style>
-  <w:style w:type="paragraph" w:styleId="Heading3">
-    <w:name w:val="heading 3"/>
-    <w:basedOn w:val="Heading2"/>
-    <w:next w:val="Body"/>
-    <w:link w:val="Heading3Char"/>
-    <w:uiPriority w:val="9"/>
-    <w:unhideWhenUsed/>
-    <w:qFormat/>
-    <w:rsid w:val="000F4FEF"/>
-    <w:pPr>
-      <w:outlineLvl w:val="2"/>
-    </w:pPr>
-    <w:rPr>
-      <w:sz w:val="32"/>
-    </w:rPr>
-  </w:style>
-  <w:style w:type="paragraph" w:styleId="Heading4">
-    <w:name w:val="heading 4"/>
-    <w:basedOn w:val="Normal"/>
-    <w:next w:val="Normal"/>
-    <w:link w:val="Heading4Char"/>
-    <w:uiPriority w:val="9"/>
-    <w:unhideWhenUsed/>
-    <w:qFormat/>
-    <w:rsid w:val="000F4FEF"/>
-    <w:pPr>
-      <w:widowControl w:val="0"/>
-      <w:autoSpaceDE w:val="0"/>
-      <w:autoSpaceDN w:val="0"/>
-      <w:spacing w:before="54" w:beforeAutospacing="0" w:after="120" w:afterAutospacing="0" w:line="276" w:lineRule="auto"/>
-      <w:ind w:left="360"/>
-      <w:outlineLvl w:val="3"/>
-    </w:pPr>
-    <w:rPr>
-      <w:rFonts w:ascii="Helvetica" w:eastAsiaTheme="minorHAnsi" w:hAnsi="Helvetica" w:cs="Helvetica"/>
-      <w:iCs/>
-      <w:color w:val="0A2A78"/>
-      <w:spacing w:val="-2"/>
-      <w:sz w:val="24"/>
-      <w:szCs w:val="24"/>
-    </w:rPr>
-  </w:style>
-  <w:style w:type="paragraph" w:styleId="Heading5">
-    <w:name w:val="heading 5"/>
-    <w:basedOn w:val="Normal"/>
-    <w:next w:val="Normal"/>
-    <w:link w:val="Heading5Char"/>
-    <w:uiPriority w:val="9"/>
-    <w:unhideWhenUsed/>
-    <w:qFormat/>
-    <w:rsid w:val="000F4FEF"/>
-    <w:pPr>
-      <w:keepNext/>
-      <w:keepLines/>
-      <w:spacing w:before="240" w:after="80"/>
-      <w:outlineLvl w:val="4"/>
-    </w:pPr>
-    <w:rPr>
-      <w:color w:val="666666"/>
-    </w:rPr>
-  </w:style>
-  <w:style w:type="paragraph" w:styleId="Heading6">
-    <w:name w:val="heading 6"/>
-    <w:basedOn w:val="Normal"/>
-    <w:next w:val="Normal"/>
-    <w:link w:val="Heading6Char"/>
-    <w:uiPriority w:val="9"/>
-    <w:semiHidden/>
-    <w:unhideWhenUsed/>
-    <w:qFormat/>
-    <w:rsid w:val="000F4FEF"/>
-    <w:pPr>
-      <w:keepNext/>
-      <w:keepLines/>
-      <w:spacing w:before="240" w:after="80"/>
-      <w:outlineLvl w:val="5"/>
-    </w:pPr>
-    <w:rPr>
-      <w:i/>
-      <w:color w:val="666666"/>
-    </w:rPr>
-  </w:style>
-  <w:style w:type="character" w:default="1" w:styleId="DefaultParagraphFont">
-    <w:name w:val="Default Paragraph Font"/>
-    <w:uiPriority w:val="1"/>
-    <w:semiHidden/>
-    <w:unhideWhenUsed/>
-  </w:style>
-  <w:style w:type="table" w:default="1" w:styleId="TableNormal">
-    <w:name w:val="Normal Table"/>
-    <w:uiPriority w:val="99"/>
-    <w:semiHidden/>
-    <w:unhideWhenUsed/>
-    <w:tblPr>
-      <w:tblInd w:w="0" w:type="dxa"/>
-      <w:tblCellMar>
-        <w:top w:w="0" w:type="dxa"/>
-        <w:left w:w="108" w:type="dxa"/>
-        <w:bottom w:w="0" w:type="dxa"/>
-        <w:right w:w="108" w:type="dxa"/>
-      </w:tblCellMar>
-    </w:tblPr>
-  </w:style>
-  <w:style w:type="numbering" w:default="1" w:styleId="NoList">
-    <w:name w:val="No List"/>
-    <w:uiPriority w:val="99"/>
-    <w:semiHidden/>
-    <w:unhideWhenUsed/>
-  </w:style>
-  <w:style w:type="paragraph" w:customStyle="1" w:styleId="Code">
-    <w:name w:val="Code"/>
-    <w:basedOn w:val="Normal"/>
-    <w:qFormat/>
-    <w:rsid w:val="000F4FEF"/>
-    <w:rPr>
-      <w:rFonts w:ascii="Calibri" w:hAnsi="Calibri"/>
-    </w:rPr>
-  </w:style>
-  <w:style w:type="paragraph" w:customStyle="1" w:styleId="Body">
-    <w:name w:val="Body"/>
-    <w:basedOn w:val="Normal"/>
-    <w:link w:val="BodyChar"/>
-    <w:qFormat/>
-    <w:rsid w:val="000F4FEF"/>
-    <w:pPr>
-      <w:spacing w:before="0" w:beforeAutospacing="0" w:after="120" w:afterAutospacing="0" w:line="276" w:lineRule="auto"/>
-    </w:pPr>
-    <w:rPr>
-      <w:rFonts w:ascii="Helvetica" w:eastAsiaTheme="minorHAnsi" w:hAnsi="Helvetica" w:cs="Helvetica"/>
-      <w:sz w:val="24"/>
-      <w:szCs w:val="24"/>
-    </w:rPr>
-  </w:style>
-  <w:style w:type="character" w:customStyle="1" w:styleId="Heading1Char">
-    <w:name w:val="Heading 1 Char"/>
-    <w:basedOn w:val="DefaultParagraphFont"/>
-    <w:link w:val="Heading1"/>
-    <w:uiPriority w:val="9"/>
-    <w:rsid w:val="000F4FEF"/>
-    <w:rPr>
-      <w:rFonts w:ascii="Helvetica" w:hAnsi="Helvetica" w:cs="Helvetica"/>
-      <w:color w:val="0A2A78"/>
-      <w:spacing w:val="-4"/>
-      <w:sz w:val="40"/>
-      <w:szCs w:val="24"/>
-    </w:rPr>
-  </w:style>
-  <w:style w:type="paragraph" w:styleId="ListParagraph">
-    <w:name w:val="List Paragraph"/>
-    <w:basedOn w:val="BodyText"/>
-    <w:uiPriority w:val="34"/>
-    <w:qFormat/>
-    <w:rsid w:val="000F4FEF"/>
-    <w:pPr>
-      <w:widowControl w:val="0"/>
-      <w:numPr>
-        <w:numId w:val="35"/>
-      </w:numPr>
-      <w:autoSpaceDE w:val="0"/>
-      <w:autoSpaceDN w:val="0"/>
-      <w:spacing w:before="54" w:beforeAutospacing="0" w:afterAutospacing="0" w:line="276" w:lineRule="auto"/>
-    </w:pPr>
-    <w:rPr>
-      <w:rFonts w:ascii="Helvetica" w:eastAsiaTheme="minorHAnsi" w:hAnsi="Helvetica" w:cs="Helvetica"/>
-      <w:color w:val="202529"/>
-      <w:spacing w:val="-2"/>
-      <w:sz w:val="24"/>
-      <w:szCs w:val="24"/>
-    </w:rPr>
-  </w:style>
-  <w:style w:type="paragraph" w:customStyle="1" w:styleId="TFVariable">
-    <w:name w:val="TF Variable"/>
-    <w:basedOn w:val="Heading3"/>
-    <w:next w:val="Body"/>
-    <w:qFormat/>
-    <w:rsid w:val="000F4FEF"/>
-    <w:pPr>
-      <w:numPr>
-        <w:numId w:val="38"/>
-      </w:numPr>
-    </w:pPr>
-  </w:style>
-  <w:style w:type="character" w:customStyle="1" w:styleId="Heading3Char">
-    <w:name w:val="Heading 3 Char"/>
-    <w:basedOn w:val="DefaultParagraphFont"/>
-    <w:link w:val="Heading3"/>
-    <w:uiPriority w:val="9"/>
-    <w:qFormat/>
-    <w:rsid w:val="000F4FEF"/>
-    <w:rPr>
-      <w:rFonts w:ascii="Helvetica" w:eastAsiaTheme="minorHAnsi" w:hAnsi="Helvetica" w:cs="Helvetica"/>
-      <w:color w:val="0A2A78"/>
-      <w:spacing w:val="-2"/>
-      <w:sz w:val="32"/>
-      <w:szCs w:val="24"/>
-    </w:rPr>
-  </w:style>
-  <w:style w:type="paragraph" w:customStyle="1" w:styleId="interviewcondition">
-    <w:name w:val="interview condition"/>
-    <w:basedOn w:val="Normal"/>
-    <w:link w:val="interviewconditionChar"/>
-    <w:qFormat/>
-    <w:rsid w:val="00F44633"/>
-    <w:pPr>
-      <w:spacing w:after="60" w:line="360" w:lineRule="auto"/>
-    </w:pPr>
-    <w:rPr>
-      <w:rFonts w:asciiTheme="minorHAnsi" w:hAnsiTheme="minorHAnsi" w:cstheme="minorBidi"/>
-      <w:color w:val="00B050"/>
-      <w:u w:val="single"/>
-    </w:rPr>
-  </w:style>
-  <w:style w:type="character" w:customStyle="1" w:styleId="interviewconditionChar">
-    <w:name w:val="interview condition Char"/>
-    <w:basedOn w:val="DefaultParagraphFont"/>
-    <w:link w:val="interviewcondition"/>
-    <w:rsid w:val="00F44633"/>
-    <w:rPr>
-      <w:color w:val="00B050"/>
-      <w:u w:val="single"/>
-    </w:rPr>
-  </w:style>
-  <w:style w:type="paragraph" w:customStyle="1" w:styleId="interviewbutton">
-    <w:name w:val="interview button"/>
-    <w:basedOn w:val="Normal"/>
-    <w:next w:val="Normal"/>
-    <w:link w:val="interviewbuttonChar"/>
-    <w:qFormat/>
-    <w:rsid w:val="000F4FEF"/>
-    <w:pPr>
-      <w:shd w:val="clear" w:color="auto" w:fill="0070C0"/>
-      <w:spacing w:after="60" w:line="360" w:lineRule="auto"/>
-    </w:pPr>
-    <w:rPr>
-      <w:rFonts w:asciiTheme="minorHAnsi" w:hAnsiTheme="minorHAnsi" w:cstheme="minorBidi"/>
-      <w:color w:val="FFFFFF" w:themeColor="background1"/>
-      <w:szCs w:val="40"/>
-    </w:rPr>
-  </w:style>
-  <w:style w:type="character" w:customStyle="1" w:styleId="interviewbuttonChar">
-    <w:name w:val="interview button Char"/>
-    <w:basedOn w:val="DefaultParagraphFont"/>
-    <w:link w:val="interviewbutton"/>
-    <w:qFormat/>
-    <w:rsid w:val="000F4FEF"/>
-    <w:rPr>
-      <w:color w:val="FFFFFF" w:themeColor="background1"/>
-      <w:szCs w:val="40"/>
-      <w:shd w:val="clear" w:color="auto" w:fill="0070C0"/>
-    </w:rPr>
-  </w:style>
-  <w:style w:type="paragraph" w:styleId="BodyText">
-    <w:name w:val="Body Text"/>
-    <w:basedOn w:val="Normal"/>
-    <w:link w:val="BodyTextChar"/>
-    <w:uiPriority w:val="1"/>
-    <w:unhideWhenUsed/>
-    <w:qFormat/>
-    <w:rsid w:val="000F4FEF"/>
-    <w:pPr>
-      <w:spacing w:after="120"/>
-    </w:pPr>
-  </w:style>
-  <w:style w:type="character" w:customStyle="1" w:styleId="BodyTextChar">
-    <w:name w:val="Body Text Char"/>
-    <w:basedOn w:val="DefaultParagraphFont"/>
-    <w:link w:val="BodyText"/>
-    <w:uiPriority w:val="1"/>
-    <w:rsid w:val="000F4FEF"/>
-    <w:rPr>
-      <w:rFonts w:ascii="Arial" w:hAnsi="Arial" w:cs="Arial"/>
-    </w:rPr>
-  </w:style>
-  <w:style w:type="character" w:customStyle="1" w:styleId="interviewcondition2">
-    <w:name w:val="interview condition 2"/>
-    <w:basedOn w:val="Hyperlink"/>
-    <w:uiPriority w:val="1"/>
-    <w:qFormat/>
-    <w:rsid w:val="000F4FEF"/>
-    <w:rPr>
-      <w:rFonts w:ascii="Helvetica" w:eastAsia="Arial" w:hAnsi="Helvetica" w:cs="Helvetica"/>
-      <w:color w:val="009999"/>
-      <w:spacing w:val="-2"/>
-      <w:sz w:val="24"/>
-      <w:szCs w:val="24"/>
-      <w:u w:val="none"/>
-    </w:rPr>
-  </w:style>
-  <w:style w:type="character" w:styleId="Hyperlink">
-    <w:name w:val="Hyperlink"/>
-    <w:basedOn w:val="DefaultParagraphFont"/>
-    <w:uiPriority w:val="99"/>
-    <w:unhideWhenUsed/>
-    <w:rsid w:val="000F4FEF"/>
-    <w:rPr>
-      <w:rFonts w:ascii="Helvetica" w:hAnsi="Helvetica" w:cs="Helvetica"/>
-      <w:color w:val="0563C1" w:themeColor="hyperlink"/>
-      <w:spacing w:val="-2"/>
-      <w:sz w:val="24"/>
-      <w:szCs w:val="24"/>
-      <w:u w:val="none"/>
-    </w:rPr>
-  </w:style>
-  <w:style w:type="paragraph" w:customStyle="1" w:styleId="variable">
-    <w:name w:val="variable"/>
-    <w:basedOn w:val="Normal"/>
-    <w:qFormat/>
-    <w:rsid w:val="00B61CCF"/>
-    <w:pPr>
-      <w:spacing w:after="120" w:line="276" w:lineRule="auto"/>
-    </w:pPr>
-    <w:rPr>
-      <w:color w:val="FF7C80"/>
-      <w:shd w:val="clear" w:color="auto" w:fill="FFFFCC"/>
-      <w:lang w:val="en"/>
-    </w:rPr>
-  </w:style>
-  <w:style w:type="character" w:customStyle="1" w:styleId="Heading2Char">
-    <w:name w:val="Heading 2 Char"/>
-    <w:basedOn w:val="DefaultParagraphFont"/>
-    <w:link w:val="Heading2"/>
-    <w:uiPriority w:val="9"/>
-    <w:rsid w:val="000F4FEF"/>
-    <w:rPr>
-      <w:rFonts w:ascii="Helvetica" w:eastAsiaTheme="minorHAnsi" w:hAnsi="Helvetica" w:cs="Helvetica"/>
-      <w:color w:val="0A2A78"/>
-      <w:spacing w:val="-2"/>
-      <w:sz w:val="36"/>
-      <w:szCs w:val="24"/>
-    </w:rPr>
-  </w:style>
-  <w:style w:type="character" w:customStyle="1" w:styleId="Heading4Char">
-    <w:name w:val="Heading 4 Char"/>
-    <w:basedOn w:val="DefaultParagraphFont"/>
-    <w:link w:val="Heading4"/>
-    <w:uiPriority w:val="9"/>
-    <w:qFormat/>
-    <w:rsid w:val="000F4FEF"/>
-    <w:rPr>
-      <w:rFonts w:ascii="Helvetica" w:eastAsiaTheme="minorHAnsi" w:hAnsi="Helvetica" w:cs="Helvetica"/>
-      <w:iCs/>
-      <w:color w:val="0A2A78"/>
-      <w:spacing w:val="-2"/>
-      <w:sz w:val="24"/>
-      <w:szCs w:val="24"/>
-    </w:rPr>
-  </w:style>
-  <w:style w:type="paragraph" w:customStyle="1" w:styleId="Example">
-    <w:name w:val="Example"/>
-    <w:basedOn w:val="Heading4"/>
-    <w:next w:val="Normal"/>
-    <w:qFormat/>
-    <w:rsid w:val="000F4FEF"/>
-  </w:style>
-  <w:style w:type="paragraph" w:customStyle="1" w:styleId="Exampleparagraph">
-    <w:name w:val="Example paragraph"/>
-    <w:basedOn w:val="Body"/>
-    <w:next w:val="Body"/>
-    <w:qFormat/>
-    <w:rsid w:val="00CA58DD"/>
-    <w:pPr>
-      <w:ind w:left="416"/>
-    </w:pPr>
-    <w:rPr>
-      <w:color w:val="202529"/>
-      <w:spacing w:val="-2"/>
-    </w:rPr>
-  </w:style>
-  <w:style w:type="paragraph" w:customStyle="1" w:styleId="ListParagraphNumbered">
-    <w:name w:val="List Paragraph Numbered"/>
-    <w:basedOn w:val="ListParagraph"/>
-    <w:qFormat/>
-    <w:rsid w:val="000F4FEF"/>
-    <w:pPr>
-      <w:numPr>
-        <w:numId w:val="36"/>
-      </w:numPr>
-    </w:pPr>
-    <w:rPr>
-      <w:b/>
-    </w:rPr>
-  </w:style>
-  <w:style w:type="paragraph" w:customStyle="1" w:styleId="ExampleorImportantblock">
-    <w:name w:val="Example or Important block"/>
-    <w:basedOn w:val="Body"/>
-    <w:qFormat/>
-    <w:rsid w:val="000F4FEF"/>
-    <w:pPr>
-      <w:widowControl w:val="0"/>
-      <w:suppressAutoHyphens/>
-      <w:ind w:left="403"/>
-    </w:pPr>
-    <w:rPr>
-      <w:color w:val="202529"/>
-      <w:spacing w:val="-2"/>
-    </w:rPr>
-  </w:style>
-  <w:style w:type="paragraph" w:customStyle="1" w:styleId="Listnumbered">
-    <w:name w:val="List numbered"/>
-    <w:basedOn w:val="Normal"/>
-    <w:qFormat/>
-    <w:rsid w:val="000F4FEF"/>
-    <w:pPr>
-      <w:widowControl w:val="0"/>
-      <w:autoSpaceDE w:val="0"/>
-      <w:autoSpaceDN w:val="0"/>
-      <w:spacing w:before="54" w:beforeAutospacing="0" w:after="120" w:afterAutospacing="0" w:line="276" w:lineRule="auto"/>
-    </w:pPr>
-    <w:rPr>
-      <w:rFonts w:ascii="Helvetica" w:eastAsiaTheme="minorHAnsi" w:hAnsi="Helvetica" w:cs="Helvetica"/>
-      <w:color w:val="202529"/>
-      <w:spacing w:val="-2"/>
-      <w:sz w:val="24"/>
-      <w:szCs w:val="24"/>
-    </w:rPr>
-  </w:style>
-  <w:style w:type="character" w:customStyle="1" w:styleId="Helptextinquestionmark">
-    <w:name w:val="Help text in question mark"/>
-    <w:basedOn w:val="DefaultParagraphFont"/>
-    <w:uiPriority w:val="1"/>
-    <w:qFormat/>
-    <w:rsid w:val="000F4FEF"/>
-    <w:rPr>
-      <w:rFonts w:ascii="Tahoma" w:hAnsi="Tahoma" w:cs="Tahoma"/>
-      <w:color w:val="FFFFFF" w:themeColor="background1"/>
-      <w:szCs w:val="24"/>
-      <w:shd w:val="clear" w:color="auto" w:fill="33CCFF"/>
-    </w:rPr>
-  </w:style>
-  <w:style w:type="character" w:customStyle="1" w:styleId="interviewtextbox">
-    <w:name w:val="interview text box"/>
-    <w:basedOn w:val="DefaultParagraphFont"/>
-    <w:uiPriority w:val="1"/>
-    <w:qFormat/>
-    <w:rsid w:val="000F4FEF"/>
-    <w:rPr>
-      <w:shd w:val="clear" w:color="auto" w:fill="D9D9D9" w:themeFill="background1" w:themeFillShade="D9"/>
-    </w:rPr>
-  </w:style>
-  <w:style w:type="character" w:customStyle="1" w:styleId="interviewhelpquestionmark">
-    <w:name w:val="interview help question mark"/>
-    <w:basedOn w:val="DefaultParagraphFont"/>
-    <w:uiPriority w:val="1"/>
-    <w:qFormat/>
-    <w:rsid w:val="000F4FEF"/>
-    <w:rPr>
-      <w:color w:val="FFFFFF" w:themeColor="background1"/>
-      <w:shd w:val="clear" w:color="auto" w:fill="9CC2E5" w:themeFill="accent5" w:themeFillTint="99"/>
-    </w:rPr>
-  </w:style>
-  <w:style w:type="paragraph" w:customStyle="1" w:styleId="ListPlevel2">
-    <w:name w:val="List P level 2"/>
-    <w:basedOn w:val="ListParagraph"/>
-    <w:qFormat/>
-    <w:rsid w:val="000F4FEF"/>
-    <w:pPr>
-      <w:ind w:left="765"/>
-    </w:pPr>
-    <w:rPr>
-      <w:color w:val="auto"/>
-      <w:spacing w:val="0"/>
-    </w:rPr>
-  </w:style>
-  <w:style w:type="paragraph" w:customStyle="1" w:styleId="ListPlevel3">
-    <w:name w:val="List P level 3"/>
-    <w:basedOn w:val="ListPlevel2"/>
-    <w:qFormat/>
-    <w:rsid w:val="000F4FEF"/>
-    <w:pPr>
-      <w:tabs>
-        <w:tab w:val="num" w:pos="360"/>
-      </w:tabs>
-      <w:ind w:left="2160"/>
-    </w:pPr>
-  </w:style>
-  <w:style w:type="paragraph" w:customStyle="1" w:styleId="ListParagraphNumberedBold">
-    <w:name w:val="List Paragraph Numbered (Bold)"/>
-    <w:basedOn w:val="ListParagraphNumbered"/>
-    <w:qFormat/>
-    <w:rsid w:val="00AA522D"/>
-    <w:pPr>
-      <w:ind w:left="405"/>
-    </w:pPr>
-    <w:rPr>
-      <w:color w:val="auto"/>
-      <w:spacing w:val="0"/>
-    </w:rPr>
-  </w:style>
-  <w:style w:type="paragraph" w:styleId="Footer">
-    <w:name w:val="footer"/>
-    <w:basedOn w:val="Normal"/>
-    <w:link w:val="FooterChar"/>
-    <w:uiPriority w:val="99"/>
-    <w:unhideWhenUsed/>
-    <w:rsid w:val="000F4FEF"/>
-    <w:pPr>
-      <w:tabs>
-        <w:tab w:val="center" w:pos="4680"/>
-        <w:tab w:val="right" w:pos="9360"/>
-      </w:tabs>
-    </w:pPr>
-  </w:style>
-  <w:style w:type="character" w:customStyle="1" w:styleId="FooterChar">
-    <w:name w:val="Footer Char"/>
-    <w:basedOn w:val="DefaultParagraphFont"/>
-    <w:link w:val="Footer"/>
-    <w:uiPriority w:val="99"/>
-    <w:qFormat/>
-    <w:rsid w:val="000F4FEF"/>
-    <w:rPr>
-      <w:rFonts w:ascii="Arial" w:hAnsi="Arial" w:cs="Arial"/>
-    </w:rPr>
-  </w:style>
-  <w:style w:type="paragraph" w:customStyle="1" w:styleId="FooterRight">
-    <w:name w:val="Footer Right"/>
-    <w:basedOn w:val="Footer"/>
-    <w:qFormat/>
-    <w:rsid w:val="00FA6057"/>
-    <w:pPr>
-      <w:jc w:val="right"/>
-    </w:pPr>
-  </w:style>
-  <w:style w:type="paragraph" w:customStyle="1" w:styleId="interviewsituationpara">
-    <w:name w:val="interview situation para"/>
-    <w:basedOn w:val="Body"/>
-    <w:next w:val="interviewsituationcondition"/>
-    <w:link w:val="interviewsituationparaChar"/>
-    <w:qFormat/>
-    <w:rsid w:val="00DD3DDA"/>
-    <w:pPr>
-      <w:spacing w:before="120" w:after="0" w:line="240" w:lineRule="auto"/>
-      <w:contextualSpacing/>
-    </w:pPr>
-  </w:style>
-  <w:style w:type="character" w:customStyle="1" w:styleId="interviewsituationparaChar">
-    <w:name w:val="interview situation para Char"/>
-    <w:basedOn w:val="BodyChar"/>
-    <w:link w:val="interviewsituationpara"/>
-    <w:rsid w:val="00DD3DDA"/>
-    <w:rPr>
-      <w:rFonts w:ascii="Helvetica" w:eastAsiaTheme="minorHAnsi" w:hAnsi="Helvetica" w:cs="Helvetica"/>
-      <w:sz w:val="24"/>
-      <w:szCs w:val="24"/>
-    </w:rPr>
-  </w:style>
-  <w:style w:type="paragraph" w:customStyle="1" w:styleId="Done">
-    <w:name w:val="Done"/>
-    <w:basedOn w:val="ListParagraph"/>
-    <w:qFormat/>
-    <w:rsid w:val="00DD3DDA"/>
-    <w:pPr>
-      <w:numPr>
-        <w:ilvl w:val="1"/>
-        <w:numId w:val="19"/>
-      </w:numPr>
-    </w:pPr>
-  </w:style>
-  <w:style w:type="character" w:customStyle="1" w:styleId="subject">
-    <w:name w:val="subject"/>
-    <w:basedOn w:val="DefaultParagraphFont"/>
-    <w:rsid w:val="000F4FEF"/>
-  </w:style>
-  <w:style w:type="character" w:customStyle="1" w:styleId="convention">
-    <w:name w:val="convention"/>
-    <w:basedOn w:val="DefaultParagraphFont"/>
-    <w:uiPriority w:val="1"/>
-    <w:qFormat/>
-    <w:rsid w:val="000F4FEF"/>
-    <w:rPr>
-      <w:sz w:val="22"/>
-      <w:szCs w:val="22"/>
-      <w:shd w:val="clear" w:color="auto" w:fill="A6A6A6" w:themeFill="background1" w:themeFillShade="A6"/>
-    </w:rPr>
-  </w:style>
-  <w:style w:type="paragraph" w:customStyle="1" w:styleId="Default">
-    <w:name w:val="Default"/>
-    <w:rsid w:val="000F4FEF"/>
-    <w:pPr>
-      <w:autoSpaceDE w:val="0"/>
-      <w:autoSpaceDN w:val="0"/>
-      <w:adjustRightInd w:val="0"/>
-      <w:spacing w:beforeAutospacing="0" w:after="0" w:afterAutospacing="0" w:line="240" w:lineRule="auto"/>
-    </w:pPr>
-    <w:rPr>
-      <w:rFonts w:ascii="Arial" w:eastAsiaTheme="minorHAnsi" w:hAnsi="Arial" w:cs="Arial"/>
-      <w:color w:val="000000"/>
-      <w:sz w:val="24"/>
-      <w:szCs w:val="24"/>
-    </w:rPr>
-  </w:style>
-  <w:style w:type="paragraph" w:customStyle="1" w:styleId="Example-bulleted">
-    <w:name w:val="Example - bulleted"/>
-    <w:basedOn w:val="Body"/>
-    <w:qFormat/>
-    <w:rsid w:val="000F4FEF"/>
-    <w:pPr>
-      <w:widowControl w:val="0"/>
-      <w:numPr>
-        <w:numId w:val="28"/>
-      </w:numPr>
-      <w:suppressAutoHyphens/>
-      <w:autoSpaceDE w:val="0"/>
-      <w:autoSpaceDN w:val="0"/>
-      <w:spacing w:before="60"/>
-    </w:pPr>
-    <w:rPr>
-      <w:rFonts w:eastAsia="Calibri"/>
-    </w:rPr>
-  </w:style>
-  <w:style w:type="character" w:customStyle="1" w:styleId="f1-light">
-    <w:name w:val="f1-light"/>
-    <w:basedOn w:val="DefaultParagraphFont"/>
-    <w:rsid w:val="000F4FEF"/>
-  </w:style>
-  <w:style w:type="paragraph" w:customStyle="1" w:styleId="H3numberedfordirections">
-    <w:name w:val="H3 numbered for directions"/>
-    <w:basedOn w:val="Heading3"/>
-    <w:next w:val="Normal"/>
-    <w:qFormat/>
-    <w:rsid w:val="000F4FEF"/>
-    <w:pPr>
-      <w:numPr>
-        <w:numId w:val="29"/>
-      </w:numPr>
-      <w:outlineLvl w:val="9"/>
-    </w:pPr>
-  </w:style>
-  <w:style w:type="character" w:customStyle="1" w:styleId="Interviewbutton0">
-    <w:name w:val="Interview button"/>
-    <w:basedOn w:val="DefaultParagraphFont"/>
-    <w:uiPriority w:val="1"/>
-    <w:qFormat/>
-    <w:rsid w:val="000F4FEF"/>
-    <w:rPr>
-      <w:color w:val="FFFFFF" w:themeColor="background1"/>
-      <w:bdr w:val="none" w:sz="0" w:space="0" w:color="auto"/>
-      <w:shd w:val="clear" w:color="auto" w:fill="0B5ED8"/>
-    </w:rPr>
-  </w:style>
-  <w:style w:type="paragraph" w:customStyle="1" w:styleId="interviewbuttons">
-    <w:name w:val="interview buttons"/>
-    <w:basedOn w:val="Normal"/>
-    <w:qFormat/>
-    <w:rsid w:val="000F4FEF"/>
-    <w:pPr>
-      <w:pBdr>
-        <w:top w:val="single" w:sz="12" w:space="1" w:color="0070C0"/>
-        <w:left w:val="single" w:sz="12" w:space="4" w:color="0070C0"/>
-        <w:bottom w:val="single" w:sz="12" w:space="1" w:color="0070C0"/>
-        <w:right w:val="single" w:sz="12" w:space="4" w:color="0070C0"/>
-        <w:between w:val="single" w:sz="12" w:space="1" w:color="0070C0"/>
-        <w:bar w:val="single" w:sz="12" w:color="0070C0"/>
-      </w:pBdr>
-      <w:shd w:val="clear" w:color="auto" w:fill="FFFFFF"/>
-      <w:spacing w:after="0"/>
-      <w:ind w:left="-58" w:right="-216"/>
-    </w:pPr>
-    <w:rPr>
-      <w:sz w:val="21"/>
-      <w:szCs w:val="21"/>
-    </w:rPr>
-  </w:style>
-  <w:style w:type="paragraph" w:customStyle="1" w:styleId="interviewcheckboxes">
-    <w:name w:val="interview checkboxes"/>
-    <w:basedOn w:val="ListParagraph"/>
-    <w:qFormat/>
-    <w:rsid w:val="000F4FEF"/>
-    <w:pPr>
-      <w:numPr>
-        <w:numId w:val="31"/>
-      </w:numPr>
-      <w:pBdr>
-        <w:top w:val="single" w:sz="12" w:space="1" w:color="0070C0"/>
-        <w:left w:val="single" w:sz="12" w:space="4" w:color="0070C0"/>
-        <w:bottom w:val="single" w:sz="12" w:space="1" w:color="0070C0"/>
-        <w:right w:val="single" w:sz="12" w:space="4" w:color="0070C0"/>
-        <w:between w:val="single" w:sz="12" w:space="1" w:color="0070C0"/>
-        <w:bar w:val="single" w:sz="12" w:color="0070C0"/>
-      </w:pBdr>
-    </w:pPr>
-  </w:style>
-  <w:style w:type="character" w:customStyle="1" w:styleId="interviewclickformoreinfo-definition">
-    <w:name w:val="interview click for more info - definition"/>
-    <w:uiPriority w:val="1"/>
-    <w:qFormat/>
-    <w:rsid w:val="000F4FEF"/>
-    <w:rPr>
-      <w:color w:val="00B050"/>
-      <w:u w:val="dash" w:color="92D050"/>
-    </w:rPr>
-  </w:style>
-  <w:style w:type="character" w:customStyle="1" w:styleId="InterviewCommentText">
-    <w:name w:val="Interview Comment Text"/>
-    <w:basedOn w:val="BodyTextChar"/>
-    <w:uiPriority w:val="1"/>
-    <w:qFormat/>
-    <w:rsid w:val="000F4FEF"/>
-    <w:rPr>
-      <w:rFonts w:ascii="Helvetica" w:eastAsia="Arial" w:hAnsi="Helvetica" w:cs="Helvetica"/>
-      <w:color w:val="7030A0"/>
-      <w:spacing w:val="-2"/>
-      <w:sz w:val="24"/>
-      <w:szCs w:val="24"/>
-    </w:rPr>
-  </w:style>
-  <w:style w:type="character" w:customStyle="1" w:styleId="interviewconvention">
-    <w:name w:val="interview convention"/>
-    <w:basedOn w:val="DefaultParagraphFont"/>
-    <w:uiPriority w:val="1"/>
-    <w:qFormat/>
-    <w:rsid w:val="000F4FEF"/>
-    <w:rPr>
-      <w:sz w:val="22"/>
-      <w:szCs w:val="22"/>
-      <w:shd w:val="clear" w:color="auto" w:fill="A6A6A6" w:themeFill="background1" w:themeFillShade="A6"/>
-    </w:rPr>
-  </w:style>
-  <w:style w:type="paragraph" w:customStyle="1" w:styleId="interviewglossarywordintemplate">
-    <w:name w:val="interview glossary word in template"/>
-    <w:basedOn w:val="Normal"/>
-    <w:link w:val="interviewglossarywordintemplateChar"/>
-    <w:qFormat/>
-    <w:rsid w:val="000F4FEF"/>
-    <w:pPr>
-      <w:spacing w:after="60" w:line="360" w:lineRule="auto"/>
-    </w:pPr>
-    <w:rPr>
-      <w:rFonts w:asciiTheme="minorHAnsi" w:hAnsiTheme="minorHAnsi" w:cstheme="minorBidi"/>
-    </w:rPr>
-  </w:style>
-  <w:style w:type="character" w:customStyle="1" w:styleId="interviewglossarywordintemplateChar">
-    <w:name w:val="interview glossary word in template Char"/>
-    <w:basedOn w:val="DefaultParagraphFont"/>
-    <w:link w:val="interviewglossarywordintemplate"/>
-    <w:rsid w:val="000F4FEF"/>
-  </w:style>
-  <w:style w:type="character" w:customStyle="1" w:styleId="interviewsituation">
-    <w:name w:val="interview situation"/>
-    <w:basedOn w:val="interviewneedstobewritten"/>
-    <w:uiPriority w:val="1"/>
-    <w:qFormat/>
-    <w:rsid w:val="00DD3DDA"/>
-    <w:rPr>
-      <w:shd w:val="clear" w:color="auto" w:fill="FFFF00"/>
-    </w:rPr>
-  </w:style>
-  <w:style w:type="character" w:customStyle="1" w:styleId="interviewneedstobewritten">
-    <w:name w:val="interview needs to be written"/>
-    <w:basedOn w:val="DefaultParagraphFont"/>
-    <w:uiPriority w:val="1"/>
-    <w:qFormat/>
-    <w:rsid w:val="000F4FEF"/>
-    <w:rPr>
-      <w:shd w:val="clear" w:color="auto" w:fill="FFFF00"/>
-    </w:rPr>
-  </w:style>
-  <w:style w:type="character" w:customStyle="1" w:styleId="interviewPAPtexttrigger">
-    <w:name w:val="interview PAP text trigger"/>
-    <w:basedOn w:val="DefaultParagraphFont"/>
-    <w:uiPriority w:val="1"/>
-    <w:qFormat/>
-    <w:rsid w:val="000F4FEF"/>
-    <w:rPr>
-      <w:shd w:val="clear" w:color="auto" w:fill="009999"/>
-    </w:rPr>
-  </w:style>
-  <w:style w:type="character" w:customStyle="1" w:styleId="interviewpdf">
-    <w:name w:val="interview pdf"/>
-    <w:basedOn w:val="DefaultParagraphFont"/>
-    <w:uiPriority w:val="1"/>
-    <w:qFormat/>
-    <w:rsid w:val="000F4FEF"/>
-    <w:rPr>
-      <w:b/>
-      <w:szCs w:val="24"/>
-      <w:shd w:val="clear" w:color="auto" w:fill="FF00FF"/>
-    </w:rPr>
-  </w:style>
-  <w:style w:type="paragraph" w:customStyle="1" w:styleId="interviewquestionid">
-    <w:name w:val="interview question id"/>
-    <w:basedOn w:val="BodyText"/>
-    <w:qFormat/>
-    <w:rsid w:val="000F4FEF"/>
-    <w:pPr>
-      <w:spacing w:before="240" w:after="0"/>
-    </w:pPr>
-    <w:rPr>
-      <w:color w:val="FF9F9F"/>
-    </w:rPr>
-  </w:style>
-  <w:style w:type="paragraph" w:customStyle="1" w:styleId="interviewradiobuttons">
-    <w:name w:val="interview radio buttons"/>
-    <w:basedOn w:val="ListParagraph"/>
-    <w:qFormat/>
-    <w:rsid w:val="000F4FEF"/>
-    <w:pPr>
-      <w:numPr>
-        <w:numId w:val="32"/>
-      </w:numPr>
-      <w:pBdr>
-        <w:top w:val="single" w:sz="12" w:space="1" w:color="0070C0"/>
-        <w:left w:val="single" w:sz="12" w:space="4" w:color="0070C0"/>
-        <w:bottom w:val="single" w:sz="12" w:space="1" w:color="0070C0"/>
-        <w:right w:val="single" w:sz="12" w:space="4" w:color="0070C0"/>
-        <w:between w:val="single" w:sz="12" w:space="1" w:color="0070C0"/>
-        <w:bar w:val="single" w:sz="12" w:color="0070C0"/>
-      </w:pBdr>
-      <w:shd w:val="clear" w:color="auto" w:fill="FFFFFF"/>
-      <w:spacing w:after="480" w:line="360" w:lineRule="auto"/>
-      <w:ind w:right="-220"/>
-    </w:pPr>
-    <w:rPr>
-      <w:szCs w:val="21"/>
-    </w:rPr>
-  </w:style>
-  <w:style w:type="character" w:customStyle="1" w:styleId="interviewvariable">
-    <w:name w:val="interview variable"/>
-    <w:basedOn w:val="DefaultParagraphFont"/>
-    <w:uiPriority w:val="1"/>
-    <w:qFormat/>
-    <w:rsid w:val="000F4FEF"/>
-    <w:rPr>
-      <w:color w:val="FF7C80"/>
-      <w:shd w:val="clear" w:color="auto" w:fill="FFFFCC"/>
-    </w:rPr>
-  </w:style>
-  <w:style w:type="paragraph" w:customStyle="1" w:styleId="Listnumberedunderbullet">
-    <w:name w:val="List numbered under bullet"/>
-    <w:basedOn w:val="Normal"/>
-    <w:qFormat/>
-    <w:rsid w:val="000F4FEF"/>
-    <w:pPr>
-      <w:widowControl w:val="0"/>
-      <w:numPr>
-        <w:ilvl w:val="4"/>
-        <w:numId w:val="33"/>
-      </w:numPr>
-      <w:autoSpaceDE w:val="0"/>
-      <w:autoSpaceDN w:val="0"/>
-      <w:spacing w:before="54" w:beforeAutospacing="0" w:after="120" w:afterAutospacing="0" w:line="276" w:lineRule="auto"/>
-    </w:pPr>
-    <w:rPr>
-      <w:rFonts w:ascii="Helvetica" w:eastAsiaTheme="minorHAnsi" w:hAnsi="Helvetica" w:cs="Helvetica"/>
-      <w:color w:val="202529"/>
-      <w:spacing w:val="-2"/>
-      <w:sz w:val="24"/>
-      <w:szCs w:val="24"/>
-    </w:rPr>
-  </w:style>
-  <w:style w:type="paragraph" w:customStyle="1" w:styleId="MLRIAdvocacyguideforPDFPart">
-    <w:name w:val="MLRI Advocacy guide for PDF Part"/>
-    <w:basedOn w:val="Normal"/>
-    <w:qFormat/>
-    <w:rsid w:val="000F4FEF"/>
-    <w:pPr>
-      <w:spacing w:before="480" w:after="80" w:line="320" w:lineRule="exact"/>
-      <w:ind w:left="187"/>
-    </w:pPr>
-    <w:rPr>
-      <w:rFonts w:ascii="Bookman Old Style" w:hAnsi="Bookman Old Style"/>
-      <w:color w:val="808080"/>
-      <w:szCs w:val="28"/>
-    </w:rPr>
-  </w:style>
-  <w:style w:type="character" w:customStyle="1" w:styleId="NumChar">
-    <w:name w:val="NumChar"/>
-    <w:basedOn w:val="DefaultParagraphFont"/>
-    <w:uiPriority w:val="1"/>
-    <w:qFormat/>
-    <w:rsid w:val="000F4FEF"/>
-    <w:rPr>
-      <w:rFonts w:eastAsiaTheme="minorHAnsi"/>
-    </w:rPr>
-  </w:style>
-  <w:style w:type="paragraph" w:customStyle="1" w:styleId="one-indent">
-    <w:name w:val="one-indent"/>
-    <w:basedOn w:val="Normal"/>
-    <w:rsid w:val="000F4FEF"/>
-    <w:pPr>
-      <w:spacing w:before="100" w:after="100"/>
-    </w:pPr>
-    <w:rPr>
-      <w:rFonts w:ascii="Times New Roman" w:eastAsia="Times New Roman" w:hAnsi="Times New Roman" w:cs="Times New Roman"/>
-      <w:sz w:val="24"/>
-      <w:szCs w:val="24"/>
-    </w:rPr>
-  </w:style>
-  <w:style w:type="character" w:customStyle="1" w:styleId="small">
-    <w:name w:val="small"/>
-    <w:basedOn w:val="DefaultParagraphFont"/>
-    <w:rsid w:val="000F4FEF"/>
-    <w:rPr>
-      <w:rFonts w:cs="Times New Roman"/>
-    </w:rPr>
-  </w:style>
-  <w:style w:type="paragraph" w:customStyle="1" w:styleId="StyleHeading1Hanging008">
-    <w:name w:val="Style Heading 1 + Hanging:  0.08&quot;"/>
-    <w:basedOn w:val="Heading1"/>
-    <w:qFormat/>
-    <w:rsid w:val="000F4FEF"/>
-    <w:pPr>
-      <w:spacing w:before="120"/>
-      <w:ind w:hanging="115"/>
-    </w:pPr>
-    <w:rPr>
-      <w:rFonts w:eastAsia="Times New Roman" w:cs="Times New Roman"/>
-      <w:szCs w:val="20"/>
-    </w:rPr>
-  </w:style>
-  <w:style w:type="numbering" w:customStyle="1" w:styleId="Style1">
-    <w:name w:val="Style1"/>
-    <w:uiPriority w:val="99"/>
-    <w:rsid w:val="000F4FEF"/>
-    <w:pPr>
-      <w:numPr>
-        <w:numId w:val="17"/>
-      </w:numPr>
-    </w:pPr>
-  </w:style>
-  <w:style w:type="paragraph" w:customStyle="1" w:styleId="TableParagraph">
-    <w:name w:val="Table Paragraph"/>
-    <w:basedOn w:val="Normal"/>
-    <w:uiPriority w:val="1"/>
-    <w:qFormat/>
-    <w:rsid w:val="000F4FEF"/>
-  </w:style>
-  <w:style w:type="character" w:customStyle="1" w:styleId="UnresolvedMention">
-    <w:name w:val="Unresolved Mention"/>
+  <w:style w:type="character" w:customStyle="1" w:styleId="UnresolvedMention1">
+    <w:name w:val="Unresolved Mention1"/>
     <w:basedOn w:val="DefaultParagraphFont"/>
     <w:uiPriority w:val="99"/>
     <w:semiHidden/>
@@ -10017,7 +7182,7 @@
   <a:extraClrSchemeLst/>
   <a:extLst>
     <a:ext uri="{05A4C25C-085E-4340-85A3-A5531E510DB2}">
-      <thm15:themeFamily xmlns="" xmlns:thm15="http://schemas.microsoft.com/office/thememl/2012/main" name="Office Theme" id="{62F939B6-93AF-4DB8-9C6B-D6C7DFDC589F}" vid="{4A3C46E8-61CC-4603-A589-7422A47A8E4A}"/>
+      <thm15:themeFamily xmlns:thm15="http://schemas.microsoft.com/office/thememl/2012/main" name="Office Theme" id="{62F939B6-93AF-4DB8-9C6B-D6C7DFDC589F}" vid="{4A3C46E8-61CC-4603-A589-7422A47A8E4A}"/>
     </a:ext>
   </a:extLst>
 </a:theme>

</xml_diff>

<commit_message>
fixed missing p in jinja condition in want_help_to_agree_content
</commit_message>
<xml_diff>
--- a/docassemble/AKA2JBranding/data/templates/want_help_to_agree_content.docx
+++ b/docassemble/AKA2JBranding/data/templates/want_help_to_agree_content.docx
@@ -1,12 +1,14 @@
 
 <file path=word/document.xml><?xml version="1.0" encoding="utf-8"?>
-<w:document xmlns:wpc="http://schemas.microsoft.com/office/word/2010/wordprocessingCanvas" xmlns:cx="http://schemas.microsoft.com/office/drawing/2014/chartex" xmlns:cx1="http://schemas.microsoft.com/office/drawing/2015/9/8/chartex" xmlns:cx2="http://schemas.microsoft.com/office/drawing/2015/10/21/chartex" xmlns:cx3="http://schemas.microsoft.com/office/drawing/2016/5/9/chartex" xmlns:cx4="http://schemas.microsoft.com/office/drawing/2016/5/10/chartex" xmlns:cx5="http://schemas.microsoft.com/office/drawing/2016/5/11/chartex" xmlns:cx6="http://schemas.microsoft.com/office/drawing/2016/5/12/chartex" xmlns:cx7="http://schemas.microsoft.com/office/drawing/2016/5/13/chartex" xmlns:cx8="http://schemas.microsoft.com/office/drawing/2016/5/14/chartex" xmlns:mc="http://schemas.openxmlformats.org/markup-compatibility/2006" xmlns:aink="http://schemas.microsoft.com/office/drawing/2016/ink" xmlns:am3d="http://schemas.microsoft.com/office/drawing/2017/model3d" xmlns:o="urn:schemas-microsoft-com:office:office" xmlns:r="http://schemas.openxmlformats.org/officeDocument/2006/relationships" xmlns:m="http://schemas.openxmlformats.org/officeDocument/2006/math" xmlns:v="urn:schemas-microsoft-com:vml" xmlns:wp14="http://schemas.microsoft.com/office/word/2010/wordprocessingDrawing" xmlns:wp="http://schemas.openxmlformats.org/drawingml/2006/wordprocessingDrawing" xmlns:w10="urn:schemas-microsoft-com:office:word" xmlns:w="http://schemas.openxmlformats.org/wordprocessingml/2006/main" xmlns:w14="http://schemas.microsoft.com/office/word/2010/wordml" xmlns:w15="http://schemas.microsoft.com/office/word/2012/wordml" xmlns:w16cex="http://schemas.microsoft.com/office/word/2018/wordml/cex" xmlns:w16cid="http://schemas.microsoft.com/office/word/2016/wordml/cid" xmlns:w16="http://schemas.microsoft.com/office/word/2018/wordml" xmlns:w16sdtdh="http://schemas.microsoft.com/office/word/2020/wordml/sdtdatahash" xmlns:w16se="http://schemas.microsoft.com/office/word/2015/wordml/symex" xmlns:wpg="http://schemas.microsoft.com/office/word/2010/wordprocessingGroup" xmlns:wpi="http://schemas.microsoft.com/office/word/2010/wordprocessingInk" xmlns:wne="http://schemas.microsoft.com/office/word/2006/wordml" xmlns:wps="http://schemas.microsoft.com/office/word/2010/wordprocessingShape" mc:Ignorable="w14 w15 w16se w16cid w16 w16cex w16sdtdh wp14">
+<w:document xmlns:wpc="http://schemas.microsoft.com/office/word/2010/wordprocessingCanvas" xmlns:mc="http://schemas.openxmlformats.org/markup-compatibility/2006" xmlns:o="urn:schemas-microsoft-com:office:office" xmlns:r="http://schemas.openxmlformats.org/officeDocument/2006/relationships" xmlns:m="http://schemas.openxmlformats.org/officeDocument/2006/math" xmlns:v="urn:schemas-microsoft-com:vml" xmlns:wp14="http://schemas.microsoft.com/office/word/2010/wordprocessingDrawing" xmlns:wp="http://schemas.openxmlformats.org/drawingml/2006/wordprocessingDrawing" xmlns:w10="urn:schemas-microsoft-com:office:word" xmlns:w="http://schemas.openxmlformats.org/wordprocessingml/2006/main" xmlns:w14="http://schemas.microsoft.com/office/word/2010/wordml" xmlns:wpg="http://schemas.microsoft.com/office/word/2010/wordprocessingGroup" xmlns:wpi="http://schemas.microsoft.com/office/word/2010/wordprocessingInk" xmlns:wne="http://schemas.microsoft.com/office/word/2006/wordml" xmlns:wps="http://schemas.microsoft.com/office/word/2010/wordprocessingShape" mc:Ignorable="w14 wp14">
   <w:body>
     <w:p>
       <w:pPr>
         <w:pStyle w:val="Body"/>
         <w:spacing w:before="120"/>
       </w:pPr>
+      <w:bookmarkStart w:id="0" w:name="_GoBack"/>
+      <w:bookmarkEnd w:id="0"/>
       <w:r>
         <w:rPr>
           <w:color w:val="FF0000"/>
@@ -1077,7 +1079,7 @@
       <w:r>
         <w:t xml:space="preserve">Watch a </w:t>
       </w:r>
-      <w:hyperlink r:id="rId7">
+      <w:hyperlink r:id="rId8">
         <w:r>
           <w:rPr>
             <w:rStyle w:val="Hyperlink"/>
@@ -1296,7 +1298,7 @@
         <w:rPr>
           <w:shd w:val="clear" w:color="auto" w:fill="FFFFFF"/>
         </w:rPr>
-        <w:t>Settlement Conference{% endif %}</w:t>
+        <w:t>Settlement Conference</w:t>
       </w:r>
     </w:p>
     <w:p>
@@ -1317,6 +1319,43 @@
       </w:pPr>
       <w:r>
         <w:rPr>
+          <w:color w:val="92D050"/>
+        </w:rPr>
+        <w:t xml:space="preserve">{%p </w:t>
+      </w:r>
+      <w:proofErr w:type="spellStart"/>
+      <w:r>
+        <w:rPr>
+          <w:color w:val="92D050"/>
+        </w:rPr>
+        <w:t>endif</w:t>
+      </w:r>
+      <w:proofErr w:type="spellEnd"/>
+      <w:r>
+        <w:rPr>
+          <w:color w:val="92D050"/>
+        </w:rPr>
+        <w:t xml:space="preserve"> %}</w:t>
+      </w:r>
+    </w:p>
+    <w:p>
+      <w:pPr>
+        <w:pStyle w:val="ListParagraph"/>
+        <w:numPr>
+          <w:ilvl w:val="0"/>
+          <w:numId w:val="47"/>
+        </w:numPr>
+        <w:suppressAutoHyphens/>
+        <w:autoSpaceDE/>
+        <w:autoSpaceDN/>
+        <w:spacing w:before="0" w:beforeAutospacing="1" w:after="0" w:afterAutospacing="1"/>
+        <w:ind w:left="514"/>
+        <w:rPr>
+          <w:color w:val="auto"/>
+        </w:rPr>
+      </w:pPr>
+      <w:r>
+        <w:rPr>
           <w:color w:val="auto"/>
         </w:rPr>
         <w:t>Collaborative Law</w:t>
@@ -1335,14 +1374,28 @@
         <w:spacing w:before="0" w:beforeAutospacing="1" w:afterAutospacing="1"/>
         <w:ind w:left="514"/>
         <w:rPr>
-          <w:color w:val="auto"/>
-        </w:rPr>
-      </w:pPr>
-      <w:r>
-        <w:rPr>
-          <w:color w:val="92D050"/>
-        </w:rPr>
-        <w:t>{%p endif %}</w:t>
+          <w:color w:val="FFC000"/>
+        </w:rPr>
+      </w:pPr>
+      <w:r>
+        <w:rPr>
+          <w:color w:val="FFC000"/>
+        </w:rPr>
+        <w:t xml:space="preserve">{%p </w:t>
+      </w:r>
+      <w:proofErr w:type="spellStart"/>
+      <w:r>
+        <w:rPr>
+          <w:color w:val="FFC000"/>
+        </w:rPr>
+        <w:t>endif</w:t>
+      </w:r>
+      <w:proofErr w:type="spellEnd"/>
+      <w:r>
+        <w:rPr>
+          <w:color w:val="FFC000"/>
+        </w:rPr>
+        <w:t xml:space="preserve"> %}</w:t>
       </w:r>
     </w:p>
     <w:p>
@@ -1513,7 +1566,7 @@
       <w:r>
         <w:t xml:space="preserve"> [</w:t>
       </w:r>
-      <w:hyperlink r:id="rId8" w:history="1">
+      <w:hyperlink r:id="rId9" w:history="1">
         <w:r>
           <w:rPr>
             <w:rStyle w:val="Hyperlink"/>
@@ -1539,6 +1592,7 @@
         <w:rPr>
           <w:color w:val="FFC000"/>
         </w:rPr>
+        <w:lastRenderedPageBreak/>
         <w:t>{%p endif %}</w:t>
       </w:r>
     </w:p>
@@ -1547,7 +1601,6 @@
         <w:pStyle w:val="Body"/>
       </w:pPr>
       <w:r>
-        <w:lastRenderedPageBreak/>
         <w:t>You can hire your own private mediator to help resolve any issue in your case. If there was abuse or domestic violence in your relationship, be sure to hire someone with training and experience working with domestic violence. Tell your mediator if you want to bring a support person with you.</w:t>
       </w:r>
     </w:p>
@@ -1559,7 +1612,7 @@
           <w:rFonts w:eastAsia="Calibri"/>
         </w:rPr>
       </w:pPr>
-      <w:hyperlink r:id="rId9">
+      <w:hyperlink r:id="rId10">
         <w:r>
           <w:rPr>
             <w:rStyle w:val="Hyperlink"/>
@@ -1583,7 +1636,7 @@
           <w:rFonts w:eastAsia="Calibri"/>
         </w:rPr>
       </w:pPr>
-      <w:hyperlink r:id="rId10" w:history="1">
+      <w:hyperlink r:id="rId11" w:history="1">
         <w:r>
           <w:rPr>
             <w:rStyle w:val="Hyperlink"/>
@@ -1748,7 +1801,7 @@
       <w:r>
         <w:t xml:space="preserve">If both parties want a judge to help settle the issues, file a Joint Motion for a Settlement Conference, SHC-1062 </w:t>
       </w:r>
-      <w:hyperlink r:id="rId11">
+      <w:hyperlink r:id="rId12">
         <w:r>
           <w:rPr>
             <w:rStyle w:val="Hyperlink"/>
@@ -1759,7 +1812,7 @@
       <w:r>
         <w:t xml:space="preserve"> | </w:t>
       </w:r>
-      <w:hyperlink r:id="rId12">
+      <w:hyperlink r:id="rId13">
         <w:r>
           <w:rPr>
             <w:rStyle w:val="Hyperlink"/>
@@ -1796,7 +1849,7 @@
       <w:r>
         <w:t xml:space="preserve">The </w:t>
       </w:r>
-      <w:hyperlink r:id="rId13">
+      <w:hyperlink r:id="rId14">
         <w:r>
           <w:rPr>
             <w:rStyle w:val="Hyperlink"/>
@@ -1852,7 +1905,7 @@
       <w:r>
         <w:t xml:space="preserve"> </w:t>
       </w:r>
-      <w:hyperlink r:id="rId14" w:history="1">
+      <w:hyperlink r:id="rId15" w:history="1">
         <w:r>
           <w:rPr>
             <w:rStyle w:val="Hyperlink"/>
@@ -1875,6 +1928,7 @@
         <w:rPr>
           <w:color w:val="FFC000"/>
         </w:rPr>
+        <w:lastRenderedPageBreak/>
         <w:t>{%p if (user_need == 'answer_custody' and type_of_response.all_false() and not agreement_documents) or (user_need == 'answer divorce' and type_of_response.all_false)%}</w:t>
       </w:r>
     </w:p>
@@ -1883,7 +1937,6 @@
         <w:pStyle w:val="Heading3"/>
       </w:pPr>
       <w:r>
-        <w:lastRenderedPageBreak/>
         <w:t>What to do if you reach an agreement</w:t>
       </w:r>
     </w:p>
@@ -1904,7 +1957,7 @@
         </w:rPr>
         <w:t>{% if user_need == 'answer custody' %}</w:t>
       </w:r>
-      <w:hyperlink r:id="rId15">
+      <w:hyperlink r:id="rId16">
         <w:r>
           <w:rPr>
             <w:rStyle w:val="Hyperlink"/>
@@ -1921,7 +1974,7 @@
         </w:rPr>
         <w:t>{% elif user_need == 'answer divorce' %}</w:t>
       </w:r>
-      <w:hyperlink r:id="rId16">
+      <w:hyperlink r:id="rId17">
         <w:r>
           <w:rPr>
             <w:rStyle w:val="Hyperlink"/>
@@ -1985,7 +2038,7 @@
       <w:pPr>
         <w:pStyle w:val="Body"/>
       </w:pPr>
-      <w:hyperlink r:id="rId17" w:history="1">
+      <w:hyperlink r:id="rId18" w:history="1">
         <w:r>
           <w:rPr>
             <w:rStyle w:val="Hyperlink"/>
@@ -1996,7 +2049,7 @@
       <w:r>
         <w:br/>
       </w:r>
-      <w:hyperlink r:id="rId18" w:history="1">
+      <w:hyperlink r:id="rId19" w:history="1">
         <w:r>
           <w:rPr>
             <w:rStyle w:val="Hyperlink"/>
@@ -2049,7 +2102,7 @@
         </w:rPr>
         <w:t xml:space="preserve"> [</w:t>
       </w:r>
-      <w:hyperlink r:id="rId19" w:history="1">
+      <w:hyperlink r:id="rId20" w:history="1">
         <w:r>
           <w:rPr>
             <w:rStyle w:val="Hyperlink"/>
@@ -2069,7 +2122,7 @@
         </w:rPr>
         <w:br/>
       </w:r>
-      <w:hyperlink r:id="rId20" w:history="1">
+      <w:hyperlink r:id="rId21" w:history="1">
         <w:r>
           <w:rPr>
             <w:rStyle w:val="Hyperlink"/>
@@ -2094,7 +2147,7 @@
       <w:pPr>
         <w:pStyle w:val="Body"/>
       </w:pPr>
-      <w:hyperlink r:id="rId21" w:history="1">
+      <w:hyperlink r:id="rId22" w:history="1">
         <w:r>
           <w:rPr>
             <w:rStyle w:val="Hyperlink"/>
@@ -2111,7 +2164,7 @@
         </w:rPr>
         <w:br/>
       </w:r>
-      <w:hyperlink r:id="rId22" w:history="1">
+      <w:hyperlink r:id="rId23" w:history="1">
         <w:r>
           <w:rPr>
             <w:rStyle w:val="Hyperlink"/>
@@ -2134,7 +2187,7 @@
           <w:szCs w:val="22"/>
         </w:rPr>
       </w:pPr>
-      <w:hyperlink r:id="rId23">
+      <w:hyperlink r:id="rId24">
         <w:r>
           <w:rPr>
             <w:rStyle w:val="Hyperlink"/>
@@ -2149,7 +2202,7 @@
         </w:rPr>
         <w:br/>
       </w:r>
-      <w:hyperlink r:id="rId24" w:history="1">
+      <w:hyperlink r:id="rId25" w:history="1">
         <w:r>
           <w:rPr>
             <w:rStyle w:val="Hyperlink"/>
@@ -2199,7 +2252,7 @@
         </w:rPr>
         <w:t xml:space="preserve"> </w:t>
       </w:r>
-      <w:hyperlink r:id="rId25">
+      <w:hyperlink r:id="rId26">
         <w:r>
           <w:rPr>
             <w:rStyle w:val="Hyperlink"/>
@@ -2219,7 +2272,7 @@
         </w:rPr>
         <w:br/>
       </w:r>
-      <w:hyperlink r:id="rId26" w:history="1">
+      <w:hyperlink r:id="rId27" w:history="1">
         <w:r>
           <w:rPr>
             <w:rStyle w:val="Hyperlink"/>
@@ -2236,7 +2289,7 @@
         <w:br/>
         <w:t xml:space="preserve">as a </w:t>
       </w:r>
-      <w:hyperlink r:id="rId27">
+      <w:hyperlink r:id="rId28">
         <w:r>
           <w:rPr>
             <w:rStyle w:val="Hyperlink"/>
@@ -2250,7 +2303,7 @@
         </w:rPr>
         <w:br/>
       </w:r>
-      <w:hyperlink r:id="rId28" w:history="1">
+      <w:hyperlink r:id="rId29" w:history="1">
         <w:r>
           <w:rPr>
             <w:rStyle w:val="Hyperlink"/>
@@ -2277,6 +2330,7 @@
         <w:rPr>
           <w:color w:val="FFC000"/>
         </w:rPr>
+        <w:lastRenderedPageBreak/>
         <w:t>{%p endif %}</w:t>
       </w:r>
     </w:p>
@@ -2284,7 +2338,7 @@
       <w:pPr>
         <w:pStyle w:val="Body"/>
       </w:pPr>
-      <w:hyperlink r:id="rId29">
+      <w:hyperlink r:id="rId30">
         <w:r>
           <w:rPr>
             <w:rStyle w:val="Hyperlink"/>
@@ -2295,7 +2349,7 @@
       <w:r>
         <w:br/>
       </w:r>
-      <w:hyperlink r:id="rId30" w:history="1">
+      <w:hyperlink r:id="rId31" w:history="1">
         <w:r>
           <w:rPr>
             <w:rStyle w:val="Hyperlink"/>
@@ -2334,7 +2388,7 @@
       <w:pPr>
         <w:pStyle w:val="Body"/>
       </w:pPr>
-      <w:hyperlink r:id="rId31" w:history="1">
+      <w:hyperlink r:id="rId32" w:history="1">
         <w:r>
           <w:rPr>
             <w:rStyle w:val="Hyperlink"/>
@@ -2346,7 +2400,7 @@
       <w:r>
         <w:br/>
       </w:r>
-      <w:hyperlink r:id="rId32" w:history="1">
+      <w:hyperlink r:id="rId33" w:history="1">
         <w:r>
           <w:rPr>
             <w:rStyle w:val="Hyperlink"/>
@@ -2398,7 +2452,7 @@
       <w:pPr>
         <w:pStyle w:val="Body"/>
       </w:pPr>
-      <w:hyperlink r:id="rId33" w:history="1">
+      <w:hyperlink r:id="rId34" w:history="1">
         <w:r>
           <w:rPr>
             <w:rStyle w:val="Hyperlink"/>
@@ -2410,7 +2464,7 @@
       <w:r>
         <w:br/>
       </w:r>
-      <w:hyperlink r:id="rId34" w:history="1">
+      <w:hyperlink r:id="rId35" w:history="1">
         <w:r>
           <w:rPr>
             <w:rStyle w:val="Hyperlink"/>
@@ -2486,12 +2540,12 @@
       </w:r>
     </w:p>
     <w:sectPr>
-      <w:headerReference w:type="even" r:id="rId35"/>
-      <w:headerReference w:type="default" r:id="rId36"/>
-      <w:footerReference w:type="even" r:id="rId37"/>
-      <w:footerReference w:type="default" r:id="rId38"/>
-      <w:headerReference w:type="first" r:id="rId39"/>
-      <w:footerReference w:type="first" r:id="rId40"/>
+      <w:headerReference w:type="even" r:id="rId36"/>
+      <w:headerReference w:type="default" r:id="rId37"/>
+      <w:footerReference w:type="even" r:id="rId38"/>
+      <w:footerReference w:type="default" r:id="rId39"/>
+      <w:headerReference w:type="first" r:id="rId40"/>
+      <w:footerReference w:type="first" r:id="rId41"/>
       <w:pgSz w:w="12240" w:h="15840"/>
       <w:pgMar w:top="1440" w:right="1440" w:bottom="1440" w:left="1440" w:header="720" w:footer="720" w:gutter="0"/>
       <w:cols w:space="720"/>
@@ -2502,7 +2556,7 @@
 </file>
 
 <file path=word/endnotes.xml><?xml version="1.0" encoding="utf-8"?>
-<w:endnotes xmlns:wpc="http://schemas.microsoft.com/office/word/2010/wordprocessingCanvas" xmlns:cx="http://schemas.microsoft.com/office/drawing/2014/chartex" xmlns:cx1="http://schemas.microsoft.com/office/drawing/2015/9/8/chartex" xmlns:cx2="http://schemas.microsoft.com/office/drawing/2015/10/21/chartex" xmlns:cx3="http://schemas.microsoft.com/office/drawing/2016/5/9/chartex" xmlns:cx4="http://schemas.microsoft.com/office/drawing/2016/5/10/chartex" xmlns:cx5="http://schemas.microsoft.com/office/drawing/2016/5/11/chartex" xmlns:cx6="http://schemas.microsoft.com/office/drawing/2016/5/12/chartex" xmlns:cx7="http://schemas.microsoft.com/office/drawing/2016/5/13/chartex" xmlns:cx8="http://schemas.microsoft.com/office/drawing/2016/5/14/chartex" xmlns:mc="http://schemas.openxmlformats.org/markup-compatibility/2006" xmlns:aink="http://schemas.microsoft.com/office/drawing/2016/ink" xmlns:am3d="http://schemas.microsoft.com/office/drawing/2017/model3d" xmlns:o="urn:schemas-microsoft-com:office:office" xmlns:r="http://schemas.openxmlformats.org/officeDocument/2006/relationships" xmlns:m="http://schemas.openxmlformats.org/officeDocument/2006/math" xmlns:v="urn:schemas-microsoft-com:vml" xmlns:wp14="http://schemas.microsoft.com/office/word/2010/wordprocessingDrawing" xmlns:wp="http://schemas.openxmlformats.org/drawingml/2006/wordprocessingDrawing" xmlns:w10="urn:schemas-microsoft-com:office:word" xmlns:w="http://schemas.openxmlformats.org/wordprocessingml/2006/main" xmlns:w14="http://schemas.microsoft.com/office/word/2010/wordml" xmlns:w15="http://schemas.microsoft.com/office/word/2012/wordml" xmlns:w16cex="http://schemas.microsoft.com/office/word/2018/wordml/cex" xmlns:w16cid="http://schemas.microsoft.com/office/word/2016/wordml/cid" xmlns:w16="http://schemas.microsoft.com/office/word/2018/wordml" xmlns:w16sdtdh="http://schemas.microsoft.com/office/word/2020/wordml/sdtdatahash" xmlns:w16se="http://schemas.microsoft.com/office/word/2015/wordml/symex" xmlns:wpg="http://schemas.microsoft.com/office/word/2010/wordprocessingGroup" xmlns:wpi="http://schemas.microsoft.com/office/word/2010/wordprocessingInk" xmlns:wne="http://schemas.microsoft.com/office/word/2006/wordml" xmlns:wps="http://schemas.microsoft.com/office/word/2010/wordprocessingShape" mc:Ignorable="w14 w15 w16se w16cid w16 w16cex w16sdtdh wp14">
+<w:endnotes xmlns:wpc="http://schemas.microsoft.com/office/word/2010/wordprocessingCanvas" xmlns:mc="http://schemas.openxmlformats.org/markup-compatibility/2006" xmlns:o="urn:schemas-microsoft-com:office:office" xmlns:r="http://schemas.openxmlformats.org/officeDocument/2006/relationships" xmlns:m="http://schemas.openxmlformats.org/officeDocument/2006/math" xmlns:v="urn:schemas-microsoft-com:vml" xmlns:wp14="http://schemas.microsoft.com/office/word/2010/wordprocessingDrawing" xmlns:wp="http://schemas.openxmlformats.org/drawingml/2006/wordprocessingDrawing" xmlns:w10="urn:schemas-microsoft-com:office:word" xmlns:w="http://schemas.openxmlformats.org/wordprocessingml/2006/main" xmlns:w14="http://schemas.microsoft.com/office/word/2010/wordml" xmlns:wpg="http://schemas.microsoft.com/office/word/2010/wordprocessingGroup" xmlns:wpi="http://schemas.microsoft.com/office/word/2010/wordprocessingInk" xmlns:wne="http://schemas.microsoft.com/office/word/2006/wordml" xmlns:wps="http://schemas.microsoft.com/office/word/2010/wordprocessingShape" mc:Ignorable="w14 wp14">
   <w:endnote w:type="separator" w:id="-1">
     <w:p>
       <w:pPr>
@@ -2527,7 +2581,7 @@
 </file>
 
 <file path=word/footer1.xml><?xml version="1.0" encoding="utf-8"?>
-<w:ftr xmlns:wpc="http://schemas.microsoft.com/office/word/2010/wordprocessingCanvas" xmlns:cx="http://schemas.microsoft.com/office/drawing/2014/chartex" xmlns:cx1="http://schemas.microsoft.com/office/drawing/2015/9/8/chartex" xmlns:cx2="http://schemas.microsoft.com/office/drawing/2015/10/21/chartex" xmlns:cx3="http://schemas.microsoft.com/office/drawing/2016/5/9/chartex" xmlns:cx4="http://schemas.microsoft.com/office/drawing/2016/5/10/chartex" xmlns:cx5="http://schemas.microsoft.com/office/drawing/2016/5/11/chartex" xmlns:cx6="http://schemas.microsoft.com/office/drawing/2016/5/12/chartex" xmlns:cx7="http://schemas.microsoft.com/office/drawing/2016/5/13/chartex" xmlns:cx8="http://schemas.microsoft.com/office/drawing/2016/5/14/chartex" xmlns:mc="http://schemas.openxmlformats.org/markup-compatibility/2006" xmlns:aink="http://schemas.microsoft.com/office/drawing/2016/ink" xmlns:am3d="http://schemas.microsoft.com/office/drawing/2017/model3d" xmlns:o="urn:schemas-microsoft-com:office:office" xmlns:r="http://schemas.openxmlformats.org/officeDocument/2006/relationships" xmlns:m="http://schemas.openxmlformats.org/officeDocument/2006/math" xmlns:v="urn:schemas-microsoft-com:vml" xmlns:wp14="http://schemas.microsoft.com/office/word/2010/wordprocessingDrawing" xmlns:wp="http://schemas.openxmlformats.org/drawingml/2006/wordprocessingDrawing" xmlns:w10="urn:schemas-microsoft-com:office:word" xmlns:w="http://schemas.openxmlformats.org/wordprocessingml/2006/main" xmlns:w14="http://schemas.microsoft.com/office/word/2010/wordml" xmlns:w15="http://schemas.microsoft.com/office/word/2012/wordml" xmlns:w16cex="http://schemas.microsoft.com/office/word/2018/wordml/cex" xmlns:w16cid="http://schemas.microsoft.com/office/word/2016/wordml/cid" xmlns:w16="http://schemas.microsoft.com/office/word/2018/wordml" xmlns:w16sdtdh="http://schemas.microsoft.com/office/word/2020/wordml/sdtdatahash" xmlns:w16se="http://schemas.microsoft.com/office/word/2015/wordml/symex" xmlns:wpg="http://schemas.microsoft.com/office/word/2010/wordprocessingGroup" xmlns:wpi="http://schemas.microsoft.com/office/word/2010/wordprocessingInk" xmlns:wne="http://schemas.microsoft.com/office/word/2006/wordml" xmlns:wps="http://schemas.microsoft.com/office/word/2010/wordprocessingShape" mc:Ignorable="w14 w15 w16se w16cid w16 w16cex w16sdtdh wp14">
+<w:ftr xmlns:wpc="http://schemas.microsoft.com/office/word/2010/wordprocessingCanvas" xmlns:mc="http://schemas.openxmlformats.org/markup-compatibility/2006" xmlns:o="urn:schemas-microsoft-com:office:office" xmlns:r="http://schemas.openxmlformats.org/officeDocument/2006/relationships" xmlns:m="http://schemas.openxmlformats.org/officeDocument/2006/math" xmlns:v="urn:schemas-microsoft-com:vml" xmlns:wp14="http://schemas.microsoft.com/office/word/2010/wordprocessingDrawing" xmlns:wp="http://schemas.openxmlformats.org/drawingml/2006/wordprocessingDrawing" xmlns:w10="urn:schemas-microsoft-com:office:word" xmlns:w="http://schemas.openxmlformats.org/wordprocessingml/2006/main" xmlns:w14="http://schemas.microsoft.com/office/word/2010/wordml" xmlns:wpg="http://schemas.microsoft.com/office/word/2010/wordprocessingGroup" xmlns:wpi="http://schemas.microsoft.com/office/word/2010/wordprocessingInk" xmlns:wne="http://schemas.microsoft.com/office/word/2006/wordml" xmlns:wps="http://schemas.microsoft.com/office/word/2010/wordprocessingShape" mc:Ignorable="w14 wp14">
   <w:p>
     <w:pPr>
       <w:pStyle w:val="Footer"/>
@@ -2537,7 +2591,7 @@
 </file>
 
 <file path=word/footer2.xml><?xml version="1.0" encoding="utf-8"?>
-<w:ftr xmlns:wpc="http://schemas.microsoft.com/office/word/2010/wordprocessingCanvas" xmlns:cx="http://schemas.microsoft.com/office/drawing/2014/chartex" xmlns:cx1="http://schemas.microsoft.com/office/drawing/2015/9/8/chartex" xmlns:cx2="http://schemas.microsoft.com/office/drawing/2015/10/21/chartex" xmlns:cx3="http://schemas.microsoft.com/office/drawing/2016/5/9/chartex" xmlns:cx4="http://schemas.microsoft.com/office/drawing/2016/5/10/chartex" xmlns:cx5="http://schemas.microsoft.com/office/drawing/2016/5/11/chartex" xmlns:cx6="http://schemas.microsoft.com/office/drawing/2016/5/12/chartex" xmlns:cx7="http://schemas.microsoft.com/office/drawing/2016/5/13/chartex" xmlns:cx8="http://schemas.microsoft.com/office/drawing/2016/5/14/chartex" xmlns:mc="http://schemas.openxmlformats.org/markup-compatibility/2006" xmlns:aink="http://schemas.microsoft.com/office/drawing/2016/ink" xmlns:am3d="http://schemas.microsoft.com/office/drawing/2017/model3d" xmlns:o="urn:schemas-microsoft-com:office:office" xmlns:r="http://schemas.openxmlformats.org/officeDocument/2006/relationships" xmlns:m="http://schemas.openxmlformats.org/officeDocument/2006/math" xmlns:v="urn:schemas-microsoft-com:vml" xmlns:wp14="http://schemas.microsoft.com/office/word/2010/wordprocessingDrawing" xmlns:wp="http://schemas.openxmlformats.org/drawingml/2006/wordprocessingDrawing" xmlns:w10="urn:schemas-microsoft-com:office:word" xmlns:w="http://schemas.openxmlformats.org/wordprocessingml/2006/main" xmlns:w14="http://schemas.microsoft.com/office/word/2010/wordml" xmlns:w15="http://schemas.microsoft.com/office/word/2012/wordml" xmlns:w16cex="http://schemas.microsoft.com/office/word/2018/wordml/cex" xmlns:w16cid="http://schemas.microsoft.com/office/word/2016/wordml/cid" xmlns:w16="http://schemas.microsoft.com/office/word/2018/wordml" xmlns:w16sdtdh="http://schemas.microsoft.com/office/word/2020/wordml/sdtdatahash" xmlns:w16se="http://schemas.microsoft.com/office/word/2015/wordml/symex" xmlns:wpg="http://schemas.microsoft.com/office/word/2010/wordprocessingGroup" xmlns:wpi="http://schemas.microsoft.com/office/word/2010/wordprocessingInk" xmlns:wne="http://schemas.microsoft.com/office/word/2006/wordml" xmlns:wps="http://schemas.microsoft.com/office/word/2010/wordprocessingShape" mc:Ignorable="w14 w15 w16se w16cid w16 w16cex w16sdtdh wp14">
+<w:ftr xmlns:wpc="http://schemas.microsoft.com/office/word/2010/wordprocessingCanvas" xmlns:mc="http://schemas.openxmlformats.org/markup-compatibility/2006" xmlns:o="urn:schemas-microsoft-com:office:office" xmlns:r="http://schemas.openxmlformats.org/officeDocument/2006/relationships" xmlns:m="http://schemas.openxmlformats.org/officeDocument/2006/math" xmlns:v="urn:schemas-microsoft-com:vml" xmlns:wp14="http://schemas.microsoft.com/office/word/2010/wordprocessingDrawing" xmlns:wp="http://schemas.openxmlformats.org/drawingml/2006/wordprocessingDrawing" xmlns:w10="urn:schemas-microsoft-com:office:word" xmlns:w="http://schemas.openxmlformats.org/wordprocessingml/2006/main" xmlns:w14="http://schemas.microsoft.com/office/word/2010/wordml" xmlns:wpg="http://schemas.microsoft.com/office/word/2010/wordprocessingGroup" xmlns:wpi="http://schemas.microsoft.com/office/word/2010/wordprocessingInk" xmlns:wne="http://schemas.microsoft.com/office/word/2006/wordml" xmlns:wps="http://schemas.microsoft.com/office/word/2010/wordprocessingShape" mc:Ignorable="w14 wp14">
   <w:p>
     <w:pPr>
       <w:pStyle w:val="Footer"/>
@@ -2547,7 +2601,7 @@
 </file>
 
 <file path=word/footer3.xml><?xml version="1.0" encoding="utf-8"?>
-<w:ftr xmlns:wpc="http://schemas.microsoft.com/office/word/2010/wordprocessingCanvas" xmlns:cx="http://schemas.microsoft.com/office/drawing/2014/chartex" xmlns:cx1="http://schemas.microsoft.com/office/drawing/2015/9/8/chartex" xmlns:cx2="http://schemas.microsoft.com/office/drawing/2015/10/21/chartex" xmlns:cx3="http://schemas.microsoft.com/office/drawing/2016/5/9/chartex" xmlns:cx4="http://schemas.microsoft.com/office/drawing/2016/5/10/chartex" xmlns:cx5="http://schemas.microsoft.com/office/drawing/2016/5/11/chartex" xmlns:cx6="http://schemas.microsoft.com/office/drawing/2016/5/12/chartex" xmlns:cx7="http://schemas.microsoft.com/office/drawing/2016/5/13/chartex" xmlns:cx8="http://schemas.microsoft.com/office/drawing/2016/5/14/chartex" xmlns:mc="http://schemas.openxmlformats.org/markup-compatibility/2006" xmlns:aink="http://schemas.microsoft.com/office/drawing/2016/ink" xmlns:am3d="http://schemas.microsoft.com/office/drawing/2017/model3d" xmlns:o="urn:schemas-microsoft-com:office:office" xmlns:r="http://schemas.openxmlformats.org/officeDocument/2006/relationships" xmlns:m="http://schemas.openxmlformats.org/officeDocument/2006/math" xmlns:v="urn:schemas-microsoft-com:vml" xmlns:wp14="http://schemas.microsoft.com/office/word/2010/wordprocessingDrawing" xmlns:wp="http://schemas.openxmlformats.org/drawingml/2006/wordprocessingDrawing" xmlns:w10="urn:schemas-microsoft-com:office:word" xmlns:w="http://schemas.openxmlformats.org/wordprocessingml/2006/main" xmlns:w14="http://schemas.microsoft.com/office/word/2010/wordml" xmlns:w15="http://schemas.microsoft.com/office/word/2012/wordml" xmlns:w16cex="http://schemas.microsoft.com/office/word/2018/wordml/cex" xmlns:w16cid="http://schemas.microsoft.com/office/word/2016/wordml/cid" xmlns:w16="http://schemas.microsoft.com/office/word/2018/wordml" xmlns:w16sdtdh="http://schemas.microsoft.com/office/word/2020/wordml/sdtdatahash" xmlns:w16se="http://schemas.microsoft.com/office/word/2015/wordml/symex" xmlns:wpg="http://schemas.microsoft.com/office/word/2010/wordprocessingGroup" xmlns:wpi="http://schemas.microsoft.com/office/word/2010/wordprocessingInk" xmlns:wne="http://schemas.microsoft.com/office/word/2006/wordml" xmlns:wps="http://schemas.microsoft.com/office/word/2010/wordprocessingShape" mc:Ignorable="w14 w15 w16se w16cid w16 w16cex w16sdtdh wp14">
+<w:ftr xmlns:wpc="http://schemas.microsoft.com/office/word/2010/wordprocessingCanvas" xmlns:mc="http://schemas.openxmlformats.org/markup-compatibility/2006" xmlns:o="urn:schemas-microsoft-com:office:office" xmlns:r="http://schemas.openxmlformats.org/officeDocument/2006/relationships" xmlns:m="http://schemas.openxmlformats.org/officeDocument/2006/math" xmlns:v="urn:schemas-microsoft-com:vml" xmlns:wp14="http://schemas.microsoft.com/office/word/2010/wordprocessingDrawing" xmlns:wp="http://schemas.openxmlformats.org/drawingml/2006/wordprocessingDrawing" xmlns:w10="urn:schemas-microsoft-com:office:word" xmlns:w="http://schemas.openxmlformats.org/wordprocessingml/2006/main" xmlns:w14="http://schemas.microsoft.com/office/word/2010/wordml" xmlns:wpg="http://schemas.microsoft.com/office/word/2010/wordprocessingGroup" xmlns:wpi="http://schemas.microsoft.com/office/word/2010/wordprocessingInk" xmlns:wne="http://schemas.microsoft.com/office/word/2006/wordml" xmlns:wps="http://schemas.microsoft.com/office/word/2010/wordprocessingShape" mc:Ignorable="w14 wp14">
   <w:p>
     <w:pPr>
       <w:pStyle w:val="Footer"/>
@@ -2557,7 +2611,7 @@
 </file>
 
 <file path=word/footnotes.xml><?xml version="1.0" encoding="utf-8"?>
-<w:footnotes xmlns:wpc="http://schemas.microsoft.com/office/word/2010/wordprocessingCanvas" xmlns:cx="http://schemas.microsoft.com/office/drawing/2014/chartex" xmlns:cx1="http://schemas.microsoft.com/office/drawing/2015/9/8/chartex" xmlns:cx2="http://schemas.microsoft.com/office/drawing/2015/10/21/chartex" xmlns:cx3="http://schemas.microsoft.com/office/drawing/2016/5/9/chartex" xmlns:cx4="http://schemas.microsoft.com/office/drawing/2016/5/10/chartex" xmlns:cx5="http://schemas.microsoft.com/office/drawing/2016/5/11/chartex" xmlns:cx6="http://schemas.microsoft.com/office/drawing/2016/5/12/chartex" xmlns:cx7="http://schemas.microsoft.com/office/drawing/2016/5/13/chartex" xmlns:cx8="http://schemas.microsoft.com/office/drawing/2016/5/14/chartex" xmlns:mc="http://schemas.openxmlformats.org/markup-compatibility/2006" xmlns:aink="http://schemas.microsoft.com/office/drawing/2016/ink" xmlns:am3d="http://schemas.microsoft.com/office/drawing/2017/model3d" xmlns:o="urn:schemas-microsoft-com:office:office" xmlns:r="http://schemas.openxmlformats.org/officeDocument/2006/relationships" xmlns:m="http://schemas.openxmlformats.org/officeDocument/2006/math" xmlns:v="urn:schemas-microsoft-com:vml" xmlns:wp14="http://schemas.microsoft.com/office/word/2010/wordprocessingDrawing" xmlns:wp="http://schemas.openxmlformats.org/drawingml/2006/wordprocessingDrawing" xmlns:w10="urn:schemas-microsoft-com:office:word" xmlns:w="http://schemas.openxmlformats.org/wordprocessingml/2006/main" xmlns:w14="http://schemas.microsoft.com/office/word/2010/wordml" xmlns:w15="http://schemas.microsoft.com/office/word/2012/wordml" xmlns:w16cex="http://schemas.microsoft.com/office/word/2018/wordml/cex" xmlns:w16cid="http://schemas.microsoft.com/office/word/2016/wordml/cid" xmlns:w16="http://schemas.microsoft.com/office/word/2018/wordml" xmlns:w16sdtdh="http://schemas.microsoft.com/office/word/2020/wordml/sdtdatahash" xmlns:w16se="http://schemas.microsoft.com/office/word/2015/wordml/symex" xmlns:wpg="http://schemas.microsoft.com/office/word/2010/wordprocessingGroup" xmlns:wpi="http://schemas.microsoft.com/office/word/2010/wordprocessingInk" xmlns:wne="http://schemas.microsoft.com/office/word/2006/wordml" xmlns:wps="http://schemas.microsoft.com/office/word/2010/wordprocessingShape" mc:Ignorable="w14 w15 w16se w16cid w16 w16cex w16sdtdh wp14">
+<w:footnotes xmlns:wpc="http://schemas.microsoft.com/office/word/2010/wordprocessingCanvas" xmlns:mc="http://schemas.openxmlformats.org/markup-compatibility/2006" xmlns:o="urn:schemas-microsoft-com:office:office" xmlns:r="http://schemas.openxmlformats.org/officeDocument/2006/relationships" xmlns:m="http://schemas.openxmlformats.org/officeDocument/2006/math" xmlns:v="urn:schemas-microsoft-com:vml" xmlns:wp14="http://schemas.microsoft.com/office/word/2010/wordprocessingDrawing" xmlns:wp="http://schemas.openxmlformats.org/drawingml/2006/wordprocessingDrawing" xmlns:w10="urn:schemas-microsoft-com:office:word" xmlns:w="http://schemas.openxmlformats.org/wordprocessingml/2006/main" xmlns:w14="http://schemas.microsoft.com/office/word/2010/wordml" xmlns:wpg="http://schemas.microsoft.com/office/word/2010/wordprocessingGroup" xmlns:wpi="http://schemas.microsoft.com/office/word/2010/wordprocessingInk" xmlns:wne="http://schemas.microsoft.com/office/word/2006/wordml" xmlns:wps="http://schemas.microsoft.com/office/word/2010/wordprocessingShape" mc:Ignorable="w14 wp14">
   <w:footnote w:type="separator" w:id="-1">
     <w:p>
       <w:pPr>
@@ -2582,7 +2636,7 @@
 </file>
 
 <file path=word/header1.xml><?xml version="1.0" encoding="utf-8"?>
-<w:hdr xmlns:wpc="http://schemas.microsoft.com/office/word/2010/wordprocessingCanvas" xmlns:cx="http://schemas.microsoft.com/office/drawing/2014/chartex" xmlns:cx1="http://schemas.microsoft.com/office/drawing/2015/9/8/chartex" xmlns:cx2="http://schemas.microsoft.com/office/drawing/2015/10/21/chartex" xmlns:cx3="http://schemas.microsoft.com/office/drawing/2016/5/9/chartex" xmlns:cx4="http://schemas.microsoft.com/office/drawing/2016/5/10/chartex" xmlns:cx5="http://schemas.microsoft.com/office/drawing/2016/5/11/chartex" xmlns:cx6="http://schemas.microsoft.com/office/drawing/2016/5/12/chartex" xmlns:cx7="http://schemas.microsoft.com/office/drawing/2016/5/13/chartex" xmlns:cx8="http://schemas.microsoft.com/office/drawing/2016/5/14/chartex" xmlns:mc="http://schemas.openxmlformats.org/markup-compatibility/2006" xmlns:aink="http://schemas.microsoft.com/office/drawing/2016/ink" xmlns:am3d="http://schemas.microsoft.com/office/drawing/2017/model3d" xmlns:o="urn:schemas-microsoft-com:office:office" xmlns:r="http://schemas.openxmlformats.org/officeDocument/2006/relationships" xmlns:m="http://schemas.openxmlformats.org/officeDocument/2006/math" xmlns:v="urn:schemas-microsoft-com:vml" xmlns:wp14="http://schemas.microsoft.com/office/word/2010/wordprocessingDrawing" xmlns:wp="http://schemas.openxmlformats.org/drawingml/2006/wordprocessingDrawing" xmlns:w10="urn:schemas-microsoft-com:office:word" xmlns:w="http://schemas.openxmlformats.org/wordprocessingml/2006/main" xmlns:w14="http://schemas.microsoft.com/office/word/2010/wordml" xmlns:w15="http://schemas.microsoft.com/office/word/2012/wordml" xmlns:w16cex="http://schemas.microsoft.com/office/word/2018/wordml/cex" xmlns:w16cid="http://schemas.microsoft.com/office/word/2016/wordml/cid" xmlns:w16="http://schemas.microsoft.com/office/word/2018/wordml" xmlns:w16sdtdh="http://schemas.microsoft.com/office/word/2020/wordml/sdtdatahash" xmlns:w16se="http://schemas.microsoft.com/office/word/2015/wordml/symex" xmlns:wpg="http://schemas.microsoft.com/office/word/2010/wordprocessingGroup" xmlns:wpi="http://schemas.microsoft.com/office/word/2010/wordprocessingInk" xmlns:wne="http://schemas.microsoft.com/office/word/2006/wordml" xmlns:wps="http://schemas.microsoft.com/office/word/2010/wordprocessingShape" mc:Ignorable="w14 w15 w16se w16cid w16 w16cex w16sdtdh wp14">
+<w:hdr xmlns:wpc="http://schemas.microsoft.com/office/word/2010/wordprocessingCanvas" xmlns:mc="http://schemas.openxmlformats.org/markup-compatibility/2006" xmlns:o="urn:schemas-microsoft-com:office:office" xmlns:r="http://schemas.openxmlformats.org/officeDocument/2006/relationships" xmlns:m="http://schemas.openxmlformats.org/officeDocument/2006/math" xmlns:v="urn:schemas-microsoft-com:vml" xmlns:wp14="http://schemas.microsoft.com/office/word/2010/wordprocessingDrawing" xmlns:wp="http://schemas.openxmlformats.org/drawingml/2006/wordprocessingDrawing" xmlns:w10="urn:schemas-microsoft-com:office:word" xmlns:w="http://schemas.openxmlformats.org/wordprocessingml/2006/main" xmlns:w14="http://schemas.microsoft.com/office/word/2010/wordml" xmlns:wpg="http://schemas.microsoft.com/office/word/2010/wordprocessingGroup" xmlns:wpi="http://schemas.microsoft.com/office/word/2010/wordprocessingInk" xmlns:wne="http://schemas.microsoft.com/office/word/2006/wordml" xmlns:wps="http://schemas.microsoft.com/office/word/2010/wordprocessingShape" mc:Ignorable="w14 wp14">
   <w:p>
     <w:pPr>
       <w:pStyle w:val="Header"/>
@@ -2592,7 +2646,7 @@
 </file>
 
 <file path=word/header2.xml><?xml version="1.0" encoding="utf-8"?>
-<w:hdr xmlns:wpc="http://schemas.microsoft.com/office/word/2010/wordprocessingCanvas" xmlns:cx="http://schemas.microsoft.com/office/drawing/2014/chartex" xmlns:cx1="http://schemas.microsoft.com/office/drawing/2015/9/8/chartex" xmlns:cx2="http://schemas.microsoft.com/office/drawing/2015/10/21/chartex" xmlns:cx3="http://schemas.microsoft.com/office/drawing/2016/5/9/chartex" xmlns:cx4="http://schemas.microsoft.com/office/drawing/2016/5/10/chartex" xmlns:cx5="http://schemas.microsoft.com/office/drawing/2016/5/11/chartex" xmlns:cx6="http://schemas.microsoft.com/office/drawing/2016/5/12/chartex" xmlns:cx7="http://schemas.microsoft.com/office/drawing/2016/5/13/chartex" xmlns:cx8="http://schemas.microsoft.com/office/drawing/2016/5/14/chartex" xmlns:mc="http://schemas.openxmlformats.org/markup-compatibility/2006" xmlns:aink="http://schemas.microsoft.com/office/drawing/2016/ink" xmlns:am3d="http://schemas.microsoft.com/office/drawing/2017/model3d" xmlns:o="urn:schemas-microsoft-com:office:office" xmlns:r="http://schemas.openxmlformats.org/officeDocument/2006/relationships" xmlns:m="http://schemas.openxmlformats.org/officeDocument/2006/math" xmlns:v="urn:schemas-microsoft-com:vml" xmlns:wp14="http://schemas.microsoft.com/office/word/2010/wordprocessingDrawing" xmlns:wp="http://schemas.openxmlformats.org/drawingml/2006/wordprocessingDrawing" xmlns:w10="urn:schemas-microsoft-com:office:word" xmlns:w="http://schemas.openxmlformats.org/wordprocessingml/2006/main" xmlns:w14="http://schemas.microsoft.com/office/word/2010/wordml" xmlns:w15="http://schemas.microsoft.com/office/word/2012/wordml" xmlns:w16cex="http://schemas.microsoft.com/office/word/2018/wordml/cex" xmlns:w16cid="http://schemas.microsoft.com/office/word/2016/wordml/cid" xmlns:w16="http://schemas.microsoft.com/office/word/2018/wordml" xmlns:w16sdtdh="http://schemas.microsoft.com/office/word/2020/wordml/sdtdatahash" xmlns:w16se="http://schemas.microsoft.com/office/word/2015/wordml/symex" xmlns:wpg="http://schemas.microsoft.com/office/word/2010/wordprocessingGroup" xmlns:wpi="http://schemas.microsoft.com/office/word/2010/wordprocessingInk" xmlns:wne="http://schemas.microsoft.com/office/word/2006/wordml" xmlns:wps="http://schemas.microsoft.com/office/word/2010/wordprocessingShape" mc:Ignorable="w14 w15 w16se w16cid w16 w16cex w16sdtdh wp14">
+<w:hdr xmlns:wpc="http://schemas.microsoft.com/office/word/2010/wordprocessingCanvas" xmlns:mc="http://schemas.openxmlformats.org/markup-compatibility/2006" xmlns:o="urn:schemas-microsoft-com:office:office" xmlns:r="http://schemas.openxmlformats.org/officeDocument/2006/relationships" xmlns:m="http://schemas.openxmlformats.org/officeDocument/2006/math" xmlns:v="urn:schemas-microsoft-com:vml" xmlns:wp14="http://schemas.microsoft.com/office/word/2010/wordprocessingDrawing" xmlns:wp="http://schemas.openxmlformats.org/drawingml/2006/wordprocessingDrawing" xmlns:w10="urn:schemas-microsoft-com:office:word" xmlns:w="http://schemas.openxmlformats.org/wordprocessingml/2006/main" xmlns:w14="http://schemas.microsoft.com/office/word/2010/wordml" xmlns:wpg="http://schemas.microsoft.com/office/word/2010/wordprocessingGroup" xmlns:wpi="http://schemas.microsoft.com/office/word/2010/wordprocessingInk" xmlns:wne="http://schemas.microsoft.com/office/word/2006/wordml" xmlns:wps="http://schemas.microsoft.com/office/word/2010/wordprocessingShape" mc:Ignorable="w14 wp14">
   <w:p>
     <w:pPr>
       <w:pStyle w:val="Header"/>
@@ -2602,7 +2656,7 @@
 </file>
 
 <file path=word/header3.xml><?xml version="1.0" encoding="utf-8"?>
-<w:hdr xmlns:wpc="http://schemas.microsoft.com/office/word/2010/wordprocessingCanvas" xmlns:cx="http://schemas.microsoft.com/office/drawing/2014/chartex" xmlns:cx1="http://schemas.microsoft.com/office/drawing/2015/9/8/chartex" xmlns:cx2="http://schemas.microsoft.com/office/drawing/2015/10/21/chartex" xmlns:cx3="http://schemas.microsoft.com/office/drawing/2016/5/9/chartex" xmlns:cx4="http://schemas.microsoft.com/office/drawing/2016/5/10/chartex" xmlns:cx5="http://schemas.microsoft.com/office/drawing/2016/5/11/chartex" xmlns:cx6="http://schemas.microsoft.com/office/drawing/2016/5/12/chartex" xmlns:cx7="http://schemas.microsoft.com/office/drawing/2016/5/13/chartex" xmlns:cx8="http://schemas.microsoft.com/office/drawing/2016/5/14/chartex" xmlns:mc="http://schemas.openxmlformats.org/markup-compatibility/2006" xmlns:aink="http://schemas.microsoft.com/office/drawing/2016/ink" xmlns:am3d="http://schemas.microsoft.com/office/drawing/2017/model3d" xmlns:o="urn:schemas-microsoft-com:office:office" xmlns:r="http://schemas.openxmlformats.org/officeDocument/2006/relationships" xmlns:m="http://schemas.openxmlformats.org/officeDocument/2006/math" xmlns:v="urn:schemas-microsoft-com:vml" xmlns:wp14="http://schemas.microsoft.com/office/word/2010/wordprocessingDrawing" xmlns:wp="http://schemas.openxmlformats.org/drawingml/2006/wordprocessingDrawing" xmlns:w10="urn:schemas-microsoft-com:office:word" xmlns:w="http://schemas.openxmlformats.org/wordprocessingml/2006/main" xmlns:w14="http://schemas.microsoft.com/office/word/2010/wordml" xmlns:w15="http://schemas.microsoft.com/office/word/2012/wordml" xmlns:w16cex="http://schemas.microsoft.com/office/word/2018/wordml/cex" xmlns:w16cid="http://schemas.microsoft.com/office/word/2016/wordml/cid" xmlns:w16="http://schemas.microsoft.com/office/word/2018/wordml" xmlns:w16sdtdh="http://schemas.microsoft.com/office/word/2020/wordml/sdtdatahash" xmlns:w16se="http://schemas.microsoft.com/office/word/2015/wordml/symex" xmlns:wpg="http://schemas.microsoft.com/office/word/2010/wordprocessingGroup" xmlns:wpi="http://schemas.microsoft.com/office/word/2010/wordprocessingInk" xmlns:wne="http://schemas.microsoft.com/office/word/2006/wordml" xmlns:wps="http://schemas.microsoft.com/office/word/2010/wordprocessingShape" mc:Ignorable="w14 w15 w16se w16cid w16 w16cex w16sdtdh wp14">
+<w:hdr xmlns:wpc="http://schemas.microsoft.com/office/word/2010/wordprocessingCanvas" xmlns:mc="http://schemas.openxmlformats.org/markup-compatibility/2006" xmlns:o="urn:schemas-microsoft-com:office:office" xmlns:r="http://schemas.openxmlformats.org/officeDocument/2006/relationships" xmlns:m="http://schemas.openxmlformats.org/officeDocument/2006/math" xmlns:v="urn:schemas-microsoft-com:vml" xmlns:wp14="http://schemas.microsoft.com/office/word/2010/wordprocessingDrawing" xmlns:wp="http://schemas.openxmlformats.org/drawingml/2006/wordprocessingDrawing" xmlns:w10="urn:schemas-microsoft-com:office:word" xmlns:w="http://schemas.openxmlformats.org/wordprocessingml/2006/main" xmlns:w14="http://schemas.microsoft.com/office/word/2010/wordml" xmlns:wpg="http://schemas.microsoft.com/office/word/2010/wordprocessingGroup" xmlns:wpi="http://schemas.microsoft.com/office/word/2010/wordprocessingInk" xmlns:wne="http://schemas.microsoft.com/office/word/2006/wordml" xmlns:wps="http://schemas.microsoft.com/office/word/2010/wordprocessingShape" mc:Ignorable="w14 wp14">
   <w:p>
     <w:pPr>
       <w:pStyle w:val="Header"/>
@@ -2612,8 +2666,8 @@
 </file>
 
 <file path=word/numbering.xml><?xml version="1.0" encoding="utf-8"?>
-<w:numbering xmlns:wpc="http://schemas.microsoft.com/office/word/2010/wordprocessingCanvas" xmlns:cx="http://schemas.microsoft.com/office/drawing/2014/chartex" xmlns:cx1="http://schemas.microsoft.com/office/drawing/2015/9/8/chartex" xmlns:cx2="http://schemas.microsoft.com/office/drawing/2015/10/21/chartex" xmlns:cx3="http://schemas.microsoft.com/office/drawing/2016/5/9/chartex" xmlns:cx4="http://schemas.microsoft.com/office/drawing/2016/5/10/chartex" xmlns:cx5="http://schemas.microsoft.com/office/drawing/2016/5/11/chartex" xmlns:cx6="http://schemas.microsoft.com/office/drawing/2016/5/12/chartex" xmlns:cx7="http://schemas.microsoft.com/office/drawing/2016/5/13/chartex" xmlns:cx8="http://schemas.microsoft.com/office/drawing/2016/5/14/chartex" xmlns:mc="http://schemas.openxmlformats.org/markup-compatibility/2006" xmlns:aink="http://schemas.microsoft.com/office/drawing/2016/ink" xmlns:am3d="http://schemas.microsoft.com/office/drawing/2017/model3d" xmlns:o="urn:schemas-microsoft-com:office:office" xmlns:r="http://schemas.openxmlformats.org/officeDocument/2006/relationships" xmlns:m="http://schemas.openxmlformats.org/officeDocument/2006/math" xmlns:v="urn:schemas-microsoft-com:vml" xmlns:wp14="http://schemas.microsoft.com/office/word/2010/wordprocessingDrawing" xmlns:wp="http://schemas.openxmlformats.org/drawingml/2006/wordprocessingDrawing" xmlns:w10="urn:schemas-microsoft-com:office:word" xmlns:w="http://schemas.openxmlformats.org/wordprocessingml/2006/main" xmlns:w14="http://schemas.microsoft.com/office/word/2010/wordml" xmlns:w15="http://schemas.microsoft.com/office/word/2012/wordml" xmlns:w16cex="http://schemas.microsoft.com/office/word/2018/wordml/cex" xmlns:w16cid="http://schemas.microsoft.com/office/word/2016/wordml/cid" xmlns:w16="http://schemas.microsoft.com/office/word/2018/wordml" xmlns:w16sdtdh="http://schemas.microsoft.com/office/word/2020/wordml/sdtdatahash" xmlns:w16se="http://schemas.microsoft.com/office/word/2015/wordml/symex" xmlns:wpg="http://schemas.microsoft.com/office/word/2010/wordprocessingGroup" xmlns:wpi="http://schemas.microsoft.com/office/word/2010/wordprocessingInk" xmlns:wne="http://schemas.microsoft.com/office/word/2006/wordml" xmlns:wps="http://schemas.microsoft.com/office/word/2010/wordprocessingShape" mc:Ignorable="w14 w15 w16se w16cid w16 w16cex w16sdtdh wp14">
-  <w:abstractNum w:abstractNumId="0" w15:restartNumberingAfterBreak="0">
+<w:numbering xmlns:wpc="http://schemas.microsoft.com/office/word/2010/wordprocessingCanvas" xmlns:mc="http://schemas.openxmlformats.org/markup-compatibility/2006" xmlns:o="urn:schemas-microsoft-com:office:office" xmlns:r="http://schemas.openxmlformats.org/officeDocument/2006/relationships" xmlns:m="http://schemas.openxmlformats.org/officeDocument/2006/math" xmlns:v="urn:schemas-microsoft-com:vml" xmlns:wp14="http://schemas.microsoft.com/office/word/2010/wordprocessingDrawing" xmlns:wp="http://schemas.openxmlformats.org/drawingml/2006/wordprocessingDrawing" xmlns:w10="urn:schemas-microsoft-com:office:word" xmlns:w="http://schemas.openxmlformats.org/wordprocessingml/2006/main" xmlns:w14="http://schemas.microsoft.com/office/word/2010/wordml" xmlns:wpg="http://schemas.microsoft.com/office/word/2010/wordprocessingGroup" xmlns:wpi="http://schemas.microsoft.com/office/word/2010/wordprocessingInk" xmlns:wne="http://schemas.microsoft.com/office/word/2006/wordml" xmlns:wps="http://schemas.microsoft.com/office/word/2010/wordprocessingShape" mc:Ignorable="w14 wp14">
+  <w:abstractNum w:abstractNumId="0">
     <w:nsid w:val="073E10F3"/>
     <w:multiLevelType w:val="hybridMultilevel"/>
     <w:tmpl w:val="8504561E"/>
@@ -2725,7 +2779,7 @@
       </w:rPr>
     </w:lvl>
   </w:abstractNum>
-  <w:abstractNum w:abstractNumId="1" w15:restartNumberingAfterBreak="0">
+  <w:abstractNum w:abstractNumId="1">
     <w:nsid w:val="08C6366F"/>
     <w:multiLevelType w:val="hybridMultilevel"/>
     <w:tmpl w:val="D3561CAA"/>
@@ -2812,7 +2866,7 @@
       </w:pPr>
     </w:lvl>
   </w:abstractNum>
-  <w:abstractNum w:abstractNumId="2" w15:restartNumberingAfterBreak="0">
+  <w:abstractNum w:abstractNumId="2">
     <w:nsid w:val="09F353E3"/>
     <w:multiLevelType w:val="hybridMultilevel"/>
     <w:tmpl w:val="EE5CFEAC"/>
@@ -2925,7 +2979,7 @@
       </w:rPr>
     </w:lvl>
   </w:abstractNum>
-  <w:abstractNum w:abstractNumId="3" w15:restartNumberingAfterBreak="0">
+  <w:abstractNum w:abstractNumId="3">
     <w:nsid w:val="0C357DD6"/>
     <w:multiLevelType w:val="hybridMultilevel"/>
     <w:tmpl w:val="D83AD7E4"/>
@@ -3016,7 +3070,7 @@
       </w:pPr>
     </w:lvl>
   </w:abstractNum>
-  <w:abstractNum w:abstractNumId="4" w15:restartNumberingAfterBreak="0">
+  <w:abstractNum w:abstractNumId="4">
     <w:nsid w:val="0DEA069D"/>
     <w:multiLevelType w:val="multilevel"/>
     <w:tmpl w:val="450C4EF6"/>
@@ -3157,7 +3211,7 @@
       </w:rPr>
     </w:lvl>
   </w:abstractNum>
-  <w:abstractNum w:abstractNumId="5" w15:restartNumberingAfterBreak="0">
+  <w:abstractNum w:abstractNumId="5">
     <w:nsid w:val="1323523E"/>
     <w:multiLevelType w:val="multilevel"/>
     <w:tmpl w:val="873C83DA"/>
@@ -3314,7 +3368,7 @@
       </w:rPr>
     </w:lvl>
   </w:abstractNum>
-  <w:abstractNum w:abstractNumId="6" w15:restartNumberingAfterBreak="0">
+  <w:abstractNum w:abstractNumId="6">
     <w:nsid w:val="15510218"/>
     <w:multiLevelType w:val="hybridMultilevel"/>
     <w:tmpl w:val="8EF49D20"/>
@@ -3404,7 +3458,7 @@
       </w:pPr>
     </w:lvl>
   </w:abstractNum>
-  <w:abstractNum w:abstractNumId="7" w15:restartNumberingAfterBreak="0">
+  <w:abstractNum w:abstractNumId="7">
     <w:nsid w:val="253D4794"/>
     <w:multiLevelType w:val="multilevel"/>
     <w:tmpl w:val="8C80AB36"/>
@@ -3517,7 +3571,7 @@
       </w:rPr>
     </w:lvl>
   </w:abstractNum>
-  <w:abstractNum w:abstractNumId="8" w15:restartNumberingAfterBreak="0">
+  <w:abstractNum w:abstractNumId="8">
     <w:nsid w:val="27FF20A5"/>
     <w:multiLevelType w:val="hybridMultilevel"/>
     <w:tmpl w:val="9036D3D8"/>
@@ -3632,7 +3686,7 @@
       </w:rPr>
     </w:lvl>
   </w:abstractNum>
-  <w:abstractNum w:abstractNumId="9" w15:restartNumberingAfterBreak="0">
+  <w:abstractNum w:abstractNumId="9">
     <w:nsid w:val="296F3872"/>
     <w:multiLevelType w:val="hybridMultilevel"/>
     <w:tmpl w:val="5E9E6A2E"/>
@@ -3746,7 +3800,7 @@
       </w:rPr>
     </w:lvl>
   </w:abstractNum>
-  <w:abstractNum w:abstractNumId="10" w15:restartNumberingAfterBreak="0">
+  <w:abstractNum w:abstractNumId="10">
     <w:nsid w:val="3BB67316"/>
     <w:multiLevelType w:val="hybridMultilevel"/>
     <w:tmpl w:val="D2A20BEA"/>
@@ -3859,7 +3913,7 @@
       </w:rPr>
     </w:lvl>
   </w:abstractNum>
-  <w:abstractNum w:abstractNumId="11" w15:restartNumberingAfterBreak="0">
+  <w:abstractNum w:abstractNumId="11">
     <w:nsid w:val="416740F3"/>
     <w:multiLevelType w:val="hybridMultilevel"/>
     <w:tmpl w:val="F012AB78"/>
@@ -3972,7 +4026,7 @@
       </w:rPr>
     </w:lvl>
   </w:abstractNum>
-  <w:abstractNum w:abstractNumId="12" w15:restartNumberingAfterBreak="0">
+  <w:abstractNum w:abstractNumId="12">
     <w:nsid w:val="4803540D"/>
     <w:multiLevelType w:val="hybridMultilevel"/>
     <w:tmpl w:val="CC58063A"/>
@@ -4086,7 +4140,7 @@
       </w:rPr>
     </w:lvl>
   </w:abstractNum>
-  <w:abstractNum w:abstractNumId="13" w15:restartNumberingAfterBreak="0">
+  <w:abstractNum w:abstractNumId="13">
     <w:nsid w:val="492F4D8F"/>
     <w:multiLevelType w:val="hybridMultilevel"/>
     <w:tmpl w:val="F62C94DE"/>
@@ -4200,7 +4254,7 @@
       </w:rPr>
     </w:lvl>
   </w:abstractNum>
-  <w:abstractNum w:abstractNumId="14" w15:restartNumberingAfterBreak="0">
+  <w:abstractNum w:abstractNumId="14">
     <w:nsid w:val="527D4778"/>
     <w:multiLevelType w:val="hybridMultilevel"/>
     <w:tmpl w:val="EE8038B2"/>
@@ -4313,7 +4367,7 @@
       </w:rPr>
     </w:lvl>
   </w:abstractNum>
-  <w:abstractNum w:abstractNumId="15" w15:restartNumberingAfterBreak="0">
+  <w:abstractNum w:abstractNumId="15">
     <w:nsid w:val="5A0B13C4"/>
     <w:multiLevelType w:val="hybridMultilevel"/>
     <w:tmpl w:val="E84E7C10"/>
@@ -4426,7 +4480,7 @@
       </w:rPr>
     </w:lvl>
   </w:abstractNum>
-  <w:abstractNum w:abstractNumId="16" w15:restartNumberingAfterBreak="0">
+  <w:abstractNum w:abstractNumId="16">
     <w:nsid w:val="636B498A"/>
     <w:multiLevelType w:val="hybridMultilevel"/>
     <w:tmpl w:val="1032CF60"/>
@@ -4539,7 +4593,7 @@
       </w:rPr>
     </w:lvl>
   </w:abstractNum>
-  <w:abstractNum w:abstractNumId="17" w15:restartNumberingAfterBreak="0">
+  <w:abstractNum w:abstractNumId="17">
     <w:nsid w:val="6774194D"/>
     <w:multiLevelType w:val="hybridMultilevel"/>
     <w:tmpl w:val="9CD2C286"/>
@@ -4652,7 +4706,7 @@
       </w:rPr>
     </w:lvl>
   </w:abstractNum>
-  <w:abstractNum w:abstractNumId="18" w15:restartNumberingAfterBreak="0">
+  <w:abstractNum w:abstractNumId="18">
     <w:nsid w:val="6B961852"/>
     <w:multiLevelType w:val="hybridMultilevel"/>
     <w:tmpl w:val="DAAECE10"/>
@@ -4745,7 +4799,7 @@
       </w:pPr>
     </w:lvl>
   </w:abstractNum>
-  <w:abstractNum w:abstractNumId="19" w15:restartNumberingAfterBreak="0">
+  <w:abstractNum w:abstractNumId="19">
     <w:nsid w:val="6DA640A9"/>
     <w:multiLevelType w:val="multilevel"/>
     <w:tmpl w:val="9760A870"/>
@@ -4885,7 +4939,7 @@
       </w:rPr>
     </w:lvl>
   </w:abstractNum>
-  <w:abstractNum w:abstractNumId="20" w15:restartNumberingAfterBreak="0">
+  <w:abstractNum w:abstractNumId="20">
     <w:nsid w:val="7BAF36E9"/>
     <w:multiLevelType w:val="multilevel"/>
     <w:tmpl w:val="24180D92"/>
@@ -5171,7 +5225,7 @@
 </file>
 
 <file path=word/styles.xml><?xml version="1.0" encoding="utf-8"?>
-<w:styles xmlns:mc="http://schemas.openxmlformats.org/markup-compatibility/2006" xmlns:r="http://schemas.openxmlformats.org/officeDocument/2006/relationships" xmlns:w="http://schemas.openxmlformats.org/wordprocessingml/2006/main" xmlns:w14="http://schemas.microsoft.com/office/word/2010/wordml" xmlns:w15="http://schemas.microsoft.com/office/word/2012/wordml" xmlns:w16cex="http://schemas.microsoft.com/office/word/2018/wordml/cex" xmlns:w16cid="http://schemas.microsoft.com/office/word/2016/wordml/cid" xmlns:w16="http://schemas.microsoft.com/office/word/2018/wordml" xmlns:w16sdtdh="http://schemas.microsoft.com/office/word/2020/wordml/sdtdatahash" xmlns:w16se="http://schemas.microsoft.com/office/word/2015/wordml/symex" mc:Ignorable="w14 w15 w16se w16cid w16 w16cex w16sdtdh">
+<w:styles xmlns:mc="http://schemas.openxmlformats.org/markup-compatibility/2006" xmlns:r="http://schemas.openxmlformats.org/officeDocument/2006/relationships" xmlns:w="http://schemas.openxmlformats.org/wordprocessingml/2006/main" xmlns:w14="http://schemas.microsoft.com/office/word/2010/wordml" mc:Ignorable="w14">
   <w:docDefaults>
     <w:rPrDefault>
       <w:rPr>
@@ -5187,383 +5241,147 @@
       </w:pPr>
     </w:pPrDefault>
   </w:docDefaults>
-  <w:latentStyles w:defLockedState="0" w:defUIPriority="99" w:defSemiHidden="0" w:defUnhideWhenUsed="0" w:defQFormat="0" w:count="376">
-    <w:lsdException w:name="Normal" w:uiPriority="0" w:qFormat="1"/>
-    <w:lsdException w:name="heading 1" w:uiPriority="9" w:qFormat="1"/>
-    <w:lsdException w:name="heading 2" w:semiHidden="1" w:uiPriority="9" w:unhideWhenUsed="1" w:qFormat="1"/>
-    <w:lsdException w:name="heading 3" w:semiHidden="1" w:uiPriority="9" w:unhideWhenUsed="1" w:qFormat="1"/>
-    <w:lsdException w:name="heading 4" w:semiHidden="1" w:uiPriority="9" w:unhideWhenUsed="1" w:qFormat="1"/>
-    <w:lsdException w:name="heading 5" w:semiHidden="1" w:uiPriority="9" w:unhideWhenUsed="1" w:qFormat="1"/>
-    <w:lsdException w:name="heading 6" w:semiHidden="1" w:uiPriority="9" w:unhideWhenUsed="1" w:qFormat="1"/>
-    <w:lsdException w:name="heading 7" w:semiHidden="1" w:uiPriority="9" w:unhideWhenUsed="1" w:qFormat="1"/>
-    <w:lsdException w:name="heading 8" w:semiHidden="1" w:uiPriority="9" w:unhideWhenUsed="1" w:qFormat="1"/>
-    <w:lsdException w:name="heading 9" w:semiHidden="1" w:uiPriority="9" w:unhideWhenUsed="1" w:qFormat="1"/>
-    <w:lsdException w:name="index 1" w:semiHidden="1" w:unhideWhenUsed="1"/>
-    <w:lsdException w:name="index 2" w:semiHidden="1" w:unhideWhenUsed="1"/>
-    <w:lsdException w:name="index 3" w:semiHidden="1" w:unhideWhenUsed="1"/>
-    <w:lsdException w:name="index 4" w:semiHidden="1" w:unhideWhenUsed="1"/>
-    <w:lsdException w:name="index 5" w:semiHidden="1" w:unhideWhenUsed="1"/>
-    <w:lsdException w:name="index 6" w:semiHidden="1" w:unhideWhenUsed="1"/>
-    <w:lsdException w:name="index 7" w:semiHidden="1" w:unhideWhenUsed="1"/>
-    <w:lsdException w:name="index 8" w:semiHidden="1" w:unhideWhenUsed="1"/>
-    <w:lsdException w:name="index 9" w:semiHidden="1" w:unhideWhenUsed="1"/>
-    <w:lsdException w:name="toc 1" w:semiHidden="1" w:uiPriority="39" w:unhideWhenUsed="1"/>
-    <w:lsdException w:name="toc 2" w:semiHidden="1" w:uiPriority="39" w:unhideWhenUsed="1"/>
-    <w:lsdException w:name="toc 3" w:semiHidden="1" w:uiPriority="39" w:unhideWhenUsed="1"/>
-    <w:lsdException w:name="toc 4" w:semiHidden="1" w:uiPriority="39" w:unhideWhenUsed="1"/>
-    <w:lsdException w:name="toc 5" w:semiHidden="1" w:uiPriority="39" w:unhideWhenUsed="1"/>
-    <w:lsdException w:name="toc 6" w:semiHidden="1" w:uiPriority="39" w:unhideWhenUsed="1"/>
-    <w:lsdException w:name="toc 7" w:semiHidden="1" w:uiPriority="39" w:unhideWhenUsed="1"/>
-    <w:lsdException w:name="toc 8" w:semiHidden="1" w:uiPriority="39" w:unhideWhenUsed="1"/>
-    <w:lsdException w:name="toc 9" w:semiHidden="1" w:uiPriority="39" w:unhideWhenUsed="1"/>
-    <w:lsdException w:name="Normal Indent" w:semiHidden="1" w:unhideWhenUsed="1"/>
-    <w:lsdException w:name="footnote text" w:semiHidden="1" w:unhideWhenUsed="1"/>
-    <w:lsdException w:name="annotation text" w:semiHidden="1" w:unhideWhenUsed="1" w:qFormat="1"/>
-    <w:lsdException w:name="header" w:semiHidden="1" w:unhideWhenUsed="1"/>
-    <w:lsdException w:name="footer" w:semiHidden="1" w:unhideWhenUsed="1"/>
-    <w:lsdException w:name="index heading" w:semiHidden="1" w:unhideWhenUsed="1"/>
-    <w:lsdException w:name="caption" w:semiHidden="1" w:uiPriority="35" w:unhideWhenUsed="1" w:qFormat="1"/>
-    <w:lsdException w:name="table of figures" w:semiHidden="1" w:unhideWhenUsed="1"/>
-    <w:lsdException w:name="envelope address" w:semiHidden="1" w:unhideWhenUsed="1"/>
-    <w:lsdException w:name="envelope return" w:semiHidden="1" w:unhideWhenUsed="1"/>
-    <w:lsdException w:name="footnote reference" w:semiHidden="1" w:unhideWhenUsed="1"/>
-    <w:lsdException w:name="annotation reference" w:semiHidden="1" w:unhideWhenUsed="1" w:qFormat="1"/>
-    <w:lsdException w:name="line number" w:semiHidden="1" w:unhideWhenUsed="1"/>
-    <w:lsdException w:name="page number" w:semiHidden="1" w:unhideWhenUsed="1"/>
-    <w:lsdException w:name="endnote reference" w:semiHidden="1" w:unhideWhenUsed="1"/>
-    <w:lsdException w:name="endnote text" w:semiHidden="1" w:unhideWhenUsed="1"/>
-    <w:lsdException w:name="table of authorities" w:semiHidden="1" w:unhideWhenUsed="1"/>
-    <w:lsdException w:name="macro" w:semiHidden="1" w:unhideWhenUsed="1"/>
-    <w:lsdException w:name="toa heading" w:semiHidden="1" w:unhideWhenUsed="1"/>
-    <w:lsdException w:name="List" w:semiHidden="1" w:unhideWhenUsed="1"/>
-    <w:lsdException w:name="List Bullet" w:semiHidden="1" w:unhideWhenUsed="1"/>
-    <w:lsdException w:name="List Number" w:semiHidden="1" w:unhideWhenUsed="1"/>
-    <w:lsdException w:name="List 2" w:semiHidden="1" w:unhideWhenUsed="1"/>
-    <w:lsdException w:name="List 3" w:semiHidden="1" w:unhideWhenUsed="1"/>
-    <w:lsdException w:name="List 4" w:semiHidden="1" w:unhideWhenUsed="1"/>
-    <w:lsdException w:name="List 5" w:semiHidden="1" w:unhideWhenUsed="1"/>
-    <w:lsdException w:name="List Bullet 2" w:semiHidden="1" w:unhideWhenUsed="1"/>
-    <w:lsdException w:name="List Bullet 3" w:semiHidden="1" w:unhideWhenUsed="1"/>
-    <w:lsdException w:name="List Bullet 4" w:semiHidden="1" w:unhideWhenUsed="1"/>
-    <w:lsdException w:name="List Bullet 5" w:semiHidden="1" w:unhideWhenUsed="1"/>
-    <w:lsdException w:name="List Number 2" w:semiHidden="1" w:unhideWhenUsed="1"/>
-    <w:lsdException w:name="List Number 3" w:semiHidden="1" w:unhideWhenUsed="1"/>
-    <w:lsdException w:name="List Number 4" w:semiHidden="1" w:unhideWhenUsed="1"/>
-    <w:lsdException w:name="List Number 5" w:semiHidden="1" w:unhideWhenUsed="1"/>
-    <w:lsdException w:name="Title" w:uiPriority="10" w:qFormat="1"/>
-    <w:lsdException w:name="Closing" w:semiHidden="1" w:unhideWhenUsed="1"/>
-    <w:lsdException w:name="Signature" w:semiHidden="1" w:unhideWhenUsed="1"/>
-    <w:lsdException w:name="Default Paragraph Font" w:semiHidden="1" w:uiPriority="1" w:unhideWhenUsed="1"/>
-    <w:lsdException w:name="Body Text" w:semiHidden="1" w:uiPriority="1" w:unhideWhenUsed="1" w:qFormat="1"/>
-    <w:lsdException w:name="Body Text Indent" w:semiHidden="1" w:unhideWhenUsed="1"/>
-    <w:lsdException w:name="List Continue" w:semiHidden="1" w:unhideWhenUsed="1"/>
-    <w:lsdException w:name="List Continue 2" w:semiHidden="1" w:unhideWhenUsed="1"/>
-    <w:lsdException w:name="List Continue 3" w:semiHidden="1" w:unhideWhenUsed="1"/>
-    <w:lsdException w:name="List Continue 4" w:semiHidden="1" w:unhideWhenUsed="1"/>
-    <w:lsdException w:name="List Continue 5" w:semiHidden="1" w:unhideWhenUsed="1"/>
-    <w:lsdException w:name="Message Header" w:semiHidden="1" w:unhideWhenUsed="1"/>
-    <w:lsdException w:name="Subtitle" w:uiPriority="11" w:qFormat="1"/>
-    <w:lsdException w:name="Salutation" w:semiHidden="1" w:unhideWhenUsed="1"/>
-    <w:lsdException w:name="Date" w:semiHidden="1" w:unhideWhenUsed="1"/>
-    <w:lsdException w:name="Body Text First Indent" w:semiHidden="1" w:unhideWhenUsed="1"/>
-    <w:lsdException w:name="Body Text First Indent 2" w:semiHidden="1" w:unhideWhenUsed="1"/>
-    <w:lsdException w:name="Note Heading" w:semiHidden="1" w:unhideWhenUsed="1"/>
-    <w:lsdException w:name="Body Text 2" w:semiHidden="1" w:unhideWhenUsed="1"/>
-    <w:lsdException w:name="Body Text 3" w:semiHidden="1" w:unhideWhenUsed="1"/>
-    <w:lsdException w:name="Body Text Indent 2" w:semiHidden="1" w:unhideWhenUsed="1"/>
-    <w:lsdException w:name="Body Text Indent 3" w:semiHidden="1" w:unhideWhenUsed="1"/>
-    <w:lsdException w:name="Block Text" w:semiHidden="1" w:unhideWhenUsed="1"/>
-    <w:lsdException w:name="Hyperlink" w:semiHidden="1" w:unhideWhenUsed="1"/>
-    <w:lsdException w:name="FollowedHyperlink" w:semiHidden="1" w:unhideWhenUsed="1"/>
-    <w:lsdException w:name="Strong" w:uiPriority="22" w:qFormat="1"/>
-    <w:lsdException w:name="Emphasis" w:uiPriority="20" w:qFormat="1"/>
-    <w:lsdException w:name="Document Map" w:semiHidden="1" w:unhideWhenUsed="1"/>
-    <w:lsdException w:name="Plain Text" w:semiHidden="1" w:unhideWhenUsed="1"/>
-    <w:lsdException w:name="E-mail Signature" w:semiHidden="1" w:unhideWhenUsed="1"/>
-    <w:lsdException w:name="HTML Top of Form" w:semiHidden="1" w:unhideWhenUsed="1"/>
-    <w:lsdException w:name="HTML Bottom of Form" w:semiHidden="1" w:unhideWhenUsed="1"/>
-    <w:lsdException w:name="Normal (Web)" w:semiHidden="1" w:unhideWhenUsed="1"/>
-    <w:lsdException w:name="HTML Acronym" w:semiHidden="1" w:unhideWhenUsed="1"/>
-    <w:lsdException w:name="HTML Address" w:semiHidden="1" w:unhideWhenUsed="1"/>
-    <w:lsdException w:name="HTML Cite" w:semiHidden="1" w:unhideWhenUsed="1"/>
-    <w:lsdException w:name="HTML Code" w:semiHidden="1" w:unhideWhenUsed="1"/>
-    <w:lsdException w:name="HTML Definition" w:semiHidden="1" w:unhideWhenUsed="1"/>
-    <w:lsdException w:name="HTML Keyboard" w:semiHidden="1" w:unhideWhenUsed="1"/>
-    <w:lsdException w:name="HTML Preformatted" w:semiHidden="1" w:unhideWhenUsed="1"/>
-    <w:lsdException w:name="HTML Sample" w:semiHidden="1" w:unhideWhenUsed="1"/>
-    <w:lsdException w:name="HTML Typewriter" w:semiHidden="1" w:unhideWhenUsed="1"/>
-    <w:lsdException w:name="HTML Variable" w:semiHidden="1" w:unhideWhenUsed="1"/>
-    <w:lsdException w:name="Normal Table" w:semiHidden="1" w:unhideWhenUsed="1"/>
-    <w:lsdException w:name="annotation subject" w:semiHidden="1" w:unhideWhenUsed="1"/>
-    <w:lsdException w:name="No List" w:semiHidden="1" w:unhideWhenUsed="1"/>
-    <w:lsdException w:name="Outline List 1" w:semiHidden="1" w:unhideWhenUsed="1"/>
-    <w:lsdException w:name="Outline List 2" w:semiHidden="1" w:unhideWhenUsed="1"/>
-    <w:lsdException w:name="Outline List 3" w:semiHidden="1" w:unhideWhenUsed="1"/>
-    <w:lsdException w:name="Table Simple 1" w:semiHidden="1" w:unhideWhenUsed="1"/>
-    <w:lsdException w:name="Table Simple 2" w:semiHidden="1" w:unhideWhenUsed="1"/>
-    <w:lsdException w:name="Table Simple 3" w:semiHidden="1" w:unhideWhenUsed="1"/>
-    <w:lsdException w:name="Table Classic 1" w:semiHidden="1" w:unhideWhenUsed="1"/>
-    <w:lsdException w:name="Table Classic 2" w:semiHidden="1" w:unhideWhenUsed="1"/>
-    <w:lsdException w:name="Table Classic 3" w:semiHidden="1" w:unhideWhenUsed="1"/>
-    <w:lsdException w:name="Table Classic 4" w:semiHidden="1" w:unhideWhenUsed="1"/>
-    <w:lsdException w:name="Table Colorful 1" w:semiHidden="1" w:unhideWhenUsed="1"/>
-    <w:lsdException w:name="Table Colorful 2" w:semiHidden="1" w:unhideWhenUsed="1"/>
-    <w:lsdException w:name="Table Colorful 3" w:semiHidden="1" w:unhideWhenUsed="1"/>
-    <w:lsdException w:name="Table Columns 1" w:semiHidden="1" w:unhideWhenUsed="1"/>
-    <w:lsdException w:name="Table Columns 2" w:semiHidden="1" w:unhideWhenUsed="1"/>
-    <w:lsdException w:name="Table Columns 3" w:semiHidden="1" w:unhideWhenUsed="1"/>
-    <w:lsdException w:name="Table Columns 4" w:semiHidden="1" w:unhideWhenUsed="1"/>
-    <w:lsdException w:name="Table Columns 5" w:semiHidden="1" w:unhideWhenUsed="1"/>
-    <w:lsdException w:name="Table Grid 1" w:semiHidden="1" w:unhideWhenUsed="1"/>
-    <w:lsdException w:name="Table Grid 2" w:semiHidden="1" w:unhideWhenUsed="1"/>
-    <w:lsdException w:name="Table Grid 3" w:semiHidden="1" w:unhideWhenUsed="1"/>
-    <w:lsdException w:name="Table Grid 4" w:semiHidden="1" w:unhideWhenUsed="1"/>
-    <w:lsdException w:name="Table Grid 5" w:semiHidden="1" w:unhideWhenUsed="1"/>
-    <w:lsdException w:name="Table Grid 6" w:semiHidden="1" w:unhideWhenUsed="1"/>
-    <w:lsdException w:name="Table Grid 7" w:semiHidden="1" w:unhideWhenUsed="1"/>
-    <w:lsdException w:name="Table Grid 8" w:semiHidden="1" w:unhideWhenUsed="1"/>
-    <w:lsdException w:name="Table List 1" w:semiHidden="1" w:unhideWhenUsed="1"/>
-    <w:lsdException w:name="Table List 2" w:semiHidden="1" w:unhideWhenUsed="1"/>
-    <w:lsdException w:name="Table List 3" w:semiHidden="1" w:unhideWhenUsed="1"/>
-    <w:lsdException w:name="Table List 4" w:semiHidden="1" w:unhideWhenUsed="1"/>
-    <w:lsdException w:name="Table List 5" w:semiHidden="1" w:unhideWhenUsed="1"/>
-    <w:lsdException w:name="Table List 6" w:semiHidden="1" w:unhideWhenUsed="1"/>
-    <w:lsdException w:name="Table List 7" w:semiHidden="1" w:unhideWhenUsed="1"/>
-    <w:lsdException w:name="Table List 8" w:semiHidden="1" w:unhideWhenUsed="1"/>
-    <w:lsdException w:name="Table 3D effects 1" w:semiHidden="1" w:unhideWhenUsed="1"/>
-    <w:lsdException w:name="Table 3D effects 2" w:semiHidden="1" w:unhideWhenUsed="1"/>
-    <w:lsdException w:name="Table 3D effects 3" w:semiHidden="1" w:unhideWhenUsed="1"/>
-    <w:lsdException w:name="Table Contemporary" w:semiHidden="1" w:unhideWhenUsed="1"/>
-    <w:lsdException w:name="Table Elegant" w:semiHidden="1" w:unhideWhenUsed="1"/>
-    <w:lsdException w:name="Table Professional" w:semiHidden="1" w:unhideWhenUsed="1"/>
-    <w:lsdException w:name="Table Subtle 1" w:semiHidden="1" w:unhideWhenUsed="1"/>
-    <w:lsdException w:name="Table Subtle 2" w:semiHidden="1" w:unhideWhenUsed="1"/>
-    <w:lsdException w:name="Table Web 1" w:semiHidden="1" w:unhideWhenUsed="1"/>
-    <w:lsdException w:name="Table Web 2" w:semiHidden="1" w:unhideWhenUsed="1"/>
-    <w:lsdException w:name="Table Web 3" w:semiHidden="1" w:unhideWhenUsed="1"/>
-    <w:lsdException w:name="Balloon Text" w:semiHidden="1" w:unhideWhenUsed="1"/>
-    <w:lsdException w:name="Table Grid" w:uiPriority="39"/>
-    <w:lsdException w:name="Table Theme" w:semiHidden="1" w:unhideWhenUsed="1"/>
-    <w:lsdException w:name="Placeholder Text" w:semiHidden="1"/>
-    <w:lsdException w:name="No Spacing" w:uiPriority="1" w:qFormat="1"/>
-    <w:lsdException w:name="Light Shading" w:uiPriority="60"/>
-    <w:lsdException w:name="Light List" w:uiPriority="61"/>
-    <w:lsdException w:name="Light Grid" w:uiPriority="62"/>
-    <w:lsdException w:name="Medium Shading 1" w:uiPriority="63"/>
-    <w:lsdException w:name="Medium Shading 2" w:uiPriority="64"/>
-    <w:lsdException w:name="Medium List 1" w:uiPriority="65"/>
-    <w:lsdException w:name="Medium List 2" w:uiPriority="66"/>
-    <w:lsdException w:name="Medium Grid 1" w:uiPriority="67"/>
-    <w:lsdException w:name="Medium Grid 2" w:uiPriority="68"/>
-    <w:lsdException w:name="Medium Grid 3" w:uiPriority="69"/>
-    <w:lsdException w:name="Dark List" w:uiPriority="70"/>
-    <w:lsdException w:name="Colorful Shading" w:uiPriority="71"/>
-    <w:lsdException w:name="Colorful List" w:uiPriority="72"/>
-    <w:lsdException w:name="Colorful Grid" w:uiPriority="73"/>
-    <w:lsdException w:name="Light Shading Accent 1" w:uiPriority="60"/>
-    <w:lsdException w:name="Light List Accent 1" w:uiPriority="61"/>
-    <w:lsdException w:name="Light Grid Accent 1" w:uiPriority="62"/>
-    <w:lsdException w:name="Medium Shading 1 Accent 1" w:uiPriority="63"/>
-    <w:lsdException w:name="Medium Shading 2 Accent 1" w:uiPriority="64"/>
-    <w:lsdException w:name="Medium List 1 Accent 1" w:uiPriority="65"/>
-    <w:lsdException w:name="Revision" w:semiHidden="1"/>
-    <w:lsdException w:name="List Paragraph" w:uiPriority="34" w:qFormat="1"/>
-    <w:lsdException w:name="Quote" w:uiPriority="29" w:qFormat="1"/>
-    <w:lsdException w:name="Intense Quote" w:uiPriority="30" w:qFormat="1"/>
-    <w:lsdException w:name="Medium List 2 Accent 1" w:uiPriority="66"/>
-    <w:lsdException w:name="Medium Grid 1 Accent 1" w:uiPriority="67"/>
-    <w:lsdException w:name="Medium Grid 2 Accent 1" w:uiPriority="68"/>
-    <w:lsdException w:name="Medium Grid 3 Accent 1" w:uiPriority="69"/>
-    <w:lsdException w:name="Dark List Accent 1" w:uiPriority="70"/>
-    <w:lsdException w:name="Colorful Shading Accent 1" w:uiPriority="71"/>
-    <w:lsdException w:name="Colorful List Accent 1" w:uiPriority="72"/>
-    <w:lsdException w:name="Colorful Grid Accent 1" w:uiPriority="73"/>
-    <w:lsdException w:name="Light Shading Accent 2" w:uiPriority="60"/>
-    <w:lsdException w:name="Light List Accent 2" w:uiPriority="61"/>
-    <w:lsdException w:name="Light Grid Accent 2" w:uiPriority="62"/>
-    <w:lsdException w:name="Medium Shading 1 Accent 2" w:uiPriority="63"/>
-    <w:lsdException w:name="Medium Shading 2 Accent 2" w:uiPriority="64"/>
-    <w:lsdException w:name="Medium List 1 Accent 2" w:uiPriority="65"/>
-    <w:lsdException w:name="Medium List 2 Accent 2" w:uiPriority="66"/>
-    <w:lsdException w:name="Medium Grid 1 Accent 2" w:uiPriority="67"/>
-    <w:lsdException w:name="Medium Grid 2 Accent 2" w:uiPriority="68"/>
-    <w:lsdException w:name="Medium Grid 3 Accent 2" w:uiPriority="69"/>
-    <w:lsdException w:name="Dark List Accent 2" w:uiPriority="70"/>
-    <w:lsdException w:name="Colorful Shading Accent 2" w:uiPriority="71"/>
-    <w:lsdException w:name="Colorful List Accent 2" w:uiPriority="72"/>
-    <w:lsdException w:name="Colorful Grid Accent 2" w:uiPriority="73"/>
-    <w:lsdException w:name="Light Shading Accent 3" w:uiPriority="60"/>
-    <w:lsdException w:name="Light List Accent 3" w:uiPriority="61"/>
-    <w:lsdException w:name="Light Grid Accent 3" w:uiPriority="62"/>
-    <w:lsdException w:name="Medium Shading 1 Accent 3" w:uiPriority="63"/>
-    <w:lsdException w:name="Medium Shading 2 Accent 3" w:uiPriority="64"/>
-    <w:lsdException w:name="Medium List 1 Accent 3" w:uiPriority="65"/>
-    <w:lsdException w:name="Medium List 2 Accent 3" w:uiPriority="66"/>
-    <w:lsdException w:name="Medium Grid 1 Accent 3" w:uiPriority="67"/>
-    <w:lsdException w:name="Medium Grid 2 Accent 3" w:uiPriority="68"/>
-    <w:lsdException w:name="Medium Grid 3 Accent 3" w:uiPriority="69"/>
-    <w:lsdException w:name="Dark List Accent 3" w:uiPriority="70"/>
-    <w:lsdException w:name="Colorful Shading Accent 3" w:uiPriority="71"/>
-    <w:lsdException w:name="Colorful List Accent 3" w:uiPriority="72"/>
-    <w:lsdException w:name="Colorful Grid Accent 3" w:uiPriority="73"/>
-    <w:lsdException w:name="Light Shading Accent 4" w:uiPriority="60"/>
-    <w:lsdException w:name="Light List Accent 4" w:uiPriority="61"/>
-    <w:lsdException w:name="Light Grid Accent 4" w:uiPriority="62"/>
-    <w:lsdException w:name="Medium Shading 1 Accent 4" w:uiPriority="63"/>
-    <w:lsdException w:name="Medium Shading 2 Accent 4" w:uiPriority="64"/>
-    <w:lsdException w:name="Medium List 1 Accent 4" w:uiPriority="65"/>
-    <w:lsdException w:name="Medium List 2 Accent 4" w:uiPriority="66"/>
-    <w:lsdException w:name="Medium Grid 1 Accent 4" w:uiPriority="67"/>
-    <w:lsdException w:name="Medium Grid 2 Accent 4" w:uiPriority="68"/>
-    <w:lsdException w:name="Medium Grid 3 Accent 4" w:uiPriority="69"/>
-    <w:lsdException w:name="Dark List Accent 4" w:uiPriority="70"/>
-    <w:lsdException w:name="Colorful Shading Accent 4" w:uiPriority="71"/>
-    <w:lsdException w:name="Colorful List Accent 4" w:uiPriority="72"/>
-    <w:lsdException w:name="Colorful Grid Accent 4" w:uiPriority="73"/>
-    <w:lsdException w:name="Light Shading Accent 5" w:uiPriority="60"/>
-    <w:lsdException w:name="Light List Accent 5" w:uiPriority="61"/>
-    <w:lsdException w:name="Light Grid Accent 5" w:uiPriority="62"/>
-    <w:lsdException w:name="Medium Shading 1 Accent 5" w:uiPriority="63"/>
-    <w:lsdException w:name="Medium Shading 2 Accent 5" w:uiPriority="64"/>
-    <w:lsdException w:name="Medium List 1 Accent 5" w:uiPriority="65"/>
-    <w:lsdException w:name="Medium List 2 Accent 5" w:uiPriority="66"/>
-    <w:lsdException w:name="Medium Grid 1 Accent 5" w:uiPriority="67"/>
-    <w:lsdException w:name="Medium Grid 2 Accent 5" w:uiPriority="68"/>
-    <w:lsdException w:name="Medium Grid 3 Accent 5" w:uiPriority="69"/>
-    <w:lsdException w:name="Dark List Accent 5" w:uiPriority="70"/>
-    <w:lsdException w:name="Colorful Shading Accent 5" w:uiPriority="71"/>
-    <w:lsdException w:name="Colorful List Accent 5" w:uiPriority="72"/>
-    <w:lsdException w:name="Colorful Grid Accent 5" w:uiPriority="73"/>
-    <w:lsdException w:name="Light Shading Accent 6" w:uiPriority="60"/>
-    <w:lsdException w:name="Light List Accent 6" w:uiPriority="61"/>
-    <w:lsdException w:name="Light Grid Accent 6" w:uiPriority="62"/>
-    <w:lsdException w:name="Medium Shading 1 Accent 6" w:uiPriority="63"/>
-    <w:lsdException w:name="Medium Shading 2 Accent 6" w:uiPriority="64"/>
-    <w:lsdException w:name="Medium List 1 Accent 6" w:uiPriority="65"/>
-    <w:lsdException w:name="Medium List 2 Accent 6" w:uiPriority="66"/>
-    <w:lsdException w:name="Medium Grid 1 Accent 6" w:uiPriority="67"/>
-    <w:lsdException w:name="Medium Grid 2 Accent 6" w:uiPriority="68"/>
-    <w:lsdException w:name="Medium Grid 3 Accent 6" w:uiPriority="69"/>
-    <w:lsdException w:name="Dark List Accent 6" w:uiPriority="70"/>
-    <w:lsdException w:name="Colorful Shading Accent 6" w:uiPriority="71"/>
-    <w:lsdException w:name="Colorful List Accent 6" w:uiPriority="72"/>
-    <w:lsdException w:name="Colorful Grid Accent 6" w:uiPriority="73"/>
-    <w:lsdException w:name="Subtle Emphasis" w:uiPriority="19" w:qFormat="1"/>
-    <w:lsdException w:name="Intense Emphasis" w:uiPriority="21" w:qFormat="1"/>
-    <w:lsdException w:name="Subtle Reference" w:uiPriority="31" w:qFormat="1"/>
-    <w:lsdException w:name="Intense Reference" w:uiPriority="32" w:qFormat="1"/>
-    <w:lsdException w:name="Book Title" w:uiPriority="33" w:qFormat="1"/>
-    <w:lsdException w:name="Bibliography" w:semiHidden="1" w:uiPriority="37" w:unhideWhenUsed="1"/>
-    <w:lsdException w:name="TOC Heading" w:semiHidden="1" w:uiPriority="39" w:unhideWhenUsed="1" w:qFormat="1"/>
-    <w:lsdException w:name="Plain Table 1" w:uiPriority="41"/>
-    <w:lsdException w:name="Plain Table 2" w:uiPriority="42"/>
-    <w:lsdException w:name="Plain Table 3" w:uiPriority="43"/>
-    <w:lsdException w:name="Plain Table 4" w:uiPriority="44"/>
-    <w:lsdException w:name="Plain Table 5" w:uiPriority="45"/>
-    <w:lsdException w:name="Grid Table Light" w:uiPriority="40"/>
-    <w:lsdException w:name="Grid Table 1 Light" w:uiPriority="46"/>
-    <w:lsdException w:name="Grid Table 2" w:uiPriority="47"/>
-    <w:lsdException w:name="Grid Table 3" w:uiPriority="48"/>
-    <w:lsdException w:name="Grid Table 4" w:uiPriority="49"/>
-    <w:lsdException w:name="Grid Table 5 Dark" w:uiPriority="50"/>
-    <w:lsdException w:name="Grid Table 6 Colorful" w:uiPriority="51"/>
-    <w:lsdException w:name="Grid Table 7 Colorful" w:uiPriority="52"/>
-    <w:lsdException w:name="Grid Table 1 Light Accent 1" w:uiPriority="46"/>
-    <w:lsdException w:name="Grid Table 2 Accent 1" w:uiPriority="47"/>
-    <w:lsdException w:name="Grid Table 3 Accent 1" w:uiPriority="48"/>
-    <w:lsdException w:name="Grid Table 4 Accent 1" w:uiPriority="49"/>
-    <w:lsdException w:name="Grid Table 5 Dark Accent 1" w:uiPriority="50"/>
-    <w:lsdException w:name="Grid Table 6 Colorful Accent 1" w:uiPriority="51"/>
-    <w:lsdException w:name="Grid Table 7 Colorful Accent 1" w:uiPriority="52"/>
-    <w:lsdException w:name="Grid Table 1 Light Accent 2" w:uiPriority="46"/>
-    <w:lsdException w:name="Grid Table 2 Accent 2" w:uiPriority="47"/>
-    <w:lsdException w:name="Grid Table 3 Accent 2" w:uiPriority="48"/>
-    <w:lsdException w:name="Grid Table 4 Accent 2" w:uiPriority="49"/>
-    <w:lsdException w:name="Grid Table 5 Dark Accent 2" w:uiPriority="50"/>
-    <w:lsdException w:name="Grid Table 6 Colorful Accent 2" w:uiPriority="51"/>
-    <w:lsdException w:name="Grid Table 7 Colorful Accent 2" w:uiPriority="52"/>
-    <w:lsdException w:name="Grid Table 1 Light Accent 3" w:uiPriority="46"/>
-    <w:lsdException w:name="Grid Table 2 Accent 3" w:uiPriority="47"/>
-    <w:lsdException w:name="Grid Table 3 Accent 3" w:uiPriority="48"/>
-    <w:lsdException w:name="Grid Table 4 Accent 3" w:uiPriority="49"/>
-    <w:lsdException w:name="Grid Table 5 Dark Accent 3" w:uiPriority="50"/>
-    <w:lsdException w:name="Grid Table 6 Colorful Accent 3" w:uiPriority="51"/>
-    <w:lsdException w:name="Grid Table 7 Colorful Accent 3" w:uiPriority="52"/>
-    <w:lsdException w:name="Grid Table 1 Light Accent 4" w:uiPriority="46"/>
-    <w:lsdException w:name="Grid Table 2 Accent 4" w:uiPriority="47"/>
-    <w:lsdException w:name="Grid Table 3 Accent 4" w:uiPriority="48"/>
-    <w:lsdException w:name="Grid Table 4 Accent 4" w:uiPriority="49"/>
-    <w:lsdException w:name="Grid Table 5 Dark Accent 4" w:uiPriority="50"/>
-    <w:lsdException w:name="Grid Table 6 Colorful Accent 4" w:uiPriority="51"/>
-    <w:lsdException w:name="Grid Table 7 Colorful Accent 4" w:uiPriority="52"/>
-    <w:lsdException w:name="Grid Table 1 Light Accent 5" w:uiPriority="46"/>
-    <w:lsdException w:name="Grid Table 2 Accent 5" w:uiPriority="47"/>
-    <w:lsdException w:name="Grid Table 3 Accent 5" w:uiPriority="48"/>
-    <w:lsdException w:name="Grid Table 4 Accent 5" w:uiPriority="49"/>
-    <w:lsdException w:name="Grid Table 5 Dark Accent 5" w:uiPriority="50"/>
-    <w:lsdException w:name="Grid Table 6 Colorful Accent 5" w:uiPriority="51"/>
-    <w:lsdException w:name="Grid Table 7 Colorful Accent 5" w:uiPriority="52"/>
-    <w:lsdException w:name="Grid Table 1 Light Accent 6" w:uiPriority="46"/>
-    <w:lsdException w:name="Grid Table 2 Accent 6" w:uiPriority="47"/>
-    <w:lsdException w:name="Grid Table 3 Accent 6" w:uiPriority="48"/>
-    <w:lsdException w:name="Grid Table 4 Accent 6" w:uiPriority="49"/>
-    <w:lsdException w:name="Grid Table 5 Dark Accent 6" w:uiPriority="50"/>
-    <w:lsdException w:name="Grid Table 6 Colorful Accent 6" w:uiPriority="51"/>
-    <w:lsdException w:name="Grid Table 7 Colorful Accent 6" w:uiPriority="52"/>
-    <w:lsdException w:name="List Table 1 Light" w:uiPriority="46"/>
-    <w:lsdException w:name="List Table 2" w:uiPriority="47"/>
-    <w:lsdException w:name="List Table 3" w:uiPriority="48"/>
-    <w:lsdException w:name="List Table 4" w:uiPriority="49"/>
-    <w:lsdException w:name="List Table 5 Dark" w:uiPriority="50"/>
-    <w:lsdException w:name="List Table 6 Colorful" w:uiPriority="51"/>
-    <w:lsdException w:name="List Table 7 Colorful" w:uiPriority="52"/>
-    <w:lsdException w:name="List Table 1 Light Accent 1" w:uiPriority="46"/>
-    <w:lsdException w:name="List Table 2 Accent 1" w:uiPriority="47"/>
-    <w:lsdException w:name="List Table 3 Accent 1" w:uiPriority="48"/>
-    <w:lsdException w:name="List Table 4 Accent 1" w:uiPriority="49"/>
-    <w:lsdException w:name="List Table 5 Dark Accent 1" w:uiPriority="50"/>
-    <w:lsdException w:name="List Table 6 Colorful Accent 1" w:uiPriority="51"/>
-    <w:lsdException w:name="List Table 7 Colorful Accent 1" w:uiPriority="52"/>
-    <w:lsdException w:name="List Table 1 Light Accent 2" w:uiPriority="46"/>
-    <w:lsdException w:name="List Table 2 Accent 2" w:uiPriority="47"/>
-    <w:lsdException w:name="List Table 3 Accent 2" w:uiPriority="48"/>
-    <w:lsdException w:name="List Table 4 Accent 2" w:uiPriority="49"/>
-    <w:lsdException w:name="List Table 5 Dark Accent 2" w:uiPriority="50"/>
-    <w:lsdException w:name="List Table 6 Colorful Accent 2" w:uiPriority="51"/>
-    <w:lsdException w:name="List Table 7 Colorful Accent 2" w:uiPriority="52"/>
-    <w:lsdException w:name="List Table 1 Light Accent 3" w:uiPriority="46"/>
-    <w:lsdException w:name="List Table 2 Accent 3" w:uiPriority="47"/>
-    <w:lsdException w:name="List Table 3 Accent 3" w:uiPriority="48"/>
-    <w:lsdException w:name="List Table 4 Accent 3" w:uiPriority="49"/>
-    <w:lsdException w:name="List Table 5 Dark Accent 3" w:uiPriority="50"/>
-    <w:lsdException w:name="List Table 6 Colorful Accent 3" w:uiPriority="51"/>
-    <w:lsdException w:name="List Table 7 Colorful Accent 3" w:uiPriority="52"/>
-    <w:lsdException w:name="List Table 1 Light Accent 4" w:uiPriority="46"/>
-    <w:lsdException w:name="List Table 2 Accent 4" w:uiPriority="47"/>
-    <w:lsdException w:name="List Table 3 Accent 4" w:uiPriority="48"/>
-    <w:lsdException w:name="List Table 4 Accent 4" w:uiPriority="49"/>
-    <w:lsdException w:name="List Table 5 Dark Accent 4" w:uiPriority="50"/>
-    <w:lsdException w:name="List Table 6 Colorful Accent 4" w:uiPriority="51"/>
-    <w:lsdException w:name="List Table 7 Colorful Accent 4" w:uiPriority="52"/>
-    <w:lsdException w:name="List Table 1 Light Accent 5" w:uiPriority="46"/>
-    <w:lsdException w:name="List Table 2 Accent 5" w:uiPriority="47"/>
-    <w:lsdException w:name="List Table 3 Accent 5" w:uiPriority="48"/>
-    <w:lsdException w:name="List Table 4 Accent 5" w:uiPriority="49"/>
-    <w:lsdException w:name="List Table 5 Dark Accent 5" w:uiPriority="50"/>
-    <w:lsdException w:name="List Table 6 Colorful Accent 5" w:uiPriority="51"/>
-    <w:lsdException w:name="List Table 7 Colorful Accent 5" w:uiPriority="52"/>
-    <w:lsdException w:name="List Table 1 Light Accent 6" w:uiPriority="46"/>
-    <w:lsdException w:name="List Table 2 Accent 6" w:uiPriority="47"/>
-    <w:lsdException w:name="List Table 3 Accent 6" w:uiPriority="48"/>
-    <w:lsdException w:name="List Table 4 Accent 6" w:uiPriority="49"/>
-    <w:lsdException w:name="List Table 5 Dark Accent 6" w:uiPriority="50"/>
-    <w:lsdException w:name="List Table 6 Colorful Accent 6" w:uiPriority="51"/>
-    <w:lsdException w:name="List Table 7 Colorful Accent 6" w:uiPriority="52"/>
-    <w:lsdException w:name="Mention" w:semiHidden="1" w:unhideWhenUsed="1"/>
-    <w:lsdException w:name="Smart Hyperlink" w:semiHidden="1" w:unhideWhenUsed="1"/>
-    <w:lsdException w:name="Hashtag" w:semiHidden="1" w:unhideWhenUsed="1"/>
-    <w:lsdException w:name="Unresolved Mention" w:semiHidden="1" w:unhideWhenUsed="1"/>
-    <w:lsdException w:name="Smart Link" w:semiHidden="1" w:unhideWhenUsed="1"/>
+  <w:latentStyles w:defLockedState="0" w:defUIPriority="99" w:defSemiHidden="1" w:defUnhideWhenUsed="1" w:defQFormat="0" w:count="267">
+    <w:lsdException w:name="Normal" w:semiHidden="0" w:uiPriority="0" w:unhideWhenUsed="0" w:qFormat="1"/>
+    <w:lsdException w:name="heading 1" w:semiHidden="0" w:uiPriority="9" w:unhideWhenUsed="0" w:qFormat="1"/>
+    <w:lsdException w:name="heading 2" w:uiPriority="9" w:qFormat="1"/>
+    <w:lsdException w:name="heading 3" w:uiPriority="9" w:qFormat="1"/>
+    <w:lsdException w:name="heading 4" w:uiPriority="9" w:qFormat="1"/>
+    <w:lsdException w:name="heading 5" w:uiPriority="9" w:qFormat="1"/>
+    <w:lsdException w:name="heading 6" w:uiPriority="9" w:qFormat="1"/>
+    <w:lsdException w:name="heading 7" w:uiPriority="9" w:qFormat="1"/>
+    <w:lsdException w:name="heading 8" w:uiPriority="9" w:qFormat="1"/>
+    <w:lsdException w:name="heading 9" w:uiPriority="9" w:qFormat="1"/>
+    <w:lsdException w:name="toc 1" w:uiPriority="39"/>
+    <w:lsdException w:name="toc 2" w:uiPriority="39"/>
+    <w:lsdException w:name="toc 3" w:uiPriority="39"/>
+    <w:lsdException w:name="toc 4" w:uiPriority="39"/>
+    <w:lsdException w:name="toc 5" w:uiPriority="39"/>
+    <w:lsdException w:name="toc 6" w:uiPriority="39"/>
+    <w:lsdException w:name="toc 7" w:uiPriority="39"/>
+    <w:lsdException w:name="toc 8" w:uiPriority="39"/>
+    <w:lsdException w:name="toc 9" w:uiPriority="39"/>
+    <w:lsdException w:name="annotation text" w:qFormat="1"/>
+    <w:lsdException w:name="caption" w:uiPriority="35" w:qFormat="1"/>
+    <w:lsdException w:name="annotation reference" w:qFormat="1"/>
+    <w:lsdException w:name="Title" w:semiHidden="0" w:uiPriority="10" w:unhideWhenUsed="0" w:qFormat="1"/>
+    <w:lsdException w:name="Default Paragraph Font" w:uiPriority="1"/>
+    <w:lsdException w:name="Body Text" w:uiPriority="1" w:qFormat="1"/>
+    <w:lsdException w:name="Subtitle" w:semiHidden="0" w:uiPriority="11" w:unhideWhenUsed="0" w:qFormat="1"/>
+    <w:lsdException w:name="Strong" w:semiHidden="0" w:uiPriority="22" w:unhideWhenUsed="0" w:qFormat="1"/>
+    <w:lsdException w:name="Emphasis" w:semiHidden="0" w:uiPriority="20" w:unhideWhenUsed="0" w:qFormat="1"/>
+    <w:lsdException w:name="Table Grid" w:semiHidden="0" w:uiPriority="39" w:unhideWhenUsed="0"/>
+    <w:lsdException w:name="Placeholder Text" w:unhideWhenUsed="0"/>
+    <w:lsdException w:name="No Spacing" w:semiHidden="0" w:uiPriority="1" w:unhideWhenUsed="0" w:qFormat="1"/>
+    <w:lsdException w:name="Light Shading" w:semiHidden="0" w:uiPriority="60" w:unhideWhenUsed="0"/>
+    <w:lsdException w:name="Light List" w:semiHidden="0" w:uiPriority="61" w:unhideWhenUsed="0"/>
+    <w:lsdException w:name="Light Grid" w:semiHidden="0" w:uiPriority="62" w:unhideWhenUsed="0"/>
+    <w:lsdException w:name="Medium Shading 1" w:semiHidden="0" w:uiPriority="63" w:unhideWhenUsed="0"/>
+    <w:lsdException w:name="Medium Shading 2" w:semiHidden="0" w:uiPriority="64" w:unhideWhenUsed="0"/>
+    <w:lsdException w:name="Medium List 1" w:semiHidden="0" w:uiPriority="65" w:unhideWhenUsed="0"/>
+    <w:lsdException w:name="Medium List 2" w:semiHidden="0" w:uiPriority="66" w:unhideWhenUsed="0"/>
+    <w:lsdException w:name="Medium Grid 1" w:semiHidden="0" w:uiPriority="67" w:unhideWhenUsed="0"/>
+    <w:lsdException w:name="Medium Grid 2" w:semiHidden="0" w:uiPriority="68" w:unhideWhenUsed="0"/>
+    <w:lsdException w:name="Medium Grid 3" w:semiHidden="0" w:uiPriority="69" w:unhideWhenUsed="0"/>
+    <w:lsdException w:name="Dark List" w:semiHidden="0" w:uiPriority="70" w:unhideWhenUsed="0"/>
+    <w:lsdException w:name="Colorful Shading" w:semiHidden="0" w:uiPriority="71" w:unhideWhenUsed="0"/>
+    <w:lsdException w:name="Colorful List" w:semiHidden="0" w:uiPriority="72" w:unhideWhenUsed="0"/>
+    <w:lsdException w:name="Colorful Grid" w:semiHidden="0" w:uiPriority="73" w:unhideWhenUsed="0"/>
+    <w:lsdException w:name="Light Shading Accent 1" w:semiHidden="0" w:uiPriority="60" w:unhideWhenUsed="0"/>
+    <w:lsdException w:name="Light List Accent 1" w:semiHidden="0" w:uiPriority="61" w:unhideWhenUsed="0"/>
+    <w:lsdException w:name="Light Grid Accent 1" w:semiHidden="0" w:uiPriority="62" w:unhideWhenUsed="0"/>
+    <w:lsdException w:name="Medium Shading 1 Accent 1" w:semiHidden="0" w:uiPriority="63" w:unhideWhenUsed="0"/>
+    <w:lsdException w:name="Medium Shading 2 Accent 1" w:semiHidden="0" w:uiPriority="64" w:unhideWhenUsed="0"/>
+    <w:lsdException w:name="Medium List 1 Accent 1" w:semiHidden="0" w:uiPriority="65" w:unhideWhenUsed="0"/>
+    <w:lsdException w:name="Revision" w:unhideWhenUsed="0"/>
+    <w:lsdException w:name="List Paragraph" w:semiHidden="0" w:uiPriority="34" w:unhideWhenUsed="0" w:qFormat="1"/>
+    <w:lsdException w:name="Quote" w:semiHidden="0" w:uiPriority="29" w:unhideWhenUsed="0" w:qFormat="1"/>
+    <w:lsdException w:name="Intense Quote" w:semiHidden="0" w:uiPriority="30" w:unhideWhenUsed="0" w:qFormat="1"/>
+    <w:lsdException w:name="Medium List 2 Accent 1" w:semiHidden="0" w:uiPriority="66" w:unhideWhenUsed="0"/>
+    <w:lsdException w:name="Medium Grid 1 Accent 1" w:semiHidden="0" w:uiPriority="67" w:unhideWhenUsed="0"/>
+    <w:lsdException w:name="Medium Grid 2 Accent 1" w:semiHidden="0" w:uiPriority="68" w:unhideWhenUsed="0"/>
+    <w:lsdException w:name="Medium Grid 3 Accent 1" w:semiHidden="0" w:uiPriority="69" w:unhideWhenUsed="0"/>
+    <w:lsdException w:name="Dark List Accent 1" w:semiHidden="0" w:uiPriority="70" w:unhideWhenUsed="0"/>
+    <w:lsdException w:name="Colorful Shading Accent 1" w:semiHidden="0" w:uiPriority="71" w:unhideWhenUsed="0"/>
+    <w:lsdException w:name="Colorful List Accent 1" w:semiHidden="0" w:uiPriority="72" w:unhideWhenUsed="0"/>
+    <w:lsdException w:name="Colorful Grid Accent 1" w:semiHidden="0" w:uiPriority="73" w:unhideWhenUsed="0"/>
+    <w:lsdException w:name="Light Shading Accent 2" w:semiHidden="0" w:uiPriority="60" w:unhideWhenUsed="0"/>
+    <w:lsdException w:name="Light List Accent 2" w:semiHidden="0" w:uiPriority="61" w:unhideWhenUsed="0"/>
+    <w:lsdException w:name="Light Grid Accent 2" w:semiHidden="0" w:uiPriority="62" w:unhideWhenUsed="0"/>
+    <w:lsdException w:name="Medium Shading 1 Accent 2" w:semiHidden="0" w:uiPriority="63" w:unhideWhenUsed="0"/>
+    <w:lsdException w:name="Medium Shading 2 Accent 2" w:semiHidden="0" w:uiPriority="64" w:unhideWhenUsed="0"/>
+    <w:lsdException w:name="Medium List 1 Accent 2" w:semiHidden="0" w:uiPriority="65" w:unhideWhenUsed="0"/>
+    <w:lsdException w:name="Medium List 2 Accent 2" w:semiHidden="0" w:uiPriority="66" w:unhideWhenUsed="0"/>
+    <w:lsdException w:name="Medium Grid 1 Accent 2" w:semiHidden="0" w:uiPriority="67" w:unhideWhenUsed="0"/>
+    <w:lsdException w:name="Medium Grid 2 Accent 2" w:semiHidden="0" w:uiPriority="68" w:unhideWhenUsed="0"/>
+    <w:lsdException w:name="Medium Grid 3 Accent 2" w:semiHidden="0" w:uiPriority="69" w:unhideWhenUsed="0"/>
+    <w:lsdException w:name="Dark List Accent 2" w:semiHidden="0" w:uiPriority="70" w:unhideWhenUsed="0"/>
+    <w:lsdException w:name="Colorful Shading Accent 2" w:semiHidden="0" w:uiPriority="71" w:unhideWhenUsed="0"/>
+    <w:lsdException w:name="Colorful List Accent 2" w:semiHidden="0" w:uiPriority="72" w:unhideWhenUsed="0"/>
+    <w:lsdException w:name="Colorful Grid Accent 2" w:semiHidden="0" w:uiPriority="73" w:unhideWhenUsed="0"/>
+    <w:lsdException w:name="Light Shading Accent 3" w:semiHidden="0" w:uiPriority="60" w:unhideWhenUsed="0"/>
+    <w:lsdException w:name="Light List Accent 3" w:semiHidden="0" w:uiPriority="61" w:unhideWhenUsed="0"/>
+    <w:lsdException w:name="Light Grid Accent 3" w:semiHidden="0" w:uiPriority="62" w:unhideWhenUsed="0"/>
+    <w:lsdException w:name="Medium Shading 1 Accent 3" w:semiHidden="0" w:uiPriority="63" w:unhideWhenUsed="0"/>
+    <w:lsdException w:name="Medium Shading 2 Accent 3" w:semiHidden="0" w:uiPriority="64" w:unhideWhenUsed="0"/>
+    <w:lsdException w:name="Medium List 1 Accent 3" w:semiHidden="0" w:uiPriority="65" w:unhideWhenUsed="0"/>
+    <w:lsdException w:name="Medium List 2 Accent 3" w:semiHidden="0" w:uiPriority="66" w:unhideWhenUsed="0"/>
+    <w:lsdException w:name="Medium Grid 1 Accent 3" w:semiHidden="0" w:uiPriority="67" w:unhideWhenUsed="0"/>
+    <w:lsdException w:name="Medium Grid 2 Accent 3" w:semiHidden="0" w:uiPriority="68" w:unhideWhenUsed="0"/>
+    <w:lsdException w:name="Medium Grid 3 Accent 3" w:semiHidden="0" w:uiPriority="69" w:unhideWhenUsed="0"/>
+    <w:lsdException w:name="Dark List Accent 3" w:semiHidden="0" w:uiPriority="70" w:unhideWhenUsed="0"/>
+    <w:lsdException w:name="Colorful Shading Accent 3" w:semiHidden="0" w:uiPriority="71" w:unhideWhenUsed="0"/>
+    <w:lsdException w:name="Colorful List Accent 3" w:semiHidden="0" w:uiPriority="72" w:unhideWhenUsed="0"/>
+    <w:lsdException w:name="Colorful Grid Accent 3" w:semiHidden="0" w:uiPriority="73" w:unhideWhenUsed="0"/>
+    <w:lsdException w:name="Light Shading Accent 4" w:semiHidden="0" w:uiPriority="60" w:unhideWhenUsed="0"/>
+    <w:lsdException w:name="Light List Accent 4" w:semiHidden="0" w:uiPriority="61" w:unhideWhenUsed="0"/>
+    <w:lsdException w:name="Light Grid Accent 4" w:semiHidden="0" w:uiPriority="62" w:unhideWhenUsed="0"/>
+    <w:lsdException w:name="Medium Shading 1 Accent 4" w:semiHidden="0" w:uiPriority="63" w:unhideWhenUsed="0"/>
+    <w:lsdException w:name="Medium Shading 2 Accent 4" w:semiHidden="0" w:uiPriority="64" w:unhideWhenUsed="0"/>
+    <w:lsdException w:name="Medium List 1 Accent 4" w:semiHidden="0" w:uiPriority="65" w:unhideWhenUsed="0"/>
+    <w:lsdException w:name="Medium List 2 Accent 4" w:semiHidden="0" w:uiPriority="66" w:unhideWhenUsed="0"/>
+    <w:lsdException w:name="Medium Grid 1 Accent 4" w:semiHidden="0" w:uiPriority="67" w:unhideWhenUsed="0"/>
+    <w:lsdException w:name="Medium Grid 2 Accent 4" w:semiHidden="0" w:uiPriority="68" w:unhideWhenUsed="0"/>
+    <w:lsdException w:name="Medium Grid 3 Accent 4" w:semiHidden="0" w:uiPriority="69" w:unhideWhenUsed="0"/>
+    <w:lsdException w:name="Dark List Accent 4" w:semiHidden="0" w:uiPriority="70" w:unhideWhenUsed="0"/>
+    <w:lsdException w:name="Colorful Shading Accent 4" w:semiHidden="0" w:uiPriority="71" w:unhideWhenUsed="0"/>
+    <w:lsdException w:name="Colorful List Accent 4" w:semiHidden="0" w:uiPriority="72" w:unhideWhenUsed="0"/>
+    <w:lsdException w:name="Colorful Grid Accent 4" w:semiHidden="0" w:uiPriority="73" w:unhideWhenUsed="0"/>
+    <w:lsdException w:name="Light Shading Accent 5" w:semiHidden="0" w:uiPriority="60" w:unhideWhenUsed="0"/>
+    <w:lsdException w:name="Light List Accent 5" w:semiHidden="0" w:uiPriority="61" w:unhideWhenUsed="0"/>
+    <w:lsdException w:name="Light Grid Accent 5" w:semiHidden="0" w:uiPriority="62" w:unhideWhenUsed="0"/>
+    <w:lsdException w:name="Medium Shading 1 Accent 5" w:semiHidden="0" w:uiPriority="63" w:unhideWhenUsed="0"/>
+    <w:lsdException w:name="Medium Shading 2 Accent 5" w:semiHidden="0" w:uiPriority="64" w:unhideWhenUsed="0"/>
+    <w:lsdException w:name="Medium List 1 Accent 5" w:semiHidden="0" w:uiPriority="65" w:unhideWhenUsed="0"/>
+    <w:lsdException w:name="Medium List 2 Accent 5" w:semiHidden="0" w:uiPriority="66" w:unhideWhenUsed="0"/>
+    <w:lsdException w:name="Medium Grid 1 Accent 5" w:semiHidden="0" w:uiPriority="67" w:unhideWhenUsed="0"/>
+    <w:lsdException w:name="Medium Grid 2 Accent 5" w:semiHidden="0" w:uiPriority="68" w:unhideWhenUsed="0"/>
+    <w:lsdException w:name="Medium Grid 3 Accent 5" w:semiHidden="0" w:uiPriority="69" w:unhideWhenUsed="0"/>
+    <w:lsdException w:name="Dark List Accent 5" w:semiHidden="0" w:uiPriority="70" w:unhideWhenUsed="0"/>
+    <w:lsdException w:name="Colorful Shading Accent 5" w:semiHidden="0" w:uiPriority="71" w:unhideWhenUsed="0"/>
+    <w:lsdException w:name="Colorful List Accent 5" w:semiHidden="0" w:uiPriority="72" w:unhideWhenUsed="0"/>
+    <w:lsdException w:name="Colorful Grid Accent 5" w:semiHidden="0" w:uiPriority="73" w:unhideWhenUsed="0"/>
+    <w:lsdException w:name="Light Shading Accent 6" w:semiHidden="0" w:uiPriority="60" w:unhideWhenUsed="0"/>
+    <w:lsdException w:name="Light List Accent 6" w:semiHidden="0" w:uiPriority="61" w:unhideWhenUsed="0"/>
+    <w:lsdException w:name="Light Grid Accent 6" w:semiHidden="0" w:uiPriority="62" w:unhideWhenUsed="0"/>
+    <w:lsdException w:name="Medium Shading 1 Accent 6" w:semiHidden="0" w:uiPriority="63" w:unhideWhenUsed="0"/>
+    <w:lsdException w:name="Medium Shading 2 Accent 6" w:semiHidden="0" w:uiPriority="64" w:unhideWhenUsed="0"/>
+    <w:lsdException w:name="Medium List 1 Accent 6" w:semiHidden="0" w:uiPriority="65" w:unhideWhenUsed="0"/>
+    <w:lsdException w:name="Medium List 2 Accent 6" w:semiHidden="0" w:uiPriority="66" w:unhideWhenUsed="0"/>
+    <w:lsdException w:name="Medium Grid 1 Accent 6" w:semiHidden="0" w:uiPriority="67" w:unhideWhenUsed="0"/>
+    <w:lsdException w:name="Medium Grid 2 Accent 6" w:semiHidden="0" w:uiPriority="68" w:unhideWhenUsed="0"/>
+    <w:lsdException w:name="Medium Grid 3 Accent 6" w:semiHidden="0" w:uiPriority="69" w:unhideWhenUsed="0"/>
+    <w:lsdException w:name="Dark List Accent 6" w:semiHidden="0" w:uiPriority="70" w:unhideWhenUsed="0"/>
+    <w:lsdException w:name="Colorful Shading Accent 6" w:semiHidden="0" w:uiPriority="71" w:unhideWhenUsed="0"/>
+    <w:lsdException w:name="Colorful List Accent 6" w:semiHidden="0" w:uiPriority="72" w:unhideWhenUsed="0"/>
+    <w:lsdException w:name="Colorful Grid Accent 6" w:semiHidden="0" w:uiPriority="73" w:unhideWhenUsed="0"/>
+    <w:lsdException w:name="Subtle Emphasis" w:semiHidden="0" w:uiPriority="19" w:unhideWhenUsed="0" w:qFormat="1"/>
+    <w:lsdException w:name="Intense Emphasis" w:semiHidden="0" w:uiPriority="21" w:unhideWhenUsed="0" w:qFormat="1"/>
+    <w:lsdException w:name="Subtle Reference" w:semiHidden="0" w:uiPriority="31" w:unhideWhenUsed="0" w:qFormat="1"/>
+    <w:lsdException w:name="Intense Reference" w:semiHidden="0" w:uiPriority="32" w:unhideWhenUsed="0" w:qFormat="1"/>
+    <w:lsdException w:name="Book Title" w:semiHidden="0" w:uiPriority="33" w:unhideWhenUsed="0" w:qFormat="1"/>
+    <w:lsdException w:name="Bibliography" w:uiPriority="37"/>
+    <w:lsdException w:name="TOC Heading" w:uiPriority="39" w:qFormat="1"/>
   </w:latentStyles>
   <w:style w:type="paragraph" w:default="1" w:styleId="Normal">
     <w:name w:val="Normal"/>
@@ -7141,7 +6959,1757 @@
       </w:tblBorders>
     </w:tblPr>
   </w:style>
-  <w:style w:type="character" w:styleId="UnresolvedMention">
+  <w:style w:type="character" w:customStyle="1" w:styleId="UnresolvedMention">
+    <w:name w:val="Unresolved Mention"/>
+    <w:basedOn w:val="DefaultParagraphFont"/>
+    <w:uiPriority w:val="99"/>
+    <w:semiHidden/>
+    <w:unhideWhenUsed/>
+    <w:rsid w:val="00864CA9"/>
+    <w:rPr>
+      <w:color w:val="605E5C"/>
+      <w:shd w:val="clear" w:color="auto" w:fill="E1DFDD"/>
+    </w:rPr>
+  </w:style>
+</w:styles>
+</file>
+
+<file path=word/stylesWithEffects.xml><?xml version="1.0" encoding="utf-8"?>
+<w:styles xmlns:wpc="http://schemas.microsoft.com/office/word/2010/wordprocessingCanvas" xmlns:mc="http://schemas.openxmlformats.org/markup-compatibility/2006" xmlns:o="urn:schemas-microsoft-com:office:office" xmlns:r="http://schemas.openxmlformats.org/officeDocument/2006/relationships" xmlns:m="http://schemas.openxmlformats.org/officeDocument/2006/math" xmlns:v="urn:schemas-microsoft-com:vml" xmlns:wp14="http://schemas.microsoft.com/office/word/2010/wordprocessingDrawing" xmlns:wp="http://schemas.openxmlformats.org/drawingml/2006/wordprocessingDrawing" xmlns:w10="urn:schemas-microsoft-com:office:word" xmlns:w="http://schemas.openxmlformats.org/wordprocessingml/2006/main" xmlns:w14="http://schemas.microsoft.com/office/word/2010/wordml" xmlns:wpg="http://schemas.microsoft.com/office/word/2010/wordprocessingGroup" xmlns:wpi="http://schemas.microsoft.com/office/word/2010/wordprocessingInk" xmlns:wne="http://schemas.microsoft.com/office/word/2006/wordml" xmlns:wps="http://schemas.microsoft.com/office/word/2010/wordprocessingShape" mc:Ignorable="w14 wp14">
+  <w:docDefaults>
+    <w:rPrDefault>
+      <w:rPr>
+        <w:rFonts w:asciiTheme="minorHAnsi" w:eastAsia="Arial" w:hAnsiTheme="minorHAnsi" w:cstheme="minorBidi"/>
+        <w:sz w:val="22"/>
+        <w:szCs w:val="22"/>
+        <w:lang w:val="en-US" w:eastAsia="en-US" w:bidi="ar-SA"/>
+      </w:rPr>
+    </w:rPrDefault>
+    <w:pPrDefault>
+      <w:pPr>
+        <w:spacing w:beforeAutospacing="1" w:after="160" w:afterAutospacing="1" w:line="259" w:lineRule="auto"/>
+      </w:pPr>
+    </w:pPrDefault>
+  </w:docDefaults>
+  <w:latentStyles w:defLockedState="0" w:defUIPriority="99" w:defSemiHidden="1" w:defUnhideWhenUsed="1" w:defQFormat="0" w:count="267">
+    <w:lsdException w:name="Normal" w:semiHidden="0" w:uiPriority="0" w:unhideWhenUsed="0" w:qFormat="1"/>
+    <w:lsdException w:name="heading 1" w:semiHidden="0" w:uiPriority="9" w:unhideWhenUsed="0" w:qFormat="1"/>
+    <w:lsdException w:name="heading 2" w:uiPriority="9" w:qFormat="1"/>
+    <w:lsdException w:name="heading 3" w:uiPriority="9" w:qFormat="1"/>
+    <w:lsdException w:name="heading 4" w:uiPriority="9" w:qFormat="1"/>
+    <w:lsdException w:name="heading 5" w:uiPriority="9" w:qFormat="1"/>
+    <w:lsdException w:name="heading 6" w:uiPriority="9" w:qFormat="1"/>
+    <w:lsdException w:name="heading 7" w:uiPriority="9" w:qFormat="1"/>
+    <w:lsdException w:name="heading 8" w:uiPriority="9" w:qFormat="1"/>
+    <w:lsdException w:name="heading 9" w:uiPriority="9" w:qFormat="1"/>
+    <w:lsdException w:name="toc 1" w:uiPriority="39"/>
+    <w:lsdException w:name="toc 2" w:uiPriority="39"/>
+    <w:lsdException w:name="toc 3" w:uiPriority="39"/>
+    <w:lsdException w:name="toc 4" w:uiPriority="39"/>
+    <w:lsdException w:name="toc 5" w:uiPriority="39"/>
+    <w:lsdException w:name="toc 6" w:uiPriority="39"/>
+    <w:lsdException w:name="toc 7" w:uiPriority="39"/>
+    <w:lsdException w:name="toc 8" w:uiPriority="39"/>
+    <w:lsdException w:name="toc 9" w:uiPriority="39"/>
+    <w:lsdException w:name="annotation text" w:qFormat="1"/>
+    <w:lsdException w:name="caption" w:uiPriority="35" w:qFormat="1"/>
+    <w:lsdException w:name="annotation reference" w:qFormat="1"/>
+    <w:lsdException w:name="Title" w:semiHidden="0" w:uiPriority="10" w:unhideWhenUsed="0" w:qFormat="1"/>
+    <w:lsdException w:name="Default Paragraph Font" w:uiPriority="1"/>
+    <w:lsdException w:name="Body Text" w:uiPriority="1" w:qFormat="1"/>
+    <w:lsdException w:name="Subtitle" w:semiHidden="0" w:uiPriority="11" w:unhideWhenUsed="0" w:qFormat="1"/>
+    <w:lsdException w:name="Strong" w:semiHidden="0" w:uiPriority="22" w:unhideWhenUsed="0" w:qFormat="1"/>
+    <w:lsdException w:name="Emphasis" w:semiHidden="0" w:uiPriority="20" w:unhideWhenUsed="0" w:qFormat="1"/>
+    <w:lsdException w:name="Table Grid" w:semiHidden="0" w:uiPriority="39" w:unhideWhenUsed="0"/>
+    <w:lsdException w:name="Placeholder Text" w:unhideWhenUsed="0"/>
+    <w:lsdException w:name="No Spacing" w:semiHidden="0" w:uiPriority="1" w:unhideWhenUsed="0" w:qFormat="1"/>
+    <w:lsdException w:name="Light Shading" w:semiHidden="0" w:uiPriority="60" w:unhideWhenUsed="0"/>
+    <w:lsdException w:name="Light List" w:semiHidden="0" w:uiPriority="61" w:unhideWhenUsed="0"/>
+    <w:lsdException w:name="Light Grid" w:semiHidden="0" w:uiPriority="62" w:unhideWhenUsed="0"/>
+    <w:lsdException w:name="Medium Shading 1" w:semiHidden="0" w:uiPriority="63" w:unhideWhenUsed="0"/>
+    <w:lsdException w:name="Medium Shading 2" w:semiHidden="0" w:uiPriority="64" w:unhideWhenUsed="0"/>
+    <w:lsdException w:name="Medium List 1" w:semiHidden="0" w:uiPriority="65" w:unhideWhenUsed="0"/>
+    <w:lsdException w:name="Medium List 2" w:semiHidden="0" w:uiPriority="66" w:unhideWhenUsed="0"/>
+    <w:lsdException w:name="Medium Grid 1" w:semiHidden="0" w:uiPriority="67" w:unhideWhenUsed="0"/>
+    <w:lsdException w:name="Medium Grid 2" w:semiHidden="0" w:uiPriority="68" w:unhideWhenUsed="0"/>
+    <w:lsdException w:name="Medium Grid 3" w:semiHidden="0" w:uiPriority="69" w:unhideWhenUsed="0"/>
+    <w:lsdException w:name="Dark List" w:semiHidden="0" w:uiPriority="70" w:unhideWhenUsed="0"/>
+    <w:lsdException w:name="Colorful Shading" w:semiHidden="0" w:uiPriority="71" w:unhideWhenUsed="0"/>
+    <w:lsdException w:name="Colorful List" w:semiHidden="0" w:uiPriority="72" w:unhideWhenUsed="0"/>
+    <w:lsdException w:name="Colorful Grid" w:semiHidden="0" w:uiPriority="73" w:unhideWhenUsed="0"/>
+    <w:lsdException w:name="Light Shading Accent 1" w:semiHidden="0" w:uiPriority="60" w:unhideWhenUsed="0"/>
+    <w:lsdException w:name="Light List Accent 1" w:semiHidden="0" w:uiPriority="61" w:unhideWhenUsed="0"/>
+    <w:lsdException w:name="Light Grid Accent 1" w:semiHidden="0" w:uiPriority="62" w:unhideWhenUsed="0"/>
+    <w:lsdException w:name="Medium Shading 1 Accent 1" w:semiHidden="0" w:uiPriority="63" w:unhideWhenUsed="0"/>
+    <w:lsdException w:name="Medium Shading 2 Accent 1" w:semiHidden="0" w:uiPriority="64" w:unhideWhenUsed="0"/>
+    <w:lsdException w:name="Medium List 1 Accent 1" w:semiHidden="0" w:uiPriority="65" w:unhideWhenUsed="0"/>
+    <w:lsdException w:name="Revision" w:unhideWhenUsed="0"/>
+    <w:lsdException w:name="List Paragraph" w:semiHidden="0" w:uiPriority="34" w:unhideWhenUsed="0" w:qFormat="1"/>
+    <w:lsdException w:name="Quote" w:semiHidden="0" w:uiPriority="29" w:unhideWhenUsed="0" w:qFormat="1"/>
+    <w:lsdException w:name="Intense Quote" w:semiHidden="0" w:uiPriority="30" w:unhideWhenUsed="0" w:qFormat="1"/>
+    <w:lsdException w:name="Medium List 2 Accent 1" w:semiHidden="0" w:uiPriority="66" w:unhideWhenUsed="0"/>
+    <w:lsdException w:name="Medium Grid 1 Accent 1" w:semiHidden="0" w:uiPriority="67" w:unhideWhenUsed="0"/>
+    <w:lsdException w:name="Medium Grid 2 Accent 1" w:semiHidden="0" w:uiPriority="68" w:unhideWhenUsed="0"/>
+    <w:lsdException w:name="Medium Grid 3 Accent 1" w:semiHidden="0" w:uiPriority="69" w:unhideWhenUsed="0"/>
+    <w:lsdException w:name="Dark List Accent 1" w:semiHidden="0" w:uiPriority="70" w:unhideWhenUsed="0"/>
+    <w:lsdException w:name="Colorful Shading Accent 1" w:semiHidden="0" w:uiPriority="71" w:unhideWhenUsed="0"/>
+    <w:lsdException w:name="Colorful List Accent 1" w:semiHidden="0" w:uiPriority="72" w:unhideWhenUsed="0"/>
+    <w:lsdException w:name="Colorful Grid Accent 1" w:semiHidden="0" w:uiPriority="73" w:unhideWhenUsed="0"/>
+    <w:lsdException w:name="Light Shading Accent 2" w:semiHidden="0" w:uiPriority="60" w:unhideWhenUsed="0"/>
+    <w:lsdException w:name="Light List Accent 2" w:semiHidden="0" w:uiPriority="61" w:unhideWhenUsed="0"/>
+    <w:lsdException w:name="Light Grid Accent 2" w:semiHidden="0" w:uiPriority="62" w:unhideWhenUsed="0"/>
+    <w:lsdException w:name="Medium Shading 1 Accent 2" w:semiHidden="0" w:uiPriority="63" w:unhideWhenUsed="0"/>
+    <w:lsdException w:name="Medium Shading 2 Accent 2" w:semiHidden="0" w:uiPriority="64" w:unhideWhenUsed="0"/>
+    <w:lsdException w:name="Medium List 1 Accent 2" w:semiHidden="0" w:uiPriority="65" w:unhideWhenUsed="0"/>
+    <w:lsdException w:name="Medium List 2 Accent 2" w:semiHidden="0" w:uiPriority="66" w:unhideWhenUsed="0"/>
+    <w:lsdException w:name="Medium Grid 1 Accent 2" w:semiHidden="0" w:uiPriority="67" w:unhideWhenUsed="0"/>
+    <w:lsdException w:name="Medium Grid 2 Accent 2" w:semiHidden="0" w:uiPriority="68" w:unhideWhenUsed="0"/>
+    <w:lsdException w:name="Medium Grid 3 Accent 2" w:semiHidden="0" w:uiPriority="69" w:unhideWhenUsed="0"/>
+    <w:lsdException w:name="Dark List Accent 2" w:semiHidden="0" w:uiPriority="70" w:unhideWhenUsed="0"/>
+    <w:lsdException w:name="Colorful Shading Accent 2" w:semiHidden="0" w:uiPriority="71" w:unhideWhenUsed="0"/>
+    <w:lsdException w:name="Colorful List Accent 2" w:semiHidden="0" w:uiPriority="72" w:unhideWhenUsed="0"/>
+    <w:lsdException w:name="Colorful Grid Accent 2" w:semiHidden="0" w:uiPriority="73" w:unhideWhenUsed="0"/>
+    <w:lsdException w:name="Light Shading Accent 3" w:semiHidden="0" w:uiPriority="60" w:unhideWhenUsed="0"/>
+    <w:lsdException w:name="Light List Accent 3" w:semiHidden="0" w:uiPriority="61" w:unhideWhenUsed="0"/>
+    <w:lsdException w:name="Light Grid Accent 3" w:semiHidden="0" w:uiPriority="62" w:unhideWhenUsed="0"/>
+    <w:lsdException w:name="Medium Shading 1 Accent 3" w:semiHidden="0" w:uiPriority="63" w:unhideWhenUsed="0"/>
+    <w:lsdException w:name="Medium Shading 2 Accent 3" w:semiHidden="0" w:uiPriority="64" w:unhideWhenUsed="0"/>
+    <w:lsdException w:name="Medium List 1 Accent 3" w:semiHidden="0" w:uiPriority="65" w:unhideWhenUsed="0"/>
+    <w:lsdException w:name="Medium List 2 Accent 3" w:semiHidden="0" w:uiPriority="66" w:unhideWhenUsed="0"/>
+    <w:lsdException w:name="Medium Grid 1 Accent 3" w:semiHidden="0" w:uiPriority="67" w:unhideWhenUsed="0"/>
+    <w:lsdException w:name="Medium Grid 2 Accent 3" w:semiHidden="0" w:uiPriority="68" w:unhideWhenUsed="0"/>
+    <w:lsdException w:name="Medium Grid 3 Accent 3" w:semiHidden="0" w:uiPriority="69" w:unhideWhenUsed="0"/>
+    <w:lsdException w:name="Dark List Accent 3" w:semiHidden="0" w:uiPriority="70" w:unhideWhenUsed="0"/>
+    <w:lsdException w:name="Colorful Shading Accent 3" w:semiHidden="0" w:uiPriority="71" w:unhideWhenUsed="0"/>
+    <w:lsdException w:name="Colorful List Accent 3" w:semiHidden="0" w:uiPriority="72" w:unhideWhenUsed="0"/>
+    <w:lsdException w:name="Colorful Grid Accent 3" w:semiHidden="0" w:uiPriority="73" w:unhideWhenUsed="0"/>
+    <w:lsdException w:name="Light Shading Accent 4" w:semiHidden="0" w:uiPriority="60" w:unhideWhenUsed="0"/>
+    <w:lsdException w:name="Light List Accent 4" w:semiHidden="0" w:uiPriority="61" w:unhideWhenUsed="0"/>
+    <w:lsdException w:name="Light Grid Accent 4" w:semiHidden="0" w:uiPriority="62" w:unhideWhenUsed="0"/>
+    <w:lsdException w:name="Medium Shading 1 Accent 4" w:semiHidden="0" w:uiPriority="63" w:unhideWhenUsed="0"/>
+    <w:lsdException w:name="Medium Shading 2 Accent 4" w:semiHidden="0" w:uiPriority="64" w:unhideWhenUsed="0"/>
+    <w:lsdException w:name="Medium List 1 Accent 4" w:semiHidden="0" w:uiPriority="65" w:unhideWhenUsed="0"/>
+    <w:lsdException w:name="Medium List 2 Accent 4" w:semiHidden="0" w:uiPriority="66" w:unhideWhenUsed="0"/>
+    <w:lsdException w:name="Medium Grid 1 Accent 4" w:semiHidden="0" w:uiPriority="67" w:unhideWhenUsed="0"/>
+    <w:lsdException w:name="Medium Grid 2 Accent 4" w:semiHidden="0" w:uiPriority="68" w:unhideWhenUsed="0"/>
+    <w:lsdException w:name="Medium Grid 3 Accent 4" w:semiHidden="0" w:uiPriority="69" w:unhideWhenUsed="0"/>
+    <w:lsdException w:name="Dark List Accent 4" w:semiHidden="0" w:uiPriority="70" w:unhideWhenUsed="0"/>
+    <w:lsdException w:name="Colorful Shading Accent 4" w:semiHidden="0" w:uiPriority="71" w:unhideWhenUsed="0"/>
+    <w:lsdException w:name="Colorful List Accent 4" w:semiHidden="0" w:uiPriority="72" w:unhideWhenUsed="0"/>
+    <w:lsdException w:name="Colorful Grid Accent 4" w:semiHidden="0" w:uiPriority="73" w:unhideWhenUsed="0"/>
+    <w:lsdException w:name="Light Shading Accent 5" w:semiHidden="0" w:uiPriority="60" w:unhideWhenUsed="0"/>
+    <w:lsdException w:name="Light List Accent 5" w:semiHidden="0" w:uiPriority="61" w:unhideWhenUsed="0"/>
+    <w:lsdException w:name="Light Grid Accent 5" w:semiHidden="0" w:uiPriority="62" w:unhideWhenUsed="0"/>
+    <w:lsdException w:name="Medium Shading 1 Accent 5" w:semiHidden="0" w:uiPriority="63" w:unhideWhenUsed="0"/>
+    <w:lsdException w:name="Medium Shading 2 Accent 5" w:semiHidden="0" w:uiPriority="64" w:unhideWhenUsed="0"/>
+    <w:lsdException w:name="Medium List 1 Accent 5" w:semiHidden="0" w:uiPriority="65" w:unhideWhenUsed="0"/>
+    <w:lsdException w:name="Medium List 2 Accent 5" w:semiHidden="0" w:uiPriority="66" w:unhideWhenUsed="0"/>
+    <w:lsdException w:name="Medium Grid 1 Accent 5" w:semiHidden="0" w:uiPriority="67" w:unhideWhenUsed="0"/>
+    <w:lsdException w:name="Medium Grid 2 Accent 5" w:semiHidden="0" w:uiPriority="68" w:unhideWhenUsed="0"/>
+    <w:lsdException w:name="Medium Grid 3 Accent 5" w:semiHidden="0" w:uiPriority="69" w:unhideWhenUsed="0"/>
+    <w:lsdException w:name="Dark List Accent 5" w:semiHidden="0" w:uiPriority="70" w:unhideWhenUsed="0"/>
+    <w:lsdException w:name="Colorful Shading Accent 5" w:semiHidden="0" w:uiPriority="71" w:unhideWhenUsed="0"/>
+    <w:lsdException w:name="Colorful List Accent 5" w:semiHidden="0" w:uiPriority="72" w:unhideWhenUsed="0"/>
+    <w:lsdException w:name="Colorful Grid Accent 5" w:semiHidden="0" w:uiPriority="73" w:unhideWhenUsed="0"/>
+    <w:lsdException w:name="Light Shading Accent 6" w:semiHidden="0" w:uiPriority="60" w:unhideWhenUsed="0"/>
+    <w:lsdException w:name="Light List Accent 6" w:semiHidden="0" w:uiPriority="61" w:unhideWhenUsed="0"/>
+    <w:lsdException w:name="Light Grid Accent 6" w:semiHidden="0" w:uiPriority="62" w:unhideWhenUsed="0"/>
+    <w:lsdException w:name="Medium Shading 1 Accent 6" w:semiHidden="0" w:uiPriority="63" w:unhideWhenUsed="0"/>
+    <w:lsdException w:name="Medium Shading 2 Accent 6" w:semiHidden="0" w:uiPriority="64" w:unhideWhenUsed="0"/>
+    <w:lsdException w:name="Medium List 1 Accent 6" w:semiHidden="0" w:uiPriority="65" w:unhideWhenUsed="0"/>
+    <w:lsdException w:name="Medium List 2 Accent 6" w:semiHidden="0" w:uiPriority="66" w:unhideWhenUsed="0"/>
+    <w:lsdException w:name="Medium Grid 1 Accent 6" w:semiHidden="0" w:uiPriority="67" w:unhideWhenUsed="0"/>
+    <w:lsdException w:name="Medium Grid 2 Accent 6" w:semiHidden="0" w:uiPriority="68" w:unhideWhenUsed="0"/>
+    <w:lsdException w:name="Medium Grid 3 Accent 6" w:semiHidden="0" w:uiPriority="69" w:unhideWhenUsed="0"/>
+    <w:lsdException w:name="Dark List Accent 6" w:semiHidden="0" w:uiPriority="70" w:unhideWhenUsed="0"/>
+    <w:lsdException w:name="Colorful Shading Accent 6" w:semiHidden="0" w:uiPriority="71" w:unhideWhenUsed="0"/>
+    <w:lsdException w:name="Colorful List Accent 6" w:semiHidden="0" w:uiPriority="72" w:unhideWhenUsed="0"/>
+    <w:lsdException w:name="Colorful Grid Accent 6" w:semiHidden="0" w:uiPriority="73" w:unhideWhenUsed="0"/>
+    <w:lsdException w:name="Subtle Emphasis" w:semiHidden="0" w:uiPriority="19" w:unhideWhenUsed="0" w:qFormat="1"/>
+    <w:lsdException w:name="Intense Emphasis" w:semiHidden="0" w:uiPriority="21" w:unhideWhenUsed="0" w:qFormat="1"/>
+    <w:lsdException w:name="Subtle Reference" w:semiHidden="0" w:uiPriority="31" w:unhideWhenUsed="0" w:qFormat="1"/>
+    <w:lsdException w:name="Intense Reference" w:semiHidden="0" w:uiPriority="32" w:unhideWhenUsed="0" w:qFormat="1"/>
+    <w:lsdException w:name="Book Title" w:semiHidden="0" w:uiPriority="33" w:unhideWhenUsed="0" w:qFormat="1"/>
+    <w:lsdException w:name="Bibliography" w:uiPriority="37"/>
+    <w:lsdException w:name="TOC Heading" w:uiPriority="39" w:qFormat="1"/>
+  </w:latentStyles>
+  <w:style w:type="paragraph" w:default="1" w:styleId="Normal">
+    <w:name w:val="Normal"/>
+    <w:qFormat/>
+    <w:rsid w:val="000F4FEF"/>
+    <w:pPr>
+      <w:spacing w:before="-1" w:after="-1" w:line="240" w:lineRule="auto"/>
+    </w:pPr>
+    <w:rPr>
+      <w:rFonts w:ascii="Arial" w:hAnsi="Arial" w:cs="Arial"/>
+    </w:rPr>
+  </w:style>
+  <w:style w:type="paragraph" w:styleId="Heading1">
+    <w:name w:val="heading 1"/>
+    <w:basedOn w:val="Normal"/>
+    <w:link w:val="Heading1Char"/>
+    <w:uiPriority w:val="9"/>
+    <w:qFormat/>
+    <w:rsid w:val="000F4FEF"/>
+    <w:pPr>
+      <w:pBdr>
+        <w:bottom w:val="single" w:sz="4" w:space="1" w:color="A6A6A6" w:themeColor="background1" w:themeShade="A6"/>
+      </w:pBdr>
+      <w:spacing w:before="0" w:beforeAutospacing="0" w:after="100" w:line="276" w:lineRule="auto"/>
+      <w:outlineLvl w:val="0"/>
+    </w:pPr>
+    <w:rPr>
+      <w:rFonts w:ascii="Helvetica" w:hAnsi="Helvetica" w:cs="Helvetica"/>
+      <w:color w:val="0A2A78"/>
+      <w:spacing w:val="-4"/>
+      <w:sz w:val="40"/>
+      <w:szCs w:val="24"/>
+    </w:rPr>
+  </w:style>
+  <w:style w:type="paragraph" w:styleId="Heading2">
+    <w:name w:val="heading 2"/>
+    <w:basedOn w:val="Normal"/>
+    <w:next w:val="Normal"/>
+    <w:link w:val="Heading2Char"/>
+    <w:uiPriority w:val="9"/>
+    <w:unhideWhenUsed/>
+    <w:qFormat/>
+    <w:rsid w:val="000F4FEF"/>
+    <w:pPr>
+      <w:widowControl w:val="0"/>
+      <w:autoSpaceDE w:val="0"/>
+      <w:autoSpaceDN w:val="0"/>
+      <w:spacing w:before="0" w:beforeAutospacing="0" w:after="0" w:afterAutospacing="0" w:line="276" w:lineRule="auto"/>
+      <w:outlineLvl w:val="1"/>
+    </w:pPr>
+    <w:rPr>
+      <w:rFonts w:ascii="Helvetica" w:eastAsiaTheme="minorHAnsi" w:hAnsi="Helvetica" w:cs="Helvetica"/>
+      <w:color w:val="0A2A78"/>
+      <w:spacing w:val="-2"/>
+      <w:sz w:val="36"/>
+      <w:szCs w:val="24"/>
+    </w:rPr>
+  </w:style>
+  <w:style w:type="paragraph" w:styleId="Heading3">
+    <w:name w:val="heading 3"/>
+    <w:basedOn w:val="Heading2"/>
+    <w:next w:val="Body"/>
+    <w:link w:val="Heading3Char"/>
+    <w:uiPriority w:val="9"/>
+    <w:unhideWhenUsed/>
+    <w:qFormat/>
+    <w:rsid w:val="000F4FEF"/>
+    <w:pPr>
+      <w:outlineLvl w:val="2"/>
+    </w:pPr>
+    <w:rPr>
+      <w:sz w:val="32"/>
+    </w:rPr>
+  </w:style>
+  <w:style w:type="paragraph" w:styleId="Heading4">
+    <w:name w:val="heading 4"/>
+    <w:basedOn w:val="Normal"/>
+    <w:next w:val="Normal"/>
+    <w:link w:val="Heading4Char"/>
+    <w:uiPriority w:val="9"/>
+    <w:unhideWhenUsed/>
+    <w:qFormat/>
+    <w:rsid w:val="000F4FEF"/>
+    <w:pPr>
+      <w:widowControl w:val="0"/>
+      <w:autoSpaceDE w:val="0"/>
+      <w:autoSpaceDN w:val="0"/>
+      <w:spacing w:before="54" w:beforeAutospacing="0" w:after="120" w:afterAutospacing="0" w:line="276" w:lineRule="auto"/>
+      <w:ind w:left="360"/>
+      <w:outlineLvl w:val="3"/>
+    </w:pPr>
+    <w:rPr>
+      <w:rFonts w:ascii="Helvetica" w:eastAsiaTheme="minorHAnsi" w:hAnsi="Helvetica" w:cs="Helvetica"/>
+      <w:iCs/>
+      <w:color w:val="0A2A78"/>
+      <w:spacing w:val="-2"/>
+      <w:sz w:val="24"/>
+      <w:szCs w:val="24"/>
+    </w:rPr>
+  </w:style>
+  <w:style w:type="paragraph" w:styleId="Heading5">
+    <w:name w:val="heading 5"/>
+    <w:basedOn w:val="Normal"/>
+    <w:next w:val="Normal"/>
+    <w:link w:val="Heading5Char"/>
+    <w:uiPriority w:val="9"/>
+    <w:unhideWhenUsed/>
+    <w:qFormat/>
+    <w:rsid w:val="000F4FEF"/>
+    <w:pPr>
+      <w:keepNext/>
+      <w:keepLines/>
+      <w:spacing w:before="240" w:after="80"/>
+      <w:outlineLvl w:val="4"/>
+    </w:pPr>
+    <w:rPr>
+      <w:color w:val="666666"/>
+    </w:rPr>
+  </w:style>
+  <w:style w:type="paragraph" w:styleId="Heading6">
+    <w:name w:val="heading 6"/>
+    <w:basedOn w:val="Normal"/>
+    <w:next w:val="Normal"/>
+    <w:link w:val="Heading6Char"/>
+    <w:uiPriority w:val="9"/>
+    <w:semiHidden/>
+    <w:unhideWhenUsed/>
+    <w:qFormat/>
+    <w:rsid w:val="000F4FEF"/>
+    <w:pPr>
+      <w:keepNext/>
+      <w:keepLines/>
+      <w:spacing w:before="240" w:after="80"/>
+      <w:outlineLvl w:val="5"/>
+    </w:pPr>
+    <w:rPr>
+      <w:i/>
+      <w:color w:val="666666"/>
+    </w:rPr>
+  </w:style>
+  <w:style w:type="character" w:default="1" w:styleId="DefaultParagraphFont">
+    <w:name w:val="Default Paragraph Font"/>
+    <w:uiPriority w:val="1"/>
+    <w:semiHidden/>
+    <w:unhideWhenUsed/>
+  </w:style>
+  <w:style w:type="table" w:default="1" w:styleId="TableNormal">
+    <w:name w:val="Normal Table"/>
+    <w:uiPriority w:val="99"/>
+    <w:semiHidden/>
+    <w:unhideWhenUsed/>
+    <w:tblPr>
+      <w:tblInd w:w="0" w:type="dxa"/>
+      <w:tblCellMar>
+        <w:top w:w="0" w:type="dxa"/>
+        <w:left w:w="108" w:type="dxa"/>
+        <w:bottom w:w="0" w:type="dxa"/>
+        <w:right w:w="108" w:type="dxa"/>
+      </w:tblCellMar>
+    </w:tblPr>
+  </w:style>
+  <w:style w:type="numbering" w:default="1" w:styleId="NoList">
+    <w:name w:val="No List"/>
+    <w:uiPriority w:val="99"/>
+    <w:semiHidden/>
+    <w:unhideWhenUsed/>
+  </w:style>
+  <w:style w:type="paragraph" w:customStyle="1" w:styleId="Code">
+    <w:name w:val="Code"/>
+    <w:basedOn w:val="Normal"/>
+    <w:qFormat/>
+    <w:rsid w:val="000F4FEF"/>
+    <w:rPr>
+      <w:rFonts w:ascii="Calibri" w:hAnsi="Calibri"/>
+    </w:rPr>
+  </w:style>
+  <w:style w:type="paragraph" w:customStyle="1" w:styleId="Body">
+    <w:name w:val="Body"/>
+    <w:basedOn w:val="Normal"/>
+    <w:link w:val="BodyChar"/>
+    <w:qFormat/>
+    <w:rsid w:val="000F4FEF"/>
+    <w:pPr>
+      <w:spacing w:before="0" w:beforeAutospacing="0" w:after="120" w:afterAutospacing="0" w:line="276" w:lineRule="auto"/>
+    </w:pPr>
+    <w:rPr>
+      <w:rFonts w:ascii="Helvetica" w:eastAsiaTheme="minorHAnsi" w:hAnsi="Helvetica" w:cs="Helvetica"/>
+      <w:sz w:val="24"/>
+      <w:szCs w:val="24"/>
+    </w:rPr>
+  </w:style>
+  <w:style w:type="character" w:customStyle="1" w:styleId="Heading1Char">
+    <w:name w:val="Heading 1 Char"/>
+    <w:basedOn w:val="DefaultParagraphFont"/>
+    <w:link w:val="Heading1"/>
+    <w:uiPriority w:val="9"/>
+    <w:rsid w:val="000F4FEF"/>
+    <w:rPr>
+      <w:rFonts w:ascii="Helvetica" w:hAnsi="Helvetica" w:cs="Helvetica"/>
+      <w:color w:val="0A2A78"/>
+      <w:spacing w:val="-4"/>
+      <w:sz w:val="40"/>
+      <w:szCs w:val="24"/>
+    </w:rPr>
+  </w:style>
+  <w:style w:type="paragraph" w:styleId="ListParagraph">
+    <w:name w:val="List Paragraph"/>
+    <w:basedOn w:val="BodyText"/>
+    <w:uiPriority w:val="34"/>
+    <w:qFormat/>
+    <w:rsid w:val="000F4FEF"/>
+    <w:pPr>
+      <w:widowControl w:val="0"/>
+      <w:numPr>
+        <w:numId w:val="35"/>
+      </w:numPr>
+      <w:autoSpaceDE w:val="0"/>
+      <w:autoSpaceDN w:val="0"/>
+      <w:spacing w:before="54" w:beforeAutospacing="0" w:afterAutospacing="0" w:line="276" w:lineRule="auto"/>
+    </w:pPr>
+    <w:rPr>
+      <w:rFonts w:ascii="Helvetica" w:eastAsiaTheme="minorHAnsi" w:hAnsi="Helvetica" w:cs="Helvetica"/>
+      <w:color w:val="202529"/>
+      <w:spacing w:val="-2"/>
+      <w:sz w:val="24"/>
+      <w:szCs w:val="24"/>
+    </w:rPr>
+  </w:style>
+  <w:style w:type="paragraph" w:customStyle="1" w:styleId="TFVariable">
+    <w:name w:val="TF Variable"/>
+    <w:basedOn w:val="Heading3"/>
+    <w:next w:val="Body"/>
+    <w:qFormat/>
+    <w:rsid w:val="000F4FEF"/>
+    <w:pPr>
+      <w:numPr>
+        <w:numId w:val="38"/>
+      </w:numPr>
+    </w:pPr>
+  </w:style>
+  <w:style w:type="character" w:customStyle="1" w:styleId="Heading3Char">
+    <w:name w:val="Heading 3 Char"/>
+    <w:basedOn w:val="DefaultParagraphFont"/>
+    <w:link w:val="Heading3"/>
+    <w:uiPriority w:val="9"/>
+    <w:qFormat/>
+    <w:rsid w:val="000F4FEF"/>
+    <w:rPr>
+      <w:rFonts w:ascii="Helvetica" w:eastAsiaTheme="minorHAnsi" w:hAnsi="Helvetica" w:cs="Helvetica"/>
+      <w:color w:val="0A2A78"/>
+      <w:spacing w:val="-2"/>
+      <w:sz w:val="32"/>
+      <w:szCs w:val="24"/>
+    </w:rPr>
+  </w:style>
+  <w:style w:type="paragraph" w:customStyle="1" w:styleId="interviewcondition">
+    <w:name w:val="interview condition"/>
+    <w:basedOn w:val="Normal"/>
+    <w:link w:val="interviewconditionChar"/>
+    <w:qFormat/>
+    <w:rsid w:val="00F44633"/>
+    <w:pPr>
+      <w:spacing w:after="60" w:line="360" w:lineRule="auto"/>
+    </w:pPr>
+    <w:rPr>
+      <w:rFonts w:asciiTheme="minorHAnsi" w:hAnsiTheme="minorHAnsi" w:cstheme="minorBidi"/>
+      <w:color w:val="00B050"/>
+      <w:u w:val="single"/>
+    </w:rPr>
+  </w:style>
+  <w:style w:type="character" w:customStyle="1" w:styleId="interviewconditionChar">
+    <w:name w:val="interview condition Char"/>
+    <w:basedOn w:val="DefaultParagraphFont"/>
+    <w:link w:val="interviewcondition"/>
+    <w:rsid w:val="00F44633"/>
+    <w:rPr>
+      <w:color w:val="00B050"/>
+      <w:u w:val="single"/>
+    </w:rPr>
+  </w:style>
+  <w:style w:type="paragraph" w:customStyle="1" w:styleId="interviewbutton">
+    <w:name w:val="interview button"/>
+    <w:basedOn w:val="Normal"/>
+    <w:next w:val="Normal"/>
+    <w:link w:val="interviewbuttonChar"/>
+    <w:qFormat/>
+    <w:rsid w:val="000F4FEF"/>
+    <w:pPr>
+      <w:shd w:val="clear" w:color="auto" w:fill="0070C0"/>
+      <w:spacing w:after="60" w:line="360" w:lineRule="auto"/>
+    </w:pPr>
+    <w:rPr>
+      <w:rFonts w:asciiTheme="minorHAnsi" w:hAnsiTheme="minorHAnsi" w:cstheme="minorBidi"/>
+      <w:color w:val="FFFFFF" w:themeColor="background1"/>
+      <w:szCs w:val="40"/>
+    </w:rPr>
+  </w:style>
+  <w:style w:type="character" w:customStyle="1" w:styleId="interviewbuttonChar">
+    <w:name w:val="interview button Char"/>
+    <w:basedOn w:val="DefaultParagraphFont"/>
+    <w:link w:val="interviewbutton"/>
+    <w:qFormat/>
+    <w:rsid w:val="000F4FEF"/>
+    <w:rPr>
+      <w:color w:val="FFFFFF" w:themeColor="background1"/>
+      <w:szCs w:val="40"/>
+      <w:shd w:val="clear" w:color="auto" w:fill="0070C0"/>
+    </w:rPr>
+  </w:style>
+  <w:style w:type="paragraph" w:styleId="BodyText">
+    <w:name w:val="Body Text"/>
+    <w:basedOn w:val="Normal"/>
+    <w:link w:val="BodyTextChar"/>
+    <w:uiPriority w:val="1"/>
+    <w:unhideWhenUsed/>
+    <w:qFormat/>
+    <w:rsid w:val="000F4FEF"/>
+    <w:pPr>
+      <w:spacing w:after="120"/>
+    </w:pPr>
+  </w:style>
+  <w:style w:type="character" w:customStyle="1" w:styleId="BodyTextChar">
+    <w:name w:val="Body Text Char"/>
+    <w:basedOn w:val="DefaultParagraphFont"/>
+    <w:link w:val="BodyText"/>
+    <w:uiPriority w:val="1"/>
+    <w:rsid w:val="000F4FEF"/>
+    <w:rPr>
+      <w:rFonts w:ascii="Arial" w:hAnsi="Arial" w:cs="Arial"/>
+    </w:rPr>
+  </w:style>
+  <w:style w:type="character" w:customStyle="1" w:styleId="interviewcondition2">
+    <w:name w:val="interview condition 2"/>
+    <w:basedOn w:val="Hyperlink"/>
+    <w:uiPriority w:val="1"/>
+    <w:qFormat/>
+    <w:rsid w:val="000F4FEF"/>
+    <w:rPr>
+      <w:rFonts w:ascii="Helvetica" w:eastAsia="Arial" w:hAnsi="Helvetica" w:cs="Helvetica"/>
+      <w:color w:val="009999"/>
+      <w:spacing w:val="-2"/>
+      <w:sz w:val="24"/>
+      <w:szCs w:val="24"/>
+      <w:u w:val="none"/>
+    </w:rPr>
+  </w:style>
+  <w:style w:type="character" w:styleId="Hyperlink">
+    <w:name w:val="Hyperlink"/>
+    <w:basedOn w:val="DefaultParagraphFont"/>
+    <w:uiPriority w:val="99"/>
+    <w:unhideWhenUsed/>
+    <w:rsid w:val="000F4FEF"/>
+    <w:rPr>
+      <w:rFonts w:ascii="Helvetica" w:hAnsi="Helvetica" w:cs="Helvetica"/>
+      <w:color w:val="0563C1" w:themeColor="hyperlink"/>
+      <w:spacing w:val="-2"/>
+      <w:sz w:val="24"/>
+      <w:szCs w:val="24"/>
+      <w:u w:val="none"/>
+    </w:rPr>
+  </w:style>
+  <w:style w:type="paragraph" w:customStyle="1" w:styleId="variable">
+    <w:name w:val="variable"/>
+    <w:basedOn w:val="Normal"/>
+    <w:qFormat/>
+    <w:rsid w:val="00B61CCF"/>
+    <w:pPr>
+      <w:spacing w:after="120" w:line="276" w:lineRule="auto"/>
+    </w:pPr>
+    <w:rPr>
+      <w:color w:val="FF7C80"/>
+      <w:shd w:val="clear" w:color="auto" w:fill="FFFFCC"/>
+      <w:lang w:val="en"/>
+    </w:rPr>
+  </w:style>
+  <w:style w:type="character" w:customStyle="1" w:styleId="Heading2Char">
+    <w:name w:val="Heading 2 Char"/>
+    <w:basedOn w:val="DefaultParagraphFont"/>
+    <w:link w:val="Heading2"/>
+    <w:uiPriority w:val="9"/>
+    <w:rsid w:val="000F4FEF"/>
+    <w:rPr>
+      <w:rFonts w:ascii="Helvetica" w:eastAsiaTheme="minorHAnsi" w:hAnsi="Helvetica" w:cs="Helvetica"/>
+      <w:color w:val="0A2A78"/>
+      <w:spacing w:val="-2"/>
+      <w:sz w:val="36"/>
+      <w:szCs w:val="24"/>
+    </w:rPr>
+  </w:style>
+  <w:style w:type="character" w:customStyle="1" w:styleId="Heading4Char">
+    <w:name w:val="Heading 4 Char"/>
+    <w:basedOn w:val="DefaultParagraphFont"/>
+    <w:link w:val="Heading4"/>
+    <w:uiPriority w:val="9"/>
+    <w:qFormat/>
+    <w:rsid w:val="000F4FEF"/>
+    <w:rPr>
+      <w:rFonts w:ascii="Helvetica" w:eastAsiaTheme="minorHAnsi" w:hAnsi="Helvetica" w:cs="Helvetica"/>
+      <w:iCs/>
+      <w:color w:val="0A2A78"/>
+      <w:spacing w:val="-2"/>
+      <w:sz w:val="24"/>
+      <w:szCs w:val="24"/>
+    </w:rPr>
+  </w:style>
+  <w:style w:type="paragraph" w:customStyle="1" w:styleId="Example">
+    <w:name w:val="Example"/>
+    <w:basedOn w:val="Heading4"/>
+    <w:next w:val="Normal"/>
+    <w:qFormat/>
+    <w:rsid w:val="000F4FEF"/>
+  </w:style>
+  <w:style w:type="paragraph" w:customStyle="1" w:styleId="Exampleparagraph">
+    <w:name w:val="Example paragraph"/>
+    <w:basedOn w:val="Body"/>
+    <w:next w:val="Body"/>
+    <w:qFormat/>
+    <w:rsid w:val="00CA58DD"/>
+    <w:pPr>
+      <w:ind w:left="416"/>
+    </w:pPr>
+    <w:rPr>
+      <w:color w:val="202529"/>
+      <w:spacing w:val="-2"/>
+    </w:rPr>
+  </w:style>
+  <w:style w:type="paragraph" w:customStyle="1" w:styleId="ListParagraphNumbered">
+    <w:name w:val="List Paragraph Numbered"/>
+    <w:basedOn w:val="ListParagraph"/>
+    <w:qFormat/>
+    <w:rsid w:val="000F4FEF"/>
+    <w:pPr>
+      <w:numPr>
+        <w:numId w:val="36"/>
+      </w:numPr>
+    </w:pPr>
+    <w:rPr>
+      <w:b/>
+    </w:rPr>
+  </w:style>
+  <w:style w:type="paragraph" w:customStyle="1" w:styleId="ExampleorImportantblock">
+    <w:name w:val="Example or Important block"/>
+    <w:basedOn w:val="Body"/>
+    <w:qFormat/>
+    <w:rsid w:val="000F4FEF"/>
+    <w:pPr>
+      <w:widowControl w:val="0"/>
+      <w:suppressAutoHyphens/>
+      <w:ind w:left="403"/>
+    </w:pPr>
+    <w:rPr>
+      <w:color w:val="202529"/>
+      <w:spacing w:val="-2"/>
+    </w:rPr>
+  </w:style>
+  <w:style w:type="paragraph" w:customStyle="1" w:styleId="Listnumbered">
+    <w:name w:val="List numbered"/>
+    <w:basedOn w:val="Normal"/>
+    <w:qFormat/>
+    <w:rsid w:val="000F4FEF"/>
+    <w:pPr>
+      <w:widowControl w:val="0"/>
+      <w:autoSpaceDE w:val="0"/>
+      <w:autoSpaceDN w:val="0"/>
+      <w:spacing w:before="54" w:beforeAutospacing="0" w:after="120" w:afterAutospacing="0" w:line="276" w:lineRule="auto"/>
+    </w:pPr>
+    <w:rPr>
+      <w:rFonts w:ascii="Helvetica" w:eastAsiaTheme="minorHAnsi" w:hAnsi="Helvetica" w:cs="Helvetica"/>
+      <w:color w:val="202529"/>
+      <w:spacing w:val="-2"/>
+      <w:sz w:val="24"/>
+      <w:szCs w:val="24"/>
+    </w:rPr>
+  </w:style>
+  <w:style w:type="character" w:customStyle="1" w:styleId="Helptextinquestionmark">
+    <w:name w:val="Help text in question mark"/>
+    <w:basedOn w:val="DefaultParagraphFont"/>
+    <w:uiPriority w:val="1"/>
+    <w:qFormat/>
+    <w:rsid w:val="000F4FEF"/>
+    <w:rPr>
+      <w:rFonts w:ascii="Tahoma" w:hAnsi="Tahoma" w:cs="Tahoma"/>
+      <w:color w:val="FFFFFF" w:themeColor="background1"/>
+      <w:szCs w:val="24"/>
+      <w:shd w:val="clear" w:color="auto" w:fill="33CCFF"/>
+    </w:rPr>
+  </w:style>
+  <w:style w:type="character" w:customStyle="1" w:styleId="interviewtextbox">
+    <w:name w:val="interview text box"/>
+    <w:basedOn w:val="DefaultParagraphFont"/>
+    <w:uiPriority w:val="1"/>
+    <w:qFormat/>
+    <w:rsid w:val="000F4FEF"/>
+    <w:rPr>
+      <w:shd w:val="clear" w:color="auto" w:fill="D9D9D9" w:themeFill="background1" w:themeFillShade="D9"/>
+    </w:rPr>
+  </w:style>
+  <w:style w:type="character" w:customStyle="1" w:styleId="interviewhelpquestionmark">
+    <w:name w:val="interview help question mark"/>
+    <w:basedOn w:val="DefaultParagraphFont"/>
+    <w:uiPriority w:val="1"/>
+    <w:qFormat/>
+    <w:rsid w:val="000F4FEF"/>
+    <w:rPr>
+      <w:color w:val="FFFFFF" w:themeColor="background1"/>
+      <w:shd w:val="clear" w:color="auto" w:fill="9CC2E5" w:themeFill="accent5" w:themeFillTint="99"/>
+    </w:rPr>
+  </w:style>
+  <w:style w:type="paragraph" w:customStyle="1" w:styleId="ListPlevel2">
+    <w:name w:val="List P level 2"/>
+    <w:basedOn w:val="ListParagraph"/>
+    <w:qFormat/>
+    <w:rsid w:val="000F4FEF"/>
+    <w:pPr>
+      <w:ind w:left="765"/>
+    </w:pPr>
+    <w:rPr>
+      <w:color w:val="auto"/>
+      <w:spacing w:val="0"/>
+    </w:rPr>
+  </w:style>
+  <w:style w:type="paragraph" w:customStyle="1" w:styleId="ListPlevel3">
+    <w:name w:val="List P level 3"/>
+    <w:basedOn w:val="ListPlevel2"/>
+    <w:qFormat/>
+    <w:rsid w:val="000F4FEF"/>
+    <w:pPr>
+      <w:tabs>
+        <w:tab w:val="num" w:pos="360"/>
+      </w:tabs>
+      <w:ind w:left="2160"/>
+    </w:pPr>
+  </w:style>
+  <w:style w:type="paragraph" w:customStyle="1" w:styleId="ListParagraphNumberedBold">
+    <w:name w:val="List Paragraph Numbered (Bold)"/>
+    <w:basedOn w:val="ListParagraphNumbered"/>
+    <w:qFormat/>
+    <w:rsid w:val="00AA522D"/>
+    <w:pPr>
+      <w:ind w:left="405"/>
+    </w:pPr>
+    <w:rPr>
+      <w:color w:val="auto"/>
+      <w:spacing w:val="0"/>
+    </w:rPr>
+  </w:style>
+  <w:style w:type="paragraph" w:styleId="Footer">
+    <w:name w:val="footer"/>
+    <w:basedOn w:val="Normal"/>
+    <w:link w:val="FooterChar"/>
+    <w:uiPriority w:val="99"/>
+    <w:unhideWhenUsed/>
+    <w:rsid w:val="000F4FEF"/>
+    <w:pPr>
+      <w:tabs>
+        <w:tab w:val="center" w:pos="4680"/>
+        <w:tab w:val="right" w:pos="9360"/>
+      </w:tabs>
+    </w:pPr>
+  </w:style>
+  <w:style w:type="character" w:customStyle="1" w:styleId="FooterChar">
+    <w:name w:val="Footer Char"/>
+    <w:basedOn w:val="DefaultParagraphFont"/>
+    <w:link w:val="Footer"/>
+    <w:uiPriority w:val="99"/>
+    <w:qFormat/>
+    <w:rsid w:val="000F4FEF"/>
+    <w:rPr>
+      <w:rFonts w:ascii="Arial" w:hAnsi="Arial" w:cs="Arial"/>
+    </w:rPr>
+  </w:style>
+  <w:style w:type="paragraph" w:customStyle="1" w:styleId="FooterRight">
+    <w:name w:val="Footer Right"/>
+    <w:basedOn w:val="Footer"/>
+    <w:qFormat/>
+    <w:rsid w:val="00FA6057"/>
+    <w:pPr>
+      <w:jc w:val="right"/>
+    </w:pPr>
+  </w:style>
+  <w:style w:type="paragraph" w:customStyle="1" w:styleId="interviewsituationpara">
+    <w:name w:val="interview situation para"/>
+    <w:basedOn w:val="Body"/>
+    <w:next w:val="interviewsituationcondition"/>
+    <w:link w:val="interviewsituationparaChar"/>
+    <w:qFormat/>
+    <w:rsid w:val="00DD3DDA"/>
+    <w:pPr>
+      <w:spacing w:before="120" w:after="0" w:line="240" w:lineRule="auto"/>
+      <w:contextualSpacing/>
+    </w:pPr>
+  </w:style>
+  <w:style w:type="character" w:customStyle="1" w:styleId="interviewsituationparaChar">
+    <w:name w:val="interview situation para Char"/>
+    <w:basedOn w:val="BodyChar"/>
+    <w:link w:val="interviewsituationpara"/>
+    <w:rsid w:val="00DD3DDA"/>
+    <w:rPr>
+      <w:rFonts w:ascii="Helvetica" w:eastAsiaTheme="minorHAnsi" w:hAnsi="Helvetica" w:cs="Helvetica"/>
+      <w:sz w:val="24"/>
+      <w:szCs w:val="24"/>
+    </w:rPr>
+  </w:style>
+  <w:style w:type="paragraph" w:customStyle="1" w:styleId="Done">
+    <w:name w:val="Done"/>
+    <w:basedOn w:val="ListParagraph"/>
+    <w:qFormat/>
+    <w:rsid w:val="00DD3DDA"/>
+    <w:pPr>
+      <w:numPr>
+        <w:ilvl w:val="1"/>
+        <w:numId w:val="19"/>
+      </w:numPr>
+    </w:pPr>
+  </w:style>
+  <w:style w:type="character" w:customStyle="1" w:styleId="subject">
+    <w:name w:val="subject"/>
+    <w:basedOn w:val="DefaultParagraphFont"/>
+    <w:rsid w:val="000F4FEF"/>
+  </w:style>
+  <w:style w:type="character" w:customStyle="1" w:styleId="convention">
+    <w:name w:val="convention"/>
+    <w:basedOn w:val="DefaultParagraphFont"/>
+    <w:uiPriority w:val="1"/>
+    <w:qFormat/>
+    <w:rsid w:val="000F4FEF"/>
+    <w:rPr>
+      <w:sz w:val="22"/>
+      <w:szCs w:val="22"/>
+      <w:shd w:val="clear" w:color="auto" w:fill="A6A6A6" w:themeFill="background1" w:themeFillShade="A6"/>
+    </w:rPr>
+  </w:style>
+  <w:style w:type="paragraph" w:customStyle="1" w:styleId="Default">
+    <w:name w:val="Default"/>
+    <w:rsid w:val="000F4FEF"/>
+    <w:pPr>
+      <w:autoSpaceDE w:val="0"/>
+      <w:autoSpaceDN w:val="0"/>
+      <w:adjustRightInd w:val="0"/>
+      <w:spacing w:beforeAutospacing="0" w:after="0" w:afterAutospacing="0" w:line="240" w:lineRule="auto"/>
+    </w:pPr>
+    <w:rPr>
+      <w:rFonts w:ascii="Arial" w:eastAsiaTheme="minorHAnsi" w:hAnsi="Arial" w:cs="Arial"/>
+      <w:color w:val="000000"/>
+      <w:sz w:val="24"/>
+      <w:szCs w:val="24"/>
+    </w:rPr>
+  </w:style>
+  <w:style w:type="paragraph" w:customStyle="1" w:styleId="Example-bulleted">
+    <w:name w:val="Example - bulleted"/>
+    <w:basedOn w:val="Body"/>
+    <w:qFormat/>
+    <w:rsid w:val="000F4FEF"/>
+    <w:pPr>
+      <w:widowControl w:val="0"/>
+      <w:numPr>
+        <w:numId w:val="28"/>
+      </w:numPr>
+      <w:suppressAutoHyphens/>
+      <w:autoSpaceDE w:val="0"/>
+      <w:autoSpaceDN w:val="0"/>
+      <w:spacing w:before="60"/>
+    </w:pPr>
+    <w:rPr>
+      <w:rFonts w:eastAsia="Calibri"/>
+    </w:rPr>
+  </w:style>
+  <w:style w:type="character" w:customStyle="1" w:styleId="f1-light">
+    <w:name w:val="f1-light"/>
+    <w:basedOn w:val="DefaultParagraphFont"/>
+    <w:rsid w:val="000F4FEF"/>
+  </w:style>
+  <w:style w:type="paragraph" w:customStyle="1" w:styleId="H3numberedfordirections">
+    <w:name w:val="H3 numbered for directions"/>
+    <w:basedOn w:val="Heading3"/>
+    <w:next w:val="Normal"/>
+    <w:qFormat/>
+    <w:rsid w:val="000F4FEF"/>
+    <w:pPr>
+      <w:numPr>
+        <w:numId w:val="29"/>
+      </w:numPr>
+      <w:outlineLvl w:val="9"/>
+    </w:pPr>
+  </w:style>
+  <w:style w:type="character" w:customStyle="1" w:styleId="Interviewbutton0">
+    <w:name w:val="Interview button"/>
+    <w:basedOn w:val="DefaultParagraphFont"/>
+    <w:uiPriority w:val="1"/>
+    <w:qFormat/>
+    <w:rsid w:val="000F4FEF"/>
+    <w:rPr>
+      <w:color w:val="FFFFFF" w:themeColor="background1"/>
+      <w:bdr w:val="none" w:sz="0" w:space="0" w:color="auto"/>
+      <w:shd w:val="clear" w:color="auto" w:fill="0B5ED8"/>
+    </w:rPr>
+  </w:style>
+  <w:style w:type="paragraph" w:customStyle="1" w:styleId="interviewbuttons">
+    <w:name w:val="interview buttons"/>
+    <w:basedOn w:val="Normal"/>
+    <w:qFormat/>
+    <w:rsid w:val="000F4FEF"/>
+    <w:pPr>
+      <w:pBdr>
+        <w:top w:val="single" w:sz="12" w:space="1" w:color="0070C0"/>
+        <w:left w:val="single" w:sz="12" w:space="4" w:color="0070C0"/>
+        <w:bottom w:val="single" w:sz="12" w:space="1" w:color="0070C0"/>
+        <w:right w:val="single" w:sz="12" w:space="4" w:color="0070C0"/>
+        <w:between w:val="single" w:sz="12" w:space="1" w:color="0070C0"/>
+        <w:bar w:val="single" w:sz="12" w:color="0070C0"/>
+      </w:pBdr>
+      <w:shd w:val="clear" w:color="auto" w:fill="FFFFFF"/>
+      <w:spacing w:after="0"/>
+      <w:ind w:left="-58" w:right="-216"/>
+    </w:pPr>
+    <w:rPr>
+      <w:sz w:val="21"/>
+      <w:szCs w:val="21"/>
+    </w:rPr>
+  </w:style>
+  <w:style w:type="paragraph" w:customStyle="1" w:styleId="interviewcheckboxes">
+    <w:name w:val="interview checkboxes"/>
+    <w:basedOn w:val="ListParagraph"/>
+    <w:qFormat/>
+    <w:rsid w:val="000F4FEF"/>
+    <w:pPr>
+      <w:numPr>
+        <w:numId w:val="31"/>
+      </w:numPr>
+      <w:pBdr>
+        <w:top w:val="single" w:sz="12" w:space="1" w:color="0070C0"/>
+        <w:left w:val="single" w:sz="12" w:space="4" w:color="0070C0"/>
+        <w:bottom w:val="single" w:sz="12" w:space="1" w:color="0070C0"/>
+        <w:right w:val="single" w:sz="12" w:space="4" w:color="0070C0"/>
+        <w:between w:val="single" w:sz="12" w:space="1" w:color="0070C0"/>
+        <w:bar w:val="single" w:sz="12" w:color="0070C0"/>
+      </w:pBdr>
+    </w:pPr>
+  </w:style>
+  <w:style w:type="character" w:customStyle="1" w:styleId="interviewclickformoreinfo-definition">
+    <w:name w:val="interview click for more info - definition"/>
+    <w:uiPriority w:val="1"/>
+    <w:qFormat/>
+    <w:rsid w:val="000F4FEF"/>
+    <w:rPr>
+      <w:color w:val="00B050"/>
+      <w:u w:val="dash" w:color="92D050"/>
+    </w:rPr>
+  </w:style>
+  <w:style w:type="character" w:customStyle="1" w:styleId="InterviewCommentText">
+    <w:name w:val="Interview Comment Text"/>
+    <w:basedOn w:val="BodyTextChar"/>
+    <w:uiPriority w:val="1"/>
+    <w:qFormat/>
+    <w:rsid w:val="000F4FEF"/>
+    <w:rPr>
+      <w:rFonts w:ascii="Helvetica" w:eastAsia="Arial" w:hAnsi="Helvetica" w:cs="Helvetica"/>
+      <w:color w:val="7030A0"/>
+      <w:spacing w:val="-2"/>
+      <w:sz w:val="24"/>
+      <w:szCs w:val="24"/>
+    </w:rPr>
+  </w:style>
+  <w:style w:type="character" w:customStyle="1" w:styleId="interviewconvention">
+    <w:name w:val="interview convention"/>
+    <w:basedOn w:val="DefaultParagraphFont"/>
+    <w:uiPriority w:val="1"/>
+    <w:qFormat/>
+    <w:rsid w:val="000F4FEF"/>
+    <w:rPr>
+      <w:sz w:val="22"/>
+      <w:szCs w:val="22"/>
+      <w:shd w:val="clear" w:color="auto" w:fill="A6A6A6" w:themeFill="background1" w:themeFillShade="A6"/>
+    </w:rPr>
+  </w:style>
+  <w:style w:type="paragraph" w:customStyle="1" w:styleId="interviewglossarywordintemplate">
+    <w:name w:val="interview glossary word in template"/>
+    <w:basedOn w:val="Normal"/>
+    <w:link w:val="interviewglossarywordintemplateChar"/>
+    <w:qFormat/>
+    <w:rsid w:val="000F4FEF"/>
+    <w:pPr>
+      <w:spacing w:after="60" w:line="360" w:lineRule="auto"/>
+    </w:pPr>
+    <w:rPr>
+      <w:rFonts w:asciiTheme="minorHAnsi" w:hAnsiTheme="minorHAnsi" w:cstheme="minorBidi"/>
+    </w:rPr>
+  </w:style>
+  <w:style w:type="character" w:customStyle="1" w:styleId="interviewglossarywordintemplateChar">
+    <w:name w:val="interview glossary word in template Char"/>
+    <w:basedOn w:val="DefaultParagraphFont"/>
+    <w:link w:val="interviewglossarywordintemplate"/>
+    <w:rsid w:val="000F4FEF"/>
+  </w:style>
+  <w:style w:type="character" w:customStyle="1" w:styleId="interviewsituation">
+    <w:name w:val="interview situation"/>
+    <w:basedOn w:val="interviewneedstobewritten"/>
+    <w:uiPriority w:val="1"/>
+    <w:qFormat/>
+    <w:rsid w:val="00DD3DDA"/>
+    <w:rPr>
+      <w:shd w:val="clear" w:color="auto" w:fill="FFFF00"/>
+    </w:rPr>
+  </w:style>
+  <w:style w:type="character" w:customStyle="1" w:styleId="interviewneedstobewritten">
+    <w:name w:val="interview needs to be written"/>
+    <w:basedOn w:val="DefaultParagraphFont"/>
+    <w:uiPriority w:val="1"/>
+    <w:qFormat/>
+    <w:rsid w:val="000F4FEF"/>
+    <w:rPr>
+      <w:shd w:val="clear" w:color="auto" w:fill="FFFF00"/>
+    </w:rPr>
+  </w:style>
+  <w:style w:type="character" w:customStyle="1" w:styleId="interviewPAPtexttrigger">
+    <w:name w:val="interview PAP text trigger"/>
+    <w:basedOn w:val="DefaultParagraphFont"/>
+    <w:uiPriority w:val="1"/>
+    <w:qFormat/>
+    <w:rsid w:val="000F4FEF"/>
+    <w:rPr>
+      <w:shd w:val="clear" w:color="auto" w:fill="009999"/>
+    </w:rPr>
+  </w:style>
+  <w:style w:type="character" w:customStyle="1" w:styleId="interviewpdf">
+    <w:name w:val="interview pdf"/>
+    <w:basedOn w:val="DefaultParagraphFont"/>
+    <w:uiPriority w:val="1"/>
+    <w:qFormat/>
+    <w:rsid w:val="000F4FEF"/>
+    <w:rPr>
+      <w:b/>
+      <w:szCs w:val="24"/>
+      <w:shd w:val="clear" w:color="auto" w:fill="FF00FF"/>
+    </w:rPr>
+  </w:style>
+  <w:style w:type="paragraph" w:customStyle="1" w:styleId="interviewquestionid">
+    <w:name w:val="interview question id"/>
+    <w:basedOn w:val="BodyText"/>
+    <w:qFormat/>
+    <w:rsid w:val="000F4FEF"/>
+    <w:pPr>
+      <w:spacing w:before="240" w:after="0"/>
+    </w:pPr>
+    <w:rPr>
+      <w:color w:val="FF9F9F"/>
+    </w:rPr>
+  </w:style>
+  <w:style w:type="paragraph" w:customStyle="1" w:styleId="interviewradiobuttons">
+    <w:name w:val="interview radio buttons"/>
+    <w:basedOn w:val="ListParagraph"/>
+    <w:qFormat/>
+    <w:rsid w:val="000F4FEF"/>
+    <w:pPr>
+      <w:numPr>
+        <w:numId w:val="32"/>
+      </w:numPr>
+      <w:pBdr>
+        <w:top w:val="single" w:sz="12" w:space="1" w:color="0070C0"/>
+        <w:left w:val="single" w:sz="12" w:space="4" w:color="0070C0"/>
+        <w:bottom w:val="single" w:sz="12" w:space="1" w:color="0070C0"/>
+        <w:right w:val="single" w:sz="12" w:space="4" w:color="0070C0"/>
+        <w:between w:val="single" w:sz="12" w:space="1" w:color="0070C0"/>
+        <w:bar w:val="single" w:sz="12" w:color="0070C0"/>
+      </w:pBdr>
+      <w:shd w:val="clear" w:color="auto" w:fill="FFFFFF"/>
+      <w:spacing w:after="480" w:line="360" w:lineRule="auto"/>
+      <w:ind w:right="-220"/>
+    </w:pPr>
+    <w:rPr>
+      <w:szCs w:val="21"/>
+    </w:rPr>
+  </w:style>
+  <w:style w:type="character" w:customStyle="1" w:styleId="interviewvariable">
+    <w:name w:val="interview variable"/>
+    <w:basedOn w:val="DefaultParagraphFont"/>
+    <w:uiPriority w:val="1"/>
+    <w:qFormat/>
+    <w:rsid w:val="000F4FEF"/>
+    <w:rPr>
+      <w:color w:val="FF7C80"/>
+      <w:shd w:val="clear" w:color="auto" w:fill="FFFFCC"/>
+    </w:rPr>
+  </w:style>
+  <w:style w:type="paragraph" w:customStyle="1" w:styleId="Listnumberedunderbullet">
+    <w:name w:val="List numbered under bullet"/>
+    <w:basedOn w:val="Normal"/>
+    <w:qFormat/>
+    <w:rsid w:val="000F4FEF"/>
+    <w:pPr>
+      <w:widowControl w:val="0"/>
+      <w:numPr>
+        <w:ilvl w:val="4"/>
+        <w:numId w:val="33"/>
+      </w:numPr>
+      <w:autoSpaceDE w:val="0"/>
+      <w:autoSpaceDN w:val="0"/>
+      <w:spacing w:before="54" w:beforeAutospacing="0" w:after="120" w:afterAutospacing="0" w:line="276" w:lineRule="auto"/>
+    </w:pPr>
+    <w:rPr>
+      <w:rFonts w:ascii="Helvetica" w:eastAsiaTheme="minorHAnsi" w:hAnsi="Helvetica" w:cs="Helvetica"/>
+      <w:color w:val="202529"/>
+      <w:spacing w:val="-2"/>
+      <w:sz w:val="24"/>
+      <w:szCs w:val="24"/>
+    </w:rPr>
+  </w:style>
+  <w:style w:type="paragraph" w:customStyle="1" w:styleId="MLRIAdvocacyguideforPDFPart">
+    <w:name w:val="MLRI Advocacy guide for PDF Part"/>
+    <w:basedOn w:val="Normal"/>
+    <w:qFormat/>
+    <w:rsid w:val="000F4FEF"/>
+    <w:pPr>
+      <w:spacing w:before="480" w:after="80" w:line="320" w:lineRule="exact"/>
+      <w:ind w:left="187"/>
+    </w:pPr>
+    <w:rPr>
+      <w:rFonts w:ascii="Bookman Old Style" w:hAnsi="Bookman Old Style"/>
+      <w:color w:val="808080"/>
+      <w:szCs w:val="28"/>
+    </w:rPr>
+  </w:style>
+  <w:style w:type="character" w:customStyle="1" w:styleId="NumChar">
+    <w:name w:val="NumChar"/>
+    <w:basedOn w:val="DefaultParagraphFont"/>
+    <w:uiPriority w:val="1"/>
+    <w:qFormat/>
+    <w:rsid w:val="000F4FEF"/>
+    <w:rPr>
+      <w:rFonts w:eastAsiaTheme="minorHAnsi"/>
+    </w:rPr>
+  </w:style>
+  <w:style w:type="paragraph" w:customStyle="1" w:styleId="one-indent">
+    <w:name w:val="one-indent"/>
+    <w:basedOn w:val="Normal"/>
+    <w:rsid w:val="000F4FEF"/>
+    <w:pPr>
+      <w:spacing w:before="100" w:after="100"/>
+    </w:pPr>
+    <w:rPr>
+      <w:rFonts w:ascii="Times New Roman" w:eastAsia="Times New Roman" w:hAnsi="Times New Roman" w:cs="Times New Roman"/>
+      <w:sz w:val="24"/>
+      <w:szCs w:val="24"/>
+    </w:rPr>
+  </w:style>
+  <w:style w:type="character" w:customStyle="1" w:styleId="small">
+    <w:name w:val="small"/>
+    <w:basedOn w:val="DefaultParagraphFont"/>
+    <w:rsid w:val="000F4FEF"/>
+    <w:rPr>
+      <w:rFonts w:cs="Times New Roman"/>
+    </w:rPr>
+  </w:style>
+  <w:style w:type="paragraph" w:customStyle="1" w:styleId="StyleHeading1Hanging008">
+    <w:name w:val="Style Heading 1 + Hanging:  0.08&quot;"/>
+    <w:basedOn w:val="Heading1"/>
+    <w:qFormat/>
+    <w:rsid w:val="000F4FEF"/>
+    <w:pPr>
+      <w:spacing w:before="120"/>
+      <w:ind w:hanging="115"/>
+    </w:pPr>
+    <w:rPr>
+      <w:rFonts w:eastAsia="Times New Roman" w:cs="Times New Roman"/>
+      <w:szCs w:val="20"/>
+    </w:rPr>
+  </w:style>
+  <w:style w:type="numbering" w:customStyle="1" w:styleId="Style1">
+    <w:name w:val="Style1"/>
+    <w:uiPriority w:val="99"/>
+    <w:rsid w:val="000F4FEF"/>
+    <w:pPr>
+      <w:numPr>
+        <w:numId w:val="17"/>
+      </w:numPr>
+    </w:pPr>
+  </w:style>
+  <w:style w:type="paragraph" w:customStyle="1" w:styleId="TableParagraph">
+    <w:name w:val="Table Paragraph"/>
+    <w:basedOn w:val="Normal"/>
+    <w:uiPriority w:val="1"/>
+    <w:qFormat/>
+    <w:rsid w:val="000F4FEF"/>
+  </w:style>
+  <w:style w:type="character" w:customStyle="1" w:styleId="UnresolvedMention1">
+    <w:name w:val="Unresolved Mention1"/>
+    <w:basedOn w:val="DefaultParagraphFont"/>
+    <w:uiPriority w:val="99"/>
+    <w:semiHidden/>
+    <w:unhideWhenUsed/>
+    <w:rsid w:val="005E785C"/>
+    <w:rPr>
+      <w:color w:val="605E5C"/>
+      <w:shd w:val="clear" w:color="auto" w:fill="E1DFDD"/>
+    </w:rPr>
+  </w:style>
+  <w:style w:type="paragraph" w:customStyle="1" w:styleId="interviewsituationcondition">
+    <w:name w:val="interview situation condition"/>
+    <w:basedOn w:val="Heading1"/>
+    <w:next w:val="Heading2"/>
+    <w:qFormat/>
+    <w:rsid w:val="000F4FEF"/>
+    <w:pPr>
+      <w:keepNext/>
+      <w:keepLines/>
+      <w:pBdr>
+        <w:bottom w:val="none" w:sz="0" w:space="0" w:color="auto"/>
+      </w:pBdr>
+      <w:spacing w:after="60" w:afterAutospacing="0"/>
+    </w:pPr>
+    <w:rPr>
+      <w:rFonts w:asciiTheme="majorHAnsi" w:eastAsiaTheme="majorEastAsia" w:hAnsiTheme="majorHAnsi" w:cstheme="majorBidi"/>
+      <w:color w:val="FF0000"/>
+      <w:spacing w:val="0"/>
+      <w:sz w:val="24"/>
+      <w:szCs w:val="26"/>
+    </w:rPr>
+  </w:style>
+  <w:style w:type="paragraph" w:customStyle="1" w:styleId="heading">
+    <w:name w:val="heading"/>
+    <w:basedOn w:val="Normal"/>
+    <w:rsid w:val="00DD3DDA"/>
+    <w:pPr>
+      <w:spacing w:before="100" w:after="100"/>
+    </w:pPr>
+    <w:rPr>
+      <w:rFonts w:ascii="Times New Roman" w:eastAsia="Times New Roman" w:hAnsi="Times New Roman" w:cs="Times New Roman"/>
+      <w:sz w:val="24"/>
+      <w:szCs w:val="24"/>
+    </w:rPr>
+  </w:style>
+  <w:style w:type="character" w:customStyle="1" w:styleId="Interviewpinknote">
+    <w:name w:val="Interview pink note"/>
+    <w:basedOn w:val="BodyChar"/>
+    <w:uiPriority w:val="1"/>
+    <w:qFormat/>
+    <w:rsid w:val="00DD3DDA"/>
+    <w:rPr>
+      <w:rFonts w:ascii="Helvetica" w:eastAsiaTheme="minorHAnsi" w:hAnsi="Helvetica" w:cs="Tahoma"/>
+      <w:b w:val="0"/>
+      <w:bCs/>
+      <w:color w:val="FF99FF"/>
+      <w:sz w:val="24"/>
+      <w:szCs w:val="24"/>
+    </w:rPr>
+  </w:style>
+  <w:style w:type="paragraph" w:customStyle="1" w:styleId="interviewsituationp">
+    <w:name w:val="interview situation p"/>
+    <w:basedOn w:val="Body"/>
+    <w:next w:val="interviewsituationcondition"/>
+    <w:qFormat/>
+    <w:rsid w:val="00DD3DDA"/>
+    <w:pPr>
+      <w:spacing w:before="240" w:after="0" w:line="240" w:lineRule="auto"/>
+      <w:contextualSpacing/>
+    </w:pPr>
+  </w:style>
+  <w:style w:type="character" w:customStyle="1" w:styleId="Heading5Char">
+    <w:name w:val="Heading 5 Char"/>
+    <w:basedOn w:val="DefaultParagraphFont"/>
+    <w:link w:val="Heading5"/>
+    <w:uiPriority w:val="9"/>
+    <w:rsid w:val="000F4FEF"/>
+    <w:rPr>
+      <w:rFonts w:ascii="Arial" w:hAnsi="Arial" w:cs="Arial"/>
+      <w:color w:val="666666"/>
+    </w:rPr>
+  </w:style>
+  <w:style w:type="character" w:customStyle="1" w:styleId="Heading6Char">
+    <w:name w:val="Heading 6 Char"/>
+    <w:basedOn w:val="DefaultParagraphFont"/>
+    <w:link w:val="Heading6"/>
+    <w:uiPriority w:val="9"/>
+    <w:semiHidden/>
+    <w:rsid w:val="000F4FEF"/>
+    <w:rPr>
+      <w:rFonts w:ascii="Arial" w:hAnsi="Arial" w:cs="Arial"/>
+      <w:i/>
+      <w:color w:val="666666"/>
+    </w:rPr>
+  </w:style>
+  <w:style w:type="paragraph" w:styleId="TOC1">
+    <w:name w:val="toc 1"/>
+    <w:basedOn w:val="Normal"/>
+    <w:next w:val="Normal"/>
+    <w:autoRedefine/>
+    <w:uiPriority w:val="39"/>
+    <w:unhideWhenUsed/>
+    <w:rsid w:val="000F4FEF"/>
+    <w:pPr>
+      <w:spacing w:after="100"/>
+    </w:pPr>
+  </w:style>
+  <w:style w:type="paragraph" w:styleId="TOC2">
+    <w:name w:val="toc 2"/>
+    <w:basedOn w:val="Normal"/>
+    <w:next w:val="Normal"/>
+    <w:autoRedefine/>
+    <w:uiPriority w:val="39"/>
+    <w:unhideWhenUsed/>
+    <w:rsid w:val="000F4FEF"/>
+    <w:pPr>
+      <w:spacing w:after="100"/>
+      <w:ind w:left="240"/>
+    </w:pPr>
+  </w:style>
+  <w:style w:type="paragraph" w:styleId="TOC3">
+    <w:name w:val="toc 3"/>
+    <w:basedOn w:val="Normal"/>
+    <w:next w:val="Normal"/>
+    <w:autoRedefine/>
+    <w:uiPriority w:val="39"/>
+    <w:unhideWhenUsed/>
+    <w:rsid w:val="000F4FEF"/>
+    <w:pPr>
+      <w:spacing w:after="100"/>
+      <w:ind w:left="480"/>
+    </w:pPr>
+  </w:style>
+  <w:style w:type="paragraph" w:styleId="CommentText">
+    <w:name w:val="annotation text"/>
+    <w:basedOn w:val="Normal"/>
+    <w:link w:val="CommentTextChar"/>
+    <w:uiPriority w:val="99"/>
+    <w:unhideWhenUsed/>
+    <w:qFormat/>
+    <w:rsid w:val="000F4FEF"/>
+    <w:rPr>
+      <w:sz w:val="20"/>
+      <w:szCs w:val="20"/>
+    </w:rPr>
+  </w:style>
+  <w:style w:type="character" w:customStyle="1" w:styleId="CommentTextChar">
+    <w:name w:val="Comment Text Char"/>
+    <w:basedOn w:val="DefaultParagraphFont"/>
+    <w:link w:val="CommentText"/>
+    <w:uiPriority w:val="99"/>
+    <w:qFormat/>
+    <w:rsid w:val="000F4FEF"/>
+    <w:rPr>
+      <w:rFonts w:ascii="Arial" w:hAnsi="Arial" w:cs="Arial"/>
+      <w:sz w:val="20"/>
+      <w:szCs w:val="20"/>
+    </w:rPr>
+  </w:style>
+  <w:style w:type="paragraph" w:styleId="Header">
+    <w:name w:val="header"/>
+    <w:basedOn w:val="Normal"/>
+    <w:link w:val="HeaderChar"/>
+    <w:uiPriority w:val="99"/>
+    <w:unhideWhenUsed/>
+    <w:rsid w:val="000F4FEF"/>
+    <w:pPr>
+      <w:tabs>
+        <w:tab w:val="center" w:pos="4680"/>
+        <w:tab w:val="right" w:pos="9360"/>
+      </w:tabs>
+    </w:pPr>
+  </w:style>
+  <w:style w:type="character" w:customStyle="1" w:styleId="HeaderChar">
+    <w:name w:val="Header Char"/>
+    <w:basedOn w:val="DefaultParagraphFont"/>
+    <w:link w:val="Header"/>
+    <w:uiPriority w:val="99"/>
+    <w:rsid w:val="000F4FEF"/>
+    <w:rPr>
+      <w:rFonts w:ascii="Arial" w:hAnsi="Arial" w:cs="Arial"/>
+    </w:rPr>
+  </w:style>
+  <w:style w:type="character" w:styleId="CommentReference">
+    <w:name w:val="annotation reference"/>
+    <w:basedOn w:val="DefaultParagraphFont"/>
+    <w:uiPriority w:val="99"/>
+    <w:semiHidden/>
+    <w:unhideWhenUsed/>
+    <w:qFormat/>
+    <w:rsid w:val="000F4FEF"/>
+    <w:rPr>
+      <w:sz w:val="16"/>
+      <w:szCs w:val="16"/>
+    </w:rPr>
+  </w:style>
+  <w:style w:type="paragraph" w:styleId="Title">
+    <w:name w:val="Title"/>
+    <w:basedOn w:val="Normal"/>
+    <w:next w:val="Normal"/>
+    <w:link w:val="TitleChar"/>
+    <w:uiPriority w:val="10"/>
+    <w:qFormat/>
+    <w:rsid w:val="000F4FEF"/>
+    <w:pPr>
+      <w:spacing w:before="0" w:beforeAutospacing="0" w:after="100" w:line="276" w:lineRule="auto"/>
+    </w:pPr>
+    <w:rPr>
+      <w:rFonts w:ascii="Helvetica" w:hAnsi="Helvetica" w:cs="Helvetica"/>
+      <w:color w:val="0A2A78"/>
+      <w:spacing w:val="-2"/>
+      <w:sz w:val="48"/>
+      <w:szCs w:val="24"/>
+    </w:rPr>
+  </w:style>
+  <w:style w:type="character" w:customStyle="1" w:styleId="TitleChar">
+    <w:name w:val="Title Char"/>
+    <w:basedOn w:val="DefaultParagraphFont"/>
+    <w:link w:val="Title"/>
+    <w:uiPriority w:val="10"/>
+    <w:qFormat/>
+    <w:rsid w:val="000F4FEF"/>
+    <w:rPr>
+      <w:rFonts w:ascii="Helvetica" w:hAnsi="Helvetica" w:cs="Helvetica"/>
+      <w:color w:val="0A2A78"/>
+      <w:spacing w:val="-2"/>
+      <w:sz w:val="48"/>
+      <w:szCs w:val="24"/>
+    </w:rPr>
+  </w:style>
+  <w:style w:type="paragraph" w:styleId="Subtitle">
+    <w:name w:val="Subtitle"/>
+    <w:basedOn w:val="Normal"/>
+    <w:next w:val="Normal"/>
+    <w:link w:val="SubtitleChar"/>
+    <w:uiPriority w:val="11"/>
+    <w:qFormat/>
+    <w:rsid w:val="000F4FEF"/>
+    <w:pPr>
+      <w:keepNext/>
+      <w:keepLines/>
+      <w:spacing w:after="320"/>
+    </w:pPr>
+    <w:rPr>
+      <w:color w:val="666666"/>
+      <w:sz w:val="30"/>
+      <w:szCs w:val="30"/>
+    </w:rPr>
+  </w:style>
+  <w:style w:type="character" w:customStyle="1" w:styleId="SubtitleChar">
+    <w:name w:val="Subtitle Char"/>
+    <w:basedOn w:val="DefaultParagraphFont"/>
+    <w:link w:val="Subtitle"/>
+    <w:uiPriority w:val="11"/>
+    <w:rsid w:val="000F4FEF"/>
+    <w:rPr>
+      <w:rFonts w:ascii="Arial" w:hAnsi="Arial" w:cs="Arial"/>
+      <w:color w:val="666666"/>
+      <w:sz w:val="30"/>
+      <w:szCs w:val="30"/>
+    </w:rPr>
+  </w:style>
+  <w:style w:type="character" w:styleId="FollowedHyperlink">
+    <w:name w:val="FollowedHyperlink"/>
+    <w:basedOn w:val="DefaultParagraphFont"/>
+    <w:uiPriority w:val="99"/>
+    <w:semiHidden/>
+    <w:unhideWhenUsed/>
+    <w:rsid w:val="000F4FEF"/>
+    <w:rPr>
+      <w:color w:val="954F72" w:themeColor="followedHyperlink"/>
+      <w:u w:val="single"/>
+    </w:rPr>
+  </w:style>
+  <w:style w:type="character" w:styleId="Strong">
+    <w:name w:val="Strong"/>
+    <w:basedOn w:val="DefaultParagraphFont"/>
+    <w:uiPriority w:val="22"/>
+    <w:qFormat/>
+    <w:rsid w:val="000F4FEF"/>
+    <w:rPr>
+      <w:b/>
+      <w:bCs/>
+    </w:rPr>
+  </w:style>
+  <w:style w:type="character" w:styleId="Emphasis">
+    <w:name w:val="Emphasis"/>
+    <w:basedOn w:val="DefaultParagraphFont"/>
+    <w:uiPriority w:val="20"/>
+    <w:qFormat/>
+    <w:rsid w:val="000F4FEF"/>
+    <w:rPr>
+      <w:i/>
+      <w:iCs/>
+    </w:rPr>
+  </w:style>
+  <w:style w:type="paragraph" w:styleId="PlainText">
+    <w:name w:val="Plain Text"/>
+    <w:basedOn w:val="Normal"/>
+    <w:link w:val="PlainTextChar"/>
+    <w:uiPriority w:val="99"/>
+    <w:semiHidden/>
+    <w:unhideWhenUsed/>
+    <w:rsid w:val="00DD3DDA"/>
+    <w:pPr>
+      <w:spacing w:after="0"/>
+    </w:pPr>
+    <w:rPr>
+      <w:sz w:val="24"/>
+      <w:szCs w:val="21"/>
+    </w:rPr>
+  </w:style>
+  <w:style w:type="character" w:customStyle="1" w:styleId="PlainTextChar">
+    <w:name w:val="Plain Text Char"/>
+    <w:basedOn w:val="DefaultParagraphFont"/>
+    <w:link w:val="PlainText"/>
+    <w:uiPriority w:val="99"/>
+    <w:semiHidden/>
+    <w:rsid w:val="00DD3DDA"/>
+    <w:rPr>
+      <w:rFonts w:ascii="Arial" w:hAnsi="Arial" w:cs="Arial"/>
+      <w:sz w:val="24"/>
+      <w:szCs w:val="21"/>
+    </w:rPr>
+  </w:style>
+  <w:style w:type="paragraph" w:styleId="NormalWeb">
+    <w:name w:val="Normal (Web)"/>
+    <w:basedOn w:val="Normal"/>
+    <w:uiPriority w:val="99"/>
+    <w:unhideWhenUsed/>
+    <w:rsid w:val="000F4FEF"/>
+    <w:pPr>
+      <w:spacing w:before="100" w:after="100"/>
+    </w:pPr>
+    <w:rPr>
+      <w:rFonts w:ascii="Times New Roman" w:eastAsia="Times New Roman" w:hAnsi="Times New Roman" w:cs="Times New Roman"/>
+      <w:sz w:val="24"/>
+      <w:szCs w:val="24"/>
+    </w:rPr>
+  </w:style>
+  <w:style w:type="paragraph" w:styleId="HTMLPreformatted">
+    <w:name w:val="HTML Preformatted"/>
+    <w:basedOn w:val="Normal"/>
+    <w:link w:val="HTMLPreformattedChar"/>
+    <w:uiPriority w:val="99"/>
+    <w:semiHidden/>
+    <w:unhideWhenUsed/>
+    <w:rsid w:val="000F4FEF"/>
+    <w:pPr>
+      <w:tabs>
+        <w:tab w:val="left" w:pos="916"/>
+        <w:tab w:val="left" w:pos="1832"/>
+        <w:tab w:val="left" w:pos="2748"/>
+        <w:tab w:val="left" w:pos="3664"/>
+        <w:tab w:val="left" w:pos="4580"/>
+        <w:tab w:val="left" w:pos="5496"/>
+        <w:tab w:val="left" w:pos="6412"/>
+        <w:tab w:val="left" w:pos="7328"/>
+        <w:tab w:val="left" w:pos="8244"/>
+        <w:tab w:val="left" w:pos="9160"/>
+        <w:tab w:val="left" w:pos="10076"/>
+        <w:tab w:val="left" w:pos="10992"/>
+        <w:tab w:val="left" w:pos="11908"/>
+        <w:tab w:val="left" w:pos="12824"/>
+        <w:tab w:val="left" w:pos="13740"/>
+        <w:tab w:val="left" w:pos="14656"/>
+      </w:tabs>
+      <w:spacing w:before="0" w:beforeAutospacing="0" w:after="0" w:afterAutospacing="0"/>
+    </w:pPr>
+    <w:rPr>
+      <w:rFonts w:ascii="Courier New" w:eastAsia="Times New Roman" w:hAnsi="Courier New" w:cs="Courier New"/>
+      <w:sz w:val="20"/>
+      <w:szCs w:val="20"/>
+    </w:rPr>
+  </w:style>
+  <w:style w:type="character" w:customStyle="1" w:styleId="HTMLPreformattedChar">
+    <w:name w:val="HTML Preformatted Char"/>
+    <w:basedOn w:val="DefaultParagraphFont"/>
+    <w:link w:val="HTMLPreformatted"/>
+    <w:uiPriority w:val="99"/>
+    <w:semiHidden/>
+    <w:rsid w:val="000F4FEF"/>
+    <w:rPr>
+      <w:rFonts w:ascii="Courier New" w:eastAsia="Times New Roman" w:hAnsi="Courier New" w:cs="Courier New"/>
+      <w:sz w:val="20"/>
+      <w:szCs w:val="20"/>
+    </w:rPr>
+  </w:style>
+  <w:style w:type="paragraph" w:styleId="CommentSubject">
+    <w:name w:val="annotation subject"/>
+    <w:basedOn w:val="CommentText"/>
+    <w:next w:val="CommentText"/>
+    <w:link w:val="CommentSubjectChar"/>
+    <w:uiPriority w:val="99"/>
+    <w:semiHidden/>
+    <w:unhideWhenUsed/>
+    <w:rsid w:val="000F4FEF"/>
+    <w:rPr>
+      <w:b/>
+      <w:bCs/>
+    </w:rPr>
+  </w:style>
+  <w:style w:type="character" w:customStyle="1" w:styleId="CommentSubjectChar">
+    <w:name w:val="Comment Subject Char"/>
+    <w:basedOn w:val="CommentTextChar"/>
+    <w:link w:val="CommentSubject"/>
+    <w:uiPriority w:val="99"/>
+    <w:semiHidden/>
+    <w:rsid w:val="000F4FEF"/>
+    <w:rPr>
+      <w:rFonts w:ascii="Arial" w:hAnsi="Arial" w:cs="Arial"/>
+      <w:b/>
+      <w:bCs/>
+      <w:sz w:val="20"/>
+      <w:szCs w:val="20"/>
+    </w:rPr>
+  </w:style>
+  <w:style w:type="paragraph" w:styleId="BalloonText">
+    <w:name w:val="Balloon Text"/>
+    <w:basedOn w:val="Normal"/>
+    <w:link w:val="BalloonTextChar"/>
+    <w:uiPriority w:val="99"/>
+    <w:semiHidden/>
+    <w:unhideWhenUsed/>
+    <w:rsid w:val="000F4FEF"/>
+    <w:rPr>
+      <w:rFonts w:ascii="Segoe UI" w:hAnsi="Segoe UI" w:cs="Segoe UI"/>
+      <w:sz w:val="18"/>
+      <w:szCs w:val="18"/>
+    </w:rPr>
+  </w:style>
+  <w:style w:type="character" w:customStyle="1" w:styleId="BalloonTextChar">
+    <w:name w:val="Balloon Text Char"/>
+    <w:basedOn w:val="DefaultParagraphFont"/>
+    <w:link w:val="BalloonText"/>
+    <w:uiPriority w:val="99"/>
+    <w:semiHidden/>
+    <w:rsid w:val="000F4FEF"/>
+    <w:rPr>
+      <w:rFonts w:ascii="Segoe UI" w:hAnsi="Segoe UI" w:cs="Segoe UI"/>
+      <w:sz w:val="18"/>
+      <w:szCs w:val="18"/>
+    </w:rPr>
+  </w:style>
+  <w:style w:type="table" w:styleId="TableGrid">
+    <w:name w:val="Table Grid"/>
+    <w:basedOn w:val="TableNormal"/>
+    <w:uiPriority w:val="39"/>
+    <w:rsid w:val="000F4FEF"/>
+    <w:pPr>
+      <w:widowControl w:val="0"/>
+      <w:autoSpaceDE w:val="0"/>
+      <w:autoSpaceDN w:val="0"/>
+      <w:spacing w:beforeAutospacing="0" w:after="0" w:afterAutospacing="0" w:line="240" w:lineRule="auto"/>
+    </w:pPr>
+    <w:rPr>
+      <w:rFonts w:eastAsiaTheme="minorHAnsi"/>
+    </w:rPr>
+    <w:tblPr>
+      <w:tblBorders>
+        <w:top w:val="single" w:sz="4" w:space="0" w:color="auto"/>
+        <w:left w:val="single" w:sz="4" w:space="0" w:color="auto"/>
+        <w:bottom w:val="single" w:sz="4" w:space="0" w:color="auto"/>
+        <w:right w:val="single" w:sz="4" w:space="0" w:color="auto"/>
+        <w:insideH w:val="single" w:sz="4" w:space="0" w:color="auto"/>
+        <w:insideV w:val="single" w:sz="4" w:space="0" w:color="auto"/>
+      </w:tblBorders>
+    </w:tblPr>
+  </w:style>
+  <w:style w:type="paragraph" w:styleId="NoSpacing">
+    <w:name w:val="No Spacing"/>
+    <w:uiPriority w:val="1"/>
+    <w:qFormat/>
+    <w:rsid w:val="00DD3DDA"/>
+    <w:pPr>
+      <w:spacing w:beforeAutospacing="0" w:after="0" w:afterAutospacing="0"/>
+    </w:pPr>
+    <w:rPr>
+      <w:rFonts w:ascii="Helvetica" w:eastAsiaTheme="minorHAnsi" w:hAnsi="Helvetica"/>
+      <w:sz w:val="24"/>
+    </w:rPr>
+  </w:style>
+  <w:style w:type="paragraph" w:styleId="Quote">
+    <w:name w:val="Quote"/>
+    <w:basedOn w:val="Normal"/>
+    <w:next w:val="Normal"/>
+    <w:link w:val="QuoteChar"/>
+    <w:uiPriority w:val="29"/>
+    <w:rsid w:val="000F4FEF"/>
+    <w:pPr>
+      <w:spacing w:before="200" w:after="160"/>
+      <w:ind w:left="864" w:right="864"/>
+      <w:jc w:val="center"/>
+    </w:pPr>
+    <w:rPr>
+      <w:i/>
+      <w:iCs/>
+      <w:color w:val="404040" w:themeColor="text1" w:themeTint="BF"/>
+    </w:rPr>
+  </w:style>
+  <w:style w:type="character" w:customStyle="1" w:styleId="QuoteChar">
+    <w:name w:val="Quote Char"/>
+    <w:basedOn w:val="DefaultParagraphFont"/>
+    <w:link w:val="Quote"/>
+    <w:uiPriority w:val="29"/>
+    <w:rsid w:val="000F4FEF"/>
+    <w:rPr>
+      <w:rFonts w:ascii="Arial" w:hAnsi="Arial" w:cs="Arial"/>
+      <w:i/>
+      <w:iCs/>
+      <w:color w:val="404040" w:themeColor="text1" w:themeTint="BF"/>
+    </w:rPr>
+  </w:style>
+  <w:style w:type="character" w:styleId="SubtleEmphasis">
+    <w:name w:val="Subtle Emphasis"/>
+    <w:basedOn w:val="DefaultParagraphFont"/>
+    <w:uiPriority w:val="19"/>
+    <w:rsid w:val="000F4FEF"/>
+    <w:rPr>
+      <w:i/>
+      <w:iCs/>
+      <w:color w:val="404040" w:themeColor="text1" w:themeTint="BF"/>
+    </w:rPr>
+  </w:style>
+  <w:style w:type="paragraph" w:styleId="TOCHeading">
+    <w:name w:val="TOC Heading"/>
+    <w:basedOn w:val="Heading1"/>
+    <w:next w:val="Normal"/>
+    <w:uiPriority w:val="39"/>
+    <w:unhideWhenUsed/>
+    <w:qFormat/>
+    <w:rsid w:val="000F4FEF"/>
+    <w:pPr>
+      <w:spacing w:before="240" w:after="0" w:line="259" w:lineRule="auto"/>
+      <w:outlineLvl w:val="9"/>
+    </w:pPr>
+    <w:rPr>
+      <w:rFonts w:asciiTheme="majorHAnsi" w:eastAsiaTheme="majorEastAsia" w:hAnsiTheme="majorHAnsi" w:cstheme="majorBidi"/>
+      <w:color w:val="2F5496" w:themeColor="accent1" w:themeShade="BF"/>
+      <w:sz w:val="32"/>
+      <w:szCs w:val="32"/>
+    </w:rPr>
+  </w:style>
+  <w:style w:type="character" w:customStyle="1" w:styleId="BodyChar">
+    <w:name w:val="Body Char"/>
+    <w:basedOn w:val="DefaultParagraphFont"/>
+    <w:link w:val="Body"/>
+    <w:rsid w:val="000F4FEF"/>
+    <w:rPr>
+      <w:rFonts w:ascii="Helvetica" w:eastAsiaTheme="minorHAnsi" w:hAnsi="Helvetica" w:cs="Helvetica"/>
+      <w:sz w:val="24"/>
+      <w:szCs w:val="24"/>
+    </w:rPr>
+  </w:style>
+  <w:style w:type="paragraph" w:customStyle="1" w:styleId="interviewneedsediting">
+    <w:name w:val="interview needs editing"/>
+    <w:basedOn w:val="Normal"/>
+    <w:next w:val="Normal"/>
+    <w:qFormat/>
+    <w:rsid w:val="000F4FEF"/>
+    <w:pPr>
+      <w:shd w:val="clear" w:color="auto" w:fill="FFFF00"/>
+      <w:spacing w:after="60" w:line="360" w:lineRule="auto"/>
+    </w:pPr>
+    <w:rPr>
+      <w:sz w:val="21"/>
+      <w:szCs w:val="21"/>
+    </w:rPr>
+  </w:style>
+  <w:style w:type="table" w:customStyle="1" w:styleId="TableGridLight1">
+    <w:name w:val="Table Grid Light1"/>
+    <w:basedOn w:val="TableNormal"/>
+    <w:uiPriority w:val="40"/>
+    <w:rsid w:val="000F4FEF"/>
+    <w:pPr>
+      <w:spacing w:beforeAutospacing="0" w:after="0" w:afterAutospacing="0" w:line="240" w:lineRule="auto"/>
+    </w:pPr>
+    <w:rPr>
+      <w:rFonts w:eastAsiaTheme="minorHAnsi"/>
+    </w:rPr>
+    <w:tblPr>
+      <w:tblBorders>
+        <w:top w:val="single" w:sz="4" w:space="0" w:color="BFBFBF" w:themeColor="background1" w:themeShade="BF"/>
+        <w:left w:val="single" w:sz="4" w:space="0" w:color="BFBFBF" w:themeColor="background1" w:themeShade="BF"/>
+        <w:bottom w:val="single" w:sz="4" w:space="0" w:color="BFBFBF" w:themeColor="background1" w:themeShade="BF"/>
+        <w:right w:val="single" w:sz="4" w:space="0" w:color="BFBFBF" w:themeColor="background1" w:themeShade="BF"/>
+        <w:insideH w:val="single" w:sz="4" w:space="0" w:color="BFBFBF" w:themeColor="background1" w:themeShade="BF"/>
+        <w:insideV w:val="single" w:sz="4" w:space="0" w:color="BFBFBF" w:themeColor="background1" w:themeShade="BF"/>
+      </w:tblBorders>
+    </w:tblPr>
+  </w:style>
+  <w:style w:type="character" w:customStyle="1" w:styleId="UnresolvedMention">
     <w:name w:val="Unresolved Mention"/>
     <w:basedOn w:val="DefaultParagraphFont"/>
     <w:uiPriority w:val="99"/>
@@ -7445,7 +9013,7 @@
   <a:extraClrSchemeLst/>
   <a:extLst>
     <a:ext uri="{05A4C25C-085E-4340-85A3-A5531E510DB2}">
-      <thm15:themeFamily xmlns:thm15="http://schemas.microsoft.com/office/thememl/2012/main" name="Office Theme" id="{62F939B6-93AF-4DB8-9C6B-D6C7DFDC589F}" vid="{4A3C46E8-61CC-4603-A589-7422A47A8E4A}"/>
+      <thm15:themeFamily xmlns:thm15="http://schemas.microsoft.com/office/thememl/2012/main" xmlns="" name="Office Theme" id="{62F939B6-93AF-4DB8-9C6B-D6C7DFDC589F}" vid="{4A3C46E8-61CC-4603-A589-7422A47A8E4A}"/>
     </a:ext>
   </a:extLst>
 </a:theme>

</xml_diff>

<commit_message>
tiny things can't remember have to check commits for diffs
</commit_message>
<xml_diff>
--- a/docassemble/AKA2JBranding/data/templates/want_help_to_agree_content.docx
+++ b/docassemble/AKA2JBranding/data/templates/want_help_to_agree_content.docx
@@ -1,14 +1,12 @@
 
 <file path=word/document.xml><?xml version="1.0" encoding="utf-8"?>
-<w:document xmlns:wpc="http://schemas.microsoft.com/office/word/2010/wordprocessingCanvas" xmlns:mc="http://schemas.openxmlformats.org/markup-compatibility/2006" xmlns:o="urn:schemas-microsoft-com:office:office" xmlns:r="http://schemas.openxmlformats.org/officeDocument/2006/relationships" xmlns:m="http://schemas.openxmlformats.org/officeDocument/2006/math" xmlns:v="urn:schemas-microsoft-com:vml" xmlns:wp14="http://schemas.microsoft.com/office/word/2010/wordprocessingDrawing" xmlns:wp="http://schemas.openxmlformats.org/drawingml/2006/wordprocessingDrawing" xmlns:w10="urn:schemas-microsoft-com:office:word" xmlns:w="http://schemas.openxmlformats.org/wordprocessingml/2006/main" xmlns:w14="http://schemas.microsoft.com/office/word/2010/wordml" xmlns:wpg="http://schemas.microsoft.com/office/word/2010/wordprocessingGroup" xmlns:wpi="http://schemas.microsoft.com/office/word/2010/wordprocessingInk" xmlns:wne="http://schemas.microsoft.com/office/word/2006/wordml" xmlns:wps="http://schemas.microsoft.com/office/word/2010/wordprocessingShape" mc:Ignorable="w14 wp14">
+<w:document xmlns:wpc="http://schemas.microsoft.com/office/word/2010/wordprocessingCanvas" xmlns:cx="http://schemas.microsoft.com/office/drawing/2014/chartex" xmlns:cx1="http://schemas.microsoft.com/office/drawing/2015/9/8/chartex" xmlns:cx2="http://schemas.microsoft.com/office/drawing/2015/10/21/chartex" xmlns:cx3="http://schemas.microsoft.com/office/drawing/2016/5/9/chartex" xmlns:cx4="http://schemas.microsoft.com/office/drawing/2016/5/10/chartex" xmlns:cx5="http://schemas.microsoft.com/office/drawing/2016/5/11/chartex" xmlns:cx6="http://schemas.microsoft.com/office/drawing/2016/5/12/chartex" xmlns:cx7="http://schemas.microsoft.com/office/drawing/2016/5/13/chartex" xmlns:cx8="http://schemas.microsoft.com/office/drawing/2016/5/14/chartex" xmlns:mc="http://schemas.openxmlformats.org/markup-compatibility/2006" xmlns:aink="http://schemas.microsoft.com/office/drawing/2016/ink" xmlns:am3d="http://schemas.microsoft.com/office/drawing/2017/model3d" xmlns:o="urn:schemas-microsoft-com:office:office" xmlns:r="http://schemas.openxmlformats.org/officeDocument/2006/relationships" xmlns:m="http://schemas.openxmlformats.org/officeDocument/2006/math" xmlns:v="urn:schemas-microsoft-com:vml" xmlns:wp14="http://schemas.microsoft.com/office/word/2010/wordprocessingDrawing" xmlns:wp="http://schemas.openxmlformats.org/drawingml/2006/wordprocessingDrawing" xmlns:w10="urn:schemas-microsoft-com:office:word" xmlns:w="http://schemas.openxmlformats.org/wordprocessingml/2006/main" xmlns:w14="http://schemas.microsoft.com/office/word/2010/wordml" xmlns:w15="http://schemas.microsoft.com/office/word/2012/wordml" xmlns:w16cex="http://schemas.microsoft.com/office/word/2018/wordml/cex" xmlns:w16cid="http://schemas.microsoft.com/office/word/2016/wordml/cid" xmlns:w16="http://schemas.microsoft.com/office/word/2018/wordml" xmlns:w16sdtdh="http://schemas.microsoft.com/office/word/2020/wordml/sdtdatahash" xmlns:w16se="http://schemas.microsoft.com/office/word/2015/wordml/symex" xmlns:wpg="http://schemas.microsoft.com/office/word/2010/wordprocessingGroup" xmlns:wpi="http://schemas.microsoft.com/office/word/2010/wordprocessingInk" xmlns:wne="http://schemas.microsoft.com/office/word/2006/wordml" xmlns:wps="http://schemas.microsoft.com/office/word/2010/wordprocessingShape" mc:Ignorable="w14 w15 w16se w16cid w16 w16cex w16sdtdh wp14">
   <w:body>
     <w:p>
       <w:pPr>
         <w:pStyle w:val="Body"/>
         <w:spacing w:before="120"/>
       </w:pPr>
-      <w:bookmarkStart w:id="0" w:name="_GoBack"/>
-      <w:bookmarkEnd w:id="0"/>
       <w:r>
         <w:rPr>
           <w:color w:val="FF0000"/>
@@ -1079,7 +1077,7 @@
       <w:r>
         <w:t xml:space="preserve">Watch a </w:t>
       </w:r>
-      <w:hyperlink r:id="rId8">
+      <w:hyperlink r:id="rId7">
         <w:r>
           <w:rPr>
             <w:rStyle w:val="Hyperlink"/>
@@ -1298,7 +1296,7 @@
         <w:rPr>
           <w:shd w:val="clear" w:color="auto" w:fill="FFFFFF"/>
         </w:rPr>
-        <w:t>Settlement Conference</w:t>
+        <w:t>Settlement Conference{% endif %}</w:t>
       </w:r>
     </w:p>
     <w:p>
@@ -1319,23 +1317,81 @@
       </w:pPr>
       <w:r>
         <w:rPr>
+          <w:color w:val="auto"/>
+        </w:rPr>
+        <w:t>Collaborative Law</w:t>
+      </w:r>
+    </w:p>
+    <w:p>
+      <w:pPr>
+        <w:pStyle w:val="ListParagraph"/>
+        <w:numPr>
+          <w:ilvl w:val="0"/>
+          <w:numId w:val="47"/>
+        </w:numPr>
+        <w:suppressAutoHyphens/>
+        <w:autoSpaceDE/>
+        <w:autoSpaceDN/>
+        <w:spacing w:before="0" w:beforeAutospacing="1" w:afterAutospacing="1"/>
+        <w:ind w:left="514"/>
+        <w:rPr>
+          <w:color w:val="auto"/>
+        </w:rPr>
+      </w:pPr>
+      <w:r>
+        <w:rPr>
           <w:color w:val="92D050"/>
         </w:rPr>
-        <w:t xml:space="preserve">{%p </w:t>
-      </w:r>
-      <w:proofErr w:type="spellStart"/>
-      <w:r>
-        <w:rPr>
-          <w:color w:val="92D050"/>
-        </w:rPr>
-        <w:t>endif</w:t>
-      </w:r>
-      <w:proofErr w:type="spellEnd"/>
-      <w:r>
-        <w:rPr>
-          <w:color w:val="92D050"/>
-        </w:rPr>
-        <w:t xml:space="preserve"> %}</w:t>
+        <w:t>{%p endif %}</w:t>
+      </w:r>
+    </w:p>
+    <w:p>
+      <w:pPr>
+        <w:pStyle w:val="Heading3"/>
+      </w:pPr>
+      <w:r>
+        <w:t>Talk to {{other_party_in_case}} about settling the case without a trial</w:t>
+      </w:r>
+    </w:p>
+    <w:p>
+      <w:pPr>
+        <w:pStyle w:val="Body"/>
+      </w:pPr>
+      <w:r>
+        <w:t>Some {{ "parents" if user_need == 'answer custody' else "spouses" }} want to work out the issues by agreement without the judge deciding and are able to talk to each other in person, on-line, or with the help of a friend or family member.</w:t>
+      </w:r>
+    </w:p>
+    <w:p>
+      <w:pPr>
+        <w:pStyle w:val="Heading3"/>
+      </w:pPr>
+      <w:r>
+        <w:t>Mediation</w:t>
+      </w:r>
+    </w:p>
+    <w:p>
+      <w:pPr>
+        <w:pStyle w:val="Body"/>
+      </w:pPr>
+      <w:r>
+        <w:t>Mediation is a voluntary and confidential way to resolve disagreements. No one else, like a judge or the mediator, decides for you. A neutral person, called the mediator, helps people outside the court process:</w:t>
+      </w:r>
+    </w:p>
+    <w:p>
+      <w:pPr>
+        <w:pStyle w:val="ListParagraph"/>
+        <w:numPr>
+          <w:ilvl w:val="0"/>
+          <w:numId w:val="47"/>
+        </w:numPr>
+        <w:suppressAutoHyphens/>
+        <w:autoSpaceDE/>
+        <w:autoSpaceDN/>
+        <w:spacing w:beforeAutospacing="1" w:after="0" w:afterAutospacing="1"/>
+        <w:ind w:left="514"/>
+      </w:pPr>
+      <w:r>
+        <w:t>Figure out the important issues in the disagreement.</w:t>
       </w:r>
     </w:p>
     <w:p>
@@ -1350,15 +1406,43 @@
         <w:autoSpaceDN/>
         <w:spacing w:before="0" w:beforeAutospacing="1" w:after="0" w:afterAutospacing="1"/>
         <w:ind w:left="514"/>
-        <w:rPr>
-          <w:color w:val="auto"/>
-        </w:rPr>
-      </w:pPr>
-      <w:r>
-        <w:rPr>
-          <w:color w:val="auto"/>
-        </w:rPr>
-        <w:t>Collaborative Law</w:t>
+      </w:pPr>
+      <w:r>
+        <w:t>Explain and understand each other's needs.</w:t>
+      </w:r>
+    </w:p>
+    <w:p>
+      <w:pPr>
+        <w:pStyle w:val="ListParagraph"/>
+        <w:numPr>
+          <w:ilvl w:val="0"/>
+          <w:numId w:val="47"/>
+        </w:numPr>
+        <w:suppressAutoHyphens/>
+        <w:autoSpaceDE/>
+        <w:autoSpaceDN/>
+        <w:spacing w:before="0" w:beforeAutospacing="1" w:after="0" w:afterAutospacing="1"/>
+        <w:ind w:left="514"/>
+      </w:pPr>
+      <w:r>
+        <w:t>Clear up misunderstandings.</w:t>
+      </w:r>
+    </w:p>
+    <w:p>
+      <w:pPr>
+        <w:pStyle w:val="ListParagraph"/>
+        <w:numPr>
+          <w:ilvl w:val="0"/>
+          <w:numId w:val="47"/>
+        </w:numPr>
+        <w:suppressAutoHyphens/>
+        <w:autoSpaceDE/>
+        <w:autoSpaceDN/>
+        <w:spacing w:before="0" w:beforeAutospacing="1" w:after="0" w:afterAutospacing="1"/>
+        <w:ind w:left="514"/>
+      </w:pPr>
+      <w:r>
+        <w:t>Explore creative solutions. And</w:t>
       </w:r>
     </w:p>
     <w:p>
@@ -1373,143 +1457,6 @@
         <w:autoSpaceDN/>
         <w:spacing w:before="0" w:beforeAutospacing="1" w:afterAutospacing="1"/>
         <w:ind w:left="514"/>
-        <w:rPr>
-          <w:color w:val="FFC000"/>
-        </w:rPr>
-      </w:pPr>
-      <w:r>
-        <w:rPr>
-          <w:color w:val="FFC000"/>
-        </w:rPr>
-        <w:t xml:space="preserve">{%p </w:t>
-      </w:r>
-      <w:proofErr w:type="spellStart"/>
-      <w:r>
-        <w:rPr>
-          <w:color w:val="FFC000"/>
-        </w:rPr>
-        <w:t>endif</w:t>
-      </w:r>
-      <w:proofErr w:type="spellEnd"/>
-      <w:r>
-        <w:rPr>
-          <w:color w:val="FFC000"/>
-        </w:rPr>
-        <w:t xml:space="preserve"> %}</w:t>
-      </w:r>
-    </w:p>
-    <w:p>
-      <w:pPr>
-        <w:pStyle w:val="Heading3"/>
-      </w:pPr>
-      <w:r>
-        <w:t>Talk to {{other_party_in_case}} about settling the case without a trial</w:t>
-      </w:r>
-    </w:p>
-    <w:p>
-      <w:pPr>
-        <w:pStyle w:val="Body"/>
-      </w:pPr>
-      <w:r>
-        <w:t>Some {{ "parents" if user_need == 'answer custody' else "spouses" }} want to work out the issues by agreement without the judge deciding and are able to talk to each other in person, on-line, or with the help of a friend or family member.</w:t>
-      </w:r>
-    </w:p>
-    <w:p>
-      <w:pPr>
-        <w:pStyle w:val="Heading3"/>
-      </w:pPr>
-      <w:r>
-        <w:t>Mediation</w:t>
-      </w:r>
-    </w:p>
-    <w:p>
-      <w:pPr>
-        <w:pStyle w:val="Body"/>
-      </w:pPr>
-      <w:r>
-        <w:t>Mediation is a voluntary and confidential way to resolve disagreements. No one else, like a judge or the mediator, decides for you. A neutral person, called the mediator, helps people outside the court process:</w:t>
-      </w:r>
-    </w:p>
-    <w:p>
-      <w:pPr>
-        <w:pStyle w:val="ListParagraph"/>
-        <w:numPr>
-          <w:ilvl w:val="0"/>
-          <w:numId w:val="47"/>
-        </w:numPr>
-        <w:suppressAutoHyphens/>
-        <w:autoSpaceDE/>
-        <w:autoSpaceDN/>
-        <w:spacing w:beforeAutospacing="1" w:after="0" w:afterAutospacing="1"/>
-        <w:ind w:left="514"/>
-      </w:pPr>
-      <w:r>
-        <w:t>Figure out the important issues in the disagreement.</w:t>
-      </w:r>
-    </w:p>
-    <w:p>
-      <w:pPr>
-        <w:pStyle w:val="ListParagraph"/>
-        <w:numPr>
-          <w:ilvl w:val="0"/>
-          <w:numId w:val="47"/>
-        </w:numPr>
-        <w:suppressAutoHyphens/>
-        <w:autoSpaceDE/>
-        <w:autoSpaceDN/>
-        <w:spacing w:before="0" w:beforeAutospacing="1" w:after="0" w:afterAutospacing="1"/>
-        <w:ind w:left="514"/>
-      </w:pPr>
-      <w:r>
-        <w:t>Explain and understand each other's needs.</w:t>
-      </w:r>
-    </w:p>
-    <w:p>
-      <w:pPr>
-        <w:pStyle w:val="ListParagraph"/>
-        <w:numPr>
-          <w:ilvl w:val="0"/>
-          <w:numId w:val="47"/>
-        </w:numPr>
-        <w:suppressAutoHyphens/>
-        <w:autoSpaceDE/>
-        <w:autoSpaceDN/>
-        <w:spacing w:before="0" w:beforeAutospacing="1" w:after="0" w:afterAutospacing="1"/>
-        <w:ind w:left="514"/>
-      </w:pPr>
-      <w:r>
-        <w:t>Clear up misunderstandings.</w:t>
-      </w:r>
-    </w:p>
-    <w:p>
-      <w:pPr>
-        <w:pStyle w:val="ListParagraph"/>
-        <w:numPr>
-          <w:ilvl w:val="0"/>
-          <w:numId w:val="47"/>
-        </w:numPr>
-        <w:suppressAutoHyphens/>
-        <w:autoSpaceDE/>
-        <w:autoSpaceDN/>
-        <w:spacing w:before="0" w:beforeAutospacing="1" w:after="0" w:afterAutospacing="1"/>
-        <w:ind w:left="514"/>
-      </w:pPr>
-      <w:r>
-        <w:t>Explore creative solutions. And</w:t>
-      </w:r>
-    </w:p>
-    <w:p>
-      <w:pPr>
-        <w:pStyle w:val="ListParagraph"/>
-        <w:numPr>
-          <w:ilvl w:val="0"/>
-          <w:numId w:val="47"/>
-        </w:numPr>
-        <w:suppressAutoHyphens/>
-        <w:autoSpaceDE/>
-        <w:autoSpaceDN/>
-        <w:spacing w:before="0" w:beforeAutospacing="1" w:afterAutospacing="1"/>
-        <w:ind w:left="514"/>
       </w:pPr>
       <w:r>
         <w:t>Reach acceptable agreements.</w:t>
@@ -1566,7 +1513,7 @@
       <w:r>
         <w:t xml:space="preserve"> [</w:t>
       </w:r>
-      <w:hyperlink r:id="rId9" w:history="1">
+      <w:hyperlink r:id="rId8" w:history="1">
         <w:r>
           <w:rPr>
             <w:rStyle w:val="Hyperlink"/>
@@ -1592,15 +1539,15 @@
         <w:rPr>
           <w:color w:val="FFC000"/>
         </w:rPr>
+        <w:t>{%p endif %}</w:t>
+      </w:r>
+    </w:p>
+    <w:p>
+      <w:pPr>
+        <w:pStyle w:val="Body"/>
+      </w:pPr>
+      <w:r>
         <w:lastRenderedPageBreak/>
-        <w:t>{%p endif %}</w:t>
-      </w:r>
-    </w:p>
-    <w:p>
-      <w:pPr>
-        <w:pStyle w:val="Body"/>
-      </w:pPr>
-      <w:r>
         <w:t>You can hire your own private mediator to help resolve any issue in your case. If there was abuse or domestic violence in your relationship, be sure to hire someone with training and experience working with domestic violence. Tell your mediator if you want to bring a support person with you.</w:t>
       </w:r>
     </w:p>
@@ -1612,7 +1559,7 @@
           <w:rFonts w:eastAsia="Calibri"/>
         </w:rPr>
       </w:pPr>
-      <w:hyperlink r:id="rId10">
+      <w:hyperlink r:id="rId9">
         <w:r>
           <w:rPr>
             <w:rStyle w:val="Hyperlink"/>
@@ -1636,7 +1583,7 @@
           <w:rFonts w:eastAsia="Calibri"/>
         </w:rPr>
       </w:pPr>
-      <w:hyperlink r:id="rId11" w:history="1">
+      <w:hyperlink r:id="rId10" w:history="1">
         <w:r>
           <w:rPr>
             <w:rStyle w:val="Hyperlink"/>
@@ -1801,7 +1748,7 @@
       <w:r>
         <w:t xml:space="preserve">If both parties want a judge to help settle the issues, file a Joint Motion for a Settlement Conference, SHC-1062 </w:t>
       </w:r>
-      <w:hyperlink r:id="rId12">
+      <w:hyperlink r:id="rId11">
         <w:r>
           <w:rPr>
             <w:rStyle w:val="Hyperlink"/>
@@ -1812,7 +1759,7 @@
       <w:r>
         <w:t xml:space="preserve"> | </w:t>
       </w:r>
-      <w:hyperlink r:id="rId13">
+      <w:hyperlink r:id="rId12">
         <w:r>
           <w:rPr>
             <w:rStyle w:val="Hyperlink"/>
@@ -1849,7 +1796,7 @@
       <w:r>
         <w:t xml:space="preserve">The </w:t>
       </w:r>
-      <w:hyperlink r:id="rId14">
+      <w:hyperlink r:id="rId13">
         <w:r>
           <w:rPr>
             <w:rStyle w:val="Hyperlink"/>
@@ -1905,7 +1852,7 @@
       <w:r>
         <w:t xml:space="preserve"> </w:t>
       </w:r>
-      <w:hyperlink r:id="rId15" w:history="1">
+      <w:hyperlink r:id="rId14" w:history="1">
         <w:r>
           <w:rPr>
             <w:rStyle w:val="Hyperlink"/>
@@ -1928,15 +1875,15 @@
         <w:rPr>
           <w:color w:val="FFC000"/>
         </w:rPr>
+        <w:t>{%p if (user_need == 'answer_custody' and type_of_response.all_false() and not agreement_documents) or (user_need == 'answer divorce' and type_of_response.all_false)%}</w:t>
+      </w:r>
+    </w:p>
+    <w:p>
+      <w:pPr>
+        <w:pStyle w:val="Heading3"/>
+      </w:pPr>
+      <w:r>
         <w:lastRenderedPageBreak/>
-        <w:t>{%p if (user_need == 'answer_custody' and type_of_response.all_false() and not agreement_documents) or (user_need == 'answer divorce' and type_of_response.all_false)%}</w:t>
-      </w:r>
-    </w:p>
-    <w:p>
-      <w:pPr>
-        <w:pStyle w:val="Heading3"/>
-      </w:pPr>
-      <w:r>
         <w:t>What to do if you reach an agreement</w:t>
       </w:r>
     </w:p>
@@ -1957,7 +1904,7 @@
         </w:rPr>
         <w:t>{% if user_need == 'answer custody' %}</w:t>
       </w:r>
-      <w:hyperlink r:id="rId16">
+      <w:hyperlink r:id="rId15">
         <w:r>
           <w:rPr>
             <w:rStyle w:val="Hyperlink"/>
@@ -1974,7 +1921,7 @@
         </w:rPr>
         <w:t>{% elif user_need == 'answer divorce' %}</w:t>
       </w:r>
-      <w:hyperlink r:id="rId17">
+      <w:hyperlink r:id="rId16">
         <w:r>
           <w:rPr>
             <w:rStyle w:val="Hyperlink"/>
@@ -2038,7 +1985,7 @@
       <w:pPr>
         <w:pStyle w:val="Body"/>
       </w:pPr>
-      <w:hyperlink r:id="rId18" w:history="1">
+      <w:hyperlink r:id="rId17" w:history="1">
         <w:r>
           <w:rPr>
             <w:rStyle w:val="Hyperlink"/>
@@ -2049,7 +1996,7 @@
       <w:r>
         <w:br/>
       </w:r>
-      <w:hyperlink r:id="rId19" w:history="1">
+      <w:hyperlink r:id="rId18" w:history="1">
         <w:r>
           <w:rPr>
             <w:rStyle w:val="Hyperlink"/>
@@ -2102,7 +2049,7 @@
         </w:rPr>
         <w:t xml:space="preserve"> [</w:t>
       </w:r>
-      <w:hyperlink r:id="rId20" w:history="1">
+      <w:hyperlink r:id="rId19" w:history="1">
         <w:r>
           <w:rPr>
             <w:rStyle w:val="Hyperlink"/>
@@ -2122,7 +2069,7 @@
         </w:rPr>
         <w:br/>
       </w:r>
-      <w:hyperlink r:id="rId21" w:history="1">
+      <w:hyperlink r:id="rId20" w:history="1">
         <w:r>
           <w:rPr>
             <w:rStyle w:val="Hyperlink"/>
@@ -2147,7 +2094,7 @@
       <w:pPr>
         <w:pStyle w:val="Body"/>
       </w:pPr>
-      <w:hyperlink r:id="rId22" w:history="1">
+      <w:hyperlink r:id="rId21" w:history="1">
         <w:r>
           <w:rPr>
             <w:rStyle w:val="Hyperlink"/>
@@ -2164,7 +2111,7 @@
         </w:rPr>
         <w:br/>
       </w:r>
-      <w:hyperlink r:id="rId23" w:history="1">
+      <w:hyperlink r:id="rId22" w:history="1">
         <w:r>
           <w:rPr>
             <w:rStyle w:val="Hyperlink"/>
@@ -2176,42 +2123,37 @@
     </w:p>
     <w:p>
       <w:pPr>
-        <w:pStyle w:val="BodyText"/>
-        <w:spacing w:before="280" w:after="280"/>
-        <w:rPr>
-          <w:rStyle w:val="Hyperlink"/>
-          <w:rFonts w:ascii="Arial" w:eastAsia="Calibri" w:hAnsi="Arial" w:cs="Arial"/>
-          <w:color w:val="auto"/>
-          <w:spacing w:val="0"/>
-          <w:sz w:val="22"/>
-          <w:szCs w:val="22"/>
-        </w:rPr>
-      </w:pPr>
-      <w:hyperlink r:id="rId24">
+        <w:pStyle w:val="Body"/>
+        <w:rPr>
+          <w:b/>
+        </w:rPr>
+      </w:pPr>
+      <w:hyperlink r:id="rId23" w:history="1">
         <w:r>
           <w:rPr>
             <w:rStyle w:val="Hyperlink"/>
-            <w:rFonts w:eastAsia="Calibri"/>
           </w:rPr>
-          <w:t>Find a private mediator</w:t>
+          <w:t xml:space="preserve">Find a private </w:t>
         </w:r>
-      </w:hyperlink>
-      <w:r>
-        <w:rPr>
-          <w:rFonts w:eastAsia="Calibri"/>
-        </w:rPr>
-        <w:br/>
-      </w:r>
-      <w:hyperlink r:id="rId25" w:history="1">
         <w:r>
           <w:rPr>
             <w:rStyle w:val="Hyperlink"/>
-            <w:rFonts w:eastAsiaTheme="minorHAnsi"/>
-            <w:spacing w:val="0"/>
           </w:rPr>
-          <w:t>alaskamediators.org/directory</w:t>
+          <w:t>m</w:t>
+        </w:r>
+        <w:r>
+          <w:rPr>
+            <w:rStyle w:val="Hyperlink"/>
+          </w:rPr>
+          <w:t>ediator</w:t>
         </w:r>
       </w:hyperlink>
+      <w:r>
+        <w:br/>
+      </w:r>
+      <w:r>
+        <w:t>pmoa.wildapricot.org/directory</w:t>
+      </w:r>
     </w:p>
     <w:p>
       <w:pPr>
@@ -2252,7 +2194,7 @@
         </w:rPr>
         <w:t xml:space="preserve"> </w:t>
       </w:r>
-      <w:hyperlink r:id="rId26">
+      <w:hyperlink r:id="rId24">
         <w:r>
           <w:rPr>
             <w:rStyle w:val="Hyperlink"/>
@@ -2272,7 +2214,7 @@
         </w:rPr>
         <w:br/>
       </w:r>
-      <w:hyperlink r:id="rId27" w:history="1">
+      <w:hyperlink r:id="rId25" w:history="1">
         <w:r>
           <w:rPr>
             <w:rStyle w:val="Hyperlink"/>
@@ -2289,7 +2231,7 @@
         <w:br/>
         <w:t xml:space="preserve">as a </w:t>
       </w:r>
-      <w:hyperlink r:id="rId28">
+      <w:hyperlink r:id="rId26">
         <w:r>
           <w:rPr>
             <w:rStyle w:val="Hyperlink"/>
@@ -2303,7 +2245,7 @@
         </w:rPr>
         <w:br/>
       </w:r>
-      <w:hyperlink r:id="rId29" w:history="1">
+      <w:hyperlink r:id="rId27" w:history="1">
         <w:r>
           <w:rPr>
             <w:rStyle w:val="Hyperlink"/>
@@ -2330,7 +2272,6 @@
         <w:rPr>
           <w:color w:val="FFC000"/>
         </w:rPr>
-        <w:lastRenderedPageBreak/>
         <w:t>{%p endif %}</w:t>
       </w:r>
     </w:p>
@@ -2338,7 +2279,7 @@
       <w:pPr>
         <w:pStyle w:val="Body"/>
       </w:pPr>
-      <w:hyperlink r:id="rId30">
+      <w:hyperlink r:id="rId28">
         <w:r>
           <w:rPr>
             <w:rStyle w:val="Hyperlink"/>
@@ -2349,7 +2290,7 @@
       <w:r>
         <w:br/>
       </w:r>
-      <w:hyperlink r:id="rId31" w:history="1">
+      <w:hyperlink r:id="rId29" w:history="1">
         <w:r>
           <w:rPr>
             <w:rStyle w:val="Hyperlink"/>
@@ -2367,6 +2308,7 @@
         <w:rPr>
           <w:color w:val="FFC000"/>
         </w:rPr>
+        <w:lastRenderedPageBreak/>
         <w:t>{%p if (user_need == 'answer_custody' and type_of_response.all_false() and not agreement_documents) or (user_need == 'answer divorce' and type_of_response.all_false)%}</w:t>
       </w:r>
     </w:p>
@@ -2388,7 +2330,7 @@
       <w:pPr>
         <w:pStyle w:val="Body"/>
       </w:pPr>
-      <w:hyperlink r:id="rId32" w:history="1">
+      <w:hyperlink r:id="rId30" w:history="1">
         <w:r>
           <w:rPr>
             <w:rStyle w:val="Hyperlink"/>
@@ -2400,7 +2342,7 @@
       <w:r>
         <w:br/>
       </w:r>
-      <w:hyperlink r:id="rId33" w:history="1">
+      <w:hyperlink r:id="rId31" w:history="1">
         <w:r>
           <w:rPr>
             <w:rStyle w:val="Hyperlink"/>
@@ -2452,7 +2394,7 @@
       <w:pPr>
         <w:pStyle w:val="Body"/>
       </w:pPr>
-      <w:hyperlink r:id="rId34" w:history="1">
+      <w:hyperlink r:id="rId32" w:history="1">
         <w:r>
           <w:rPr>
             <w:rStyle w:val="Hyperlink"/>
@@ -2464,7 +2406,7 @@
       <w:r>
         <w:br/>
       </w:r>
-      <w:hyperlink r:id="rId35" w:history="1">
+      <w:hyperlink r:id="rId33" w:history="1">
         <w:r>
           <w:rPr>
             <w:rStyle w:val="Hyperlink"/>
@@ -2540,12 +2482,12 @@
       </w:r>
     </w:p>
     <w:sectPr>
-      <w:headerReference w:type="even" r:id="rId36"/>
-      <w:headerReference w:type="default" r:id="rId37"/>
-      <w:footerReference w:type="even" r:id="rId38"/>
-      <w:footerReference w:type="default" r:id="rId39"/>
-      <w:headerReference w:type="first" r:id="rId40"/>
-      <w:footerReference w:type="first" r:id="rId41"/>
+      <w:headerReference w:type="even" r:id="rId34"/>
+      <w:headerReference w:type="default" r:id="rId35"/>
+      <w:footerReference w:type="even" r:id="rId36"/>
+      <w:footerReference w:type="default" r:id="rId37"/>
+      <w:headerReference w:type="first" r:id="rId38"/>
+      <w:footerReference w:type="first" r:id="rId39"/>
       <w:pgSz w:w="12240" w:h="15840"/>
       <w:pgMar w:top="1440" w:right="1440" w:bottom="1440" w:left="1440" w:header="720" w:footer="720" w:gutter="0"/>
       <w:cols w:space="720"/>
@@ -2556,7 +2498,7 @@
 </file>
 
 <file path=word/endnotes.xml><?xml version="1.0" encoding="utf-8"?>
-<w:endnotes xmlns:wpc="http://schemas.microsoft.com/office/word/2010/wordprocessingCanvas" xmlns:mc="http://schemas.openxmlformats.org/markup-compatibility/2006" xmlns:o="urn:schemas-microsoft-com:office:office" xmlns:r="http://schemas.openxmlformats.org/officeDocument/2006/relationships" xmlns:m="http://schemas.openxmlformats.org/officeDocument/2006/math" xmlns:v="urn:schemas-microsoft-com:vml" xmlns:wp14="http://schemas.microsoft.com/office/word/2010/wordprocessingDrawing" xmlns:wp="http://schemas.openxmlformats.org/drawingml/2006/wordprocessingDrawing" xmlns:w10="urn:schemas-microsoft-com:office:word" xmlns:w="http://schemas.openxmlformats.org/wordprocessingml/2006/main" xmlns:w14="http://schemas.microsoft.com/office/word/2010/wordml" xmlns:wpg="http://schemas.microsoft.com/office/word/2010/wordprocessingGroup" xmlns:wpi="http://schemas.microsoft.com/office/word/2010/wordprocessingInk" xmlns:wne="http://schemas.microsoft.com/office/word/2006/wordml" xmlns:wps="http://schemas.microsoft.com/office/word/2010/wordprocessingShape" mc:Ignorable="w14 wp14">
+<w:endnotes xmlns:wpc="http://schemas.microsoft.com/office/word/2010/wordprocessingCanvas" xmlns:cx="http://schemas.microsoft.com/office/drawing/2014/chartex" xmlns:cx1="http://schemas.microsoft.com/office/drawing/2015/9/8/chartex" xmlns:cx2="http://schemas.microsoft.com/office/drawing/2015/10/21/chartex" xmlns:cx3="http://schemas.microsoft.com/office/drawing/2016/5/9/chartex" xmlns:cx4="http://schemas.microsoft.com/office/drawing/2016/5/10/chartex" xmlns:cx5="http://schemas.microsoft.com/office/drawing/2016/5/11/chartex" xmlns:cx6="http://schemas.microsoft.com/office/drawing/2016/5/12/chartex" xmlns:cx7="http://schemas.microsoft.com/office/drawing/2016/5/13/chartex" xmlns:cx8="http://schemas.microsoft.com/office/drawing/2016/5/14/chartex" xmlns:mc="http://schemas.openxmlformats.org/markup-compatibility/2006" xmlns:aink="http://schemas.microsoft.com/office/drawing/2016/ink" xmlns:am3d="http://schemas.microsoft.com/office/drawing/2017/model3d" xmlns:o="urn:schemas-microsoft-com:office:office" xmlns:r="http://schemas.openxmlformats.org/officeDocument/2006/relationships" xmlns:m="http://schemas.openxmlformats.org/officeDocument/2006/math" xmlns:v="urn:schemas-microsoft-com:vml" xmlns:wp14="http://schemas.microsoft.com/office/word/2010/wordprocessingDrawing" xmlns:wp="http://schemas.openxmlformats.org/drawingml/2006/wordprocessingDrawing" xmlns:w10="urn:schemas-microsoft-com:office:word" xmlns:w="http://schemas.openxmlformats.org/wordprocessingml/2006/main" xmlns:w14="http://schemas.microsoft.com/office/word/2010/wordml" xmlns:w15="http://schemas.microsoft.com/office/word/2012/wordml" xmlns:w16cex="http://schemas.microsoft.com/office/word/2018/wordml/cex" xmlns:w16cid="http://schemas.microsoft.com/office/word/2016/wordml/cid" xmlns:w16="http://schemas.microsoft.com/office/word/2018/wordml" xmlns:w16sdtdh="http://schemas.microsoft.com/office/word/2020/wordml/sdtdatahash" xmlns:w16se="http://schemas.microsoft.com/office/word/2015/wordml/symex" xmlns:wpg="http://schemas.microsoft.com/office/word/2010/wordprocessingGroup" xmlns:wpi="http://schemas.microsoft.com/office/word/2010/wordprocessingInk" xmlns:wne="http://schemas.microsoft.com/office/word/2006/wordml" xmlns:wps="http://schemas.microsoft.com/office/word/2010/wordprocessingShape" mc:Ignorable="w14 w15 w16se w16cid w16 w16cex w16sdtdh wp14">
   <w:endnote w:type="separator" w:id="-1">
     <w:p>
       <w:pPr>
@@ -2581,7 +2523,7 @@
 </file>
 
 <file path=word/footer1.xml><?xml version="1.0" encoding="utf-8"?>
-<w:ftr xmlns:wpc="http://schemas.microsoft.com/office/word/2010/wordprocessingCanvas" xmlns:mc="http://schemas.openxmlformats.org/markup-compatibility/2006" xmlns:o="urn:schemas-microsoft-com:office:office" xmlns:r="http://schemas.openxmlformats.org/officeDocument/2006/relationships" xmlns:m="http://schemas.openxmlformats.org/officeDocument/2006/math" xmlns:v="urn:schemas-microsoft-com:vml" xmlns:wp14="http://schemas.microsoft.com/office/word/2010/wordprocessingDrawing" xmlns:wp="http://schemas.openxmlformats.org/drawingml/2006/wordprocessingDrawing" xmlns:w10="urn:schemas-microsoft-com:office:word" xmlns:w="http://schemas.openxmlformats.org/wordprocessingml/2006/main" xmlns:w14="http://schemas.microsoft.com/office/word/2010/wordml" xmlns:wpg="http://schemas.microsoft.com/office/word/2010/wordprocessingGroup" xmlns:wpi="http://schemas.microsoft.com/office/word/2010/wordprocessingInk" xmlns:wne="http://schemas.microsoft.com/office/word/2006/wordml" xmlns:wps="http://schemas.microsoft.com/office/word/2010/wordprocessingShape" mc:Ignorable="w14 wp14">
+<w:ftr xmlns:wpc="http://schemas.microsoft.com/office/word/2010/wordprocessingCanvas" xmlns:cx="http://schemas.microsoft.com/office/drawing/2014/chartex" xmlns:cx1="http://schemas.microsoft.com/office/drawing/2015/9/8/chartex" xmlns:cx2="http://schemas.microsoft.com/office/drawing/2015/10/21/chartex" xmlns:cx3="http://schemas.microsoft.com/office/drawing/2016/5/9/chartex" xmlns:cx4="http://schemas.microsoft.com/office/drawing/2016/5/10/chartex" xmlns:cx5="http://schemas.microsoft.com/office/drawing/2016/5/11/chartex" xmlns:cx6="http://schemas.microsoft.com/office/drawing/2016/5/12/chartex" xmlns:cx7="http://schemas.microsoft.com/office/drawing/2016/5/13/chartex" xmlns:cx8="http://schemas.microsoft.com/office/drawing/2016/5/14/chartex" xmlns:mc="http://schemas.openxmlformats.org/markup-compatibility/2006" xmlns:aink="http://schemas.microsoft.com/office/drawing/2016/ink" xmlns:am3d="http://schemas.microsoft.com/office/drawing/2017/model3d" xmlns:o="urn:schemas-microsoft-com:office:office" xmlns:r="http://schemas.openxmlformats.org/officeDocument/2006/relationships" xmlns:m="http://schemas.openxmlformats.org/officeDocument/2006/math" xmlns:v="urn:schemas-microsoft-com:vml" xmlns:wp14="http://schemas.microsoft.com/office/word/2010/wordprocessingDrawing" xmlns:wp="http://schemas.openxmlformats.org/drawingml/2006/wordprocessingDrawing" xmlns:w10="urn:schemas-microsoft-com:office:word" xmlns:w="http://schemas.openxmlformats.org/wordprocessingml/2006/main" xmlns:w14="http://schemas.microsoft.com/office/word/2010/wordml" xmlns:w15="http://schemas.microsoft.com/office/word/2012/wordml" xmlns:w16cex="http://schemas.microsoft.com/office/word/2018/wordml/cex" xmlns:w16cid="http://schemas.microsoft.com/office/word/2016/wordml/cid" xmlns:w16="http://schemas.microsoft.com/office/word/2018/wordml" xmlns:w16sdtdh="http://schemas.microsoft.com/office/word/2020/wordml/sdtdatahash" xmlns:w16se="http://schemas.microsoft.com/office/word/2015/wordml/symex" xmlns:wpg="http://schemas.microsoft.com/office/word/2010/wordprocessingGroup" xmlns:wpi="http://schemas.microsoft.com/office/word/2010/wordprocessingInk" xmlns:wne="http://schemas.microsoft.com/office/word/2006/wordml" xmlns:wps="http://schemas.microsoft.com/office/word/2010/wordprocessingShape" mc:Ignorable="w14 w15 w16se w16cid w16 w16cex w16sdtdh wp14">
   <w:p>
     <w:pPr>
       <w:pStyle w:val="Footer"/>
@@ -2591,7 +2533,7 @@
 </file>
 
 <file path=word/footer2.xml><?xml version="1.0" encoding="utf-8"?>
-<w:ftr xmlns:wpc="http://schemas.microsoft.com/office/word/2010/wordprocessingCanvas" xmlns:mc="http://schemas.openxmlformats.org/markup-compatibility/2006" xmlns:o="urn:schemas-microsoft-com:office:office" xmlns:r="http://schemas.openxmlformats.org/officeDocument/2006/relationships" xmlns:m="http://schemas.openxmlformats.org/officeDocument/2006/math" xmlns:v="urn:schemas-microsoft-com:vml" xmlns:wp14="http://schemas.microsoft.com/office/word/2010/wordprocessingDrawing" xmlns:wp="http://schemas.openxmlformats.org/drawingml/2006/wordprocessingDrawing" xmlns:w10="urn:schemas-microsoft-com:office:word" xmlns:w="http://schemas.openxmlformats.org/wordprocessingml/2006/main" xmlns:w14="http://schemas.microsoft.com/office/word/2010/wordml" xmlns:wpg="http://schemas.microsoft.com/office/word/2010/wordprocessingGroup" xmlns:wpi="http://schemas.microsoft.com/office/word/2010/wordprocessingInk" xmlns:wne="http://schemas.microsoft.com/office/word/2006/wordml" xmlns:wps="http://schemas.microsoft.com/office/word/2010/wordprocessingShape" mc:Ignorable="w14 wp14">
+<w:ftr xmlns:wpc="http://schemas.microsoft.com/office/word/2010/wordprocessingCanvas" xmlns:cx="http://schemas.microsoft.com/office/drawing/2014/chartex" xmlns:cx1="http://schemas.microsoft.com/office/drawing/2015/9/8/chartex" xmlns:cx2="http://schemas.microsoft.com/office/drawing/2015/10/21/chartex" xmlns:cx3="http://schemas.microsoft.com/office/drawing/2016/5/9/chartex" xmlns:cx4="http://schemas.microsoft.com/office/drawing/2016/5/10/chartex" xmlns:cx5="http://schemas.microsoft.com/office/drawing/2016/5/11/chartex" xmlns:cx6="http://schemas.microsoft.com/office/drawing/2016/5/12/chartex" xmlns:cx7="http://schemas.microsoft.com/office/drawing/2016/5/13/chartex" xmlns:cx8="http://schemas.microsoft.com/office/drawing/2016/5/14/chartex" xmlns:mc="http://schemas.openxmlformats.org/markup-compatibility/2006" xmlns:aink="http://schemas.microsoft.com/office/drawing/2016/ink" xmlns:am3d="http://schemas.microsoft.com/office/drawing/2017/model3d" xmlns:o="urn:schemas-microsoft-com:office:office" xmlns:r="http://schemas.openxmlformats.org/officeDocument/2006/relationships" xmlns:m="http://schemas.openxmlformats.org/officeDocument/2006/math" xmlns:v="urn:schemas-microsoft-com:vml" xmlns:wp14="http://schemas.microsoft.com/office/word/2010/wordprocessingDrawing" xmlns:wp="http://schemas.openxmlformats.org/drawingml/2006/wordprocessingDrawing" xmlns:w10="urn:schemas-microsoft-com:office:word" xmlns:w="http://schemas.openxmlformats.org/wordprocessingml/2006/main" xmlns:w14="http://schemas.microsoft.com/office/word/2010/wordml" xmlns:w15="http://schemas.microsoft.com/office/word/2012/wordml" xmlns:w16cex="http://schemas.microsoft.com/office/word/2018/wordml/cex" xmlns:w16cid="http://schemas.microsoft.com/office/word/2016/wordml/cid" xmlns:w16="http://schemas.microsoft.com/office/word/2018/wordml" xmlns:w16sdtdh="http://schemas.microsoft.com/office/word/2020/wordml/sdtdatahash" xmlns:w16se="http://schemas.microsoft.com/office/word/2015/wordml/symex" xmlns:wpg="http://schemas.microsoft.com/office/word/2010/wordprocessingGroup" xmlns:wpi="http://schemas.microsoft.com/office/word/2010/wordprocessingInk" xmlns:wne="http://schemas.microsoft.com/office/word/2006/wordml" xmlns:wps="http://schemas.microsoft.com/office/word/2010/wordprocessingShape" mc:Ignorable="w14 w15 w16se w16cid w16 w16cex w16sdtdh wp14">
   <w:p>
     <w:pPr>
       <w:pStyle w:val="Footer"/>
@@ -2601,7 +2543,7 @@
 </file>
 
 <file path=word/footer3.xml><?xml version="1.0" encoding="utf-8"?>
-<w:ftr xmlns:wpc="http://schemas.microsoft.com/office/word/2010/wordprocessingCanvas" xmlns:mc="http://schemas.openxmlformats.org/markup-compatibility/2006" xmlns:o="urn:schemas-microsoft-com:office:office" xmlns:r="http://schemas.openxmlformats.org/officeDocument/2006/relationships" xmlns:m="http://schemas.openxmlformats.org/officeDocument/2006/math" xmlns:v="urn:schemas-microsoft-com:vml" xmlns:wp14="http://schemas.microsoft.com/office/word/2010/wordprocessingDrawing" xmlns:wp="http://schemas.openxmlformats.org/drawingml/2006/wordprocessingDrawing" xmlns:w10="urn:schemas-microsoft-com:office:word" xmlns:w="http://schemas.openxmlformats.org/wordprocessingml/2006/main" xmlns:w14="http://schemas.microsoft.com/office/word/2010/wordml" xmlns:wpg="http://schemas.microsoft.com/office/word/2010/wordprocessingGroup" xmlns:wpi="http://schemas.microsoft.com/office/word/2010/wordprocessingInk" xmlns:wne="http://schemas.microsoft.com/office/word/2006/wordml" xmlns:wps="http://schemas.microsoft.com/office/word/2010/wordprocessingShape" mc:Ignorable="w14 wp14">
+<w:ftr xmlns:wpc="http://schemas.microsoft.com/office/word/2010/wordprocessingCanvas" xmlns:cx="http://schemas.microsoft.com/office/drawing/2014/chartex" xmlns:cx1="http://schemas.microsoft.com/office/drawing/2015/9/8/chartex" xmlns:cx2="http://schemas.microsoft.com/office/drawing/2015/10/21/chartex" xmlns:cx3="http://schemas.microsoft.com/office/drawing/2016/5/9/chartex" xmlns:cx4="http://schemas.microsoft.com/office/drawing/2016/5/10/chartex" xmlns:cx5="http://schemas.microsoft.com/office/drawing/2016/5/11/chartex" xmlns:cx6="http://schemas.microsoft.com/office/drawing/2016/5/12/chartex" xmlns:cx7="http://schemas.microsoft.com/office/drawing/2016/5/13/chartex" xmlns:cx8="http://schemas.microsoft.com/office/drawing/2016/5/14/chartex" xmlns:mc="http://schemas.openxmlformats.org/markup-compatibility/2006" xmlns:aink="http://schemas.microsoft.com/office/drawing/2016/ink" xmlns:am3d="http://schemas.microsoft.com/office/drawing/2017/model3d" xmlns:o="urn:schemas-microsoft-com:office:office" xmlns:r="http://schemas.openxmlformats.org/officeDocument/2006/relationships" xmlns:m="http://schemas.openxmlformats.org/officeDocument/2006/math" xmlns:v="urn:schemas-microsoft-com:vml" xmlns:wp14="http://schemas.microsoft.com/office/word/2010/wordprocessingDrawing" xmlns:wp="http://schemas.openxmlformats.org/drawingml/2006/wordprocessingDrawing" xmlns:w10="urn:schemas-microsoft-com:office:word" xmlns:w="http://schemas.openxmlformats.org/wordprocessingml/2006/main" xmlns:w14="http://schemas.microsoft.com/office/word/2010/wordml" xmlns:w15="http://schemas.microsoft.com/office/word/2012/wordml" xmlns:w16cex="http://schemas.microsoft.com/office/word/2018/wordml/cex" xmlns:w16cid="http://schemas.microsoft.com/office/word/2016/wordml/cid" xmlns:w16="http://schemas.microsoft.com/office/word/2018/wordml" xmlns:w16sdtdh="http://schemas.microsoft.com/office/word/2020/wordml/sdtdatahash" xmlns:w16se="http://schemas.microsoft.com/office/word/2015/wordml/symex" xmlns:wpg="http://schemas.microsoft.com/office/word/2010/wordprocessingGroup" xmlns:wpi="http://schemas.microsoft.com/office/word/2010/wordprocessingInk" xmlns:wne="http://schemas.microsoft.com/office/word/2006/wordml" xmlns:wps="http://schemas.microsoft.com/office/word/2010/wordprocessingShape" mc:Ignorable="w14 w15 w16se w16cid w16 w16cex w16sdtdh wp14">
   <w:p>
     <w:pPr>
       <w:pStyle w:val="Footer"/>
@@ -2611,7 +2553,7 @@
 </file>
 
 <file path=word/footnotes.xml><?xml version="1.0" encoding="utf-8"?>
-<w:footnotes xmlns:wpc="http://schemas.microsoft.com/office/word/2010/wordprocessingCanvas" xmlns:mc="http://schemas.openxmlformats.org/markup-compatibility/2006" xmlns:o="urn:schemas-microsoft-com:office:office" xmlns:r="http://schemas.openxmlformats.org/officeDocument/2006/relationships" xmlns:m="http://schemas.openxmlformats.org/officeDocument/2006/math" xmlns:v="urn:schemas-microsoft-com:vml" xmlns:wp14="http://schemas.microsoft.com/office/word/2010/wordprocessingDrawing" xmlns:wp="http://schemas.openxmlformats.org/drawingml/2006/wordprocessingDrawing" xmlns:w10="urn:schemas-microsoft-com:office:word" xmlns:w="http://schemas.openxmlformats.org/wordprocessingml/2006/main" xmlns:w14="http://schemas.microsoft.com/office/word/2010/wordml" xmlns:wpg="http://schemas.microsoft.com/office/word/2010/wordprocessingGroup" xmlns:wpi="http://schemas.microsoft.com/office/word/2010/wordprocessingInk" xmlns:wne="http://schemas.microsoft.com/office/word/2006/wordml" xmlns:wps="http://schemas.microsoft.com/office/word/2010/wordprocessingShape" mc:Ignorable="w14 wp14">
+<w:footnotes xmlns:wpc="http://schemas.microsoft.com/office/word/2010/wordprocessingCanvas" xmlns:cx="http://schemas.microsoft.com/office/drawing/2014/chartex" xmlns:cx1="http://schemas.microsoft.com/office/drawing/2015/9/8/chartex" xmlns:cx2="http://schemas.microsoft.com/office/drawing/2015/10/21/chartex" xmlns:cx3="http://schemas.microsoft.com/office/drawing/2016/5/9/chartex" xmlns:cx4="http://schemas.microsoft.com/office/drawing/2016/5/10/chartex" xmlns:cx5="http://schemas.microsoft.com/office/drawing/2016/5/11/chartex" xmlns:cx6="http://schemas.microsoft.com/office/drawing/2016/5/12/chartex" xmlns:cx7="http://schemas.microsoft.com/office/drawing/2016/5/13/chartex" xmlns:cx8="http://schemas.microsoft.com/office/drawing/2016/5/14/chartex" xmlns:mc="http://schemas.openxmlformats.org/markup-compatibility/2006" xmlns:aink="http://schemas.microsoft.com/office/drawing/2016/ink" xmlns:am3d="http://schemas.microsoft.com/office/drawing/2017/model3d" xmlns:o="urn:schemas-microsoft-com:office:office" xmlns:r="http://schemas.openxmlformats.org/officeDocument/2006/relationships" xmlns:m="http://schemas.openxmlformats.org/officeDocument/2006/math" xmlns:v="urn:schemas-microsoft-com:vml" xmlns:wp14="http://schemas.microsoft.com/office/word/2010/wordprocessingDrawing" xmlns:wp="http://schemas.openxmlformats.org/drawingml/2006/wordprocessingDrawing" xmlns:w10="urn:schemas-microsoft-com:office:word" xmlns:w="http://schemas.openxmlformats.org/wordprocessingml/2006/main" xmlns:w14="http://schemas.microsoft.com/office/word/2010/wordml" xmlns:w15="http://schemas.microsoft.com/office/word/2012/wordml" xmlns:w16cex="http://schemas.microsoft.com/office/word/2018/wordml/cex" xmlns:w16cid="http://schemas.microsoft.com/office/word/2016/wordml/cid" xmlns:w16="http://schemas.microsoft.com/office/word/2018/wordml" xmlns:w16sdtdh="http://schemas.microsoft.com/office/word/2020/wordml/sdtdatahash" xmlns:w16se="http://schemas.microsoft.com/office/word/2015/wordml/symex" xmlns:wpg="http://schemas.microsoft.com/office/word/2010/wordprocessingGroup" xmlns:wpi="http://schemas.microsoft.com/office/word/2010/wordprocessingInk" xmlns:wne="http://schemas.microsoft.com/office/word/2006/wordml" xmlns:wps="http://schemas.microsoft.com/office/word/2010/wordprocessingShape" mc:Ignorable="w14 w15 w16se w16cid w16 w16cex w16sdtdh wp14">
   <w:footnote w:type="separator" w:id="-1">
     <w:p>
       <w:pPr>
@@ -2636,7 +2578,7 @@
 </file>
 
 <file path=word/header1.xml><?xml version="1.0" encoding="utf-8"?>
-<w:hdr xmlns:wpc="http://schemas.microsoft.com/office/word/2010/wordprocessingCanvas" xmlns:mc="http://schemas.openxmlformats.org/markup-compatibility/2006" xmlns:o="urn:schemas-microsoft-com:office:office" xmlns:r="http://schemas.openxmlformats.org/officeDocument/2006/relationships" xmlns:m="http://schemas.openxmlformats.org/officeDocument/2006/math" xmlns:v="urn:schemas-microsoft-com:vml" xmlns:wp14="http://schemas.microsoft.com/office/word/2010/wordprocessingDrawing" xmlns:wp="http://schemas.openxmlformats.org/drawingml/2006/wordprocessingDrawing" xmlns:w10="urn:schemas-microsoft-com:office:word" xmlns:w="http://schemas.openxmlformats.org/wordprocessingml/2006/main" xmlns:w14="http://schemas.microsoft.com/office/word/2010/wordml" xmlns:wpg="http://schemas.microsoft.com/office/word/2010/wordprocessingGroup" xmlns:wpi="http://schemas.microsoft.com/office/word/2010/wordprocessingInk" xmlns:wne="http://schemas.microsoft.com/office/word/2006/wordml" xmlns:wps="http://schemas.microsoft.com/office/word/2010/wordprocessingShape" mc:Ignorable="w14 wp14">
+<w:hdr xmlns:wpc="http://schemas.microsoft.com/office/word/2010/wordprocessingCanvas" xmlns:cx="http://schemas.microsoft.com/office/drawing/2014/chartex" xmlns:cx1="http://schemas.microsoft.com/office/drawing/2015/9/8/chartex" xmlns:cx2="http://schemas.microsoft.com/office/drawing/2015/10/21/chartex" xmlns:cx3="http://schemas.microsoft.com/office/drawing/2016/5/9/chartex" xmlns:cx4="http://schemas.microsoft.com/office/drawing/2016/5/10/chartex" xmlns:cx5="http://schemas.microsoft.com/office/drawing/2016/5/11/chartex" xmlns:cx6="http://schemas.microsoft.com/office/drawing/2016/5/12/chartex" xmlns:cx7="http://schemas.microsoft.com/office/drawing/2016/5/13/chartex" xmlns:cx8="http://schemas.microsoft.com/office/drawing/2016/5/14/chartex" xmlns:mc="http://schemas.openxmlformats.org/markup-compatibility/2006" xmlns:aink="http://schemas.microsoft.com/office/drawing/2016/ink" xmlns:am3d="http://schemas.microsoft.com/office/drawing/2017/model3d" xmlns:o="urn:schemas-microsoft-com:office:office" xmlns:r="http://schemas.openxmlformats.org/officeDocument/2006/relationships" xmlns:m="http://schemas.openxmlformats.org/officeDocument/2006/math" xmlns:v="urn:schemas-microsoft-com:vml" xmlns:wp14="http://schemas.microsoft.com/office/word/2010/wordprocessingDrawing" xmlns:wp="http://schemas.openxmlformats.org/drawingml/2006/wordprocessingDrawing" xmlns:w10="urn:schemas-microsoft-com:office:word" xmlns:w="http://schemas.openxmlformats.org/wordprocessingml/2006/main" xmlns:w14="http://schemas.microsoft.com/office/word/2010/wordml" xmlns:w15="http://schemas.microsoft.com/office/word/2012/wordml" xmlns:w16cex="http://schemas.microsoft.com/office/word/2018/wordml/cex" xmlns:w16cid="http://schemas.microsoft.com/office/word/2016/wordml/cid" xmlns:w16="http://schemas.microsoft.com/office/word/2018/wordml" xmlns:w16sdtdh="http://schemas.microsoft.com/office/word/2020/wordml/sdtdatahash" xmlns:w16se="http://schemas.microsoft.com/office/word/2015/wordml/symex" xmlns:wpg="http://schemas.microsoft.com/office/word/2010/wordprocessingGroup" xmlns:wpi="http://schemas.microsoft.com/office/word/2010/wordprocessingInk" xmlns:wne="http://schemas.microsoft.com/office/word/2006/wordml" xmlns:wps="http://schemas.microsoft.com/office/word/2010/wordprocessingShape" mc:Ignorable="w14 w15 w16se w16cid w16 w16cex w16sdtdh wp14">
   <w:p>
     <w:pPr>
       <w:pStyle w:val="Header"/>
@@ -2646,7 +2588,7 @@
 </file>
 
 <file path=word/header2.xml><?xml version="1.0" encoding="utf-8"?>
-<w:hdr xmlns:wpc="http://schemas.microsoft.com/office/word/2010/wordprocessingCanvas" xmlns:mc="http://schemas.openxmlformats.org/markup-compatibility/2006" xmlns:o="urn:schemas-microsoft-com:office:office" xmlns:r="http://schemas.openxmlformats.org/officeDocument/2006/relationships" xmlns:m="http://schemas.openxmlformats.org/officeDocument/2006/math" xmlns:v="urn:schemas-microsoft-com:vml" xmlns:wp14="http://schemas.microsoft.com/office/word/2010/wordprocessingDrawing" xmlns:wp="http://schemas.openxmlformats.org/drawingml/2006/wordprocessingDrawing" xmlns:w10="urn:schemas-microsoft-com:office:word" xmlns:w="http://schemas.openxmlformats.org/wordprocessingml/2006/main" xmlns:w14="http://schemas.microsoft.com/office/word/2010/wordml" xmlns:wpg="http://schemas.microsoft.com/office/word/2010/wordprocessingGroup" xmlns:wpi="http://schemas.microsoft.com/office/word/2010/wordprocessingInk" xmlns:wne="http://schemas.microsoft.com/office/word/2006/wordml" xmlns:wps="http://schemas.microsoft.com/office/word/2010/wordprocessingShape" mc:Ignorable="w14 wp14">
+<w:hdr xmlns:wpc="http://schemas.microsoft.com/office/word/2010/wordprocessingCanvas" xmlns:cx="http://schemas.microsoft.com/office/drawing/2014/chartex" xmlns:cx1="http://schemas.microsoft.com/office/drawing/2015/9/8/chartex" xmlns:cx2="http://schemas.microsoft.com/office/drawing/2015/10/21/chartex" xmlns:cx3="http://schemas.microsoft.com/office/drawing/2016/5/9/chartex" xmlns:cx4="http://schemas.microsoft.com/office/drawing/2016/5/10/chartex" xmlns:cx5="http://schemas.microsoft.com/office/drawing/2016/5/11/chartex" xmlns:cx6="http://schemas.microsoft.com/office/drawing/2016/5/12/chartex" xmlns:cx7="http://schemas.microsoft.com/office/drawing/2016/5/13/chartex" xmlns:cx8="http://schemas.microsoft.com/office/drawing/2016/5/14/chartex" xmlns:mc="http://schemas.openxmlformats.org/markup-compatibility/2006" xmlns:aink="http://schemas.microsoft.com/office/drawing/2016/ink" xmlns:am3d="http://schemas.microsoft.com/office/drawing/2017/model3d" xmlns:o="urn:schemas-microsoft-com:office:office" xmlns:r="http://schemas.openxmlformats.org/officeDocument/2006/relationships" xmlns:m="http://schemas.openxmlformats.org/officeDocument/2006/math" xmlns:v="urn:schemas-microsoft-com:vml" xmlns:wp14="http://schemas.microsoft.com/office/word/2010/wordprocessingDrawing" xmlns:wp="http://schemas.openxmlformats.org/drawingml/2006/wordprocessingDrawing" xmlns:w10="urn:schemas-microsoft-com:office:word" xmlns:w="http://schemas.openxmlformats.org/wordprocessingml/2006/main" xmlns:w14="http://schemas.microsoft.com/office/word/2010/wordml" xmlns:w15="http://schemas.microsoft.com/office/word/2012/wordml" xmlns:w16cex="http://schemas.microsoft.com/office/word/2018/wordml/cex" xmlns:w16cid="http://schemas.microsoft.com/office/word/2016/wordml/cid" xmlns:w16="http://schemas.microsoft.com/office/word/2018/wordml" xmlns:w16sdtdh="http://schemas.microsoft.com/office/word/2020/wordml/sdtdatahash" xmlns:w16se="http://schemas.microsoft.com/office/word/2015/wordml/symex" xmlns:wpg="http://schemas.microsoft.com/office/word/2010/wordprocessingGroup" xmlns:wpi="http://schemas.microsoft.com/office/word/2010/wordprocessingInk" xmlns:wne="http://schemas.microsoft.com/office/word/2006/wordml" xmlns:wps="http://schemas.microsoft.com/office/word/2010/wordprocessingShape" mc:Ignorable="w14 w15 w16se w16cid w16 w16cex w16sdtdh wp14">
   <w:p>
     <w:pPr>
       <w:pStyle w:val="Header"/>
@@ -2656,7 +2598,7 @@
 </file>
 
 <file path=word/header3.xml><?xml version="1.0" encoding="utf-8"?>
-<w:hdr xmlns:wpc="http://schemas.microsoft.com/office/word/2010/wordprocessingCanvas" xmlns:mc="http://schemas.openxmlformats.org/markup-compatibility/2006" xmlns:o="urn:schemas-microsoft-com:office:office" xmlns:r="http://schemas.openxmlformats.org/officeDocument/2006/relationships" xmlns:m="http://schemas.openxmlformats.org/officeDocument/2006/math" xmlns:v="urn:schemas-microsoft-com:vml" xmlns:wp14="http://schemas.microsoft.com/office/word/2010/wordprocessingDrawing" xmlns:wp="http://schemas.openxmlformats.org/drawingml/2006/wordprocessingDrawing" xmlns:w10="urn:schemas-microsoft-com:office:word" xmlns:w="http://schemas.openxmlformats.org/wordprocessingml/2006/main" xmlns:w14="http://schemas.microsoft.com/office/word/2010/wordml" xmlns:wpg="http://schemas.microsoft.com/office/word/2010/wordprocessingGroup" xmlns:wpi="http://schemas.microsoft.com/office/word/2010/wordprocessingInk" xmlns:wne="http://schemas.microsoft.com/office/word/2006/wordml" xmlns:wps="http://schemas.microsoft.com/office/word/2010/wordprocessingShape" mc:Ignorable="w14 wp14">
+<w:hdr xmlns:wpc="http://schemas.microsoft.com/office/word/2010/wordprocessingCanvas" xmlns:cx="http://schemas.microsoft.com/office/drawing/2014/chartex" xmlns:cx1="http://schemas.microsoft.com/office/drawing/2015/9/8/chartex" xmlns:cx2="http://schemas.microsoft.com/office/drawing/2015/10/21/chartex" xmlns:cx3="http://schemas.microsoft.com/office/drawing/2016/5/9/chartex" xmlns:cx4="http://schemas.microsoft.com/office/drawing/2016/5/10/chartex" xmlns:cx5="http://schemas.microsoft.com/office/drawing/2016/5/11/chartex" xmlns:cx6="http://schemas.microsoft.com/office/drawing/2016/5/12/chartex" xmlns:cx7="http://schemas.microsoft.com/office/drawing/2016/5/13/chartex" xmlns:cx8="http://schemas.microsoft.com/office/drawing/2016/5/14/chartex" xmlns:mc="http://schemas.openxmlformats.org/markup-compatibility/2006" xmlns:aink="http://schemas.microsoft.com/office/drawing/2016/ink" xmlns:am3d="http://schemas.microsoft.com/office/drawing/2017/model3d" xmlns:o="urn:schemas-microsoft-com:office:office" xmlns:r="http://schemas.openxmlformats.org/officeDocument/2006/relationships" xmlns:m="http://schemas.openxmlformats.org/officeDocument/2006/math" xmlns:v="urn:schemas-microsoft-com:vml" xmlns:wp14="http://schemas.microsoft.com/office/word/2010/wordprocessingDrawing" xmlns:wp="http://schemas.openxmlformats.org/drawingml/2006/wordprocessingDrawing" xmlns:w10="urn:schemas-microsoft-com:office:word" xmlns:w="http://schemas.openxmlformats.org/wordprocessingml/2006/main" xmlns:w14="http://schemas.microsoft.com/office/word/2010/wordml" xmlns:w15="http://schemas.microsoft.com/office/word/2012/wordml" xmlns:w16cex="http://schemas.microsoft.com/office/word/2018/wordml/cex" xmlns:w16cid="http://schemas.microsoft.com/office/word/2016/wordml/cid" xmlns:w16="http://schemas.microsoft.com/office/word/2018/wordml" xmlns:w16sdtdh="http://schemas.microsoft.com/office/word/2020/wordml/sdtdatahash" xmlns:w16se="http://schemas.microsoft.com/office/word/2015/wordml/symex" xmlns:wpg="http://schemas.microsoft.com/office/word/2010/wordprocessingGroup" xmlns:wpi="http://schemas.microsoft.com/office/word/2010/wordprocessingInk" xmlns:wne="http://schemas.microsoft.com/office/word/2006/wordml" xmlns:wps="http://schemas.microsoft.com/office/word/2010/wordprocessingShape" mc:Ignorable="w14 w15 w16se w16cid w16 w16cex w16sdtdh wp14">
   <w:p>
     <w:pPr>
       <w:pStyle w:val="Header"/>
@@ -2666,8 +2608,8 @@
 </file>
 
 <file path=word/numbering.xml><?xml version="1.0" encoding="utf-8"?>
-<w:numbering xmlns:wpc="http://schemas.microsoft.com/office/word/2010/wordprocessingCanvas" xmlns:mc="http://schemas.openxmlformats.org/markup-compatibility/2006" xmlns:o="urn:schemas-microsoft-com:office:office" xmlns:r="http://schemas.openxmlformats.org/officeDocument/2006/relationships" xmlns:m="http://schemas.openxmlformats.org/officeDocument/2006/math" xmlns:v="urn:schemas-microsoft-com:vml" xmlns:wp14="http://schemas.microsoft.com/office/word/2010/wordprocessingDrawing" xmlns:wp="http://schemas.openxmlformats.org/drawingml/2006/wordprocessingDrawing" xmlns:w10="urn:schemas-microsoft-com:office:word" xmlns:w="http://schemas.openxmlformats.org/wordprocessingml/2006/main" xmlns:w14="http://schemas.microsoft.com/office/word/2010/wordml" xmlns:wpg="http://schemas.microsoft.com/office/word/2010/wordprocessingGroup" xmlns:wpi="http://schemas.microsoft.com/office/word/2010/wordprocessingInk" xmlns:wne="http://schemas.microsoft.com/office/word/2006/wordml" xmlns:wps="http://schemas.microsoft.com/office/word/2010/wordprocessingShape" mc:Ignorable="w14 wp14">
-  <w:abstractNum w:abstractNumId="0">
+<w:numbering xmlns:wpc="http://schemas.microsoft.com/office/word/2010/wordprocessingCanvas" xmlns:cx="http://schemas.microsoft.com/office/drawing/2014/chartex" xmlns:cx1="http://schemas.microsoft.com/office/drawing/2015/9/8/chartex" xmlns:cx2="http://schemas.microsoft.com/office/drawing/2015/10/21/chartex" xmlns:cx3="http://schemas.microsoft.com/office/drawing/2016/5/9/chartex" xmlns:cx4="http://schemas.microsoft.com/office/drawing/2016/5/10/chartex" xmlns:cx5="http://schemas.microsoft.com/office/drawing/2016/5/11/chartex" xmlns:cx6="http://schemas.microsoft.com/office/drawing/2016/5/12/chartex" xmlns:cx7="http://schemas.microsoft.com/office/drawing/2016/5/13/chartex" xmlns:cx8="http://schemas.microsoft.com/office/drawing/2016/5/14/chartex" xmlns:mc="http://schemas.openxmlformats.org/markup-compatibility/2006" xmlns:aink="http://schemas.microsoft.com/office/drawing/2016/ink" xmlns:am3d="http://schemas.microsoft.com/office/drawing/2017/model3d" xmlns:o="urn:schemas-microsoft-com:office:office" xmlns:r="http://schemas.openxmlformats.org/officeDocument/2006/relationships" xmlns:m="http://schemas.openxmlformats.org/officeDocument/2006/math" xmlns:v="urn:schemas-microsoft-com:vml" xmlns:wp14="http://schemas.microsoft.com/office/word/2010/wordprocessingDrawing" xmlns:wp="http://schemas.openxmlformats.org/drawingml/2006/wordprocessingDrawing" xmlns:w10="urn:schemas-microsoft-com:office:word" xmlns:w="http://schemas.openxmlformats.org/wordprocessingml/2006/main" xmlns:w14="http://schemas.microsoft.com/office/word/2010/wordml" xmlns:w15="http://schemas.microsoft.com/office/word/2012/wordml" xmlns:w16cex="http://schemas.microsoft.com/office/word/2018/wordml/cex" xmlns:w16cid="http://schemas.microsoft.com/office/word/2016/wordml/cid" xmlns:w16="http://schemas.microsoft.com/office/word/2018/wordml" xmlns:w16sdtdh="http://schemas.microsoft.com/office/word/2020/wordml/sdtdatahash" xmlns:w16se="http://schemas.microsoft.com/office/word/2015/wordml/symex" xmlns:wpg="http://schemas.microsoft.com/office/word/2010/wordprocessingGroup" xmlns:wpi="http://schemas.microsoft.com/office/word/2010/wordprocessingInk" xmlns:wne="http://schemas.microsoft.com/office/word/2006/wordml" xmlns:wps="http://schemas.microsoft.com/office/word/2010/wordprocessingShape" mc:Ignorable="w14 w15 w16se w16cid w16 w16cex w16sdtdh wp14">
+  <w:abstractNum w:abstractNumId="0" w15:restartNumberingAfterBreak="0">
     <w:nsid w:val="073E10F3"/>
     <w:multiLevelType w:val="hybridMultilevel"/>
     <w:tmpl w:val="8504561E"/>
@@ -2779,7 +2721,7 @@
       </w:rPr>
     </w:lvl>
   </w:abstractNum>
-  <w:abstractNum w:abstractNumId="1">
+  <w:abstractNum w:abstractNumId="1" w15:restartNumberingAfterBreak="0">
     <w:nsid w:val="08C6366F"/>
     <w:multiLevelType w:val="hybridMultilevel"/>
     <w:tmpl w:val="D3561CAA"/>
@@ -2866,7 +2808,7 @@
       </w:pPr>
     </w:lvl>
   </w:abstractNum>
-  <w:abstractNum w:abstractNumId="2">
+  <w:abstractNum w:abstractNumId="2" w15:restartNumberingAfterBreak="0">
     <w:nsid w:val="09F353E3"/>
     <w:multiLevelType w:val="hybridMultilevel"/>
     <w:tmpl w:val="EE5CFEAC"/>
@@ -2979,7 +2921,7 @@
       </w:rPr>
     </w:lvl>
   </w:abstractNum>
-  <w:abstractNum w:abstractNumId="3">
+  <w:abstractNum w:abstractNumId="3" w15:restartNumberingAfterBreak="0">
     <w:nsid w:val="0C357DD6"/>
     <w:multiLevelType w:val="hybridMultilevel"/>
     <w:tmpl w:val="D83AD7E4"/>
@@ -3070,7 +3012,7 @@
       </w:pPr>
     </w:lvl>
   </w:abstractNum>
-  <w:abstractNum w:abstractNumId="4">
+  <w:abstractNum w:abstractNumId="4" w15:restartNumberingAfterBreak="0">
     <w:nsid w:val="0DEA069D"/>
     <w:multiLevelType w:val="multilevel"/>
     <w:tmpl w:val="450C4EF6"/>
@@ -3211,7 +3153,7 @@
       </w:rPr>
     </w:lvl>
   </w:abstractNum>
-  <w:abstractNum w:abstractNumId="5">
+  <w:abstractNum w:abstractNumId="5" w15:restartNumberingAfterBreak="0">
     <w:nsid w:val="1323523E"/>
     <w:multiLevelType w:val="multilevel"/>
     <w:tmpl w:val="873C83DA"/>
@@ -3368,7 +3310,7 @@
       </w:rPr>
     </w:lvl>
   </w:abstractNum>
-  <w:abstractNum w:abstractNumId="6">
+  <w:abstractNum w:abstractNumId="6" w15:restartNumberingAfterBreak="0">
     <w:nsid w:val="15510218"/>
     <w:multiLevelType w:val="hybridMultilevel"/>
     <w:tmpl w:val="8EF49D20"/>
@@ -3458,7 +3400,7 @@
       </w:pPr>
     </w:lvl>
   </w:abstractNum>
-  <w:abstractNum w:abstractNumId="7">
+  <w:abstractNum w:abstractNumId="7" w15:restartNumberingAfterBreak="0">
     <w:nsid w:val="253D4794"/>
     <w:multiLevelType w:val="multilevel"/>
     <w:tmpl w:val="8C80AB36"/>
@@ -3571,7 +3513,7 @@
       </w:rPr>
     </w:lvl>
   </w:abstractNum>
-  <w:abstractNum w:abstractNumId="8">
+  <w:abstractNum w:abstractNumId="8" w15:restartNumberingAfterBreak="0">
     <w:nsid w:val="27FF20A5"/>
     <w:multiLevelType w:val="hybridMultilevel"/>
     <w:tmpl w:val="9036D3D8"/>
@@ -3686,7 +3628,7 @@
       </w:rPr>
     </w:lvl>
   </w:abstractNum>
-  <w:abstractNum w:abstractNumId="9">
+  <w:abstractNum w:abstractNumId="9" w15:restartNumberingAfterBreak="0">
     <w:nsid w:val="296F3872"/>
     <w:multiLevelType w:val="hybridMultilevel"/>
     <w:tmpl w:val="5E9E6A2E"/>
@@ -3800,7 +3742,7 @@
       </w:rPr>
     </w:lvl>
   </w:abstractNum>
-  <w:abstractNum w:abstractNumId="10">
+  <w:abstractNum w:abstractNumId="10" w15:restartNumberingAfterBreak="0">
     <w:nsid w:val="3BB67316"/>
     <w:multiLevelType w:val="hybridMultilevel"/>
     <w:tmpl w:val="D2A20BEA"/>
@@ -3913,7 +3855,7 @@
       </w:rPr>
     </w:lvl>
   </w:abstractNum>
-  <w:abstractNum w:abstractNumId="11">
+  <w:abstractNum w:abstractNumId="11" w15:restartNumberingAfterBreak="0">
     <w:nsid w:val="416740F3"/>
     <w:multiLevelType w:val="hybridMultilevel"/>
     <w:tmpl w:val="F012AB78"/>
@@ -4026,7 +3968,7 @@
       </w:rPr>
     </w:lvl>
   </w:abstractNum>
-  <w:abstractNum w:abstractNumId="12">
+  <w:abstractNum w:abstractNumId="12" w15:restartNumberingAfterBreak="0">
     <w:nsid w:val="4803540D"/>
     <w:multiLevelType w:val="hybridMultilevel"/>
     <w:tmpl w:val="CC58063A"/>
@@ -4140,7 +4082,7 @@
       </w:rPr>
     </w:lvl>
   </w:abstractNum>
-  <w:abstractNum w:abstractNumId="13">
+  <w:abstractNum w:abstractNumId="13" w15:restartNumberingAfterBreak="0">
     <w:nsid w:val="492F4D8F"/>
     <w:multiLevelType w:val="hybridMultilevel"/>
     <w:tmpl w:val="F62C94DE"/>
@@ -4254,7 +4196,7 @@
       </w:rPr>
     </w:lvl>
   </w:abstractNum>
-  <w:abstractNum w:abstractNumId="14">
+  <w:abstractNum w:abstractNumId="14" w15:restartNumberingAfterBreak="0">
     <w:nsid w:val="527D4778"/>
     <w:multiLevelType w:val="hybridMultilevel"/>
     <w:tmpl w:val="EE8038B2"/>
@@ -4367,7 +4309,7 @@
       </w:rPr>
     </w:lvl>
   </w:abstractNum>
-  <w:abstractNum w:abstractNumId="15">
+  <w:abstractNum w:abstractNumId="15" w15:restartNumberingAfterBreak="0">
     <w:nsid w:val="5A0B13C4"/>
     <w:multiLevelType w:val="hybridMultilevel"/>
     <w:tmpl w:val="E84E7C10"/>
@@ -4480,7 +4422,7 @@
       </w:rPr>
     </w:lvl>
   </w:abstractNum>
-  <w:abstractNum w:abstractNumId="16">
+  <w:abstractNum w:abstractNumId="16" w15:restartNumberingAfterBreak="0">
     <w:nsid w:val="636B498A"/>
     <w:multiLevelType w:val="hybridMultilevel"/>
     <w:tmpl w:val="1032CF60"/>
@@ -4593,7 +4535,7 @@
       </w:rPr>
     </w:lvl>
   </w:abstractNum>
-  <w:abstractNum w:abstractNumId="17">
+  <w:abstractNum w:abstractNumId="17" w15:restartNumberingAfterBreak="0">
     <w:nsid w:val="6774194D"/>
     <w:multiLevelType w:val="hybridMultilevel"/>
     <w:tmpl w:val="9CD2C286"/>
@@ -4706,7 +4648,7 @@
       </w:rPr>
     </w:lvl>
   </w:abstractNum>
-  <w:abstractNum w:abstractNumId="18">
+  <w:abstractNum w:abstractNumId="18" w15:restartNumberingAfterBreak="0">
     <w:nsid w:val="6B961852"/>
     <w:multiLevelType w:val="hybridMultilevel"/>
     <w:tmpl w:val="DAAECE10"/>
@@ -4799,7 +4741,7 @@
       </w:pPr>
     </w:lvl>
   </w:abstractNum>
-  <w:abstractNum w:abstractNumId="19">
+  <w:abstractNum w:abstractNumId="19" w15:restartNumberingAfterBreak="0">
     <w:nsid w:val="6DA640A9"/>
     <w:multiLevelType w:val="multilevel"/>
     <w:tmpl w:val="9760A870"/>
@@ -4939,7 +4881,7 @@
       </w:rPr>
     </w:lvl>
   </w:abstractNum>
-  <w:abstractNum w:abstractNumId="20">
+  <w:abstractNum w:abstractNumId="20" w15:restartNumberingAfterBreak="0">
     <w:nsid w:val="7BAF36E9"/>
     <w:multiLevelType w:val="multilevel"/>
     <w:tmpl w:val="24180D92"/>
@@ -5225,7 +5167,7 @@
 </file>
 
 <file path=word/styles.xml><?xml version="1.0" encoding="utf-8"?>
-<w:styles xmlns:mc="http://schemas.openxmlformats.org/markup-compatibility/2006" xmlns:r="http://schemas.openxmlformats.org/officeDocument/2006/relationships" xmlns:w="http://schemas.openxmlformats.org/wordprocessingml/2006/main" xmlns:w14="http://schemas.microsoft.com/office/word/2010/wordml" mc:Ignorable="w14">
+<w:styles xmlns:mc="http://schemas.openxmlformats.org/markup-compatibility/2006" xmlns:r="http://schemas.openxmlformats.org/officeDocument/2006/relationships" xmlns:w="http://schemas.openxmlformats.org/wordprocessingml/2006/main" xmlns:w14="http://schemas.microsoft.com/office/word/2010/wordml" xmlns:w15="http://schemas.microsoft.com/office/word/2012/wordml" xmlns:w16cex="http://schemas.microsoft.com/office/word/2018/wordml/cex" xmlns:w16cid="http://schemas.microsoft.com/office/word/2016/wordml/cid" xmlns:w16="http://schemas.microsoft.com/office/word/2018/wordml" xmlns:w16sdtdh="http://schemas.microsoft.com/office/word/2020/wordml/sdtdatahash" xmlns:w16se="http://schemas.microsoft.com/office/word/2015/wordml/symex" mc:Ignorable="w14 w15 w16se w16cid w16 w16cex w16sdtdh">
   <w:docDefaults>
     <w:rPrDefault>
       <w:rPr>
@@ -5241,147 +5183,383 @@
       </w:pPr>
     </w:pPrDefault>
   </w:docDefaults>
-  <w:latentStyles w:defLockedState="0" w:defUIPriority="99" w:defSemiHidden="1" w:defUnhideWhenUsed="1" w:defQFormat="0" w:count="267">
-    <w:lsdException w:name="Normal" w:semiHidden="0" w:uiPriority="0" w:unhideWhenUsed="0" w:qFormat="1"/>
-    <w:lsdException w:name="heading 1" w:semiHidden="0" w:uiPriority="9" w:unhideWhenUsed="0" w:qFormat="1"/>
-    <w:lsdException w:name="heading 2" w:uiPriority="9" w:qFormat="1"/>
-    <w:lsdException w:name="heading 3" w:uiPriority="9" w:qFormat="1"/>
-    <w:lsdException w:name="heading 4" w:uiPriority="9" w:qFormat="1"/>
-    <w:lsdException w:name="heading 5" w:uiPriority="9" w:qFormat="1"/>
-    <w:lsdException w:name="heading 6" w:uiPriority="9" w:qFormat="1"/>
-    <w:lsdException w:name="heading 7" w:uiPriority="9" w:qFormat="1"/>
-    <w:lsdException w:name="heading 8" w:uiPriority="9" w:qFormat="1"/>
-    <w:lsdException w:name="heading 9" w:uiPriority="9" w:qFormat="1"/>
-    <w:lsdException w:name="toc 1" w:uiPriority="39"/>
-    <w:lsdException w:name="toc 2" w:uiPriority="39"/>
-    <w:lsdException w:name="toc 3" w:uiPriority="39"/>
-    <w:lsdException w:name="toc 4" w:uiPriority="39"/>
-    <w:lsdException w:name="toc 5" w:uiPriority="39"/>
-    <w:lsdException w:name="toc 6" w:uiPriority="39"/>
-    <w:lsdException w:name="toc 7" w:uiPriority="39"/>
-    <w:lsdException w:name="toc 8" w:uiPriority="39"/>
-    <w:lsdException w:name="toc 9" w:uiPriority="39"/>
-    <w:lsdException w:name="annotation text" w:qFormat="1"/>
-    <w:lsdException w:name="caption" w:uiPriority="35" w:qFormat="1"/>
-    <w:lsdException w:name="annotation reference" w:qFormat="1"/>
-    <w:lsdException w:name="Title" w:semiHidden="0" w:uiPriority="10" w:unhideWhenUsed="0" w:qFormat="1"/>
-    <w:lsdException w:name="Default Paragraph Font" w:uiPriority="1"/>
-    <w:lsdException w:name="Body Text" w:uiPriority="1" w:qFormat="1"/>
-    <w:lsdException w:name="Subtitle" w:semiHidden="0" w:uiPriority="11" w:unhideWhenUsed="0" w:qFormat="1"/>
-    <w:lsdException w:name="Strong" w:semiHidden="0" w:uiPriority="22" w:unhideWhenUsed="0" w:qFormat="1"/>
-    <w:lsdException w:name="Emphasis" w:semiHidden="0" w:uiPriority="20" w:unhideWhenUsed="0" w:qFormat="1"/>
-    <w:lsdException w:name="Table Grid" w:semiHidden="0" w:uiPriority="39" w:unhideWhenUsed="0"/>
-    <w:lsdException w:name="Placeholder Text" w:unhideWhenUsed="0"/>
-    <w:lsdException w:name="No Spacing" w:semiHidden="0" w:uiPriority="1" w:unhideWhenUsed="0" w:qFormat="1"/>
-    <w:lsdException w:name="Light Shading" w:semiHidden="0" w:uiPriority="60" w:unhideWhenUsed="0"/>
-    <w:lsdException w:name="Light List" w:semiHidden="0" w:uiPriority="61" w:unhideWhenUsed="0"/>
-    <w:lsdException w:name="Light Grid" w:semiHidden="0" w:uiPriority="62" w:unhideWhenUsed="0"/>
-    <w:lsdException w:name="Medium Shading 1" w:semiHidden="0" w:uiPriority="63" w:unhideWhenUsed="0"/>
-    <w:lsdException w:name="Medium Shading 2" w:semiHidden="0" w:uiPriority="64" w:unhideWhenUsed="0"/>
-    <w:lsdException w:name="Medium List 1" w:semiHidden="0" w:uiPriority="65" w:unhideWhenUsed="0"/>
-    <w:lsdException w:name="Medium List 2" w:semiHidden="0" w:uiPriority="66" w:unhideWhenUsed="0"/>
-    <w:lsdException w:name="Medium Grid 1" w:semiHidden="0" w:uiPriority="67" w:unhideWhenUsed="0"/>
-    <w:lsdException w:name="Medium Grid 2" w:semiHidden="0" w:uiPriority="68" w:unhideWhenUsed="0"/>
-    <w:lsdException w:name="Medium Grid 3" w:semiHidden="0" w:uiPriority="69" w:unhideWhenUsed="0"/>
-    <w:lsdException w:name="Dark List" w:semiHidden="0" w:uiPriority="70" w:unhideWhenUsed="0"/>
-    <w:lsdException w:name="Colorful Shading" w:semiHidden="0" w:uiPriority="71" w:unhideWhenUsed="0"/>
-    <w:lsdException w:name="Colorful List" w:semiHidden="0" w:uiPriority="72" w:unhideWhenUsed="0"/>
-    <w:lsdException w:name="Colorful Grid" w:semiHidden="0" w:uiPriority="73" w:unhideWhenUsed="0"/>
-    <w:lsdException w:name="Light Shading Accent 1" w:semiHidden="0" w:uiPriority="60" w:unhideWhenUsed="0"/>
-    <w:lsdException w:name="Light List Accent 1" w:semiHidden="0" w:uiPriority="61" w:unhideWhenUsed="0"/>
-    <w:lsdException w:name="Light Grid Accent 1" w:semiHidden="0" w:uiPriority="62" w:unhideWhenUsed="0"/>
-    <w:lsdException w:name="Medium Shading 1 Accent 1" w:semiHidden="0" w:uiPriority="63" w:unhideWhenUsed="0"/>
-    <w:lsdException w:name="Medium Shading 2 Accent 1" w:semiHidden="0" w:uiPriority="64" w:unhideWhenUsed="0"/>
-    <w:lsdException w:name="Medium List 1 Accent 1" w:semiHidden="0" w:uiPriority="65" w:unhideWhenUsed="0"/>
-    <w:lsdException w:name="Revision" w:unhideWhenUsed="0"/>
-    <w:lsdException w:name="List Paragraph" w:semiHidden="0" w:uiPriority="34" w:unhideWhenUsed="0" w:qFormat="1"/>
-    <w:lsdException w:name="Quote" w:semiHidden="0" w:uiPriority="29" w:unhideWhenUsed="0" w:qFormat="1"/>
-    <w:lsdException w:name="Intense Quote" w:semiHidden="0" w:uiPriority="30" w:unhideWhenUsed="0" w:qFormat="1"/>
-    <w:lsdException w:name="Medium List 2 Accent 1" w:semiHidden="0" w:uiPriority="66" w:unhideWhenUsed="0"/>
-    <w:lsdException w:name="Medium Grid 1 Accent 1" w:semiHidden="0" w:uiPriority="67" w:unhideWhenUsed="0"/>
-    <w:lsdException w:name="Medium Grid 2 Accent 1" w:semiHidden="0" w:uiPriority="68" w:unhideWhenUsed="0"/>
-    <w:lsdException w:name="Medium Grid 3 Accent 1" w:semiHidden="0" w:uiPriority="69" w:unhideWhenUsed="0"/>
-    <w:lsdException w:name="Dark List Accent 1" w:semiHidden="0" w:uiPriority="70" w:unhideWhenUsed="0"/>
-    <w:lsdException w:name="Colorful Shading Accent 1" w:semiHidden="0" w:uiPriority="71" w:unhideWhenUsed="0"/>
-    <w:lsdException w:name="Colorful List Accent 1" w:semiHidden="0" w:uiPriority="72" w:unhideWhenUsed="0"/>
-    <w:lsdException w:name="Colorful Grid Accent 1" w:semiHidden="0" w:uiPriority="73" w:unhideWhenUsed="0"/>
-    <w:lsdException w:name="Light Shading Accent 2" w:semiHidden="0" w:uiPriority="60" w:unhideWhenUsed="0"/>
-    <w:lsdException w:name="Light List Accent 2" w:semiHidden="0" w:uiPriority="61" w:unhideWhenUsed="0"/>
-    <w:lsdException w:name="Light Grid Accent 2" w:semiHidden="0" w:uiPriority="62" w:unhideWhenUsed="0"/>
-    <w:lsdException w:name="Medium Shading 1 Accent 2" w:semiHidden="0" w:uiPriority="63" w:unhideWhenUsed="0"/>
-    <w:lsdException w:name="Medium Shading 2 Accent 2" w:semiHidden="0" w:uiPriority="64" w:unhideWhenUsed="0"/>
-    <w:lsdException w:name="Medium List 1 Accent 2" w:semiHidden="0" w:uiPriority="65" w:unhideWhenUsed="0"/>
-    <w:lsdException w:name="Medium List 2 Accent 2" w:semiHidden="0" w:uiPriority="66" w:unhideWhenUsed="0"/>
-    <w:lsdException w:name="Medium Grid 1 Accent 2" w:semiHidden="0" w:uiPriority="67" w:unhideWhenUsed="0"/>
-    <w:lsdException w:name="Medium Grid 2 Accent 2" w:semiHidden="0" w:uiPriority="68" w:unhideWhenUsed="0"/>
-    <w:lsdException w:name="Medium Grid 3 Accent 2" w:semiHidden="0" w:uiPriority="69" w:unhideWhenUsed="0"/>
-    <w:lsdException w:name="Dark List Accent 2" w:semiHidden="0" w:uiPriority="70" w:unhideWhenUsed="0"/>
-    <w:lsdException w:name="Colorful Shading Accent 2" w:semiHidden="0" w:uiPriority="71" w:unhideWhenUsed="0"/>
-    <w:lsdException w:name="Colorful List Accent 2" w:semiHidden="0" w:uiPriority="72" w:unhideWhenUsed="0"/>
-    <w:lsdException w:name="Colorful Grid Accent 2" w:semiHidden="0" w:uiPriority="73" w:unhideWhenUsed="0"/>
-    <w:lsdException w:name="Light Shading Accent 3" w:semiHidden="0" w:uiPriority="60" w:unhideWhenUsed="0"/>
-    <w:lsdException w:name="Light List Accent 3" w:semiHidden="0" w:uiPriority="61" w:unhideWhenUsed="0"/>
-    <w:lsdException w:name="Light Grid Accent 3" w:semiHidden="0" w:uiPriority="62" w:unhideWhenUsed="0"/>
-    <w:lsdException w:name="Medium Shading 1 Accent 3" w:semiHidden="0" w:uiPriority="63" w:unhideWhenUsed="0"/>
-    <w:lsdException w:name="Medium Shading 2 Accent 3" w:semiHidden="0" w:uiPriority="64" w:unhideWhenUsed="0"/>
-    <w:lsdException w:name="Medium List 1 Accent 3" w:semiHidden="0" w:uiPriority="65" w:unhideWhenUsed="0"/>
-    <w:lsdException w:name="Medium List 2 Accent 3" w:semiHidden="0" w:uiPriority="66" w:unhideWhenUsed="0"/>
-    <w:lsdException w:name="Medium Grid 1 Accent 3" w:semiHidden="0" w:uiPriority="67" w:unhideWhenUsed="0"/>
-    <w:lsdException w:name="Medium Grid 2 Accent 3" w:semiHidden="0" w:uiPriority="68" w:unhideWhenUsed="0"/>
-    <w:lsdException w:name="Medium Grid 3 Accent 3" w:semiHidden="0" w:uiPriority="69" w:unhideWhenUsed="0"/>
-    <w:lsdException w:name="Dark List Accent 3" w:semiHidden="0" w:uiPriority="70" w:unhideWhenUsed="0"/>
-    <w:lsdException w:name="Colorful Shading Accent 3" w:semiHidden="0" w:uiPriority="71" w:unhideWhenUsed="0"/>
-    <w:lsdException w:name="Colorful List Accent 3" w:semiHidden="0" w:uiPriority="72" w:unhideWhenUsed="0"/>
-    <w:lsdException w:name="Colorful Grid Accent 3" w:semiHidden="0" w:uiPriority="73" w:unhideWhenUsed="0"/>
-    <w:lsdException w:name="Light Shading Accent 4" w:semiHidden="0" w:uiPriority="60" w:unhideWhenUsed="0"/>
-    <w:lsdException w:name="Light List Accent 4" w:semiHidden="0" w:uiPriority="61" w:unhideWhenUsed="0"/>
-    <w:lsdException w:name="Light Grid Accent 4" w:semiHidden="0" w:uiPriority="62" w:unhideWhenUsed="0"/>
-    <w:lsdException w:name="Medium Shading 1 Accent 4" w:semiHidden="0" w:uiPriority="63" w:unhideWhenUsed="0"/>
-    <w:lsdException w:name="Medium Shading 2 Accent 4" w:semiHidden="0" w:uiPriority="64" w:unhideWhenUsed="0"/>
-    <w:lsdException w:name="Medium List 1 Accent 4" w:semiHidden="0" w:uiPriority="65" w:unhideWhenUsed="0"/>
-    <w:lsdException w:name="Medium List 2 Accent 4" w:semiHidden="0" w:uiPriority="66" w:unhideWhenUsed="0"/>
-    <w:lsdException w:name="Medium Grid 1 Accent 4" w:semiHidden="0" w:uiPriority="67" w:unhideWhenUsed="0"/>
-    <w:lsdException w:name="Medium Grid 2 Accent 4" w:semiHidden="0" w:uiPriority="68" w:unhideWhenUsed="0"/>
-    <w:lsdException w:name="Medium Grid 3 Accent 4" w:semiHidden="0" w:uiPriority="69" w:unhideWhenUsed="0"/>
-    <w:lsdException w:name="Dark List Accent 4" w:semiHidden="0" w:uiPriority="70" w:unhideWhenUsed="0"/>
-    <w:lsdException w:name="Colorful Shading Accent 4" w:semiHidden="0" w:uiPriority="71" w:unhideWhenUsed="0"/>
-    <w:lsdException w:name="Colorful List Accent 4" w:semiHidden="0" w:uiPriority="72" w:unhideWhenUsed="0"/>
-    <w:lsdException w:name="Colorful Grid Accent 4" w:semiHidden="0" w:uiPriority="73" w:unhideWhenUsed="0"/>
-    <w:lsdException w:name="Light Shading Accent 5" w:semiHidden="0" w:uiPriority="60" w:unhideWhenUsed="0"/>
-    <w:lsdException w:name="Light List Accent 5" w:semiHidden="0" w:uiPriority="61" w:unhideWhenUsed="0"/>
-    <w:lsdException w:name="Light Grid Accent 5" w:semiHidden="0" w:uiPriority="62" w:unhideWhenUsed="0"/>
-    <w:lsdException w:name="Medium Shading 1 Accent 5" w:semiHidden="0" w:uiPriority="63" w:unhideWhenUsed="0"/>
-    <w:lsdException w:name="Medium Shading 2 Accent 5" w:semiHidden="0" w:uiPriority="64" w:unhideWhenUsed="0"/>
-    <w:lsdException w:name="Medium List 1 Accent 5" w:semiHidden="0" w:uiPriority="65" w:unhideWhenUsed="0"/>
-    <w:lsdException w:name="Medium List 2 Accent 5" w:semiHidden="0" w:uiPriority="66" w:unhideWhenUsed="0"/>
-    <w:lsdException w:name="Medium Grid 1 Accent 5" w:semiHidden="0" w:uiPriority="67" w:unhideWhenUsed="0"/>
-    <w:lsdException w:name="Medium Grid 2 Accent 5" w:semiHidden="0" w:uiPriority="68" w:unhideWhenUsed="0"/>
-    <w:lsdException w:name="Medium Grid 3 Accent 5" w:semiHidden="0" w:uiPriority="69" w:unhideWhenUsed="0"/>
-    <w:lsdException w:name="Dark List Accent 5" w:semiHidden="0" w:uiPriority="70" w:unhideWhenUsed="0"/>
-    <w:lsdException w:name="Colorful Shading Accent 5" w:semiHidden="0" w:uiPriority="71" w:unhideWhenUsed="0"/>
-    <w:lsdException w:name="Colorful List Accent 5" w:semiHidden="0" w:uiPriority="72" w:unhideWhenUsed="0"/>
-    <w:lsdException w:name="Colorful Grid Accent 5" w:semiHidden="0" w:uiPriority="73" w:unhideWhenUsed="0"/>
-    <w:lsdException w:name="Light Shading Accent 6" w:semiHidden="0" w:uiPriority="60" w:unhideWhenUsed="0"/>
-    <w:lsdException w:name="Light List Accent 6" w:semiHidden="0" w:uiPriority="61" w:unhideWhenUsed="0"/>
-    <w:lsdException w:name="Light Grid Accent 6" w:semiHidden="0" w:uiPriority="62" w:unhideWhenUsed="0"/>
-    <w:lsdException w:name="Medium Shading 1 Accent 6" w:semiHidden="0" w:uiPriority="63" w:unhideWhenUsed="0"/>
-    <w:lsdException w:name="Medium Shading 2 Accent 6" w:semiHidden="0" w:uiPriority="64" w:unhideWhenUsed="0"/>
-    <w:lsdException w:name="Medium List 1 Accent 6" w:semiHidden="0" w:uiPriority="65" w:unhideWhenUsed="0"/>
-    <w:lsdException w:name="Medium List 2 Accent 6" w:semiHidden="0" w:uiPriority="66" w:unhideWhenUsed="0"/>
-    <w:lsdException w:name="Medium Grid 1 Accent 6" w:semiHidden="0" w:uiPriority="67" w:unhideWhenUsed="0"/>
-    <w:lsdException w:name="Medium Grid 2 Accent 6" w:semiHidden="0" w:uiPriority="68" w:unhideWhenUsed="0"/>
-    <w:lsdException w:name="Medium Grid 3 Accent 6" w:semiHidden="0" w:uiPriority="69" w:unhideWhenUsed="0"/>
-    <w:lsdException w:name="Dark List Accent 6" w:semiHidden="0" w:uiPriority="70" w:unhideWhenUsed="0"/>
-    <w:lsdException w:name="Colorful Shading Accent 6" w:semiHidden="0" w:uiPriority="71" w:unhideWhenUsed="0"/>
-    <w:lsdException w:name="Colorful List Accent 6" w:semiHidden="0" w:uiPriority="72" w:unhideWhenUsed="0"/>
-    <w:lsdException w:name="Colorful Grid Accent 6" w:semiHidden="0" w:uiPriority="73" w:unhideWhenUsed="0"/>
-    <w:lsdException w:name="Subtle Emphasis" w:semiHidden="0" w:uiPriority="19" w:unhideWhenUsed="0" w:qFormat="1"/>
-    <w:lsdException w:name="Intense Emphasis" w:semiHidden="0" w:uiPriority="21" w:unhideWhenUsed="0" w:qFormat="1"/>
-    <w:lsdException w:name="Subtle Reference" w:semiHidden="0" w:uiPriority="31" w:unhideWhenUsed="0" w:qFormat="1"/>
-    <w:lsdException w:name="Intense Reference" w:semiHidden="0" w:uiPriority="32" w:unhideWhenUsed="0" w:qFormat="1"/>
-    <w:lsdException w:name="Book Title" w:semiHidden="0" w:uiPriority="33" w:unhideWhenUsed="0" w:qFormat="1"/>
-    <w:lsdException w:name="Bibliography" w:uiPriority="37"/>
-    <w:lsdException w:name="TOC Heading" w:uiPriority="39" w:qFormat="1"/>
+  <w:latentStyles w:defLockedState="0" w:defUIPriority="99" w:defSemiHidden="0" w:defUnhideWhenUsed="0" w:defQFormat="0" w:count="376">
+    <w:lsdException w:name="Normal" w:uiPriority="0" w:qFormat="1"/>
+    <w:lsdException w:name="heading 1" w:uiPriority="9" w:qFormat="1"/>
+    <w:lsdException w:name="heading 2" w:semiHidden="1" w:uiPriority="9" w:unhideWhenUsed="1" w:qFormat="1"/>
+    <w:lsdException w:name="heading 3" w:semiHidden="1" w:uiPriority="9" w:unhideWhenUsed="1" w:qFormat="1"/>
+    <w:lsdException w:name="heading 4" w:semiHidden="1" w:uiPriority="9" w:unhideWhenUsed="1" w:qFormat="1"/>
+    <w:lsdException w:name="heading 5" w:semiHidden="1" w:uiPriority="9" w:unhideWhenUsed="1" w:qFormat="1"/>
+    <w:lsdException w:name="heading 6" w:semiHidden="1" w:uiPriority="9" w:unhideWhenUsed="1" w:qFormat="1"/>
+    <w:lsdException w:name="heading 7" w:semiHidden="1" w:uiPriority="9" w:unhideWhenUsed="1" w:qFormat="1"/>
+    <w:lsdException w:name="heading 8" w:semiHidden="1" w:uiPriority="9" w:unhideWhenUsed="1" w:qFormat="1"/>
+    <w:lsdException w:name="heading 9" w:semiHidden="1" w:uiPriority="9" w:unhideWhenUsed="1" w:qFormat="1"/>
+    <w:lsdException w:name="index 1" w:semiHidden="1" w:unhideWhenUsed="1"/>
+    <w:lsdException w:name="index 2" w:semiHidden="1" w:unhideWhenUsed="1"/>
+    <w:lsdException w:name="index 3" w:semiHidden="1" w:unhideWhenUsed="1"/>
+    <w:lsdException w:name="index 4" w:semiHidden="1" w:unhideWhenUsed="1"/>
+    <w:lsdException w:name="index 5" w:semiHidden="1" w:unhideWhenUsed="1"/>
+    <w:lsdException w:name="index 6" w:semiHidden="1" w:unhideWhenUsed="1"/>
+    <w:lsdException w:name="index 7" w:semiHidden="1" w:unhideWhenUsed="1"/>
+    <w:lsdException w:name="index 8" w:semiHidden="1" w:unhideWhenUsed="1"/>
+    <w:lsdException w:name="index 9" w:semiHidden="1" w:unhideWhenUsed="1"/>
+    <w:lsdException w:name="toc 1" w:semiHidden="1" w:uiPriority="39" w:unhideWhenUsed="1"/>
+    <w:lsdException w:name="toc 2" w:semiHidden="1" w:uiPriority="39" w:unhideWhenUsed="1"/>
+    <w:lsdException w:name="toc 3" w:semiHidden="1" w:uiPriority="39" w:unhideWhenUsed="1"/>
+    <w:lsdException w:name="toc 4" w:semiHidden="1" w:uiPriority="39" w:unhideWhenUsed="1"/>
+    <w:lsdException w:name="toc 5" w:semiHidden="1" w:uiPriority="39" w:unhideWhenUsed="1"/>
+    <w:lsdException w:name="toc 6" w:semiHidden="1" w:uiPriority="39" w:unhideWhenUsed="1"/>
+    <w:lsdException w:name="toc 7" w:semiHidden="1" w:uiPriority="39" w:unhideWhenUsed="1"/>
+    <w:lsdException w:name="toc 8" w:semiHidden="1" w:uiPriority="39" w:unhideWhenUsed="1"/>
+    <w:lsdException w:name="toc 9" w:semiHidden="1" w:uiPriority="39" w:unhideWhenUsed="1"/>
+    <w:lsdException w:name="Normal Indent" w:semiHidden="1" w:unhideWhenUsed="1"/>
+    <w:lsdException w:name="footnote text" w:semiHidden="1" w:unhideWhenUsed="1"/>
+    <w:lsdException w:name="annotation text" w:semiHidden="1" w:unhideWhenUsed="1" w:qFormat="1"/>
+    <w:lsdException w:name="header" w:semiHidden="1" w:unhideWhenUsed="1"/>
+    <w:lsdException w:name="footer" w:semiHidden="1" w:unhideWhenUsed="1"/>
+    <w:lsdException w:name="index heading" w:semiHidden="1" w:unhideWhenUsed="1"/>
+    <w:lsdException w:name="caption" w:semiHidden="1" w:uiPriority="35" w:unhideWhenUsed="1" w:qFormat="1"/>
+    <w:lsdException w:name="table of figures" w:semiHidden="1" w:unhideWhenUsed="1"/>
+    <w:lsdException w:name="envelope address" w:semiHidden="1" w:unhideWhenUsed="1"/>
+    <w:lsdException w:name="envelope return" w:semiHidden="1" w:unhideWhenUsed="1"/>
+    <w:lsdException w:name="footnote reference" w:semiHidden="1" w:unhideWhenUsed="1"/>
+    <w:lsdException w:name="annotation reference" w:semiHidden="1" w:unhideWhenUsed="1" w:qFormat="1"/>
+    <w:lsdException w:name="line number" w:semiHidden="1" w:unhideWhenUsed="1"/>
+    <w:lsdException w:name="page number" w:semiHidden="1" w:unhideWhenUsed="1"/>
+    <w:lsdException w:name="endnote reference" w:semiHidden="1" w:unhideWhenUsed="1"/>
+    <w:lsdException w:name="endnote text" w:semiHidden="1" w:unhideWhenUsed="1"/>
+    <w:lsdException w:name="table of authorities" w:semiHidden="1" w:unhideWhenUsed="1"/>
+    <w:lsdException w:name="macro" w:semiHidden="1" w:unhideWhenUsed="1"/>
+    <w:lsdException w:name="toa heading" w:semiHidden="1" w:unhideWhenUsed="1"/>
+    <w:lsdException w:name="List" w:semiHidden="1" w:unhideWhenUsed="1"/>
+    <w:lsdException w:name="List Bullet" w:semiHidden="1" w:unhideWhenUsed="1"/>
+    <w:lsdException w:name="List Number" w:semiHidden="1" w:unhideWhenUsed="1"/>
+    <w:lsdException w:name="List 2" w:semiHidden="1" w:unhideWhenUsed="1"/>
+    <w:lsdException w:name="List 3" w:semiHidden="1" w:unhideWhenUsed="1"/>
+    <w:lsdException w:name="List 4" w:semiHidden="1" w:unhideWhenUsed="1"/>
+    <w:lsdException w:name="List 5" w:semiHidden="1" w:unhideWhenUsed="1"/>
+    <w:lsdException w:name="List Bullet 2" w:semiHidden="1" w:unhideWhenUsed="1"/>
+    <w:lsdException w:name="List Bullet 3" w:semiHidden="1" w:unhideWhenUsed="1"/>
+    <w:lsdException w:name="List Bullet 4" w:semiHidden="1" w:unhideWhenUsed="1"/>
+    <w:lsdException w:name="List Bullet 5" w:semiHidden="1" w:unhideWhenUsed="1"/>
+    <w:lsdException w:name="List Number 2" w:semiHidden="1" w:unhideWhenUsed="1"/>
+    <w:lsdException w:name="List Number 3" w:semiHidden="1" w:unhideWhenUsed="1"/>
+    <w:lsdException w:name="List Number 4" w:semiHidden="1" w:unhideWhenUsed="1"/>
+    <w:lsdException w:name="List Number 5" w:semiHidden="1" w:unhideWhenUsed="1"/>
+    <w:lsdException w:name="Title" w:uiPriority="10" w:qFormat="1"/>
+    <w:lsdException w:name="Closing" w:semiHidden="1" w:unhideWhenUsed="1"/>
+    <w:lsdException w:name="Signature" w:semiHidden="1" w:unhideWhenUsed="1"/>
+    <w:lsdException w:name="Default Paragraph Font" w:semiHidden="1" w:uiPriority="1" w:unhideWhenUsed="1"/>
+    <w:lsdException w:name="Body Text" w:semiHidden="1" w:uiPriority="1" w:unhideWhenUsed="1" w:qFormat="1"/>
+    <w:lsdException w:name="Body Text Indent" w:semiHidden="1" w:unhideWhenUsed="1"/>
+    <w:lsdException w:name="List Continue" w:semiHidden="1" w:unhideWhenUsed="1"/>
+    <w:lsdException w:name="List Continue 2" w:semiHidden="1" w:unhideWhenUsed="1"/>
+    <w:lsdException w:name="List Continue 3" w:semiHidden="1" w:unhideWhenUsed="1"/>
+    <w:lsdException w:name="List Continue 4" w:semiHidden="1" w:unhideWhenUsed="1"/>
+    <w:lsdException w:name="List Continue 5" w:semiHidden="1" w:unhideWhenUsed="1"/>
+    <w:lsdException w:name="Message Header" w:semiHidden="1" w:unhideWhenUsed="1"/>
+    <w:lsdException w:name="Subtitle" w:uiPriority="11" w:qFormat="1"/>
+    <w:lsdException w:name="Salutation" w:semiHidden="1" w:unhideWhenUsed="1"/>
+    <w:lsdException w:name="Date" w:semiHidden="1" w:unhideWhenUsed="1"/>
+    <w:lsdException w:name="Body Text First Indent" w:semiHidden="1" w:unhideWhenUsed="1"/>
+    <w:lsdException w:name="Body Text First Indent 2" w:semiHidden="1" w:unhideWhenUsed="1"/>
+    <w:lsdException w:name="Note Heading" w:semiHidden="1" w:unhideWhenUsed="1"/>
+    <w:lsdException w:name="Body Text 2" w:semiHidden="1" w:unhideWhenUsed="1"/>
+    <w:lsdException w:name="Body Text 3" w:semiHidden="1" w:unhideWhenUsed="1"/>
+    <w:lsdException w:name="Body Text Indent 2" w:semiHidden="1" w:unhideWhenUsed="1"/>
+    <w:lsdException w:name="Body Text Indent 3" w:semiHidden="1" w:unhideWhenUsed="1"/>
+    <w:lsdException w:name="Block Text" w:semiHidden="1" w:unhideWhenUsed="1"/>
+    <w:lsdException w:name="Hyperlink" w:semiHidden="1" w:unhideWhenUsed="1"/>
+    <w:lsdException w:name="FollowedHyperlink" w:semiHidden="1" w:unhideWhenUsed="1"/>
+    <w:lsdException w:name="Strong" w:uiPriority="22" w:qFormat="1"/>
+    <w:lsdException w:name="Emphasis" w:uiPriority="20" w:qFormat="1"/>
+    <w:lsdException w:name="Document Map" w:semiHidden="1" w:unhideWhenUsed="1"/>
+    <w:lsdException w:name="Plain Text" w:semiHidden="1" w:unhideWhenUsed="1"/>
+    <w:lsdException w:name="E-mail Signature" w:semiHidden="1" w:unhideWhenUsed="1"/>
+    <w:lsdException w:name="HTML Top of Form" w:semiHidden="1" w:unhideWhenUsed="1"/>
+    <w:lsdException w:name="HTML Bottom of Form" w:semiHidden="1" w:unhideWhenUsed="1"/>
+    <w:lsdException w:name="Normal (Web)" w:semiHidden="1" w:unhideWhenUsed="1"/>
+    <w:lsdException w:name="HTML Acronym" w:semiHidden="1" w:unhideWhenUsed="1"/>
+    <w:lsdException w:name="HTML Address" w:semiHidden="1" w:unhideWhenUsed="1"/>
+    <w:lsdException w:name="HTML Cite" w:semiHidden="1" w:unhideWhenUsed="1"/>
+    <w:lsdException w:name="HTML Code" w:semiHidden="1" w:unhideWhenUsed="1"/>
+    <w:lsdException w:name="HTML Definition" w:semiHidden="1" w:unhideWhenUsed="1"/>
+    <w:lsdException w:name="HTML Keyboard" w:semiHidden="1" w:unhideWhenUsed="1"/>
+    <w:lsdException w:name="HTML Preformatted" w:semiHidden="1" w:unhideWhenUsed="1"/>
+    <w:lsdException w:name="HTML Sample" w:semiHidden="1" w:unhideWhenUsed="1"/>
+    <w:lsdException w:name="HTML Typewriter" w:semiHidden="1" w:unhideWhenUsed="1"/>
+    <w:lsdException w:name="HTML Variable" w:semiHidden="1" w:unhideWhenUsed="1"/>
+    <w:lsdException w:name="Normal Table" w:semiHidden="1" w:unhideWhenUsed="1"/>
+    <w:lsdException w:name="annotation subject" w:semiHidden="1" w:unhideWhenUsed="1"/>
+    <w:lsdException w:name="No List" w:semiHidden="1" w:unhideWhenUsed="1"/>
+    <w:lsdException w:name="Outline List 1" w:semiHidden="1" w:unhideWhenUsed="1"/>
+    <w:lsdException w:name="Outline List 2" w:semiHidden="1" w:unhideWhenUsed="1"/>
+    <w:lsdException w:name="Outline List 3" w:semiHidden="1" w:unhideWhenUsed="1"/>
+    <w:lsdException w:name="Table Simple 1" w:semiHidden="1" w:unhideWhenUsed="1"/>
+    <w:lsdException w:name="Table Simple 2" w:semiHidden="1" w:unhideWhenUsed="1"/>
+    <w:lsdException w:name="Table Simple 3" w:semiHidden="1" w:unhideWhenUsed="1"/>
+    <w:lsdException w:name="Table Classic 1" w:semiHidden="1" w:unhideWhenUsed="1"/>
+    <w:lsdException w:name="Table Classic 2" w:semiHidden="1" w:unhideWhenUsed="1"/>
+    <w:lsdException w:name="Table Classic 3" w:semiHidden="1" w:unhideWhenUsed="1"/>
+    <w:lsdException w:name="Table Classic 4" w:semiHidden="1" w:unhideWhenUsed="1"/>
+    <w:lsdException w:name="Table Colorful 1" w:semiHidden="1" w:unhideWhenUsed="1"/>
+    <w:lsdException w:name="Table Colorful 2" w:semiHidden="1" w:unhideWhenUsed="1"/>
+    <w:lsdException w:name="Table Colorful 3" w:semiHidden="1" w:unhideWhenUsed="1"/>
+    <w:lsdException w:name="Table Columns 1" w:semiHidden="1" w:unhideWhenUsed="1"/>
+    <w:lsdException w:name="Table Columns 2" w:semiHidden="1" w:unhideWhenUsed="1"/>
+    <w:lsdException w:name="Table Columns 3" w:semiHidden="1" w:unhideWhenUsed="1"/>
+    <w:lsdException w:name="Table Columns 4" w:semiHidden="1" w:unhideWhenUsed="1"/>
+    <w:lsdException w:name="Table Columns 5" w:semiHidden="1" w:unhideWhenUsed="1"/>
+    <w:lsdException w:name="Table Grid 1" w:semiHidden="1" w:unhideWhenUsed="1"/>
+    <w:lsdException w:name="Table Grid 2" w:semiHidden="1" w:unhideWhenUsed="1"/>
+    <w:lsdException w:name="Table Grid 3" w:semiHidden="1" w:unhideWhenUsed="1"/>
+    <w:lsdException w:name="Table Grid 4" w:semiHidden="1" w:unhideWhenUsed="1"/>
+    <w:lsdException w:name="Table Grid 5" w:semiHidden="1" w:unhideWhenUsed="1"/>
+    <w:lsdException w:name="Table Grid 6" w:semiHidden="1" w:unhideWhenUsed="1"/>
+    <w:lsdException w:name="Table Grid 7" w:semiHidden="1" w:unhideWhenUsed="1"/>
+    <w:lsdException w:name="Table Grid 8" w:semiHidden="1" w:unhideWhenUsed="1"/>
+    <w:lsdException w:name="Table List 1" w:semiHidden="1" w:unhideWhenUsed="1"/>
+    <w:lsdException w:name="Table List 2" w:semiHidden="1" w:unhideWhenUsed="1"/>
+    <w:lsdException w:name="Table List 3" w:semiHidden="1" w:unhideWhenUsed="1"/>
+    <w:lsdException w:name="Table List 4" w:semiHidden="1" w:unhideWhenUsed="1"/>
+    <w:lsdException w:name="Table List 5" w:semiHidden="1" w:unhideWhenUsed="1"/>
+    <w:lsdException w:name="Table List 6" w:semiHidden="1" w:unhideWhenUsed="1"/>
+    <w:lsdException w:name="Table List 7" w:semiHidden="1" w:unhideWhenUsed="1"/>
+    <w:lsdException w:name="Table List 8" w:semiHidden="1" w:unhideWhenUsed="1"/>
+    <w:lsdException w:name="Table 3D effects 1" w:semiHidden="1" w:unhideWhenUsed="1"/>
+    <w:lsdException w:name="Table 3D effects 2" w:semiHidden="1" w:unhideWhenUsed="1"/>
+    <w:lsdException w:name="Table 3D effects 3" w:semiHidden="1" w:unhideWhenUsed="1"/>
+    <w:lsdException w:name="Table Contemporary" w:semiHidden="1" w:unhideWhenUsed="1"/>
+    <w:lsdException w:name="Table Elegant" w:semiHidden="1" w:unhideWhenUsed="1"/>
+    <w:lsdException w:name="Table Professional" w:semiHidden="1" w:unhideWhenUsed="1"/>
+    <w:lsdException w:name="Table Subtle 1" w:semiHidden="1" w:unhideWhenUsed="1"/>
+    <w:lsdException w:name="Table Subtle 2" w:semiHidden="1" w:unhideWhenUsed="1"/>
+    <w:lsdException w:name="Table Web 1" w:semiHidden="1" w:unhideWhenUsed="1"/>
+    <w:lsdException w:name="Table Web 2" w:semiHidden="1" w:unhideWhenUsed="1"/>
+    <w:lsdException w:name="Table Web 3" w:semiHidden="1" w:unhideWhenUsed="1"/>
+    <w:lsdException w:name="Balloon Text" w:semiHidden="1" w:unhideWhenUsed="1"/>
+    <w:lsdException w:name="Table Grid" w:uiPriority="39"/>
+    <w:lsdException w:name="Table Theme" w:semiHidden="1" w:unhideWhenUsed="1"/>
+    <w:lsdException w:name="Placeholder Text" w:semiHidden="1"/>
+    <w:lsdException w:name="No Spacing" w:uiPriority="1" w:qFormat="1"/>
+    <w:lsdException w:name="Light Shading" w:uiPriority="60"/>
+    <w:lsdException w:name="Light List" w:uiPriority="61"/>
+    <w:lsdException w:name="Light Grid" w:uiPriority="62"/>
+    <w:lsdException w:name="Medium Shading 1" w:uiPriority="63"/>
+    <w:lsdException w:name="Medium Shading 2" w:uiPriority="64"/>
+    <w:lsdException w:name="Medium List 1" w:uiPriority="65"/>
+    <w:lsdException w:name="Medium List 2" w:uiPriority="66"/>
+    <w:lsdException w:name="Medium Grid 1" w:uiPriority="67"/>
+    <w:lsdException w:name="Medium Grid 2" w:uiPriority="68"/>
+    <w:lsdException w:name="Medium Grid 3" w:uiPriority="69"/>
+    <w:lsdException w:name="Dark List" w:uiPriority="70"/>
+    <w:lsdException w:name="Colorful Shading" w:uiPriority="71"/>
+    <w:lsdException w:name="Colorful List" w:uiPriority="72"/>
+    <w:lsdException w:name="Colorful Grid" w:uiPriority="73"/>
+    <w:lsdException w:name="Light Shading Accent 1" w:uiPriority="60"/>
+    <w:lsdException w:name="Light List Accent 1" w:uiPriority="61"/>
+    <w:lsdException w:name="Light Grid Accent 1" w:uiPriority="62"/>
+    <w:lsdException w:name="Medium Shading 1 Accent 1" w:uiPriority="63"/>
+    <w:lsdException w:name="Medium Shading 2 Accent 1" w:uiPriority="64"/>
+    <w:lsdException w:name="Medium List 1 Accent 1" w:uiPriority="65"/>
+    <w:lsdException w:name="Revision" w:semiHidden="1"/>
+    <w:lsdException w:name="List Paragraph" w:uiPriority="34" w:qFormat="1"/>
+    <w:lsdException w:name="Quote" w:uiPriority="29" w:qFormat="1"/>
+    <w:lsdException w:name="Intense Quote" w:uiPriority="30" w:qFormat="1"/>
+    <w:lsdException w:name="Medium List 2 Accent 1" w:uiPriority="66"/>
+    <w:lsdException w:name="Medium Grid 1 Accent 1" w:uiPriority="67"/>
+    <w:lsdException w:name="Medium Grid 2 Accent 1" w:uiPriority="68"/>
+    <w:lsdException w:name="Medium Grid 3 Accent 1" w:uiPriority="69"/>
+    <w:lsdException w:name="Dark List Accent 1" w:uiPriority="70"/>
+    <w:lsdException w:name="Colorful Shading Accent 1" w:uiPriority="71"/>
+    <w:lsdException w:name="Colorful List Accent 1" w:uiPriority="72"/>
+    <w:lsdException w:name="Colorful Grid Accent 1" w:uiPriority="73"/>
+    <w:lsdException w:name="Light Shading Accent 2" w:uiPriority="60"/>
+    <w:lsdException w:name="Light List Accent 2" w:uiPriority="61"/>
+    <w:lsdException w:name="Light Grid Accent 2" w:uiPriority="62"/>
+    <w:lsdException w:name="Medium Shading 1 Accent 2" w:uiPriority="63"/>
+    <w:lsdException w:name="Medium Shading 2 Accent 2" w:uiPriority="64"/>
+    <w:lsdException w:name="Medium List 1 Accent 2" w:uiPriority="65"/>
+    <w:lsdException w:name="Medium List 2 Accent 2" w:uiPriority="66"/>
+    <w:lsdException w:name="Medium Grid 1 Accent 2" w:uiPriority="67"/>
+    <w:lsdException w:name="Medium Grid 2 Accent 2" w:uiPriority="68"/>
+    <w:lsdException w:name="Medium Grid 3 Accent 2" w:uiPriority="69"/>
+    <w:lsdException w:name="Dark List Accent 2" w:uiPriority="70"/>
+    <w:lsdException w:name="Colorful Shading Accent 2" w:uiPriority="71"/>
+    <w:lsdException w:name="Colorful List Accent 2" w:uiPriority="72"/>
+    <w:lsdException w:name="Colorful Grid Accent 2" w:uiPriority="73"/>
+    <w:lsdException w:name="Light Shading Accent 3" w:uiPriority="60"/>
+    <w:lsdException w:name="Light List Accent 3" w:uiPriority="61"/>
+    <w:lsdException w:name="Light Grid Accent 3" w:uiPriority="62"/>
+    <w:lsdException w:name="Medium Shading 1 Accent 3" w:uiPriority="63"/>
+    <w:lsdException w:name="Medium Shading 2 Accent 3" w:uiPriority="64"/>
+    <w:lsdException w:name="Medium List 1 Accent 3" w:uiPriority="65"/>
+    <w:lsdException w:name="Medium List 2 Accent 3" w:uiPriority="66"/>
+    <w:lsdException w:name="Medium Grid 1 Accent 3" w:uiPriority="67"/>
+    <w:lsdException w:name="Medium Grid 2 Accent 3" w:uiPriority="68"/>
+    <w:lsdException w:name="Medium Grid 3 Accent 3" w:uiPriority="69"/>
+    <w:lsdException w:name="Dark List Accent 3" w:uiPriority="70"/>
+    <w:lsdException w:name="Colorful Shading Accent 3" w:uiPriority="71"/>
+    <w:lsdException w:name="Colorful List Accent 3" w:uiPriority="72"/>
+    <w:lsdException w:name="Colorful Grid Accent 3" w:uiPriority="73"/>
+    <w:lsdException w:name="Light Shading Accent 4" w:uiPriority="60"/>
+    <w:lsdException w:name="Light List Accent 4" w:uiPriority="61"/>
+    <w:lsdException w:name="Light Grid Accent 4" w:uiPriority="62"/>
+    <w:lsdException w:name="Medium Shading 1 Accent 4" w:uiPriority="63"/>
+    <w:lsdException w:name="Medium Shading 2 Accent 4" w:uiPriority="64"/>
+    <w:lsdException w:name="Medium List 1 Accent 4" w:uiPriority="65"/>
+    <w:lsdException w:name="Medium List 2 Accent 4" w:uiPriority="66"/>
+    <w:lsdException w:name="Medium Grid 1 Accent 4" w:uiPriority="67"/>
+    <w:lsdException w:name="Medium Grid 2 Accent 4" w:uiPriority="68"/>
+    <w:lsdException w:name="Medium Grid 3 Accent 4" w:uiPriority="69"/>
+    <w:lsdException w:name="Dark List Accent 4" w:uiPriority="70"/>
+    <w:lsdException w:name="Colorful Shading Accent 4" w:uiPriority="71"/>
+    <w:lsdException w:name="Colorful List Accent 4" w:uiPriority="72"/>
+    <w:lsdException w:name="Colorful Grid Accent 4" w:uiPriority="73"/>
+    <w:lsdException w:name="Light Shading Accent 5" w:uiPriority="60"/>
+    <w:lsdException w:name="Light List Accent 5" w:uiPriority="61"/>
+    <w:lsdException w:name="Light Grid Accent 5" w:uiPriority="62"/>
+    <w:lsdException w:name="Medium Shading 1 Accent 5" w:uiPriority="63"/>
+    <w:lsdException w:name="Medium Shading 2 Accent 5" w:uiPriority="64"/>
+    <w:lsdException w:name="Medium List 1 Accent 5" w:uiPriority="65"/>
+    <w:lsdException w:name="Medium List 2 Accent 5" w:uiPriority="66"/>
+    <w:lsdException w:name="Medium Grid 1 Accent 5" w:uiPriority="67"/>
+    <w:lsdException w:name="Medium Grid 2 Accent 5" w:uiPriority="68"/>
+    <w:lsdException w:name="Medium Grid 3 Accent 5" w:uiPriority="69"/>
+    <w:lsdException w:name="Dark List Accent 5" w:uiPriority="70"/>
+    <w:lsdException w:name="Colorful Shading Accent 5" w:uiPriority="71"/>
+    <w:lsdException w:name="Colorful List Accent 5" w:uiPriority="72"/>
+    <w:lsdException w:name="Colorful Grid Accent 5" w:uiPriority="73"/>
+    <w:lsdException w:name="Light Shading Accent 6" w:uiPriority="60"/>
+    <w:lsdException w:name="Light List Accent 6" w:uiPriority="61"/>
+    <w:lsdException w:name="Light Grid Accent 6" w:uiPriority="62"/>
+    <w:lsdException w:name="Medium Shading 1 Accent 6" w:uiPriority="63"/>
+    <w:lsdException w:name="Medium Shading 2 Accent 6" w:uiPriority="64"/>
+    <w:lsdException w:name="Medium List 1 Accent 6" w:uiPriority="65"/>
+    <w:lsdException w:name="Medium List 2 Accent 6" w:uiPriority="66"/>
+    <w:lsdException w:name="Medium Grid 1 Accent 6" w:uiPriority="67"/>
+    <w:lsdException w:name="Medium Grid 2 Accent 6" w:uiPriority="68"/>
+    <w:lsdException w:name="Medium Grid 3 Accent 6" w:uiPriority="69"/>
+    <w:lsdException w:name="Dark List Accent 6" w:uiPriority="70"/>
+    <w:lsdException w:name="Colorful Shading Accent 6" w:uiPriority="71"/>
+    <w:lsdException w:name="Colorful List Accent 6" w:uiPriority="72"/>
+    <w:lsdException w:name="Colorful Grid Accent 6" w:uiPriority="73"/>
+    <w:lsdException w:name="Subtle Emphasis" w:uiPriority="19" w:qFormat="1"/>
+    <w:lsdException w:name="Intense Emphasis" w:uiPriority="21" w:qFormat="1"/>
+    <w:lsdException w:name="Subtle Reference" w:uiPriority="31" w:qFormat="1"/>
+    <w:lsdException w:name="Intense Reference" w:uiPriority="32" w:qFormat="1"/>
+    <w:lsdException w:name="Book Title" w:uiPriority="33" w:qFormat="1"/>
+    <w:lsdException w:name="Bibliography" w:semiHidden="1" w:uiPriority="37" w:unhideWhenUsed="1"/>
+    <w:lsdException w:name="TOC Heading" w:semiHidden="1" w:uiPriority="39" w:unhideWhenUsed="1" w:qFormat="1"/>
+    <w:lsdException w:name="Plain Table 1" w:uiPriority="41"/>
+    <w:lsdException w:name="Plain Table 2" w:uiPriority="42"/>
+    <w:lsdException w:name="Plain Table 3" w:uiPriority="43"/>
+    <w:lsdException w:name="Plain Table 4" w:uiPriority="44"/>
+    <w:lsdException w:name="Plain Table 5" w:uiPriority="45"/>
+    <w:lsdException w:name="Grid Table Light" w:uiPriority="40"/>
+    <w:lsdException w:name="Grid Table 1 Light" w:uiPriority="46"/>
+    <w:lsdException w:name="Grid Table 2" w:uiPriority="47"/>
+    <w:lsdException w:name="Grid Table 3" w:uiPriority="48"/>
+    <w:lsdException w:name="Grid Table 4" w:uiPriority="49"/>
+    <w:lsdException w:name="Grid Table 5 Dark" w:uiPriority="50"/>
+    <w:lsdException w:name="Grid Table 6 Colorful" w:uiPriority="51"/>
+    <w:lsdException w:name="Grid Table 7 Colorful" w:uiPriority="52"/>
+    <w:lsdException w:name="Grid Table 1 Light Accent 1" w:uiPriority="46"/>
+    <w:lsdException w:name="Grid Table 2 Accent 1" w:uiPriority="47"/>
+    <w:lsdException w:name="Grid Table 3 Accent 1" w:uiPriority="48"/>
+    <w:lsdException w:name="Grid Table 4 Accent 1" w:uiPriority="49"/>
+    <w:lsdException w:name="Grid Table 5 Dark Accent 1" w:uiPriority="50"/>
+    <w:lsdException w:name="Grid Table 6 Colorful Accent 1" w:uiPriority="51"/>
+    <w:lsdException w:name="Grid Table 7 Colorful Accent 1" w:uiPriority="52"/>
+    <w:lsdException w:name="Grid Table 1 Light Accent 2" w:uiPriority="46"/>
+    <w:lsdException w:name="Grid Table 2 Accent 2" w:uiPriority="47"/>
+    <w:lsdException w:name="Grid Table 3 Accent 2" w:uiPriority="48"/>
+    <w:lsdException w:name="Grid Table 4 Accent 2" w:uiPriority="49"/>
+    <w:lsdException w:name="Grid Table 5 Dark Accent 2" w:uiPriority="50"/>
+    <w:lsdException w:name="Grid Table 6 Colorful Accent 2" w:uiPriority="51"/>
+    <w:lsdException w:name="Grid Table 7 Colorful Accent 2" w:uiPriority="52"/>
+    <w:lsdException w:name="Grid Table 1 Light Accent 3" w:uiPriority="46"/>
+    <w:lsdException w:name="Grid Table 2 Accent 3" w:uiPriority="47"/>
+    <w:lsdException w:name="Grid Table 3 Accent 3" w:uiPriority="48"/>
+    <w:lsdException w:name="Grid Table 4 Accent 3" w:uiPriority="49"/>
+    <w:lsdException w:name="Grid Table 5 Dark Accent 3" w:uiPriority="50"/>
+    <w:lsdException w:name="Grid Table 6 Colorful Accent 3" w:uiPriority="51"/>
+    <w:lsdException w:name="Grid Table 7 Colorful Accent 3" w:uiPriority="52"/>
+    <w:lsdException w:name="Grid Table 1 Light Accent 4" w:uiPriority="46"/>
+    <w:lsdException w:name="Grid Table 2 Accent 4" w:uiPriority="47"/>
+    <w:lsdException w:name="Grid Table 3 Accent 4" w:uiPriority="48"/>
+    <w:lsdException w:name="Grid Table 4 Accent 4" w:uiPriority="49"/>
+    <w:lsdException w:name="Grid Table 5 Dark Accent 4" w:uiPriority="50"/>
+    <w:lsdException w:name="Grid Table 6 Colorful Accent 4" w:uiPriority="51"/>
+    <w:lsdException w:name="Grid Table 7 Colorful Accent 4" w:uiPriority="52"/>
+    <w:lsdException w:name="Grid Table 1 Light Accent 5" w:uiPriority="46"/>
+    <w:lsdException w:name="Grid Table 2 Accent 5" w:uiPriority="47"/>
+    <w:lsdException w:name="Grid Table 3 Accent 5" w:uiPriority="48"/>
+    <w:lsdException w:name="Grid Table 4 Accent 5" w:uiPriority="49"/>
+    <w:lsdException w:name="Grid Table 5 Dark Accent 5" w:uiPriority="50"/>
+    <w:lsdException w:name="Grid Table 6 Colorful Accent 5" w:uiPriority="51"/>
+    <w:lsdException w:name="Grid Table 7 Colorful Accent 5" w:uiPriority="52"/>
+    <w:lsdException w:name="Grid Table 1 Light Accent 6" w:uiPriority="46"/>
+    <w:lsdException w:name="Grid Table 2 Accent 6" w:uiPriority="47"/>
+    <w:lsdException w:name="Grid Table 3 Accent 6" w:uiPriority="48"/>
+    <w:lsdException w:name="Grid Table 4 Accent 6" w:uiPriority="49"/>
+    <w:lsdException w:name="Grid Table 5 Dark Accent 6" w:uiPriority="50"/>
+    <w:lsdException w:name="Grid Table 6 Colorful Accent 6" w:uiPriority="51"/>
+    <w:lsdException w:name="Grid Table 7 Colorful Accent 6" w:uiPriority="52"/>
+    <w:lsdException w:name="List Table 1 Light" w:uiPriority="46"/>
+    <w:lsdException w:name="List Table 2" w:uiPriority="47"/>
+    <w:lsdException w:name="List Table 3" w:uiPriority="48"/>
+    <w:lsdException w:name="List Table 4" w:uiPriority="49"/>
+    <w:lsdException w:name="List Table 5 Dark" w:uiPriority="50"/>
+    <w:lsdException w:name="List Table 6 Colorful" w:uiPriority="51"/>
+    <w:lsdException w:name="List Table 7 Colorful" w:uiPriority="52"/>
+    <w:lsdException w:name="List Table 1 Light Accent 1" w:uiPriority="46"/>
+    <w:lsdException w:name="List Table 2 Accent 1" w:uiPriority="47"/>
+    <w:lsdException w:name="List Table 3 Accent 1" w:uiPriority="48"/>
+    <w:lsdException w:name="List Table 4 Accent 1" w:uiPriority="49"/>
+    <w:lsdException w:name="List Table 5 Dark Accent 1" w:uiPriority="50"/>
+    <w:lsdException w:name="List Table 6 Colorful Accent 1" w:uiPriority="51"/>
+    <w:lsdException w:name="List Table 7 Colorful Accent 1" w:uiPriority="52"/>
+    <w:lsdException w:name="List Table 1 Light Accent 2" w:uiPriority="46"/>
+    <w:lsdException w:name="List Table 2 Accent 2" w:uiPriority="47"/>
+    <w:lsdException w:name="List Table 3 Accent 2" w:uiPriority="48"/>
+    <w:lsdException w:name="List Table 4 Accent 2" w:uiPriority="49"/>
+    <w:lsdException w:name="List Table 5 Dark Accent 2" w:uiPriority="50"/>
+    <w:lsdException w:name="List Table 6 Colorful Accent 2" w:uiPriority="51"/>
+    <w:lsdException w:name="List Table 7 Colorful Accent 2" w:uiPriority="52"/>
+    <w:lsdException w:name="List Table 1 Light Accent 3" w:uiPriority="46"/>
+    <w:lsdException w:name="List Table 2 Accent 3" w:uiPriority="47"/>
+    <w:lsdException w:name="List Table 3 Accent 3" w:uiPriority="48"/>
+    <w:lsdException w:name="List Table 4 Accent 3" w:uiPriority="49"/>
+    <w:lsdException w:name="List Table 5 Dark Accent 3" w:uiPriority="50"/>
+    <w:lsdException w:name="List Table 6 Colorful Accent 3" w:uiPriority="51"/>
+    <w:lsdException w:name="List Table 7 Colorful Accent 3" w:uiPriority="52"/>
+    <w:lsdException w:name="List Table 1 Light Accent 4" w:uiPriority="46"/>
+    <w:lsdException w:name="List Table 2 Accent 4" w:uiPriority="47"/>
+    <w:lsdException w:name="List Table 3 Accent 4" w:uiPriority="48"/>
+    <w:lsdException w:name="List Table 4 Accent 4" w:uiPriority="49"/>
+    <w:lsdException w:name="List Table 5 Dark Accent 4" w:uiPriority="50"/>
+    <w:lsdException w:name="List Table 6 Colorful Accent 4" w:uiPriority="51"/>
+    <w:lsdException w:name="List Table 7 Colorful Accent 4" w:uiPriority="52"/>
+    <w:lsdException w:name="List Table 1 Light Accent 5" w:uiPriority="46"/>
+    <w:lsdException w:name="List Table 2 Accent 5" w:uiPriority="47"/>
+    <w:lsdException w:name="List Table 3 Accent 5" w:uiPriority="48"/>
+    <w:lsdException w:name="List Table 4 Accent 5" w:uiPriority="49"/>
+    <w:lsdException w:name="List Table 5 Dark Accent 5" w:uiPriority="50"/>
+    <w:lsdException w:name="List Table 6 Colorful Accent 5" w:uiPriority="51"/>
+    <w:lsdException w:name="List Table 7 Colorful Accent 5" w:uiPriority="52"/>
+    <w:lsdException w:name="List Table 1 Light Accent 6" w:uiPriority="46"/>
+    <w:lsdException w:name="List Table 2 Accent 6" w:uiPriority="47"/>
+    <w:lsdException w:name="List Table 3 Accent 6" w:uiPriority="48"/>
+    <w:lsdException w:name="List Table 4 Accent 6" w:uiPriority="49"/>
+    <w:lsdException w:name="List Table 5 Dark Accent 6" w:uiPriority="50"/>
+    <w:lsdException w:name="List Table 6 Colorful Accent 6" w:uiPriority="51"/>
+    <w:lsdException w:name="List Table 7 Colorful Accent 6" w:uiPriority="52"/>
+    <w:lsdException w:name="Mention" w:semiHidden="1" w:unhideWhenUsed="1"/>
+    <w:lsdException w:name="Smart Hyperlink" w:semiHidden="1" w:unhideWhenUsed="1"/>
+    <w:lsdException w:name="Hashtag" w:semiHidden="1" w:unhideWhenUsed="1"/>
+    <w:lsdException w:name="Unresolved Mention" w:semiHidden="1" w:unhideWhenUsed="1"/>
+    <w:lsdException w:name="Smart Link" w:semiHidden="1" w:unhideWhenUsed="1"/>
   </w:latentStyles>
   <w:style w:type="paragraph" w:default="1" w:styleId="Normal">
     <w:name w:val="Normal"/>
@@ -6959,1757 +7137,7 @@
       </w:tblBorders>
     </w:tblPr>
   </w:style>
-  <w:style w:type="character" w:customStyle="1" w:styleId="UnresolvedMention">
-    <w:name w:val="Unresolved Mention"/>
-    <w:basedOn w:val="DefaultParagraphFont"/>
-    <w:uiPriority w:val="99"/>
-    <w:semiHidden/>
-    <w:unhideWhenUsed/>
-    <w:rsid w:val="00864CA9"/>
-    <w:rPr>
-      <w:color w:val="605E5C"/>
-      <w:shd w:val="clear" w:color="auto" w:fill="E1DFDD"/>
-    </w:rPr>
-  </w:style>
-</w:styles>
-</file>
-
-<file path=word/stylesWithEffects.xml><?xml version="1.0" encoding="utf-8"?>
-<w:styles xmlns:wpc="http://schemas.microsoft.com/office/word/2010/wordprocessingCanvas" xmlns:mc="http://schemas.openxmlformats.org/markup-compatibility/2006" xmlns:o="urn:schemas-microsoft-com:office:office" xmlns:r="http://schemas.openxmlformats.org/officeDocument/2006/relationships" xmlns:m="http://schemas.openxmlformats.org/officeDocument/2006/math" xmlns:v="urn:schemas-microsoft-com:vml" xmlns:wp14="http://schemas.microsoft.com/office/word/2010/wordprocessingDrawing" xmlns:wp="http://schemas.openxmlformats.org/drawingml/2006/wordprocessingDrawing" xmlns:w10="urn:schemas-microsoft-com:office:word" xmlns:w="http://schemas.openxmlformats.org/wordprocessingml/2006/main" xmlns:w14="http://schemas.microsoft.com/office/word/2010/wordml" xmlns:wpg="http://schemas.microsoft.com/office/word/2010/wordprocessingGroup" xmlns:wpi="http://schemas.microsoft.com/office/word/2010/wordprocessingInk" xmlns:wne="http://schemas.microsoft.com/office/word/2006/wordml" xmlns:wps="http://schemas.microsoft.com/office/word/2010/wordprocessingShape" mc:Ignorable="w14 wp14">
-  <w:docDefaults>
-    <w:rPrDefault>
-      <w:rPr>
-        <w:rFonts w:asciiTheme="minorHAnsi" w:eastAsia="Arial" w:hAnsiTheme="minorHAnsi" w:cstheme="minorBidi"/>
-        <w:sz w:val="22"/>
-        <w:szCs w:val="22"/>
-        <w:lang w:val="en-US" w:eastAsia="en-US" w:bidi="ar-SA"/>
-      </w:rPr>
-    </w:rPrDefault>
-    <w:pPrDefault>
-      <w:pPr>
-        <w:spacing w:beforeAutospacing="1" w:after="160" w:afterAutospacing="1" w:line="259" w:lineRule="auto"/>
-      </w:pPr>
-    </w:pPrDefault>
-  </w:docDefaults>
-  <w:latentStyles w:defLockedState="0" w:defUIPriority="99" w:defSemiHidden="1" w:defUnhideWhenUsed="1" w:defQFormat="0" w:count="267">
-    <w:lsdException w:name="Normal" w:semiHidden="0" w:uiPriority="0" w:unhideWhenUsed="0" w:qFormat="1"/>
-    <w:lsdException w:name="heading 1" w:semiHidden="0" w:uiPriority="9" w:unhideWhenUsed="0" w:qFormat="1"/>
-    <w:lsdException w:name="heading 2" w:uiPriority="9" w:qFormat="1"/>
-    <w:lsdException w:name="heading 3" w:uiPriority="9" w:qFormat="1"/>
-    <w:lsdException w:name="heading 4" w:uiPriority="9" w:qFormat="1"/>
-    <w:lsdException w:name="heading 5" w:uiPriority="9" w:qFormat="1"/>
-    <w:lsdException w:name="heading 6" w:uiPriority="9" w:qFormat="1"/>
-    <w:lsdException w:name="heading 7" w:uiPriority="9" w:qFormat="1"/>
-    <w:lsdException w:name="heading 8" w:uiPriority="9" w:qFormat="1"/>
-    <w:lsdException w:name="heading 9" w:uiPriority="9" w:qFormat="1"/>
-    <w:lsdException w:name="toc 1" w:uiPriority="39"/>
-    <w:lsdException w:name="toc 2" w:uiPriority="39"/>
-    <w:lsdException w:name="toc 3" w:uiPriority="39"/>
-    <w:lsdException w:name="toc 4" w:uiPriority="39"/>
-    <w:lsdException w:name="toc 5" w:uiPriority="39"/>
-    <w:lsdException w:name="toc 6" w:uiPriority="39"/>
-    <w:lsdException w:name="toc 7" w:uiPriority="39"/>
-    <w:lsdException w:name="toc 8" w:uiPriority="39"/>
-    <w:lsdException w:name="toc 9" w:uiPriority="39"/>
-    <w:lsdException w:name="annotation text" w:qFormat="1"/>
-    <w:lsdException w:name="caption" w:uiPriority="35" w:qFormat="1"/>
-    <w:lsdException w:name="annotation reference" w:qFormat="1"/>
-    <w:lsdException w:name="Title" w:semiHidden="0" w:uiPriority="10" w:unhideWhenUsed="0" w:qFormat="1"/>
-    <w:lsdException w:name="Default Paragraph Font" w:uiPriority="1"/>
-    <w:lsdException w:name="Body Text" w:uiPriority="1" w:qFormat="1"/>
-    <w:lsdException w:name="Subtitle" w:semiHidden="0" w:uiPriority="11" w:unhideWhenUsed="0" w:qFormat="1"/>
-    <w:lsdException w:name="Strong" w:semiHidden="0" w:uiPriority="22" w:unhideWhenUsed="0" w:qFormat="1"/>
-    <w:lsdException w:name="Emphasis" w:semiHidden="0" w:uiPriority="20" w:unhideWhenUsed="0" w:qFormat="1"/>
-    <w:lsdException w:name="Table Grid" w:semiHidden="0" w:uiPriority="39" w:unhideWhenUsed="0"/>
-    <w:lsdException w:name="Placeholder Text" w:unhideWhenUsed="0"/>
-    <w:lsdException w:name="No Spacing" w:semiHidden="0" w:uiPriority="1" w:unhideWhenUsed="0" w:qFormat="1"/>
-    <w:lsdException w:name="Light Shading" w:semiHidden="0" w:uiPriority="60" w:unhideWhenUsed="0"/>
-    <w:lsdException w:name="Light List" w:semiHidden="0" w:uiPriority="61" w:unhideWhenUsed="0"/>
-    <w:lsdException w:name="Light Grid" w:semiHidden="0" w:uiPriority="62" w:unhideWhenUsed="0"/>
-    <w:lsdException w:name="Medium Shading 1" w:semiHidden="0" w:uiPriority="63" w:unhideWhenUsed="0"/>
-    <w:lsdException w:name="Medium Shading 2" w:semiHidden="0" w:uiPriority="64" w:unhideWhenUsed="0"/>
-    <w:lsdException w:name="Medium List 1" w:semiHidden="0" w:uiPriority="65" w:unhideWhenUsed="0"/>
-    <w:lsdException w:name="Medium List 2" w:semiHidden="0" w:uiPriority="66" w:unhideWhenUsed="0"/>
-    <w:lsdException w:name="Medium Grid 1" w:semiHidden="0" w:uiPriority="67" w:unhideWhenUsed="0"/>
-    <w:lsdException w:name="Medium Grid 2" w:semiHidden="0" w:uiPriority="68" w:unhideWhenUsed="0"/>
-    <w:lsdException w:name="Medium Grid 3" w:semiHidden="0" w:uiPriority="69" w:unhideWhenUsed="0"/>
-    <w:lsdException w:name="Dark List" w:semiHidden="0" w:uiPriority="70" w:unhideWhenUsed="0"/>
-    <w:lsdException w:name="Colorful Shading" w:semiHidden="0" w:uiPriority="71" w:unhideWhenUsed="0"/>
-    <w:lsdException w:name="Colorful List" w:semiHidden="0" w:uiPriority="72" w:unhideWhenUsed="0"/>
-    <w:lsdException w:name="Colorful Grid" w:semiHidden="0" w:uiPriority="73" w:unhideWhenUsed="0"/>
-    <w:lsdException w:name="Light Shading Accent 1" w:semiHidden="0" w:uiPriority="60" w:unhideWhenUsed="0"/>
-    <w:lsdException w:name="Light List Accent 1" w:semiHidden="0" w:uiPriority="61" w:unhideWhenUsed="0"/>
-    <w:lsdException w:name="Light Grid Accent 1" w:semiHidden="0" w:uiPriority="62" w:unhideWhenUsed="0"/>
-    <w:lsdException w:name="Medium Shading 1 Accent 1" w:semiHidden="0" w:uiPriority="63" w:unhideWhenUsed="0"/>
-    <w:lsdException w:name="Medium Shading 2 Accent 1" w:semiHidden="0" w:uiPriority="64" w:unhideWhenUsed="0"/>
-    <w:lsdException w:name="Medium List 1 Accent 1" w:semiHidden="0" w:uiPriority="65" w:unhideWhenUsed="0"/>
-    <w:lsdException w:name="Revision" w:unhideWhenUsed="0"/>
-    <w:lsdException w:name="List Paragraph" w:semiHidden="0" w:uiPriority="34" w:unhideWhenUsed="0" w:qFormat="1"/>
-    <w:lsdException w:name="Quote" w:semiHidden="0" w:uiPriority="29" w:unhideWhenUsed="0" w:qFormat="1"/>
-    <w:lsdException w:name="Intense Quote" w:semiHidden="0" w:uiPriority="30" w:unhideWhenUsed="0" w:qFormat="1"/>
-    <w:lsdException w:name="Medium List 2 Accent 1" w:semiHidden="0" w:uiPriority="66" w:unhideWhenUsed="0"/>
-    <w:lsdException w:name="Medium Grid 1 Accent 1" w:semiHidden="0" w:uiPriority="67" w:unhideWhenUsed="0"/>
-    <w:lsdException w:name="Medium Grid 2 Accent 1" w:semiHidden="0" w:uiPriority="68" w:unhideWhenUsed="0"/>
-    <w:lsdException w:name="Medium Grid 3 Accent 1" w:semiHidden="0" w:uiPriority="69" w:unhideWhenUsed="0"/>
-    <w:lsdException w:name="Dark List Accent 1" w:semiHidden="0" w:uiPriority="70" w:unhideWhenUsed="0"/>
-    <w:lsdException w:name="Colorful Shading Accent 1" w:semiHidden="0" w:uiPriority="71" w:unhideWhenUsed="0"/>
-    <w:lsdException w:name="Colorful List Accent 1" w:semiHidden="0" w:uiPriority="72" w:unhideWhenUsed="0"/>
-    <w:lsdException w:name="Colorful Grid Accent 1" w:semiHidden="0" w:uiPriority="73" w:unhideWhenUsed="0"/>
-    <w:lsdException w:name="Light Shading Accent 2" w:semiHidden="0" w:uiPriority="60" w:unhideWhenUsed="0"/>
-    <w:lsdException w:name="Light List Accent 2" w:semiHidden="0" w:uiPriority="61" w:unhideWhenUsed="0"/>
-    <w:lsdException w:name="Light Grid Accent 2" w:semiHidden="0" w:uiPriority="62" w:unhideWhenUsed="0"/>
-    <w:lsdException w:name="Medium Shading 1 Accent 2" w:semiHidden="0" w:uiPriority="63" w:unhideWhenUsed="0"/>
-    <w:lsdException w:name="Medium Shading 2 Accent 2" w:semiHidden="0" w:uiPriority="64" w:unhideWhenUsed="0"/>
-    <w:lsdException w:name="Medium List 1 Accent 2" w:semiHidden="0" w:uiPriority="65" w:unhideWhenUsed="0"/>
-    <w:lsdException w:name="Medium List 2 Accent 2" w:semiHidden="0" w:uiPriority="66" w:unhideWhenUsed="0"/>
-    <w:lsdException w:name="Medium Grid 1 Accent 2" w:semiHidden="0" w:uiPriority="67" w:unhideWhenUsed="0"/>
-    <w:lsdException w:name="Medium Grid 2 Accent 2" w:semiHidden="0" w:uiPriority="68" w:unhideWhenUsed="0"/>
-    <w:lsdException w:name="Medium Grid 3 Accent 2" w:semiHidden="0" w:uiPriority="69" w:unhideWhenUsed="0"/>
-    <w:lsdException w:name="Dark List Accent 2" w:semiHidden="0" w:uiPriority="70" w:unhideWhenUsed="0"/>
-    <w:lsdException w:name="Colorful Shading Accent 2" w:semiHidden="0" w:uiPriority="71" w:unhideWhenUsed="0"/>
-    <w:lsdException w:name="Colorful List Accent 2" w:semiHidden="0" w:uiPriority="72" w:unhideWhenUsed="0"/>
-    <w:lsdException w:name="Colorful Grid Accent 2" w:semiHidden="0" w:uiPriority="73" w:unhideWhenUsed="0"/>
-    <w:lsdException w:name="Light Shading Accent 3" w:semiHidden="0" w:uiPriority="60" w:unhideWhenUsed="0"/>
-    <w:lsdException w:name="Light List Accent 3" w:semiHidden="0" w:uiPriority="61" w:unhideWhenUsed="0"/>
-    <w:lsdException w:name="Light Grid Accent 3" w:semiHidden="0" w:uiPriority="62" w:unhideWhenUsed="0"/>
-    <w:lsdException w:name="Medium Shading 1 Accent 3" w:semiHidden="0" w:uiPriority="63" w:unhideWhenUsed="0"/>
-    <w:lsdException w:name="Medium Shading 2 Accent 3" w:semiHidden="0" w:uiPriority="64" w:unhideWhenUsed="0"/>
-    <w:lsdException w:name="Medium List 1 Accent 3" w:semiHidden="0" w:uiPriority="65" w:unhideWhenUsed="0"/>
-    <w:lsdException w:name="Medium List 2 Accent 3" w:semiHidden="0" w:uiPriority="66" w:unhideWhenUsed="0"/>
-    <w:lsdException w:name="Medium Grid 1 Accent 3" w:semiHidden="0" w:uiPriority="67" w:unhideWhenUsed="0"/>
-    <w:lsdException w:name="Medium Grid 2 Accent 3" w:semiHidden="0" w:uiPriority="68" w:unhideWhenUsed="0"/>
-    <w:lsdException w:name="Medium Grid 3 Accent 3" w:semiHidden="0" w:uiPriority="69" w:unhideWhenUsed="0"/>
-    <w:lsdException w:name="Dark List Accent 3" w:semiHidden="0" w:uiPriority="70" w:unhideWhenUsed="0"/>
-    <w:lsdException w:name="Colorful Shading Accent 3" w:semiHidden="0" w:uiPriority="71" w:unhideWhenUsed="0"/>
-    <w:lsdException w:name="Colorful List Accent 3" w:semiHidden="0" w:uiPriority="72" w:unhideWhenUsed="0"/>
-    <w:lsdException w:name="Colorful Grid Accent 3" w:semiHidden="0" w:uiPriority="73" w:unhideWhenUsed="0"/>
-    <w:lsdException w:name="Light Shading Accent 4" w:semiHidden="0" w:uiPriority="60" w:unhideWhenUsed="0"/>
-    <w:lsdException w:name="Light List Accent 4" w:semiHidden="0" w:uiPriority="61" w:unhideWhenUsed="0"/>
-    <w:lsdException w:name="Light Grid Accent 4" w:semiHidden="0" w:uiPriority="62" w:unhideWhenUsed="0"/>
-    <w:lsdException w:name="Medium Shading 1 Accent 4" w:semiHidden="0" w:uiPriority="63" w:unhideWhenUsed="0"/>
-    <w:lsdException w:name="Medium Shading 2 Accent 4" w:semiHidden="0" w:uiPriority="64" w:unhideWhenUsed="0"/>
-    <w:lsdException w:name="Medium List 1 Accent 4" w:semiHidden="0" w:uiPriority="65" w:unhideWhenUsed="0"/>
-    <w:lsdException w:name="Medium List 2 Accent 4" w:semiHidden="0" w:uiPriority="66" w:unhideWhenUsed="0"/>
-    <w:lsdException w:name="Medium Grid 1 Accent 4" w:semiHidden="0" w:uiPriority="67" w:unhideWhenUsed="0"/>
-    <w:lsdException w:name="Medium Grid 2 Accent 4" w:semiHidden="0" w:uiPriority="68" w:unhideWhenUsed="0"/>
-    <w:lsdException w:name="Medium Grid 3 Accent 4" w:semiHidden="0" w:uiPriority="69" w:unhideWhenUsed="0"/>
-    <w:lsdException w:name="Dark List Accent 4" w:semiHidden="0" w:uiPriority="70" w:unhideWhenUsed="0"/>
-    <w:lsdException w:name="Colorful Shading Accent 4" w:semiHidden="0" w:uiPriority="71" w:unhideWhenUsed="0"/>
-    <w:lsdException w:name="Colorful List Accent 4" w:semiHidden="0" w:uiPriority="72" w:unhideWhenUsed="0"/>
-    <w:lsdException w:name="Colorful Grid Accent 4" w:semiHidden="0" w:uiPriority="73" w:unhideWhenUsed="0"/>
-    <w:lsdException w:name="Light Shading Accent 5" w:semiHidden="0" w:uiPriority="60" w:unhideWhenUsed="0"/>
-    <w:lsdException w:name="Light List Accent 5" w:semiHidden="0" w:uiPriority="61" w:unhideWhenUsed="0"/>
-    <w:lsdException w:name="Light Grid Accent 5" w:semiHidden="0" w:uiPriority="62" w:unhideWhenUsed="0"/>
-    <w:lsdException w:name="Medium Shading 1 Accent 5" w:semiHidden="0" w:uiPriority="63" w:unhideWhenUsed="0"/>
-    <w:lsdException w:name="Medium Shading 2 Accent 5" w:semiHidden="0" w:uiPriority="64" w:unhideWhenUsed="0"/>
-    <w:lsdException w:name="Medium List 1 Accent 5" w:semiHidden="0" w:uiPriority="65" w:unhideWhenUsed="0"/>
-    <w:lsdException w:name="Medium List 2 Accent 5" w:semiHidden="0" w:uiPriority="66" w:unhideWhenUsed="0"/>
-    <w:lsdException w:name="Medium Grid 1 Accent 5" w:semiHidden="0" w:uiPriority="67" w:unhideWhenUsed="0"/>
-    <w:lsdException w:name="Medium Grid 2 Accent 5" w:semiHidden="0" w:uiPriority="68" w:unhideWhenUsed="0"/>
-    <w:lsdException w:name="Medium Grid 3 Accent 5" w:semiHidden="0" w:uiPriority="69" w:unhideWhenUsed="0"/>
-    <w:lsdException w:name="Dark List Accent 5" w:semiHidden="0" w:uiPriority="70" w:unhideWhenUsed="0"/>
-    <w:lsdException w:name="Colorful Shading Accent 5" w:semiHidden="0" w:uiPriority="71" w:unhideWhenUsed="0"/>
-    <w:lsdException w:name="Colorful List Accent 5" w:semiHidden="0" w:uiPriority="72" w:unhideWhenUsed="0"/>
-    <w:lsdException w:name="Colorful Grid Accent 5" w:semiHidden="0" w:uiPriority="73" w:unhideWhenUsed="0"/>
-    <w:lsdException w:name="Light Shading Accent 6" w:semiHidden="0" w:uiPriority="60" w:unhideWhenUsed="0"/>
-    <w:lsdException w:name="Light List Accent 6" w:semiHidden="0" w:uiPriority="61" w:unhideWhenUsed="0"/>
-    <w:lsdException w:name="Light Grid Accent 6" w:semiHidden="0" w:uiPriority="62" w:unhideWhenUsed="0"/>
-    <w:lsdException w:name="Medium Shading 1 Accent 6" w:semiHidden="0" w:uiPriority="63" w:unhideWhenUsed="0"/>
-    <w:lsdException w:name="Medium Shading 2 Accent 6" w:semiHidden="0" w:uiPriority="64" w:unhideWhenUsed="0"/>
-    <w:lsdException w:name="Medium List 1 Accent 6" w:semiHidden="0" w:uiPriority="65" w:unhideWhenUsed="0"/>
-    <w:lsdException w:name="Medium List 2 Accent 6" w:semiHidden="0" w:uiPriority="66" w:unhideWhenUsed="0"/>
-    <w:lsdException w:name="Medium Grid 1 Accent 6" w:semiHidden="0" w:uiPriority="67" w:unhideWhenUsed="0"/>
-    <w:lsdException w:name="Medium Grid 2 Accent 6" w:semiHidden="0" w:uiPriority="68" w:unhideWhenUsed="0"/>
-    <w:lsdException w:name="Medium Grid 3 Accent 6" w:semiHidden="0" w:uiPriority="69" w:unhideWhenUsed="0"/>
-    <w:lsdException w:name="Dark List Accent 6" w:semiHidden="0" w:uiPriority="70" w:unhideWhenUsed="0"/>
-    <w:lsdException w:name="Colorful Shading Accent 6" w:semiHidden="0" w:uiPriority="71" w:unhideWhenUsed="0"/>
-    <w:lsdException w:name="Colorful List Accent 6" w:semiHidden="0" w:uiPriority="72" w:unhideWhenUsed="0"/>
-    <w:lsdException w:name="Colorful Grid Accent 6" w:semiHidden="0" w:uiPriority="73" w:unhideWhenUsed="0"/>
-    <w:lsdException w:name="Subtle Emphasis" w:semiHidden="0" w:uiPriority="19" w:unhideWhenUsed="0" w:qFormat="1"/>
-    <w:lsdException w:name="Intense Emphasis" w:semiHidden="0" w:uiPriority="21" w:unhideWhenUsed="0" w:qFormat="1"/>
-    <w:lsdException w:name="Subtle Reference" w:semiHidden="0" w:uiPriority="31" w:unhideWhenUsed="0" w:qFormat="1"/>
-    <w:lsdException w:name="Intense Reference" w:semiHidden="0" w:uiPriority="32" w:unhideWhenUsed="0" w:qFormat="1"/>
-    <w:lsdException w:name="Book Title" w:semiHidden="0" w:uiPriority="33" w:unhideWhenUsed="0" w:qFormat="1"/>
-    <w:lsdException w:name="Bibliography" w:uiPriority="37"/>
-    <w:lsdException w:name="TOC Heading" w:uiPriority="39" w:qFormat="1"/>
-  </w:latentStyles>
-  <w:style w:type="paragraph" w:default="1" w:styleId="Normal">
-    <w:name w:val="Normal"/>
-    <w:qFormat/>
-    <w:rsid w:val="000F4FEF"/>
-    <w:pPr>
-      <w:spacing w:before="-1" w:after="-1" w:line="240" w:lineRule="auto"/>
-    </w:pPr>
-    <w:rPr>
-      <w:rFonts w:ascii="Arial" w:hAnsi="Arial" w:cs="Arial"/>
-    </w:rPr>
-  </w:style>
-  <w:style w:type="paragraph" w:styleId="Heading1">
-    <w:name w:val="heading 1"/>
-    <w:basedOn w:val="Normal"/>
-    <w:link w:val="Heading1Char"/>
-    <w:uiPriority w:val="9"/>
-    <w:qFormat/>
-    <w:rsid w:val="000F4FEF"/>
-    <w:pPr>
-      <w:pBdr>
-        <w:bottom w:val="single" w:sz="4" w:space="1" w:color="A6A6A6" w:themeColor="background1" w:themeShade="A6"/>
-      </w:pBdr>
-      <w:spacing w:before="0" w:beforeAutospacing="0" w:after="100" w:line="276" w:lineRule="auto"/>
-      <w:outlineLvl w:val="0"/>
-    </w:pPr>
-    <w:rPr>
-      <w:rFonts w:ascii="Helvetica" w:hAnsi="Helvetica" w:cs="Helvetica"/>
-      <w:color w:val="0A2A78"/>
-      <w:spacing w:val="-4"/>
-      <w:sz w:val="40"/>
-      <w:szCs w:val="24"/>
-    </w:rPr>
-  </w:style>
-  <w:style w:type="paragraph" w:styleId="Heading2">
-    <w:name w:val="heading 2"/>
-    <w:basedOn w:val="Normal"/>
-    <w:next w:val="Normal"/>
-    <w:link w:val="Heading2Char"/>
-    <w:uiPriority w:val="9"/>
-    <w:unhideWhenUsed/>
-    <w:qFormat/>
-    <w:rsid w:val="000F4FEF"/>
-    <w:pPr>
-      <w:widowControl w:val="0"/>
-      <w:autoSpaceDE w:val="0"/>
-      <w:autoSpaceDN w:val="0"/>
-      <w:spacing w:before="0" w:beforeAutospacing="0" w:after="0" w:afterAutospacing="0" w:line="276" w:lineRule="auto"/>
-      <w:outlineLvl w:val="1"/>
-    </w:pPr>
-    <w:rPr>
-      <w:rFonts w:ascii="Helvetica" w:eastAsiaTheme="minorHAnsi" w:hAnsi="Helvetica" w:cs="Helvetica"/>
-      <w:color w:val="0A2A78"/>
-      <w:spacing w:val="-2"/>
-      <w:sz w:val="36"/>
-      <w:szCs w:val="24"/>
-    </w:rPr>
-  </w:style>
-  <w:style w:type="paragraph" w:styleId="Heading3">
-    <w:name w:val="heading 3"/>
-    <w:basedOn w:val="Heading2"/>
-    <w:next w:val="Body"/>
-    <w:link w:val="Heading3Char"/>
-    <w:uiPriority w:val="9"/>
-    <w:unhideWhenUsed/>
-    <w:qFormat/>
-    <w:rsid w:val="000F4FEF"/>
-    <w:pPr>
-      <w:outlineLvl w:val="2"/>
-    </w:pPr>
-    <w:rPr>
-      <w:sz w:val="32"/>
-    </w:rPr>
-  </w:style>
-  <w:style w:type="paragraph" w:styleId="Heading4">
-    <w:name w:val="heading 4"/>
-    <w:basedOn w:val="Normal"/>
-    <w:next w:val="Normal"/>
-    <w:link w:val="Heading4Char"/>
-    <w:uiPriority w:val="9"/>
-    <w:unhideWhenUsed/>
-    <w:qFormat/>
-    <w:rsid w:val="000F4FEF"/>
-    <w:pPr>
-      <w:widowControl w:val="0"/>
-      <w:autoSpaceDE w:val="0"/>
-      <w:autoSpaceDN w:val="0"/>
-      <w:spacing w:before="54" w:beforeAutospacing="0" w:after="120" w:afterAutospacing="0" w:line="276" w:lineRule="auto"/>
-      <w:ind w:left="360"/>
-      <w:outlineLvl w:val="3"/>
-    </w:pPr>
-    <w:rPr>
-      <w:rFonts w:ascii="Helvetica" w:eastAsiaTheme="minorHAnsi" w:hAnsi="Helvetica" w:cs="Helvetica"/>
-      <w:iCs/>
-      <w:color w:val="0A2A78"/>
-      <w:spacing w:val="-2"/>
-      <w:sz w:val="24"/>
-      <w:szCs w:val="24"/>
-    </w:rPr>
-  </w:style>
-  <w:style w:type="paragraph" w:styleId="Heading5">
-    <w:name w:val="heading 5"/>
-    <w:basedOn w:val="Normal"/>
-    <w:next w:val="Normal"/>
-    <w:link w:val="Heading5Char"/>
-    <w:uiPriority w:val="9"/>
-    <w:unhideWhenUsed/>
-    <w:qFormat/>
-    <w:rsid w:val="000F4FEF"/>
-    <w:pPr>
-      <w:keepNext/>
-      <w:keepLines/>
-      <w:spacing w:before="240" w:after="80"/>
-      <w:outlineLvl w:val="4"/>
-    </w:pPr>
-    <w:rPr>
-      <w:color w:val="666666"/>
-    </w:rPr>
-  </w:style>
-  <w:style w:type="paragraph" w:styleId="Heading6">
-    <w:name w:val="heading 6"/>
-    <w:basedOn w:val="Normal"/>
-    <w:next w:val="Normal"/>
-    <w:link w:val="Heading6Char"/>
-    <w:uiPriority w:val="9"/>
-    <w:semiHidden/>
-    <w:unhideWhenUsed/>
-    <w:qFormat/>
-    <w:rsid w:val="000F4FEF"/>
-    <w:pPr>
-      <w:keepNext/>
-      <w:keepLines/>
-      <w:spacing w:before="240" w:after="80"/>
-      <w:outlineLvl w:val="5"/>
-    </w:pPr>
-    <w:rPr>
-      <w:i/>
-      <w:color w:val="666666"/>
-    </w:rPr>
-  </w:style>
-  <w:style w:type="character" w:default="1" w:styleId="DefaultParagraphFont">
-    <w:name w:val="Default Paragraph Font"/>
-    <w:uiPriority w:val="1"/>
-    <w:semiHidden/>
-    <w:unhideWhenUsed/>
-  </w:style>
-  <w:style w:type="table" w:default="1" w:styleId="TableNormal">
-    <w:name w:val="Normal Table"/>
-    <w:uiPriority w:val="99"/>
-    <w:semiHidden/>
-    <w:unhideWhenUsed/>
-    <w:tblPr>
-      <w:tblInd w:w="0" w:type="dxa"/>
-      <w:tblCellMar>
-        <w:top w:w="0" w:type="dxa"/>
-        <w:left w:w="108" w:type="dxa"/>
-        <w:bottom w:w="0" w:type="dxa"/>
-        <w:right w:w="108" w:type="dxa"/>
-      </w:tblCellMar>
-    </w:tblPr>
-  </w:style>
-  <w:style w:type="numbering" w:default="1" w:styleId="NoList">
-    <w:name w:val="No List"/>
-    <w:uiPriority w:val="99"/>
-    <w:semiHidden/>
-    <w:unhideWhenUsed/>
-  </w:style>
-  <w:style w:type="paragraph" w:customStyle="1" w:styleId="Code">
-    <w:name w:val="Code"/>
-    <w:basedOn w:val="Normal"/>
-    <w:qFormat/>
-    <w:rsid w:val="000F4FEF"/>
-    <w:rPr>
-      <w:rFonts w:ascii="Calibri" w:hAnsi="Calibri"/>
-    </w:rPr>
-  </w:style>
-  <w:style w:type="paragraph" w:customStyle="1" w:styleId="Body">
-    <w:name w:val="Body"/>
-    <w:basedOn w:val="Normal"/>
-    <w:link w:val="BodyChar"/>
-    <w:qFormat/>
-    <w:rsid w:val="000F4FEF"/>
-    <w:pPr>
-      <w:spacing w:before="0" w:beforeAutospacing="0" w:after="120" w:afterAutospacing="0" w:line="276" w:lineRule="auto"/>
-    </w:pPr>
-    <w:rPr>
-      <w:rFonts w:ascii="Helvetica" w:eastAsiaTheme="minorHAnsi" w:hAnsi="Helvetica" w:cs="Helvetica"/>
-      <w:sz w:val="24"/>
-      <w:szCs w:val="24"/>
-    </w:rPr>
-  </w:style>
-  <w:style w:type="character" w:customStyle="1" w:styleId="Heading1Char">
-    <w:name w:val="Heading 1 Char"/>
-    <w:basedOn w:val="DefaultParagraphFont"/>
-    <w:link w:val="Heading1"/>
-    <w:uiPriority w:val="9"/>
-    <w:rsid w:val="000F4FEF"/>
-    <w:rPr>
-      <w:rFonts w:ascii="Helvetica" w:hAnsi="Helvetica" w:cs="Helvetica"/>
-      <w:color w:val="0A2A78"/>
-      <w:spacing w:val="-4"/>
-      <w:sz w:val="40"/>
-      <w:szCs w:val="24"/>
-    </w:rPr>
-  </w:style>
-  <w:style w:type="paragraph" w:styleId="ListParagraph">
-    <w:name w:val="List Paragraph"/>
-    <w:basedOn w:val="BodyText"/>
-    <w:uiPriority w:val="34"/>
-    <w:qFormat/>
-    <w:rsid w:val="000F4FEF"/>
-    <w:pPr>
-      <w:widowControl w:val="0"/>
-      <w:numPr>
-        <w:numId w:val="35"/>
-      </w:numPr>
-      <w:autoSpaceDE w:val="0"/>
-      <w:autoSpaceDN w:val="0"/>
-      <w:spacing w:before="54" w:beforeAutospacing="0" w:afterAutospacing="0" w:line="276" w:lineRule="auto"/>
-    </w:pPr>
-    <w:rPr>
-      <w:rFonts w:ascii="Helvetica" w:eastAsiaTheme="minorHAnsi" w:hAnsi="Helvetica" w:cs="Helvetica"/>
-      <w:color w:val="202529"/>
-      <w:spacing w:val="-2"/>
-      <w:sz w:val="24"/>
-      <w:szCs w:val="24"/>
-    </w:rPr>
-  </w:style>
-  <w:style w:type="paragraph" w:customStyle="1" w:styleId="TFVariable">
-    <w:name w:val="TF Variable"/>
-    <w:basedOn w:val="Heading3"/>
-    <w:next w:val="Body"/>
-    <w:qFormat/>
-    <w:rsid w:val="000F4FEF"/>
-    <w:pPr>
-      <w:numPr>
-        <w:numId w:val="38"/>
-      </w:numPr>
-    </w:pPr>
-  </w:style>
-  <w:style w:type="character" w:customStyle="1" w:styleId="Heading3Char">
-    <w:name w:val="Heading 3 Char"/>
-    <w:basedOn w:val="DefaultParagraphFont"/>
-    <w:link w:val="Heading3"/>
-    <w:uiPriority w:val="9"/>
-    <w:qFormat/>
-    <w:rsid w:val="000F4FEF"/>
-    <w:rPr>
-      <w:rFonts w:ascii="Helvetica" w:eastAsiaTheme="minorHAnsi" w:hAnsi="Helvetica" w:cs="Helvetica"/>
-      <w:color w:val="0A2A78"/>
-      <w:spacing w:val="-2"/>
-      <w:sz w:val="32"/>
-      <w:szCs w:val="24"/>
-    </w:rPr>
-  </w:style>
-  <w:style w:type="paragraph" w:customStyle="1" w:styleId="interviewcondition">
-    <w:name w:val="interview condition"/>
-    <w:basedOn w:val="Normal"/>
-    <w:link w:val="interviewconditionChar"/>
-    <w:qFormat/>
-    <w:rsid w:val="00F44633"/>
-    <w:pPr>
-      <w:spacing w:after="60" w:line="360" w:lineRule="auto"/>
-    </w:pPr>
-    <w:rPr>
-      <w:rFonts w:asciiTheme="minorHAnsi" w:hAnsiTheme="minorHAnsi" w:cstheme="minorBidi"/>
-      <w:color w:val="00B050"/>
-      <w:u w:val="single"/>
-    </w:rPr>
-  </w:style>
-  <w:style w:type="character" w:customStyle="1" w:styleId="interviewconditionChar">
-    <w:name w:val="interview condition Char"/>
-    <w:basedOn w:val="DefaultParagraphFont"/>
-    <w:link w:val="interviewcondition"/>
-    <w:rsid w:val="00F44633"/>
-    <w:rPr>
-      <w:color w:val="00B050"/>
-      <w:u w:val="single"/>
-    </w:rPr>
-  </w:style>
-  <w:style w:type="paragraph" w:customStyle="1" w:styleId="interviewbutton">
-    <w:name w:val="interview button"/>
-    <w:basedOn w:val="Normal"/>
-    <w:next w:val="Normal"/>
-    <w:link w:val="interviewbuttonChar"/>
-    <w:qFormat/>
-    <w:rsid w:val="000F4FEF"/>
-    <w:pPr>
-      <w:shd w:val="clear" w:color="auto" w:fill="0070C0"/>
-      <w:spacing w:after="60" w:line="360" w:lineRule="auto"/>
-    </w:pPr>
-    <w:rPr>
-      <w:rFonts w:asciiTheme="minorHAnsi" w:hAnsiTheme="minorHAnsi" w:cstheme="minorBidi"/>
-      <w:color w:val="FFFFFF" w:themeColor="background1"/>
-      <w:szCs w:val="40"/>
-    </w:rPr>
-  </w:style>
-  <w:style w:type="character" w:customStyle="1" w:styleId="interviewbuttonChar">
-    <w:name w:val="interview button Char"/>
-    <w:basedOn w:val="DefaultParagraphFont"/>
-    <w:link w:val="interviewbutton"/>
-    <w:qFormat/>
-    <w:rsid w:val="000F4FEF"/>
-    <w:rPr>
-      <w:color w:val="FFFFFF" w:themeColor="background1"/>
-      <w:szCs w:val="40"/>
-      <w:shd w:val="clear" w:color="auto" w:fill="0070C0"/>
-    </w:rPr>
-  </w:style>
-  <w:style w:type="paragraph" w:styleId="BodyText">
-    <w:name w:val="Body Text"/>
-    <w:basedOn w:val="Normal"/>
-    <w:link w:val="BodyTextChar"/>
-    <w:uiPriority w:val="1"/>
-    <w:unhideWhenUsed/>
-    <w:qFormat/>
-    <w:rsid w:val="000F4FEF"/>
-    <w:pPr>
-      <w:spacing w:after="120"/>
-    </w:pPr>
-  </w:style>
-  <w:style w:type="character" w:customStyle="1" w:styleId="BodyTextChar">
-    <w:name w:val="Body Text Char"/>
-    <w:basedOn w:val="DefaultParagraphFont"/>
-    <w:link w:val="BodyText"/>
-    <w:uiPriority w:val="1"/>
-    <w:rsid w:val="000F4FEF"/>
-    <w:rPr>
-      <w:rFonts w:ascii="Arial" w:hAnsi="Arial" w:cs="Arial"/>
-    </w:rPr>
-  </w:style>
-  <w:style w:type="character" w:customStyle="1" w:styleId="interviewcondition2">
-    <w:name w:val="interview condition 2"/>
-    <w:basedOn w:val="Hyperlink"/>
-    <w:uiPriority w:val="1"/>
-    <w:qFormat/>
-    <w:rsid w:val="000F4FEF"/>
-    <w:rPr>
-      <w:rFonts w:ascii="Helvetica" w:eastAsia="Arial" w:hAnsi="Helvetica" w:cs="Helvetica"/>
-      <w:color w:val="009999"/>
-      <w:spacing w:val="-2"/>
-      <w:sz w:val="24"/>
-      <w:szCs w:val="24"/>
-      <w:u w:val="none"/>
-    </w:rPr>
-  </w:style>
-  <w:style w:type="character" w:styleId="Hyperlink">
-    <w:name w:val="Hyperlink"/>
-    <w:basedOn w:val="DefaultParagraphFont"/>
-    <w:uiPriority w:val="99"/>
-    <w:unhideWhenUsed/>
-    <w:rsid w:val="000F4FEF"/>
-    <w:rPr>
-      <w:rFonts w:ascii="Helvetica" w:hAnsi="Helvetica" w:cs="Helvetica"/>
-      <w:color w:val="0563C1" w:themeColor="hyperlink"/>
-      <w:spacing w:val="-2"/>
-      <w:sz w:val="24"/>
-      <w:szCs w:val="24"/>
-      <w:u w:val="none"/>
-    </w:rPr>
-  </w:style>
-  <w:style w:type="paragraph" w:customStyle="1" w:styleId="variable">
-    <w:name w:val="variable"/>
-    <w:basedOn w:val="Normal"/>
-    <w:qFormat/>
-    <w:rsid w:val="00B61CCF"/>
-    <w:pPr>
-      <w:spacing w:after="120" w:line="276" w:lineRule="auto"/>
-    </w:pPr>
-    <w:rPr>
-      <w:color w:val="FF7C80"/>
-      <w:shd w:val="clear" w:color="auto" w:fill="FFFFCC"/>
-      <w:lang w:val="en"/>
-    </w:rPr>
-  </w:style>
-  <w:style w:type="character" w:customStyle="1" w:styleId="Heading2Char">
-    <w:name w:val="Heading 2 Char"/>
-    <w:basedOn w:val="DefaultParagraphFont"/>
-    <w:link w:val="Heading2"/>
-    <w:uiPriority w:val="9"/>
-    <w:rsid w:val="000F4FEF"/>
-    <w:rPr>
-      <w:rFonts w:ascii="Helvetica" w:eastAsiaTheme="minorHAnsi" w:hAnsi="Helvetica" w:cs="Helvetica"/>
-      <w:color w:val="0A2A78"/>
-      <w:spacing w:val="-2"/>
-      <w:sz w:val="36"/>
-      <w:szCs w:val="24"/>
-    </w:rPr>
-  </w:style>
-  <w:style w:type="character" w:customStyle="1" w:styleId="Heading4Char">
-    <w:name w:val="Heading 4 Char"/>
-    <w:basedOn w:val="DefaultParagraphFont"/>
-    <w:link w:val="Heading4"/>
-    <w:uiPriority w:val="9"/>
-    <w:qFormat/>
-    <w:rsid w:val="000F4FEF"/>
-    <w:rPr>
-      <w:rFonts w:ascii="Helvetica" w:eastAsiaTheme="minorHAnsi" w:hAnsi="Helvetica" w:cs="Helvetica"/>
-      <w:iCs/>
-      <w:color w:val="0A2A78"/>
-      <w:spacing w:val="-2"/>
-      <w:sz w:val="24"/>
-      <w:szCs w:val="24"/>
-    </w:rPr>
-  </w:style>
-  <w:style w:type="paragraph" w:customStyle="1" w:styleId="Example">
-    <w:name w:val="Example"/>
-    <w:basedOn w:val="Heading4"/>
-    <w:next w:val="Normal"/>
-    <w:qFormat/>
-    <w:rsid w:val="000F4FEF"/>
-  </w:style>
-  <w:style w:type="paragraph" w:customStyle="1" w:styleId="Exampleparagraph">
-    <w:name w:val="Example paragraph"/>
-    <w:basedOn w:val="Body"/>
-    <w:next w:val="Body"/>
-    <w:qFormat/>
-    <w:rsid w:val="00CA58DD"/>
-    <w:pPr>
-      <w:ind w:left="416"/>
-    </w:pPr>
-    <w:rPr>
-      <w:color w:val="202529"/>
-      <w:spacing w:val="-2"/>
-    </w:rPr>
-  </w:style>
-  <w:style w:type="paragraph" w:customStyle="1" w:styleId="ListParagraphNumbered">
-    <w:name w:val="List Paragraph Numbered"/>
-    <w:basedOn w:val="ListParagraph"/>
-    <w:qFormat/>
-    <w:rsid w:val="000F4FEF"/>
-    <w:pPr>
-      <w:numPr>
-        <w:numId w:val="36"/>
-      </w:numPr>
-    </w:pPr>
-    <w:rPr>
-      <w:b/>
-    </w:rPr>
-  </w:style>
-  <w:style w:type="paragraph" w:customStyle="1" w:styleId="ExampleorImportantblock">
-    <w:name w:val="Example or Important block"/>
-    <w:basedOn w:val="Body"/>
-    <w:qFormat/>
-    <w:rsid w:val="000F4FEF"/>
-    <w:pPr>
-      <w:widowControl w:val="0"/>
-      <w:suppressAutoHyphens/>
-      <w:ind w:left="403"/>
-    </w:pPr>
-    <w:rPr>
-      <w:color w:val="202529"/>
-      <w:spacing w:val="-2"/>
-    </w:rPr>
-  </w:style>
-  <w:style w:type="paragraph" w:customStyle="1" w:styleId="Listnumbered">
-    <w:name w:val="List numbered"/>
-    <w:basedOn w:val="Normal"/>
-    <w:qFormat/>
-    <w:rsid w:val="000F4FEF"/>
-    <w:pPr>
-      <w:widowControl w:val="0"/>
-      <w:autoSpaceDE w:val="0"/>
-      <w:autoSpaceDN w:val="0"/>
-      <w:spacing w:before="54" w:beforeAutospacing="0" w:after="120" w:afterAutospacing="0" w:line="276" w:lineRule="auto"/>
-    </w:pPr>
-    <w:rPr>
-      <w:rFonts w:ascii="Helvetica" w:eastAsiaTheme="minorHAnsi" w:hAnsi="Helvetica" w:cs="Helvetica"/>
-      <w:color w:val="202529"/>
-      <w:spacing w:val="-2"/>
-      <w:sz w:val="24"/>
-      <w:szCs w:val="24"/>
-    </w:rPr>
-  </w:style>
-  <w:style w:type="character" w:customStyle="1" w:styleId="Helptextinquestionmark">
-    <w:name w:val="Help text in question mark"/>
-    <w:basedOn w:val="DefaultParagraphFont"/>
-    <w:uiPriority w:val="1"/>
-    <w:qFormat/>
-    <w:rsid w:val="000F4FEF"/>
-    <w:rPr>
-      <w:rFonts w:ascii="Tahoma" w:hAnsi="Tahoma" w:cs="Tahoma"/>
-      <w:color w:val="FFFFFF" w:themeColor="background1"/>
-      <w:szCs w:val="24"/>
-      <w:shd w:val="clear" w:color="auto" w:fill="33CCFF"/>
-    </w:rPr>
-  </w:style>
-  <w:style w:type="character" w:customStyle="1" w:styleId="interviewtextbox">
-    <w:name w:val="interview text box"/>
-    <w:basedOn w:val="DefaultParagraphFont"/>
-    <w:uiPriority w:val="1"/>
-    <w:qFormat/>
-    <w:rsid w:val="000F4FEF"/>
-    <w:rPr>
-      <w:shd w:val="clear" w:color="auto" w:fill="D9D9D9" w:themeFill="background1" w:themeFillShade="D9"/>
-    </w:rPr>
-  </w:style>
-  <w:style w:type="character" w:customStyle="1" w:styleId="interviewhelpquestionmark">
-    <w:name w:val="interview help question mark"/>
-    <w:basedOn w:val="DefaultParagraphFont"/>
-    <w:uiPriority w:val="1"/>
-    <w:qFormat/>
-    <w:rsid w:val="000F4FEF"/>
-    <w:rPr>
-      <w:color w:val="FFFFFF" w:themeColor="background1"/>
-      <w:shd w:val="clear" w:color="auto" w:fill="9CC2E5" w:themeFill="accent5" w:themeFillTint="99"/>
-    </w:rPr>
-  </w:style>
-  <w:style w:type="paragraph" w:customStyle="1" w:styleId="ListPlevel2">
-    <w:name w:val="List P level 2"/>
-    <w:basedOn w:val="ListParagraph"/>
-    <w:qFormat/>
-    <w:rsid w:val="000F4FEF"/>
-    <w:pPr>
-      <w:ind w:left="765"/>
-    </w:pPr>
-    <w:rPr>
-      <w:color w:val="auto"/>
-      <w:spacing w:val="0"/>
-    </w:rPr>
-  </w:style>
-  <w:style w:type="paragraph" w:customStyle="1" w:styleId="ListPlevel3">
-    <w:name w:val="List P level 3"/>
-    <w:basedOn w:val="ListPlevel2"/>
-    <w:qFormat/>
-    <w:rsid w:val="000F4FEF"/>
-    <w:pPr>
-      <w:tabs>
-        <w:tab w:val="num" w:pos="360"/>
-      </w:tabs>
-      <w:ind w:left="2160"/>
-    </w:pPr>
-  </w:style>
-  <w:style w:type="paragraph" w:customStyle="1" w:styleId="ListParagraphNumberedBold">
-    <w:name w:val="List Paragraph Numbered (Bold)"/>
-    <w:basedOn w:val="ListParagraphNumbered"/>
-    <w:qFormat/>
-    <w:rsid w:val="00AA522D"/>
-    <w:pPr>
-      <w:ind w:left="405"/>
-    </w:pPr>
-    <w:rPr>
-      <w:color w:val="auto"/>
-      <w:spacing w:val="0"/>
-    </w:rPr>
-  </w:style>
-  <w:style w:type="paragraph" w:styleId="Footer">
-    <w:name w:val="footer"/>
-    <w:basedOn w:val="Normal"/>
-    <w:link w:val="FooterChar"/>
-    <w:uiPriority w:val="99"/>
-    <w:unhideWhenUsed/>
-    <w:rsid w:val="000F4FEF"/>
-    <w:pPr>
-      <w:tabs>
-        <w:tab w:val="center" w:pos="4680"/>
-        <w:tab w:val="right" w:pos="9360"/>
-      </w:tabs>
-    </w:pPr>
-  </w:style>
-  <w:style w:type="character" w:customStyle="1" w:styleId="FooterChar">
-    <w:name w:val="Footer Char"/>
-    <w:basedOn w:val="DefaultParagraphFont"/>
-    <w:link w:val="Footer"/>
-    <w:uiPriority w:val="99"/>
-    <w:qFormat/>
-    <w:rsid w:val="000F4FEF"/>
-    <w:rPr>
-      <w:rFonts w:ascii="Arial" w:hAnsi="Arial" w:cs="Arial"/>
-    </w:rPr>
-  </w:style>
-  <w:style w:type="paragraph" w:customStyle="1" w:styleId="FooterRight">
-    <w:name w:val="Footer Right"/>
-    <w:basedOn w:val="Footer"/>
-    <w:qFormat/>
-    <w:rsid w:val="00FA6057"/>
-    <w:pPr>
-      <w:jc w:val="right"/>
-    </w:pPr>
-  </w:style>
-  <w:style w:type="paragraph" w:customStyle="1" w:styleId="interviewsituationpara">
-    <w:name w:val="interview situation para"/>
-    <w:basedOn w:val="Body"/>
-    <w:next w:val="interviewsituationcondition"/>
-    <w:link w:val="interviewsituationparaChar"/>
-    <w:qFormat/>
-    <w:rsid w:val="00DD3DDA"/>
-    <w:pPr>
-      <w:spacing w:before="120" w:after="0" w:line="240" w:lineRule="auto"/>
-      <w:contextualSpacing/>
-    </w:pPr>
-  </w:style>
-  <w:style w:type="character" w:customStyle="1" w:styleId="interviewsituationparaChar">
-    <w:name w:val="interview situation para Char"/>
-    <w:basedOn w:val="BodyChar"/>
-    <w:link w:val="interviewsituationpara"/>
-    <w:rsid w:val="00DD3DDA"/>
-    <w:rPr>
-      <w:rFonts w:ascii="Helvetica" w:eastAsiaTheme="minorHAnsi" w:hAnsi="Helvetica" w:cs="Helvetica"/>
-      <w:sz w:val="24"/>
-      <w:szCs w:val="24"/>
-    </w:rPr>
-  </w:style>
-  <w:style w:type="paragraph" w:customStyle="1" w:styleId="Done">
-    <w:name w:val="Done"/>
-    <w:basedOn w:val="ListParagraph"/>
-    <w:qFormat/>
-    <w:rsid w:val="00DD3DDA"/>
-    <w:pPr>
-      <w:numPr>
-        <w:ilvl w:val="1"/>
-        <w:numId w:val="19"/>
-      </w:numPr>
-    </w:pPr>
-  </w:style>
-  <w:style w:type="character" w:customStyle="1" w:styleId="subject">
-    <w:name w:val="subject"/>
-    <w:basedOn w:val="DefaultParagraphFont"/>
-    <w:rsid w:val="000F4FEF"/>
-  </w:style>
-  <w:style w:type="character" w:customStyle="1" w:styleId="convention">
-    <w:name w:val="convention"/>
-    <w:basedOn w:val="DefaultParagraphFont"/>
-    <w:uiPriority w:val="1"/>
-    <w:qFormat/>
-    <w:rsid w:val="000F4FEF"/>
-    <w:rPr>
-      <w:sz w:val="22"/>
-      <w:szCs w:val="22"/>
-      <w:shd w:val="clear" w:color="auto" w:fill="A6A6A6" w:themeFill="background1" w:themeFillShade="A6"/>
-    </w:rPr>
-  </w:style>
-  <w:style w:type="paragraph" w:customStyle="1" w:styleId="Default">
-    <w:name w:val="Default"/>
-    <w:rsid w:val="000F4FEF"/>
-    <w:pPr>
-      <w:autoSpaceDE w:val="0"/>
-      <w:autoSpaceDN w:val="0"/>
-      <w:adjustRightInd w:val="0"/>
-      <w:spacing w:beforeAutospacing="0" w:after="0" w:afterAutospacing="0" w:line="240" w:lineRule="auto"/>
-    </w:pPr>
-    <w:rPr>
-      <w:rFonts w:ascii="Arial" w:eastAsiaTheme="minorHAnsi" w:hAnsi="Arial" w:cs="Arial"/>
-      <w:color w:val="000000"/>
-      <w:sz w:val="24"/>
-      <w:szCs w:val="24"/>
-    </w:rPr>
-  </w:style>
-  <w:style w:type="paragraph" w:customStyle="1" w:styleId="Example-bulleted">
-    <w:name w:val="Example - bulleted"/>
-    <w:basedOn w:val="Body"/>
-    <w:qFormat/>
-    <w:rsid w:val="000F4FEF"/>
-    <w:pPr>
-      <w:widowControl w:val="0"/>
-      <w:numPr>
-        <w:numId w:val="28"/>
-      </w:numPr>
-      <w:suppressAutoHyphens/>
-      <w:autoSpaceDE w:val="0"/>
-      <w:autoSpaceDN w:val="0"/>
-      <w:spacing w:before="60"/>
-    </w:pPr>
-    <w:rPr>
-      <w:rFonts w:eastAsia="Calibri"/>
-    </w:rPr>
-  </w:style>
-  <w:style w:type="character" w:customStyle="1" w:styleId="f1-light">
-    <w:name w:val="f1-light"/>
-    <w:basedOn w:val="DefaultParagraphFont"/>
-    <w:rsid w:val="000F4FEF"/>
-  </w:style>
-  <w:style w:type="paragraph" w:customStyle="1" w:styleId="H3numberedfordirections">
-    <w:name w:val="H3 numbered for directions"/>
-    <w:basedOn w:val="Heading3"/>
-    <w:next w:val="Normal"/>
-    <w:qFormat/>
-    <w:rsid w:val="000F4FEF"/>
-    <w:pPr>
-      <w:numPr>
-        <w:numId w:val="29"/>
-      </w:numPr>
-      <w:outlineLvl w:val="9"/>
-    </w:pPr>
-  </w:style>
-  <w:style w:type="character" w:customStyle="1" w:styleId="Interviewbutton0">
-    <w:name w:val="Interview button"/>
-    <w:basedOn w:val="DefaultParagraphFont"/>
-    <w:uiPriority w:val="1"/>
-    <w:qFormat/>
-    <w:rsid w:val="000F4FEF"/>
-    <w:rPr>
-      <w:color w:val="FFFFFF" w:themeColor="background1"/>
-      <w:bdr w:val="none" w:sz="0" w:space="0" w:color="auto"/>
-      <w:shd w:val="clear" w:color="auto" w:fill="0B5ED8"/>
-    </w:rPr>
-  </w:style>
-  <w:style w:type="paragraph" w:customStyle="1" w:styleId="interviewbuttons">
-    <w:name w:val="interview buttons"/>
-    <w:basedOn w:val="Normal"/>
-    <w:qFormat/>
-    <w:rsid w:val="000F4FEF"/>
-    <w:pPr>
-      <w:pBdr>
-        <w:top w:val="single" w:sz="12" w:space="1" w:color="0070C0"/>
-        <w:left w:val="single" w:sz="12" w:space="4" w:color="0070C0"/>
-        <w:bottom w:val="single" w:sz="12" w:space="1" w:color="0070C0"/>
-        <w:right w:val="single" w:sz="12" w:space="4" w:color="0070C0"/>
-        <w:between w:val="single" w:sz="12" w:space="1" w:color="0070C0"/>
-        <w:bar w:val="single" w:sz="12" w:color="0070C0"/>
-      </w:pBdr>
-      <w:shd w:val="clear" w:color="auto" w:fill="FFFFFF"/>
-      <w:spacing w:after="0"/>
-      <w:ind w:left="-58" w:right="-216"/>
-    </w:pPr>
-    <w:rPr>
-      <w:sz w:val="21"/>
-      <w:szCs w:val="21"/>
-    </w:rPr>
-  </w:style>
-  <w:style w:type="paragraph" w:customStyle="1" w:styleId="interviewcheckboxes">
-    <w:name w:val="interview checkboxes"/>
-    <w:basedOn w:val="ListParagraph"/>
-    <w:qFormat/>
-    <w:rsid w:val="000F4FEF"/>
-    <w:pPr>
-      <w:numPr>
-        <w:numId w:val="31"/>
-      </w:numPr>
-      <w:pBdr>
-        <w:top w:val="single" w:sz="12" w:space="1" w:color="0070C0"/>
-        <w:left w:val="single" w:sz="12" w:space="4" w:color="0070C0"/>
-        <w:bottom w:val="single" w:sz="12" w:space="1" w:color="0070C0"/>
-        <w:right w:val="single" w:sz="12" w:space="4" w:color="0070C0"/>
-        <w:between w:val="single" w:sz="12" w:space="1" w:color="0070C0"/>
-        <w:bar w:val="single" w:sz="12" w:color="0070C0"/>
-      </w:pBdr>
-    </w:pPr>
-  </w:style>
-  <w:style w:type="character" w:customStyle="1" w:styleId="interviewclickformoreinfo-definition">
-    <w:name w:val="interview click for more info - definition"/>
-    <w:uiPriority w:val="1"/>
-    <w:qFormat/>
-    <w:rsid w:val="000F4FEF"/>
-    <w:rPr>
-      <w:color w:val="00B050"/>
-      <w:u w:val="dash" w:color="92D050"/>
-    </w:rPr>
-  </w:style>
-  <w:style w:type="character" w:customStyle="1" w:styleId="InterviewCommentText">
-    <w:name w:val="Interview Comment Text"/>
-    <w:basedOn w:val="BodyTextChar"/>
-    <w:uiPriority w:val="1"/>
-    <w:qFormat/>
-    <w:rsid w:val="000F4FEF"/>
-    <w:rPr>
-      <w:rFonts w:ascii="Helvetica" w:eastAsia="Arial" w:hAnsi="Helvetica" w:cs="Helvetica"/>
-      <w:color w:val="7030A0"/>
-      <w:spacing w:val="-2"/>
-      <w:sz w:val="24"/>
-      <w:szCs w:val="24"/>
-    </w:rPr>
-  </w:style>
-  <w:style w:type="character" w:customStyle="1" w:styleId="interviewconvention">
-    <w:name w:val="interview convention"/>
-    <w:basedOn w:val="DefaultParagraphFont"/>
-    <w:uiPriority w:val="1"/>
-    <w:qFormat/>
-    <w:rsid w:val="000F4FEF"/>
-    <w:rPr>
-      <w:sz w:val="22"/>
-      <w:szCs w:val="22"/>
-      <w:shd w:val="clear" w:color="auto" w:fill="A6A6A6" w:themeFill="background1" w:themeFillShade="A6"/>
-    </w:rPr>
-  </w:style>
-  <w:style w:type="paragraph" w:customStyle="1" w:styleId="interviewglossarywordintemplate">
-    <w:name w:val="interview glossary word in template"/>
-    <w:basedOn w:val="Normal"/>
-    <w:link w:val="interviewglossarywordintemplateChar"/>
-    <w:qFormat/>
-    <w:rsid w:val="000F4FEF"/>
-    <w:pPr>
-      <w:spacing w:after="60" w:line="360" w:lineRule="auto"/>
-    </w:pPr>
-    <w:rPr>
-      <w:rFonts w:asciiTheme="minorHAnsi" w:hAnsiTheme="minorHAnsi" w:cstheme="minorBidi"/>
-    </w:rPr>
-  </w:style>
-  <w:style w:type="character" w:customStyle="1" w:styleId="interviewglossarywordintemplateChar">
-    <w:name w:val="interview glossary word in template Char"/>
-    <w:basedOn w:val="DefaultParagraphFont"/>
-    <w:link w:val="interviewglossarywordintemplate"/>
-    <w:rsid w:val="000F4FEF"/>
-  </w:style>
-  <w:style w:type="character" w:customStyle="1" w:styleId="interviewsituation">
-    <w:name w:val="interview situation"/>
-    <w:basedOn w:val="interviewneedstobewritten"/>
-    <w:uiPriority w:val="1"/>
-    <w:qFormat/>
-    <w:rsid w:val="00DD3DDA"/>
-    <w:rPr>
-      <w:shd w:val="clear" w:color="auto" w:fill="FFFF00"/>
-    </w:rPr>
-  </w:style>
-  <w:style w:type="character" w:customStyle="1" w:styleId="interviewneedstobewritten">
-    <w:name w:val="interview needs to be written"/>
-    <w:basedOn w:val="DefaultParagraphFont"/>
-    <w:uiPriority w:val="1"/>
-    <w:qFormat/>
-    <w:rsid w:val="000F4FEF"/>
-    <w:rPr>
-      <w:shd w:val="clear" w:color="auto" w:fill="FFFF00"/>
-    </w:rPr>
-  </w:style>
-  <w:style w:type="character" w:customStyle="1" w:styleId="interviewPAPtexttrigger">
-    <w:name w:val="interview PAP text trigger"/>
-    <w:basedOn w:val="DefaultParagraphFont"/>
-    <w:uiPriority w:val="1"/>
-    <w:qFormat/>
-    <w:rsid w:val="000F4FEF"/>
-    <w:rPr>
-      <w:shd w:val="clear" w:color="auto" w:fill="009999"/>
-    </w:rPr>
-  </w:style>
-  <w:style w:type="character" w:customStyle="1" w:styleId="interviewpdf">
-    <w:name w:val="interview pdf"/>
-    <w:basedOn w:val="DefaultParagraphFont"/>
-    <w:uiPriority w:val="1"/>
-    <w:qFormat/>
-    <w:rsid w:val="000F4FEF"/>
-    <w:rPr>
-      <w:b/>
-      <w:szCs w:val="24"/>
-      <w:shd w:val="clear" w:color="auto" w:fill="FF00FF"/>
-    </w:rPr>
-  </w:style>
-  <w:style w:type="paragraph" w:customStyle="1" w:styleId="interviewquestionid">
-    <w:name w:val="interview question id"/>
-    <w:basedOn w:val="BodyText"/>
-    <w:qFormat/>
-    <w:rsid w:val="000F4FEF"/>
-    <w:pPr>
-      <w:spacing w:before="240" w:after="0"/>
-    </w:pPr>
-    <w:rPr>
-      <w:color w:val="FF9F9F"/>
-    </w:rPr>
-  </w:style>
-  <w:style w:type="paragraph" w:customStyle="1" w:styleId="interviewradiobuttons">
-    <w:name w:val="interview radio buttons"/>
-    <w:basedOn w:val="ListParagraph"/>
-    <w:qFormat/>
-    <w:rsid w:val="000F4FEF"/>
-    <w:pPr>
-      <w:numPr>
-        <w:numId w:val="32"/>
-      </w:numPr>
-      <w:pBdr>
-        <w:top w:val="single" w:sz="12" w:space="1" w:color="0070C0"/>
-        <w:left w:val="single" w:sz="12" w:space="4" w:color="0070C0"/>
-        <w:bottom w:val="single" w:sz="12" w:space="1" w:color="0070C0"/>
-        <w:right w:val="single" w:sz="12" w:space="4" w:color="0070C0"/>
-        <w:between w:val="single" w:sz="12" w:space="1" w:color="0070C0"/>
-        <w:bar w:val="single" w:sz="12" w:color="0070C0"/>
-      </w:pBdr>
-      <w:shd w:val="clear" w:color="auto" w:fill="FFFFFF"/>
-      <w:spacing w:after="480" w:line="360" w:lineRule="auto"/>
-      <w:ind w:right="-220"/>
-    </w:pPr>
-    <w:rPr>
-      <w:szCs w:val="21"/>
-    </w:rPr>
-  </w:style>
-  <w:style w:type="character" w:customStyle="1" w:styleId="interviewvariable">
-    <w:name w:val="interview variable"/>
-    <w:basedOn w:val="DefaultParagraphFont"/>
-    <w:uiPriority w:val="1"/>
-    <w:qFormat/>
-    <w:rsid w:val="000F4FEF"/>
-    <w:rPr>
-      <w:color w:val="FF7C80"/>
-      <w:shd w:val="clear" w:color="auto" w:fill="FFFFCC"/>
-    </w:rPr>
-  </w:style>
-  <w:style w:type="paragraph" w:customStyle="1" w:styleId="Listnumberedunderbullet">
-    <w:name w:val="List numbered under bullet"/>
-    <w:basedOn w:val="Normal"/>
-    <w:qFormat/>
-    <w:rsid w:val="000F4FEF"/>
-    <w:pPr>
-      <w:widowControl w:val="0"/>
-      <w:numPr>
-        <w:ilvl w:val="4"/>
-        <w:numId w:val="33"/>
-      </w:numPr>
-      <w:autoSpaceDE w:val="0"/>
-      <w:autoSpaceDN w:val="0"/>
-      <w:spacing w:before="54" w:beforeAutospacing="0" w:after="120" w:afterAutospacing="0" w:line="276" w:lineRule="auto"/>
-    </w:pPr>
-    <w:rPr>
-      <w:rFonts w:ascii="Helvetica" w:eastAsiaTheme="minorHAnsi" w:hAnsi="Helvetica" w:cs="Helvetica"/>
-      <w:color w:val="202529"/>
-      <w:spacing w:val="-2"/>
-      <w:sz w:val="24"/>
-      <w:szCs w:val="24"/>
-    </w:rPr>
-  </w:style>
-  <w:style w:type="paragraph" w:customStyle="1" w:styleId="MLRIAdvocacyguideforPDFPart">
-    <w:name w:val="MLRI Advocacy guide for PDF Part"/>
-    <w:basedOn w:val="Normal"/>
-    <w:qFormat/>
-    <w:rsid w:val="000F4FEF"/>
-    <w:pPr>
-      <w:spacing w:before="480" w:after="80" w:line="320" w:lineRule="exact"/>
-      <w:ind w:left="187"/>
-    </w:pPr>
-    <w:rPr>
-      <w:rFonts w:ascii="Bookman Old Style" w:hAnsi="Bookman Old Style"/>
-      <w:color w:val="808080"/>
-      <w:szCs w:val="28"/>
-    </w:rPr>
-  </w:style>
-  <w:style w:type="character" w:customStyle="1" w:styleId="NumChar">
-    <w:name w:val="NumChar"/>
-    <w:basedOn w:val="DefaultParagraphFont"/>
-    <w:uiPriority w:val="1"/>
-    <w:qFormat/>
-    <w:rsid w:val="000F4FEF"/>
-    <w:rPr>
-      <w:rFonts w:eastAsiaTheme="minorHAnsi"/>
-    </w:rPr>
-  </w:style>
-  <w:style w:type="paragraph" w:customStyle="1" w:styleId="one-indent">
-    <w:name w:val="one-indent"/>
-    <w:basedOn w:val="Normal"/>
-    <w:rsid w:val="000F4FEF"/>
-    <w:pPr>
-      <w:spacing w:before="100" w:after="100"/>
-    </w:pPr>
-    <w:rPr>
-      <w:rFonts w:ascii="Times New Roman" w:eastAsia="Times New Roman" w:hAnsi="Times New Roman" w:cs="Times New Roman"/>
-      <w:sz w:val="24"/>
-      <w:szCs w:val="24"/>
-    </w:rPr>
-  </w:style>
-  <w:style w:type="character" w:customStyle="1" w:styleId="small">
-    <w:name w:val="small"/>
-    <w:basedOn w:val="DefaultParagraphFont"/>
-    <w:rsid w:val="000F4FEF"/>
-    <w:rPr>
-      <w:rFonts w:cs="Times New Roman"/>
-    </w:rPr>
-  </w:style>
-  <w:style w:type="paragraph" w:customStyle="1" w:styleId="StyleHeading1Hanging008">
-    <w:name w:val="Style Heading 1 + Hanging:  0.08&quot;"/>
-    <w:basedOn w:val="Heading1"/>
-    <w:qFormat/>
-    <w:rsid w:val="000F4FEF"/>
-    <w:pPr>
-      <w:spacing w:before="120"/>
-      <w:ind w:hanging="115"/>
-    </w:pPr>
-    <w:rPr>
-      <w:rFonts w:eastAsia="Times New Roman" w:cs="Times New Roman"/>
-      <w:szCs w:val="20"/>
-    </w:rPr>
-  </w:style>
-  <w:style w:type="numbering" w:customStyle="1" w:styleId="Style1">
-    <w:name w:val="Style1"/>
-    <w:uiPriority w:val="99"/>
-    <w:rsid w:val="000F4FEF"/>
-    <w:pPr>
-      <w:numPr>
-        <w:numId w:val="17"/>
-      </w:numPr>
-    </w:pPr>
-  </w:style>
-  <w:style w:type="paragraph" w:customStyle="1" w:styleId="TableParagraph">
-    <w:name w:val="Table Paragraph"/>
-    <w:basedOn w:val="Normal"/>
-    <w:uiPriority w:val="1"/>
-    <w:qFormat/>
-    <w:rsid w:val="000F4FEF"/>
-  </w:style>
-  <w:style w:type="character" w:customStyle="1" w:styleId="UnresolvedMention1">
-    <w:name w:val="Unresolved Mention1"/>
-    <w:basedOn w:val="DefaultParagraphFont"/>
-    <w:uiPriority w:val="99"/>
-    <w:semiHidden/>
-    <w:unhideWhenUsed/>
-    <w:rsid w:val="005E785C"/>
-    <w:rPr>
-      <w:color w:val="605E5C"/>
-      <w:shd w:val="clear" w:color="auto" w:fill="E1DFDD"/>
-    </w:rPr>
-  </w:style>
-  <w:style w:type="paragraph" w:customStyle="1" w:styleId="interviewsituationcondition">
-    <w:name w:val="interview situation condition"/>
-    <w:basedOn w:val="Heading1"/>
-    <w:next w:val="Heading2"/>
-    <w:qFormat/>
-    <w:rsid w:val="000F4FEF"/>
-    <w:pPr>
-      <w:keepNext/>
-      <w:keepLines/>
-      <w:pBdr>
-        <w:bottom w:val="none" w:sz="0" w:space="0" w:color="auto"/>
-      </w:pBdr>
-      <w:spacing w:after="60" w:afterAutospacing="0"/>
-    </w:pPr>
-    <w:rPr>
-      <w:rFonts w:asciiTheme="majorHAnsi" w:eastAsiaTheme="majorEastAsia" w:hAnsiTheme="majorHAnsi" w:cstheme="majorBidi"/>
-      <w:color w:val="FF0000"/>
-      <w:spacing w:val="0"/>
-      <w:sz w:val="24"/>
-      <w:szCs w:val="26"/>
-    </w:rPr>
-  </w:style>
-  <w:style w:type="paragraph" w:customStyle="1" w:styleId="heading">
-    <w:name w:val="heading"/>
-    <w:basedOn w:val="Normal"/>
-    <w:rsid w:val="00DD3DDA"/>
-    <w:pPr>
-      <w:spacing w:before="100" w:after="100"/>
-    </w:pPr>
-    <w:rPr>
-      <w:rFonts w:ascii="Times New Roman" w:eastAsia="Times New Roman" w:hAnsi="Times New Roman" w:cs="Times New Roman"/>
-      <w:sz w:val="24"/>
-      <w:szCs w:val="24"/>
-    </w:rPr>
-  </w:style>
-  <w:style w:type="character" w:customStyle="1" w:styleId="Interviewpinknote">
-    <w:name w:val="Interview pink note"/>
-    <w:basedOn w:val="BodyChar"/>
-    <w:uiPriority w:val="1"/>
-    <w:qFormat/>
-    <w:rsid w:val="00DD3DDA"/>
-    <w:rPr>
-      <w:rFonts w:ascii="Helvetica" w:eastAsiaTheme="minorHAnsi" w:hAnsi="Helvetica" w:cs="Tahoma"/>
-      <w:b w:val="0"/>
-      <w:bCs/>
-      <w:color w:val="FF99FF"/>
-      <w:sz w:val="24"/>
-      <w:szCs w:val="24"/>
-    </w:rPr>
-  </w:style>
-  <w:style w:type="paragraph" w:customStyle="1" w:styleId="interviewsituationp">
-    <w:name w:val="interview situation p"/>
-    <w:basedOn w:val="Body"/>
-    <w:next w:val="interviewsituationcondition"/>
-    <w:qFormat/>
-    <w:rsid w:val="00DD3DDA"/>
-    <w:pPr>
-      <w:spacing w:before="240" w:after="0" w:line="240" w:lineRule="auto"/>
-      <w:contextualSpacing/>
-    </w:pPr>
-  </w:style>
-  <w:style w:type="character" w:customStyle="1" w:styleId="Heading5Char">
-    <w:name w:val="Heading 5 Char"/>
-    <w:basedOn w:val="DefaultParagraphFont"/>
-    <w:link w:val="Heading5"/>
-    <w:uiPriority w:val="9"/>
-    <w:rsid w:val="000F4FEF"/>
-    <w:rPr>
-      <w:rFonts w:ascii="Arial" w:hAnsi="Arial" w:cs="Arial"/>
-      <w:color w:val="666666"/>
-    </w:rPr>
-  </w:style>
-  <w:style w:type="character" w:customStyle="1" w:styleId="Heading6Char">
-    <w:name w:val="Heading 6 Char"/>
-    <w:basedOn w:val="DefaultParagraphFont"/>
-    <w:link w:val="Heading6"/>
-    <w:uiPriority w:val="9"/>
-    <w:semiHidden/>
-    <w:rsid w:val="000F4FEF"/>
-    <w:rPr>
-      <w:rFonts w:ascii="Arial" w:hAnsi="Arial" w:cs="Arial"/>
-      <w:i/>
-      <w:color w:val="666666"/>
-    </w:rPr>
-  </w:style>
-  <w:style w:type="paragraph" w:styleId="TOC1">
-    <w:name w:val="toc 1"/>
-    <w:basedOn w:val="Normal"/>
-    <w:next w:val="Normal"/>
-    <w:autoRedefine/>
-    <w:uiPriority w:val="39"/>
-    <w:unhideWhenUsed/>
-    <w:rsid w:val="000F4FEF"/>
-    <w:pPr>
-      <w:spacing w:after="100"/>
-    </w:pPr>
-  </w:style>
-  <w:style w:type="paragraph" w:styleId="TOC2">
-    <w:name w:val="toc 2"/>
-    <w:basedOn w:val="Normal"/>
-    <w:next w:val="Normal"/>
-    <w:autoRedefine/>
-    <w:uiPriority w:val="39"/>
-    <w:unhideWhenUsed/>
-    <w:rsid w:val="000F4FEF"/>
-    <w:pPr>
-      <w:spacing w:after="100"/>
-      <w:ind w:left="240"/>
-    </w:pPr>
-  </w:style>
-  <w:style w:type="paragraph" w:styleId="TOC3">
-    <w:name w:val="toc 3"/>
-    <w:basedOn w:val="Normal"/>
-    <w:next w:val="Normal"/>
-    <w:autoRedefine/>
-    <w:uiPriority w:val="39"/>
-    <w:unhideWhenUsed/>
-    <w:rsid w:val="000F4FEF"/>
-    <w:pPr>
-      <w:spacing w:after="100"/>
-      <w:ind w:left="480"/>
-    </w:pPr>
-  </w:style>
-  <w:style w:type="paragraph" w:styleId="CommentText">
-    <w:name w:val="annotation text"/>
-    <w:basedOn w:val="Normal"/>
-    <w:link w:val="CommentTextChar"/>
-    <w:uiPriority w:val="99"/>
-    <w:unhideWhenUsed/>
-    <w:qFormat/>
-    <w:rsid w:val="000F4FEF"/>
-    <w:rPr>
-      <w:sz w:val="20"/>
-      <w:szCs w:val="20"/>
-    </w:rPr>
-  </w:style>
-  <w:style w:type="character" w:customStyle="1" w:styleId="CommentTextChar">
-    <w:name w:val="Comment Text Char"/>
-    <w:basedOn w:val="DefaultParagraphFont"/>
-    <w:link w:val="CommentText"/>
-    <w:uiPriority w:val="99"/>
-    <w:qFormat/>
-    <w:rsid w:val="000F4FEF"/>
-    <w:rPr>
-      <w:rFonts w:ascii="Arial" w:hAnsi="Arial" w:cs="Arial"/>
-      <w:sz w:val="20"/>
-      <w:szCs w:val="20"/>
-    </w:rPr>
-  </w:style>
-  <w:style w:type="paragraph" w:styleId="Header">
-    <w:name w:val="header"/>
-    <w:basedOn w:val="Normal"/>
-    <w:link w:val="HeaderChar"/>
-    <w:uiPriority w:val="99"/>
-    <w:unhideWhenUsed/>
-    <w:rsid w:val="000F4FEF"/>
-    <w:pPr>
-      <w:tabs>
-        <w:tab w:val="center" w:pos="4680"/>
-        <w:tab w:val="right" w:pos="9360"/>
-      </w:tabs>
-    </w:pPr>
-  </w:style>
-  <w:style w:type="character" w:customStyle="1" w:styleId="HeaderChar">
-    <w:name w:val="Header Char"/>
-    <w:basedOn w:val="DefaultParagraphFont"/>
-    <w:link w:val="Header"/>
-    <w:uiPriority w:val="99"/>
-    <w:rsid w:val="000F4FEF"/>
-    <w:rPr>
-      <w:rFonts w:ascii="Arial" w:hAnsi="Arial" w:cs="Arial"/>
-    </w:rPr>
-  </w:style>
-  <w:style w:type="character" w:styleId="CommentReference">
-    <w:name w:val="annotation reference"/>
-    <w:basedOn w:val="DefaultParagraphFont"/>
-    <w:uiPriority w:val="99"/>
-    <w:semiHidden/>
-    <w:unhideWhenUsed/>
-    <w:qFormat/>
-    <w:rsid w:val="000F4FEF"/>
-    <w:rPr>
-      <w:sz w:val="16"/>
-      <w:szCs w:val="16"/>
-    </w:rPr>
-  </w:style>
-  <w:style w:type="paragraph" w:styleId="Title">
-    <w:name w:val="Title"/>
-    <w:basedOn w:val="Normal"/>
-    <w:next w:val="Normal"/>
-    <w:link w:val="TitleChar"/>
-    <w:uiPriority w:val="10"/>
-    <w:qFormat/>
-    <w:rsid w:val="000F4FEF"/>
-    <w:pPr>
-      <w:spacing w:before="0" w:beforeAutospacing="0" w:after="100" w:line="276" w:lineRule="auto"/>
-    </w:pPr>
-    <w:rPr>
-      <w:rFonts w:ascii="Helvetica" w:hAnsi="Helvetica" w:cs="Helvetica"/>
-      <w:color w:val="0A2A78"/>
-      <w:spacing w:val="-2"/>
-      <w:sz w:val="48"/>
-      <w:szCs w:val="24"/>
-    </w:rPr>
-  </w:style>
-  <w:style w:type="character" w:customStyle="1" w:styleId="TitleChar">
-    <w:name w:val="Title Char"/>
-    <w:basedOn w:val="DefaultParagraphFont"/>
-    <w:link w:val="Title"/>
-    <w:uiPriority w:val="10"/>
-    <w:qFormat/>
-    <w:rsid w:val="000F4FEF"/>
-    <w:rPr>
-      <w:rFonts w:ascii="Helvetica" w:hAnsi="Helvetica" w:cs="Helvetica"/>
-      <w:color w:val="0A2A78"/>
-      <w:spacing w:val="-2"/>
-      <w:sz w:val="48"/>
-      <w:szCs w:val="24"/>
-    </w:rPr>
-  </w:style>
-  <w:style w:type="paragraph" w:styleId="Subtitle">
-    <w:name w:val="Subtitle"/>
-    <w:basedOn w:val="Normal"/>
-    <w:next w:val="Normal"/>
-    <w:link w:val="SubtitleChar"/>
-    <w:uiPriority w:val="11"/>
-    <w:qFormat/>
-    <w:rsid w:val="000F4FEF"/>
-    <w:pPr>
-      <w:keepNext/>
-      <w:keepLines/>
-      <w:spacing w:after="320"/>
-    </w:pPr>
-    <w:rPr>
-      <w:color w:val="666666"/>
-      <w:sz w:val="30"/>
-      <w:szCs w:val="30"/>
-    </w:rPr>
-  </w:style>
-  <w:style w:type="character" w:customStyle="1" w:styleId="SubtitleChar">
-    <w:name w:val="Subtitle Char"/>
-    <w:basedOn w:val="DefaultParagraphFont"/>
-    <w:link w:val="Subtitle"/>
-    <w:uiPriority w:val="11"/>
-    <w:rsid w:val="000F4FEF"/>
-    <w:rPr>
-      <w:rFonts w:ascii="Arial" w:hAnsi="Arial" w:cs="Arial"/>
-      <w:color w:val="666666"/>
-      <w:sz w:val="30"/>
-      <w:szCs w:val="30"/>
-    </w:rPr>
-  </w:style>
-  <w:style w:type="character" w:styleId="FollowedHyperlink">
-    <w:name w:val="FollowedHyperlink"/>
-    <w:basedOn w:val="DefaultParagraphFont"/>
-    <w:uiPriority w:val="99"/>
-    <w:semiHidden/>
-    <w:unhideWhenUsed/>
-    <w:rsid w:val="000F4FEF"/>
-    <w:rPr>
-      <w:color w:val="954F72" w:themeColor="followedHyperlink"/>
-      <w:u w:val="single"/>
-    </w:rPr>
-  </w:style>
-  <w:style w:type="character" w:styleId="Strong">
-    <w:name w:val="Strong"/>
-    <w:basedOn w:val="DefaultParagraphFont"/>
-    <w:uiPriority w:val="22"/>
-    <w:qFormat/>
-    <w:rsid w:val="000F4FEF"/>
-    <w:rPr>
-      <w:b/>
-      <w:bCs/>
-    </w:rPr>
-  </w:style>
-  <w:style w:type="character" w:styleId="Emphasis">
-    <w:name w:val="Emphasis"/>
-    <w:basedOn w:val="DefaultParagraphFont"/>
-    <w:uiPriority w:val="20"/>
-    <w:qFormat/>
-    <w:rsid w:val="000F4FEF"/>
-    <w:rPr>
-      <w:i/>
-      <w:iCs/>
-    </w:rPr>
-  </w:style>
-  <w:style w:type="paragraph" w:styleId="PlainText">
-    <w:name w:val="Plain Text"/>
-    <w:basedOn w:val="Normal"/>
-    <w:link w:val="PlainTextChar"/>
-    <w:uiPriority w:val="99"/>
-    <w:semiHidden/>
-    <w:unhideWhenUsed/>
-    <w:rsid w:val="00DD3DDA"/>
-    <w:pPr>
-      <w:spacing w:after="0"/>
-    </w:pPr>
-    <w:rPr>
-      <w:sz w:val="24"/>
-      <w:szCs w:val="21"/>
-    </w:rPr>
-  </w:style>
-  <w:style w:type="character" w:customStyle="1" w:styleId="PlainTextChar">
-    <w:name w:val="Plain Text Char"/>
-    <w:basedOn w:val="DefaultParagraphFont"/>
-    <w:link w:val="PlainText"/>
-    <w:uiPriority w:val="99"/>
-    <w:semiHidden/>
-    <w:rsid w:val="00DD3DDA"/>
-    <w:rPr>
-      <w:rFonts w:ascii="Arial" w:hAnsi="Arial" w:cs="Arial"/>
-      <w:sz w:val="24"/>
-      <w:szCs w:val="21"/>
-    </w:rPr>
-  </w:style>
-  <w:style w:type="paragraph" w:styleId="NormalWeb">
-    <w:name w:val="Normal (Web)"/>
-    <w:basedOn w:val="Normal"/>
-    <w:uiPriority w:val="99"/>
-    <w:unhideWhenUsed/>
-    <w:rsid w:val="000F4FEF"/>
-    <w:pPr>
-      <w:spacing w:before="100" w:after="100"/>
-    </w:pPr>
-    <w:rPr>
-      <w:rFonts w:ascii="Times New Roman" w:eastAsia="Times New Roman" w:hAnsi="Times New Roman" w:cs="Times New Roman"/>
-      <w:sz w:val="24"/>
-      <w:szCs w:val="24"/>
-    </w:rPr>
-  </w:style>
-  <w:style w:type="paragraph" w:styleId="HTMLPreformatted">
-    <w:name w:val="HTML Preformatted"/>
-    <w:basedOn w:val="Normal"/>
-    <w:link w:val="HTMLPreformattedChar"/>
-    <w:uiPriority w:val="99"/>
-    <w:semiHidden/>
-    <w:unhideWhenUsed/>
-    <w:rsid w:val="000F4FEF"/>
-    <w:pPr>
-      <w:tabs>
-        <w:tab w:val="left" w:pos="916"/>
-        <w:tab w:val="left" w:pos="1832"/>
-        <w:tab w:val="left" w:pos="2748"/>
-        <w:tab w:val="left" w:pos="3664"/>
-        <w:tab w:val="left" w:pos="4580"/>
-        <w:tab w:val="left" w:pos="5496"/>
-        <w:tab w:val="left" w:pos="6412"/>
-        <w:tab w:val="left" w:pos="7328"/>
-        <w:tab w:val="left" w:pos="8244"/>
-        <w:tab w:val="left" w:pos="9160"/>
-        <w:tab w:val="left" w:pos="10076"/>
-        <w:tab w:val="left" w:pos="10992"/>
-        <w:tab w:val="left" w:pos="11908"/>
-        <w:tab w:val="left" w:pos="12824"/>
-        <w:tab w:val="left" w:pos="13740"/>
-        <w:tab w:val="left" w:pos="14656"/>
-      </w:tabs>
-      <w:spacing w:before="0" w:beforeAutospacing="0" w:after="0" w:afterAutospacing="0"/>
-    </w:pPr>
-    <w:rPr>
-      <w:rFonts w:ascii="Courier New" w:eastAsia="Times New Roman" w:hAnsi="Courier New" w:cs="Courier New"/>
-      <w:sz w:val="20"/>
-      <w:szCs w:val="20"/>
-    </w:rPr>
-  </w:style>
-  <w:style w:type="character" w:customStyle="1" w:styleId="HTMLPreformattedChar">
-    <w:name w:val="HTML Preformatted Char"/>
-    <w:basedOn w:val="DefaultParagraphFont"/>
-    <w:link w:val="HTMLPreformatted"/>
-    <w:uiPriority w:val="99"/>
-    <w:semiHidden/>
-    <w:rsid w:val="000F4FEF"/>
-    <w:rPr>
-      <w:rFonts w:ascii="Courier New" w:eastAsia="Times New Roman" w:hAnsi="Courier New" w:cs="Courier New"/>
-      <w:sz w:val="20"/>
-      <w:szCs w:val="20"/>
-    </w:rPr>
-  </w:style>
-  <w:style w:type="paragraph" w:styleId="CommentSubject">
-    <w:name w:val="annotation subject"/>
-    <w:basedOn w:val="CommentText"/>
-    <w:next w:val="CommentText"/>
-    <w:link w:val="CommentSubjectChar"/>
-    <w:uiPriority w:val="99"/>
-    <w:semiHidden/>
-    <w:unhideWhenUsed/>
-    <w:rsid w:val="000F4FEF"/>
-    <w:rPr>
-      <w:b/>
-      <w:bCs/>
-    </w:rPr>
-  </w:style>
-  <w:style w:type="character" w:customStyle="1" w:styleId="CommentSubjectChar">
-    <w:name w:val="Comment Subject Char"/>
-    <w:basedOn w:val="CommentTextChar"/>
-    <w:link w:val="CommentSubject"/>
-    <w:uiPriority w:val="99"/>
-    <w:semiHidden/>
-    <w:rsid w:val="000F4FEF"/>
-    <w:rPr>
-      <w:rFonts w:ascii="Arial" w:hAnsi="Arial" w:cs="Arial"/>
-      <w:b/>
-      <w:bCs/>
-      <w:sz w:val="20"/>
-      <w:szCs w:val="20"/>
-    </w:rPr>
-  </w:style>
-  <w:style w:type="paragraph" w:styleId="BalloonText">
-    <w:name w:val="Balloon Text"/>
-    <w:basedOn w:val="Normal"/>
-    <w:link w:val="BalloonTextChar"/>
-    <w:uiPriority w:val="99"/>
-    <w:semiHidden/>
-    <w:unhideWhenUsed/>
-    <w:rsid w:val="000F4FEF"/>
-    <w:rPr>
-      <w:rFonts w:ascii="Segoe UI" w:hAnsi="Segoe UI" w:cs="Segoe UI"/>
-      <w:sz w:val="18"/>
-      <w:szCs w:val="18"/>
-    </w:rPr>
-  </w:style>
-  <w:style w:type="character" w:customStyle="1" w:styleId="BalloonTextChar">
-    <w:name w:val="Balloon Text Char"/>
-    <w:basedOn w:val="DefaultParagraphFont"/>
-    <w:link w:val="BalloonText"/>
-    <w:uiPriority w:val="99"/>
-    <w:semiHidden/>
-    <w:rsid w:val="000F4FEF"/>
-    <w:rPr>
-      <w:rFonts w:ascii="Segoe UI" w:hAnsi="Segoe UI" w:cs="Segoe UI"/>
-      <w:sz w:val="18"/>
-      <w:szCs w:val="18"/>
-    </w:rPr>
-  </w:style>
-  <w:style w:type="table" w:styleId="TableGrid">
-    <w:name w:val="Table Grid"/>
-    <w:basedOn w:val="TableNormal"/>
-    <w:uiPriority w:val="39"/>
-    <w:rsid w:val="000F4FEF"/>
-    <w:pPr>
-      <w:widowControl w:val="0"/>
-      <w:autoSpaceDE w:val="0"/>
-      <w:autoSpaceDN w:val="0"/>
-      <w:spacing w:beforeAutospacing="0" w:after="0" w:afterAutospacing="0" w:line="240" w:lineRule="auto"/>
-    </w:pPr>
-    <w:rPr>
-      <w:rFonts w:eastAsiaTheme="minorHAnsi"/>
-    </w:rPr>
-    <w:tblPr>
-      <w:tblBorders>
-        <w:top w:val="single" w:sz="4" w:space="0" w:color="auto"/>
-        <w:left w:val="single" w:sz="4" w:space="0" w:color="auto"/>
-        <w:bottom w:val="single" w:sz="4" w:space="0" w:color="auto"/>
-        <w:right w:val="single" w:sz="4" w:space="0" w:color="auto"/>
-        <w:insideH w:val="single" w:sz="4" w:space="0" w:color="auto"/>
-        <w:insideV w:val="single" w:sz="4" w:space="0" w:color="auto"/>
-      </w:tblBorders>
-    </w:tblPr>
-  </w:style>
-  <w:style w:type="paragraph" w:styleId="NoSpacing">
-    <w:name w:val="No Spacing"/>
-    <w:uiPriority w:val="1"/>
-    <w:qFormat/>
-    <w:rsid w:val="00DD3DDA"/>
-    <w:pPr>
-      <w:spacing w:beforeAutospacing="0" w:after="0" w:afterAutospacing="0"/>
-    </w:pPr>
-    <w:rPr>
-      <w:rFonts w:ascii="Helvetica" w:eastAsiaTheme="minorHAnsi" w:hAnsi="Helvetica"/>
-      <w:sz w:val="24"/>
-    </w:rPr>
-  </w:style>
-  <w:style w:type="paragraph" w:styleId="Quote">
-    <w:name w:val="Quote"/>
-    <w:basedOn w:val="Normal"/>
-    <w:next w:val="Normal"/>
-    <w:link w:val="QuoteChar"/>
-    <w:uiPriority w:val="29"/>
-    <w:rsid w:val="000F4FEF"/>
-    <w:pPr>
-      <w:spacing w:before="200" w:after="160"/>
-      <w:ind w:left="864" w:right="864"/>
-      <w:jc w:val="center"/>
-    </w:pPr>
-    <w:rPr>
-      <w:i/>
-      <w:iCs/>
-      <w:color w:val="404040" w:themeColor="text1" w:themeTint="BF"/>
-    </w:rPr>
-  </w:style>
-  <w:style w:type="character" w:customStyle="1" w:styleId="QuoteChar">
-    <w:name w:val="Quote Char"/>
-    <w:basedOn w:val="DefaultParagraphFont"/>
-    <w:link w:val="Quote"/>
-    <w:uiPriority w:val="29"/>
-    <w:rsid w:val="000F4FEF"/>
-    <w:rPr>
-      <w:rFonts w:ascii="Arial" w:hAnsi="Arial" w:cs="Arial"/>
-      <w:i/>
-      <w:iCs/>
-      <w:color w:val="404040" w:themeColor="text1" w:themeTint="BF"/>
-    </w:rPr>
-  </w:style>
-  <w:style w:type="character" w:styleId="SubtleEmphasis">
-    <w:name w:val="Subtle Emphasis"/>
-    <w:basedOn w:val="DefaultParagraphFont"/>
-    <w:uiPriority w:val="19"/>
-    <w:rsid w:val="000F4FEF"/>
-    <w:rPr>
-      <w:i/>
-      <w:iCs/>
-      <w:color w:val="404040" w:themeColor="text1" w:themeTint="BF"/>
-    </w:rPr>
-  </w:style>
-  <w:style w:type="paragraph" w:styleId="TOCHeading">
-    <w:name w:val="TOC Heading"/>
-    <w:basedOn w:val="Heading1"/>
-    <w:next w:val="Normal"/>
-    <w:uiPriority w:val="39"/>
-    <w:unhideWhenUsed/>
-    <w:qFormat/>
-    <w:rsid w:val="000F4FEF"/>
-    <w:pPr>
-      <w:spacing w:before="240" w:after="0" w:line="259" w:lineRule="auto"/>
-      <w:outlineLvl w:val="9"/>
-    </w:pPr>
-    <w:rPr>
-      <w:rFonts w:asciiTheme="majorHAnsi" w:eastAsiaTheme="majorEastAsia" w:hAnsiTheme="majorHAnsi" w:cstheme="majorBidi"/>
-      <w:color w:val="2F5496" w:themeColor="accent1" w:themeShade="BF"/>
-      <w:sz w:val="32"/>
-      <w:szCs w:val="32"/>
-    </w:rPr>
-  </w:style>
-  <w:style w:type="character" w:customStyle="1" w:styleId="BodyChar">
-    <w:name w:val="Body Char"/>
-    <w:basedOn w:val="DefaultParagraphFont"/>
-    <w:link w:val="Body"/>
-    <w:rsid w:val="000F4FEF"/>
-    <w:rPr>
-      <w:rFonts w:ascii="Helvetica" w:eastAsiaTheme="minorHAnsi" w:hAnsi="Helvetica" w:cs="Helvetica"/>
-      <w:sz w:val="24"/>
-      <w:szCs w:val="24"/>
-    </w:rPr>
-  </w:style>
-  <w:style w:type="paragraph" w:customStyle="1" w:styleId="interviewneedsediting">
-    <w:name w:val="interview needs editing"/>
-    <w:basedOn w:val="Normal"/>
-    <w:next w:val="Normal"/>
-    <w:qFormat/>
-    <w:rsid w:val="000F4FEF"/>
-    <w:pPr>
-      <w:shd w:val="clear" w:color="auto" w:fill="FFFF00"/>
-      <w:spacing w:after="60" w:line="360" w:lineRule="auto"/>
-    </w:pPr>
-    <w:rPr>
-      <w:sz w:val="21"/>
-      <w:szCs w:val="21"/>
-    </w:rPr>
-  </w:style>
-  <w:style w:type="table" w:customStyle="1" w:styleId="TableGridLight1">
-    <w:name w:val="Table Grid Light1"/>
-    <w:basedOn w:val="TableNormal"/>
-    <w:uiPriority w:val="40"/>
-    <w:rsid w:val="000F4FEF"/>
-    <w:pPr>
-      <w:spacing w:beforeAutospacing="0" w:after="0" w:afterAutospacing="0" w:line="240" w:lineRule="auto"/>
-    </w:pPr>
-    <w:rPr>
-      <w:rFonts w:eastAsiaTheme="minorHAnsi"/>
-    </w:rPr>
-    <w:tblPr>
-      <w:tblBorders>
-        <w:top w:val="single" w:sz="4" w:space="0" w:color="BFBFBF" w:themeColor="background1" w:themeShade="BF"/>
-        <w:left w:val="single" w:sz="4" w:space="0" w:color="BFBFBF" w:themeColor="background1" w:themeShade="BF"/>
-        <w:bottom w:val="single" w:sz="4" w:space="0" w:color="BFBFBF" w:themeColor="background1" w:themeShade="BF"/>
-        <w:right w:val="single" w:sz="4" w:space="0" w:color="BFBFBF" w:themeColor="background1" w:themeShade="BF"/>
-        <w:insideH w:val="single" w:sz="4" w:space="0" w:color="BFBFBF" w:themeColor="background1" w:themeShade="BF"/>
-        <w:insideV w:val="single" w:sz="4" w:space="0" w:color="BFBFBF" w:themeColor="background1" w:themeShade="BF"/>
-      </w:tblBorders>
-    </w:tblPr>
-  </w:style>
-  <w:style w:type="character" w:customStyle="1" w:styleId="UnresolvedMention">
+  <w:style w:type="character" w:styleId="UnresolvedMention">
     <w:name w:val="Unresolved Mention"/>
     <w:basedOn w:val="DefaultParagraphFont"/>
     <w:uiPriority w:val="99"/>
@@ -9013,7 +7441,7 @@
   <a:extraClrSchemeLst/>
   <a:extLst>
     <a:ext uri="{05A4C25C-085E-4340-85A3-A5531E510DB2}">
-      <thm15:themeFamily xmlns:thm15="http://schemas.microsoft.com/office/thememl/2012/main" xmlns="" name="Office Theme" id="{62F939B6-93AF-4DB8-9C6B-D6C7DFDC589F}" vid="{4A3C46E8-61CC-4603-A589-7422A47A8E4A}"/>
+      <thm15:themeFamily xmlns:thm15="http://schemas.microsoft.com/office/thememl/2012/main" name="Office Theme" id="{62F939B6-93AF-4DB8-9C6B-D6C7DFDC589F}" vid="{4A3C46E8-61CC-4603-A589-7422A47A8E4A}"/>
     </a:ext>
   </a:extLst>
 </a:theme>

</xml_diff>